<commit_message>
Added quit game are you sure popup.
</commit_message>
<xml_diff>
--- a/Documentation/Unity Associate Programmer.docx
+++ b/Documentation/Unity Associate Programmer.docx
@@ -181,13 +181,23 @@
           <w:szCs w:val="28"/>
         </w:rPr>
       </w:pPr>
+      <w:proofErr w:type="gramStart"/>
       <w:r>
         <w:rPr>
           <w:rFonts w:asciiTheme="minorHAnsi" w:hAnsiTheme="minorHAnsi" w:cstheme="minorHAnsi"/>
           <w:sz w:val="28"/>
           <w:szCs w:val="28"/>
         </w:rPr>
-        <w:t xml:space="preserve">By:   </w:t>
+        <w:t>By:</w:t>
+      </w:r>
+      <w:proofErr w:type="gramEnd"/>
+      <w:r>
+        <w:rPr>
+          <w:rFonts w:asciiTheme="minorHAnsi" w:hAnsiTheme="minorHAnsi" w:cstheme="minorHAnsi"/>
+          <w:sz w:val="28"/>
+          <w:szCs w:val="28"/>
+        </w:rPr>
+        <w:t xml:space="preserve">   </w:t>
       </w:r>
     </w:p>
     <w:p>
@@ -2092,8 +2102,16 @@
         <w:rPr>
           <w:rFonts w:asciiTheme="minorHAnsi" w:hAnsiTheme="minorHAnsi" w:cstheme="minorHAnsi"/>
         </w:rPr>
-        <w:t>Save data between scenes and between sessions using approaches such as static variables and PlayerPrefs</w:t>
-      </w:r>
+        <w:t xml:space="preserve">Save data between scenes and between sessions using approaches such as static variables and </w:t>
+      </w:r>
+      <w:proofErr w:type="spellStart"/>
+      <w:r>
+        <w:rPr>
+          <w:rFonts w:asciiTheme="minorHAnsi" w:hAnsiTheme="minorHAnsi" w:cstheme="minorHAnsi"/>
+        </w:rPr>
+        <w:t>PlayerPrefs</w:t>
+      </w:r>
+      <w:proofErr w:type="spellEnd"/>
     </w:p>
     <w:p>
       <w:pPr>
@@ -2126,7 +2144,21 @@
         <w:rPr>
           <w:rFonts w:asciiTheme="minorHAnsi" w:hAnsiTheme="minorHAnsi" w:cstheme="minorHAnsi"/>
         </w:rPr>
-        <w:t>Select the appropriate properties, scripts, and components of GameObjects for required tasks</w:t>
+        <w:t xml:space="preserve">Select the appropriate properties, scripts, and components of </w:t>
+      </w:r>
+      <w:proofErr w:type="spellStart"/>
+      <w:r>
+        <w:rPr>
+          <w:rFonts w:asciiTheme="minorHAnsi" w:hAnsiTheme="minorHAnsi" w:cstheme="minorHAnsi"/>
+        </w:rPr>
+        <w:t>GameObjects</w:t>
+      </w:r>
+      <w:proofErr w:type="spellEnd"/>
+      <w:r>
+        <w:rPr>
+          <w:rFonts w:asciiTheme="minorHAnsi" w:hAnsiTheme="minorHAnsi" w:cstheme="minorHAnsi"/>
+        </w:rPr>
+        <w:t xml:space="preserve"> for required tasks</w:t>
       </w:r>
     </w:p>
     <w:p>
@@ -2258,7 +2290,21 @@
         <w:rPr>
           <w:rFonts w:asciiTheme="minorHAnsi" w:hAnsiTheme="minorHAnsi" w:cstheme="minorHAnsi"/>
         </w:rPr>
-        <w:t>Explain how to use the UnityEvent system to respond to User Input</w:t>
+        <w:t xml:space="preserve">Explain how to use the </w:t>
+      </w:r>
+      <w:proofErr w:type="spellStart"/>
+      <w:r>
+        <w:rPr>
+          <w:rFonts w:asciiTheme="minorHAnsi" w:hAnsiTheme="minorHAnsi" w:cstheme="minorHAnsi"/>
+        </w:rPr>
+        <w:t>UnityEvent</w:t>
+      </w:r>
+      <w:proofErr w:type="spellEnd"/>
+      <w:r>
+        <w:rPr>
+          <w:rFonts w:asciiTheme="minorHAnsi" w:hAnsiTheme="minorHAnsi" w:cstheme="minorHAnsi"/>
+        </w:rPr>
+        <w:t xml:space="preserve"> system to respond to User Input</w:t>
       </w:r>
     </w:p>
     <w:p>
@@ -2403,7 +2449,21 @@
         <w:rPr>
           <w:rFonts w:asciiTheme="minorHAnsi" w:hAnsiTheme="minorHAnsi" w:cstheme="minorHAnsi"/>
         </w:rPr>
-        <w:t>Describe the process and outcomes for changing a nested prefab or prefab variant</w:t>
+        <w:t xml:space="preserve">Describe the process and outcomes for changing a </w:t>
+      </w:r>
+      <w:proofErr w:type="gramStart"/>
+      <w:r>
+        <w:rPr>
+          <w:rFonts w:asciiTheme="minorHAnsi" w:hAnsiTheme="minorHAnsi" w:cstheme="minorHAnsi"/>
+        </w:rPr>
+        <w:t>nested</w:t>
+      </w:r>
+      <w:proofErr w:type="gramEnd"/>
+      <w:r>
+        <w:rPr>
+          <w:rFonts w:asciiTheme="minorHAnsi" w:hAnsiTheme="minorHAnsi" w:cstheme="minorHAnsi"/>
+        </w:rPr>
+        <w:t xml:space="preserve"> prefab or prefab variant</w:t>
       </w:r>
     </w:p>
     <w:p>
@@ -2584,8 +2644,13 @@
           <w:numId w:val="509"/>
         </w:numPr>
       </w:pPr>
-      <w:r>
-        <w:t>Player Can Destroy Enemies</w:t>
+      <w:proofErr w:type="gramStart"/>
+      <w:r>
+        <w:t>Player</w:t>
+      </w:r>
+      <w:proofErr w:type="gramEnd"/>
+      <w:r>
+        <w:t xml:space="preserve"> Can Destroy Enemies</w:t>
       </w:r>
     </w:p>
     <w:p>
@@ -2675,7 +2740,15 @@
         </w:numPr>
       </w:pPr>
       <w:r>
-        <w:t>Player health should be edited in the inspector.</w:t>
+        <w:t xml:space="preserve">Player health should be edited </w:t>
+      </w:r>
+      <w:proofErr w:type="gramStart"/>
+      <w:r>
+        <w:t>in</w:t>
+      </w:r>
+      <w:proofErr w:type="gramEnd"/>
+      <w:r>
+        <w:t xml:space="preserve"> the inspector.</w:t>
       </w:r>
     </w:p>
     <w:p/>
@@ -2856,10 +2929,12 @@
       </w:r>
     </w:p>
     <w:p>
+      <w:proofErr w:type="gramStart"/>
       <w:r>
         <w:lastRenderedPageBreak/>
         <w:t>Solution :</w:t>
       </w:r>
+      <w:proofErr w:type="gramEnd"/>
     </w:p>
     <w:p>
       <w:pPr>
@@ -2873,12 +2948,21 @@
           <w:bCs/>
         </w:rPr>
       </w:pPr>
+      <w:proofErr w:type="spellStart"/>
       <w:r>
         <w:rPr>
           <w:b/>
           <w:bCs/>
         </w:rPr>
-        <w:t xml:space="preserve">PlayerMovement.cs </w:t>
+        <w:t>PlayerMovement.cs</w:t>
+      </w:r>
+      <w:proofErr w:type="spellEnd"/>
+      <w:r>
+        <w:rPr>
+          <w:b/>
+          <w:bCs/>
+        </w:rPr>
+        <w:t xml:space="preserve"> </w:t>
       </w:r>
       <w:r>
         <w:t>script</w:t>
@@ -2917,11 +3001,24 @@
         <w:t>Stats</w:t>
       </w:r>
       <w:r>
-        <w:t xml:space="preserve"> struct: </w:t>
-      </w:r>
-      <w:r>
-        <w:t>public float health;</w:t>
-      </w:r>
+        <w:t xml:space="preserve"> </w:t>
+      </w:r>
+      <w:proofErr w:type="gramStart"/>
+      <w:r>
+        <w:t>struct:</w:t>
+      </w:r>
+      <w:proofErr w:type="gramEnd"/>
+      <w:r>
+        <w:t xml:space="preserve"> </w:t>
+      </w:r>
+      <w:r>
+        <w:t xml:space="preserve">public float </w:t>
+      </w:r>
+      <w:proofErr w:type="gramStart"/>
+      <w:r>
+        <w:t>health;</w:t>
+      </w:r>
+      <w:proofErr w:type="gramEnd"/>
     </w:p>
     <w:p>
       <w:pPr>
@@ -2937,12 +3034,30 @@
       <w:r>
         <w:t xml:space="preserve"> method </w:t>
       </w:r>
+      <w:proofErr w:type="spellStart"/>
+      <w:proofErr w:type="gramStart"/>
       <w:r>
         <w:rPr>
           <w:b/>
           <w:bCs/>
         </w:rPr>
-        <w:t>UpdateHealth(float amount)</w:t>
+        <w:t>UpdateHealth</w:t>
+      </w:r>
+      <w:proofErr w:type="spellEnd"/>
+      <w:r>
+        <w:rPr>
+          <w:b/>
+          <w:bCs/>
+        </w:rPr>
+        <w:t>(</w:t>
+      </w:r>
+      <w:proofErr w:type="gramEnd"/>
+      <w:r>
+        <w:rPr>
+          <w:b/>
+          <w:bCs/>
+        </w:rPr>
+        <w:t>float amount)</w:t>
       </w:r>
       <w:r>
         <w:rPr>
@@ -3019,8 +3134,32 @@
           <w:szCs w:val="19"/>
           <w:highlight w:val="white"/>
         </w:rPr>
-        <w:t xml:space="preserve"> UpdateHealth(</w:t>
-      </w:r>
+        <w:t xml:space="preserve"> </w:t>
+      </w:r>
+      <w:proofErr w:type="spellStart"/>
+      <w:proofErr w:type="gramStart"/>
+      <w:r>
+        <w:rPr>
+          <w:rFonts w:ascii="Cascadia Mono" w:hAnsi="Cascadia Mono" w:cs="Cascadia Mono"/>
+          <w:color w:val="000000"/>
+          <w:sz w:val="19"/>
+          <w:szCs w:val="19"/>
+          <w:highlight w:val="white"/>
+        </w:rPr>
+        <w:t>UpdateHealth</w:t>
+      </w:r>
+      <w:proofErr w:type="spellEnd"/>
+      <w:r>
+        <w:rPr>
+          <w:rFonts w:ascii="Cascadia Mono" w:hAnsi="Cascadia Mono" w:cs="Cascadia Mono"/>
+          <w:color w:val="000000"/>
+          <w:sz w:val="19"/>
+          <w:szCs w:val="19"/>
+          <w:highlight w:val="white"/>
+        </w:rPr>
+        <w:t>(</w:t>
+      </w:r>
+      <w:proofErr w:type="gramEnd"/>
       <w:r>
         <w:rPr>
           <w:rFonts w:ascii="Cascadia Mono" w:hAnsi="Cascadia Mono" w:cs="Cascadia Mono"/>
@@ -3089,15 +3228,10 @@
           <w:szCs w:val="19"/>
           <w:highlight w:val="white"/>
         </w:rPr>
-        <w:t xml:space="preserve">    playerStats.health += amount;</w:t>
-      </w:r>
-    </w:p>
-    <w:p>
-      <w:pPr>
-        <w:autoSpaceDE w:val="0"/>
-        <w:autoSpaceDN w:val="0"/>
-        <w:adjustRightInd w:val="0"/>
-        <w:ind w:firstLine="0"/>
+        <w:t xml:space="preserve">    </w:t>
+      </w:r>
+      <w:proofErr w:type="spellStart"/>
+      <w:r>
         <w:rPr>
           <w:rFonts w:ascii="Cascadia Mono" w:hAnsi="Cascadia Mono" w:cs="Cascadia Mono"/>
           <w:color w:val="000000"/>
@@ -3105,7 +3239,9 @@
           <w:szCs w:val="19"/>
           <w:highlight w:val="white"/>
         </w:rPr>
-      </w:pPr>
+        <w:t>playerStats.health</w:t>
+      </w:r>
+      <w:proofErr w:type="spellEnd"/>
       <w:r>
         <w:rPr>
           <w:rFonts w:ascii="Cascadia Mono" w:hAnsi="Cascadia Mono" w:cs="Cascadia Mono"/>
@@ -3114,8 +3250,46 @@
           <w:szCs w:val="19"/>
           <w:highlight w:val="white"/>
         </w:rPr>
+        <w:t xml:space="preserve"> += </w:t>
+      </w:r>
+      <w:proofErr w:type="gramStart"/>
+      <w:r>
+        <w:rPr>
+          <w:rFonts w:ascii="Cascadia Mono" w:hAnsi="Cascadia Mono" w:cs="Cascadia Mono"/>
+          <w:color w:val="000000"/>
+          <w:sz w:val="19"/>
+          <w:szCs w:val="19"/>
+          <w:highlight w:val="white"/>
+        </w:rPr>
+        <w:t>amount;</w:t>
+      </w:r>
+      <w:proofErr w:type="gramEnd"/>
+    </w:p>
+    <w:p>
+      <w:pPr>
+        <w:autoSpaceDE w:val="0"/>
+        <w:autoSpaceDN w:val="0"/>
+        <w:adjustRightInd w:val="0"/>
+        <w:ind w:firstLine="0"/>
+        <w:rPr>
+          <w:rFonts w:ascii="Cascadia Mono" w:hAnsi="Cascadia Mono" w:cs="Cascadia Mono"/>
+          <w:color w:val="000000"/>
+          <w:sz w:val="19"/>
+          <w:szCs w:val="19"/>
+          <w:highlight w:val="white"/>
+        </w:rPr>
+      </w:pPr>
+      <w:r>
+        <w:rPr>
+          <w:rFonts w:ascii="Cascadia Mono" w:hAnsi="Cascadia Mono" w:cs="Cascadia Mono"/>
+          <w:color w:val="000000"/>
+          <w:sz w:val="19"/>
+          <w:szCs w:val="19"/>
+          <w:highlight w:val="white"/>
+        </w:rPr>
         <w:t xml:space="preserve">    </w:t>
       </w:r>
+      <w:proofErr w:type="spellStart"/>
       <w:r>
         <w:rPr>
           <w:rFonts w:ascii="Cascadia Mono" w:hAnsi="Cascadia Mono" w:cs="Cascadia Mono"/>
@@ -3134,7 +3308,18 @@
           <w:szCs w:val="19"/>
           <w:highlight w:val="white"/>
         </w:rPr>
-        <w:t>.Log(</w:t>
+        <w:t>.Log</w:t>
+      </w:r>
+      <w:proofErr w:type="spellEnd"/>
+      <w:r>
+        <w:rPr>
+          <w:rFonts w:ascii="Cascadia Mono" w:hAnsi="Cascadia Mono" w:cs="Cascadia Mono"/>
+          <w:color w:val="000000"/>
+          <w:sz w:val="19"/>
+          <w:szCs w:val="19"/>
+          <w:highlight w:val="white"/>
+        </w:rPr>
+        <w:t>(</w:t>
       </w:r>
       <w:r>
         <w:rPr>
@@ -3144,7 +3329,29 @@
           <w:szCs w:val="19"/>
           <w:highlight w:val="white"/>
         </w:rPr>
-        <w:t xml:space="preserve">$"Updated health by: </w:t>
+        <w:t xml:space="preserve">$"Updated health </w:t>
+      </w:r>
+      <w:proofErr w:type="gramStart"/>
+      <w:r>
+        <w:rPr>
+          <w:rFonts w:ascii="Cascadia Mono" w:hAnsi="Cascadia Mono" w:cs="Cascadia Mono"/>
+          <w:color w:val="A31515"/>
+          <w:sz w:val="19"/>
+          <w:szCs w:val="19"/>
+          <w:highlight w:val="white"/>
+        </w:rPr>
+        <w:t>by:</w:t>
+      </w:r>
+      <w:proofErr w:type="gramEnd"/>
+      <w:r>
+        <w:rPr>
+          <w:rFonts w:ascii="Cascadia Mono" w:hAnsi="Cascadia Mono" w:cs="Cascadia Mono"/>
+          <w:color w:val="A31515"/>
+          <w:sz w:val="19"/>
+          <w:szCs w:val="19"/>
+          <w:highlight w:val="white"/>
+        </w:rPr>
+        <w:t xml:space="preserve"> </w:t>
       </w:r>
       <w:r>
         <w:rPr>
@@ -3154,7 +3361,18 @@
           <w:szCs w:val="19"/>
           <w:highlight w:val="white"/>
         </w:rPr>
-        <w:t>{amount}</w:t>
+        <w:t>{</w:t>
+      </w:r>
+      <w:proofErr w:type="gramStart"/>
+      <w:r>
+        <w:rPr>
+          <w:rFonts w:ascii="Cascadia Mono" w:hAnsi="Cascadia Mono" w:cs="Cascadia Mono"/>
+          <w:color w:val="000000"/>
+          <w:sz w:val="19"/>
+          <w:szCs w:val="19"/>
+          <w:highlight w:val="white"/>
+        </w:rPr>
+        <w:t>amount}</w:t>
       </w:r>
       <w:r>
         <w:rPr>
@@ -3164,7 +3382,29 @@
           <w:szCs w:val="19"/>
           <w:highlight w:val="white"/>
         </w:rPr>
-        <w:t xml:space="preserve">, Player's current Health: </w:t>
+        <w:t>,</w:t>
+      </w:r>
+      <w:proofErr w:type="gramEnd"/>
+      <w:r>
+        <w:rPr>
+          <w:rFonts w:ascii="Cascadia Mono" w:hAnsi="Cascadia Mono" w:cs="Cascadia Mono"/>
+          <w:color w:val="A31515"/>
+          <w:sz w:val="19"/>
+          <w:szCs w:val="19"/>
+          <w:highlight w:val="white"/>
+        </w:rPr>
+        <w:t xml:space="preserve"> Player's current </w:t>
+      </w:r>
+      <w:proofErr w:type="gramStart"/>
+      <w:r>
+        <w:rPr>
+          <w:rFonts w:ascii="Cascadia Mono" w:hAnsi="Cascadia Mono" w:cs="Cascadia Mono"/>
+          <w:color w:val="A31515"/>
+          <w:sz w:val="19"/>
+          <w:szCs w:val="19"/>
+          <w:highlight w:val="white"/>
+        </w:rPr>
+        <w:t xml:space="preserve">Health: </w:t>
       </w:r>
       <w:r>
         <w:rPr>
@@ -3174,7 +3414,41 @@
           <w:szCs w:val="19"/>
           <w:highlight w:val="white"/>
         </w:rPr>
-        <w:t>{playerStats.health}</w:t>
+        <w:t>{</w:t>
+      </w:r>
+      <w:proofErr w:type="spellStart"/>
+      <w:proofErr w:type="gramEnd"/>
+      <w:r>
+        <w:rPr>
+          <w:rFonts w:ascii="Cascadia Mono" w:hAnsi="Cascadia Mono" w:cs="Cascadia Mono"/>
+          <w:color w:val="000000"/>
+          <w:sz w:val="19"/>
+          <w:szCs w:val="19"/>
+          <w:highlight w:val="white"/>
+        </w:rPr>
+        <w:t>playerStats.</w:t>
+      </w:r>
+      <w:proofErr w:type="gramStart"/>
+      <w:r>
+        <w:rPr>
+          <w:rFonts w:ascii="Cascadia Mono" w:hAnsi="Cascadia Mono" w:cs="Cascadia Mono"/>
+          <w:color w:val="000000"/>
+          <w:sz w:val="19"/>
+          <w:szCs w:val="19"/>
+          <w:highlight w:val="white"/>
+        </w:rPr>
+        <w:t>health</w:t>
+      </w:r>
+      <w:proofErr w:type="spellEnd"/>
+      <w:r>
+        <w:rPr>
+          <w:rFonts w:ascii="Cascadia Mono" w:hAnsi="Cascadia Mono" w:cs="Cascadia Mono"/>
+          <w:color w:val="000000"/>
+          <w:sz w:val="19"/>
+          <w:szCs w:val="19"/>
+          <w:highlight w:val="white"/>
+        </w:rPr>
+        <w:t>}</w:t>
       </w:r>
       <w:r>
         <w:rPr>
@@ -3196,6 +3470,7 @@
         </w:rPr>
         <w:t>);</w:t>
       </w:r>
+      <w:proofErr w:type="gramEnd"/>
     </w:p>
     <w:p>
       <w:pPr>
@@ -3229,6 +3504,7 @@
           <w:bCs/>
         </w:rPr>
       </w:pPr>
+      <w:proofErr w:type="spellStart"/>
       <w:r>
         <w:rPr>
           <w:b/>
@@ -3236,6 +3512,7 @@
         </w:rPr>
         <w:t>GetHit</w:t>
       </w:r>
+      <w:proofErr w:type="spellEnd"/>
       <w:r>
         <w:rPr>
           <w:b/>
@@ -3274,7 +3551,15 @@
         <w:t xml:space="preserve"> </w:t>
       </w:r>
       <w:r>
-        <w:t>getting a hit by enemy or trap.</w:t>
+        <w:t xml:space="preserve">getting </w:t>
+      </w:r>
+      <w:proofErr w:type="gramStart"/>
+      <w:r>
+        <w:t>a hit</w:t>
+      </w:r>
+      <w:proofErr w:type="gramEnd"/>
+      <w:r>
+        <w:t xml:space="preserve"> by enemy or trap.</w:t>
       </w:r>
     </w:p>
     <w:p>
@@ -3299,40 +3584,77 @@
         </w:rPr>
         <w:t xml:space="preserve"> </w:t>
       </w:r>
+      <w:proofErr w:type="spellStart"/>
+      <w:proofErr w:type="gramStart"/>
       <w:r>
         <w:rPr>
           <w:b/>
           <w:bCs/>
         </w:rPr>
-        <w:t>TakeDamage()</w:t>
-      </w:r>
+        <w:t>TakeDamage</w:t>
+      </w:r>
+      <w:proofErr w:type="spellEnd"/>
       <w:r>
         <w:rPr>
           <w:b/>
           <w:bCs/>
         </w:rPr>
-        <w:t xml:space="preserve"> </w:t>
-      </w:r>
-      <w:r>
-        <w:t>method</w:t>
-      </w:r>
+        <w:t>(</w:t>
+      </w:r>
+      <w:proofErr w:type="gramEnd"/>
       <w:r>
         <w:rPr>
           <w:b/>
           <w:bCs/>
         </w:rPr>
-        <w:t xml:space="preserve"> </w:t>
+        <w:t>)</w:t>
       </w:r>
       <w:r>
         <w:rPr>
           <w:b/>
           <w:bCs/>
         </w:rPr>
-        <w:t xml:space="preserve">: </w:t>
-      </w:r>
-      <w:r>
-        <w:t>playerMovementScript.UpdateHealth(-1);</w:t>
-      </w:r>
+        <w:t xml:space="preserve"> </w:t>
+      </w:r>
+      <w:proofErr w:type="gramStart"/>
+      <w:r>
+        <w:t>method</w:t>
+      </w:r>
+      <w:r>
+        <w:rPr>
+          <w:b/>
+          <w:bCs/>
+        </w:rPr>
+        <w:t xml:space="preserve"> </w:t>
+      </w:r>
+      <w:r>
+        <w:rPr>
+          <w:b/>
+          <w:bCs/>
+        </w:rPr>
+        <w:t>:</w:t>
+      </w:r>
+      <w:proofErr w:type="gramEnd"/>
+      <w:r>
+        <w:rPr>
+          <w:b/>
+          <w:bCs/>
+        </w:rPr>
+        <w:t xml:space="preserve"> </w:t>
+      </w:r>
+      <w:proofErr w:type="spellStart"/>
+      <w:r>
+        <w:t>playerMovementScript.UpdateHealth</w:t>
+      </w:r>
+      <w:proofErr w:type="spellEnd"/>
+      <w:r>
+        <w:t>(-1</w:t>
+      </w:r>
+      <w:proofErr w:type="gramStart"/>
+      <w:r>
+        <w:t>);</w:t>
+      </w:r>
+      <w:proofErr w:type="gramEnd"/>
     </w:p>
     <w:p>
       <w:pPr>
@@ -3349,7 +3671,25 @@
         <w:t>Challenge 1: Extra Challenge</w:t>
       </w:r>
       <w:r>
-        <w:t xml:space="preserve"> Examining a Project &amp; Adding a Health System We have all these coins floating around, let's put them to some good use. Design a system that allows you to collect 10 coins to add one health back to the player’s health. The player's health should still be capped at it’s starting base health. Consider how we can integrate this new system into our existing codeset and use the new functionality we created in this session’s challenge</w:t>
+        <w:t xml:space="preserve"> Examining a Project &amp; Adding a Health System We have all these coins floating around, let's put them to some good use. Design a system that allows you to collect 10 coins to add one health back to the player’s health. The player's health should still be capped at </w:t>
+      </w:r>
+      <w:proofErr w:type="spellStart"/>
+      <w:proofErr w:type="gramStart"/>
+      <w:r>
+        <w:t>it’s</w:t>
+      </w:r>
+      <w:proofErr w:type="spellEnd"/>
+      <w:proofErr w:type="gramEnd"/>
+      <w:r>
+        <w:t xml:space="preserve"> starting base health. Consider how we can integrate this new system into our existing </w:t>
+      </w:r>
+      <w:proofErr w:type="spellStart"/>
+      <w:r>
+        <w:t>codeset</w:t>
+      </w:r>
+      <w:proofErr w:type="spellEnd"/>
+      <w:r>
+        <w:t xml:space="preserve"> and use the new functionality we created in this session’s challenge</w:t>
       </w:r>
     </w:p>
     <w:p/>
@@ -3362,12 +3702,21 @@
       <w:r>
         <w:t xml:space="preserve">Update </w:t>
       </w:r>
+      <w:proofErr w:type="spellStart"/>
       <w:r>
         <w:rPr>
           <w:b/>
           <w:bCs/>
         </w:rPr>
-        <w:t xml:space="preserve">CollectCoins </w:t>
+        <w:t>CollectCoins</w:t>
+      </w:r>
+      <w:proofErr w:type="spellEnd"/>
+      <w:r>
+        <w:rPr>
+          <w:b/>
+          <w:bCs/>
+        </w:rPr>
+        <w:t xml:space="preserve"> </w:t>
       </w:r>
       <w:r>
         <w:t xml:space="preserve">script: </w:t>
@@ -3402,6 +3751,7 @@
           <w:highlight w:val="white"/>
         </w:rPr>
       </w:pPr>
+      <w:proofErr w:type="gramStart"/>
       <w:r>
         <w:rPr>
           <w:rFonts w:ascii="Cascadia Mono" w:hAnsi="Cascadia Mono" w:cs="Cascadia Mono"/>
@@ -3422,6 +3772,8 @@
         </w:rPr>
         <w:t>(</w:t>
       </w:r>
+      <w:proofErr w:type="spellStart"/>
+      <w:proofErr w:type="gramEnd"/>
       <w:r>
         <w:rPr>
           <w:rFonts w:ascii="Cascadia Mono" w:hAnsi="Cascadia Mono" w:cs="Cascadia Mono"/>
@@ -3440,15 +3792,10 @@
           <w:szCs w:val="19"/>
           <w:highlight w:val="white"/>
         </w:rPr>
-        <w:t>.score % 100 == 0 &amp;&amp; playerMovementScript.playerStats.health &lt; 100)</w:t>
-      </w:r>
-    </w:p>
-    <w:p>
-      <w:pPr>
-        <w:autoSpaceDE w:val="0"/>
-        <w:autoSpaceDN w:val="0"/>
-        <w:adjustRightInd w:val="0"/>
-        <w:ind w:left="144" w:firstLine="0"/>
+        <w:t>.score</w:t>
+      </w:r>
+      <w:proofErr w:type="spellEnd"/>
+      <w:r>
         <w:rPr>
           <w:rFonts w:ascii="Cascadia Mono" w:hAnsi="Cascadia Mono" w:cs="Cascadia Mono"/>
           <w:color w:val="000000"/>
@@ -3456,7 +3803,10 @@
           <w:szCs w:val="19"/>
           <w:highlight w:val="white"/>
         </w:rPr>
-      </w:pPr>
+        <w:t xml:space="preserve"> % 100 == 0 &amp;&amp; </w:t>
+      </w:r>
+      <w:proofErr w:type="spellStart"/>
+      <w:proofErr w:type="gramStart"/>
       <w:r>
         <w:rPr>
           <w:rFonts w:ascii="Cascadia Mono" w:hAnsi="Cascadia Mono" w:cs="Cascadia Mono"/>
@@ -3465,15 +3815,11 @@
           <w:szCs w:val="19"/>
           <w:highlight w:val="white"/>
         </w:rPr>
-        <w:t xml:space="preserve"> {</w:t>
-      </w:r>
-    </w:p>
-    <w:p>
-      <w:pPr>
-        <w:autoSpaceDE w:val="0"/>
-        <w:autoSpaceDN w:val="0"/>
-        <w:adjustRightInd w:val="0"/>
-        <w:ind w:left="144" w:firstLine="0"/>
+        <w:t>playerMovementScript.playerStats.health</w:t>
+      </w:r>
+      <w:proofErr w:type="spellEnd"/>
+      <w:proofErr w:type="gramEnd"/>
+      <w:r>
         <w:rPr>
           <w:rFonts w:ascii="Cascadia Mono" w:hAnsi="Cascadia Mono" w:cs="Cascadia Mono"/>
           <w:color w:val="000000"/>
@@ -3481,8 +3827,15 @@
           <w:szCs w:val="19"/>
           <w:highlight w:val="white"/>
         </w:rPr>
-      </w:pPr>
-      <w:r>
+        <w:t xml:space="preserve"> &lt; 100)</w:t>
+      </w:r>
+    </w:p>
+    <w:p>
+      <w:pPr>
+        <w:autoSpaceDE w:val="0"/>
+        <w:autoSpaceDN w:val="0"/>
+        <w:adjustRightInd w:val="0"/>
+        <w:ind w:left="144" w:firstLine="0"/>
         <w:rPr>
           <w:rFonts w:ascii="Cascadia Mono" w:hAnsi="Cascadia Mono" w:cs="Cascadia Mono"/>
           <w:color w:val="000000"/>
@@ -3490,12 +3843,6 @@
           <w:szCs w:val="19"/>
           <w:highlight w:val="white"/>
         </w:rPr>
-        <w:t xml:space="preserve">     playerMovementScript.UpdateHealth(1);</w:t>
-      </w:r>
-    </w:p>
-    <w:p>
-      <w:pPr>
-        <w:ind w:left="144" w:firstLine="0"/>
       </w:pPr>
       <w:r>
         <w:rPr>
@@ -3505,6 +3852,80 @@
           <w:szCs w:val="19"/>
           <w:highlight w:val="white"/>
         </w:rPr>
+        <w:t xml:space="preserve"> {</w:t>
+      </w:r>
+    </w:p>
+    <w:p>
+      <w:pPr>
+        <w:autoSpaceDE w:val="0"/>
+        <w:autoSpaceDN w:val="0"/>
+        <w:adjustRightInd w:val="0"/>
+        <w:ind w:left="144" w:firstLine="0"/>
+        <w:rPr>
+          <w:rFonts w:ascii="Cascadia Mono" w:hAnsi="Cascadia Mono" w:cs="Cascadia Mono"/>
+          <w:color w:val="000000"/>
+          <w:sz w:val="19"/>
+          <w:szCs w:val="19"/>
+          <w:highlight w:val="white"/>
+        </w:rPr>
+      </w:pPr>
+      <w:r>
+        <w:rPr>
+          <w:rFonts w:ascii="Cascadia Mono" w:hAnsi="Cascadia Mono" w:cs="Cascadia Mono"/>
+          <w:color w:val="000000"/>
+          <w:sz w:val="19"/>
+          <w:szCs w:val="19"/>
+          <w:highlight w:val="white"/>
+        </w:rPr>
+        <w:t xml:space="preserve">     </w:t>
+      </w:r>
+      <w:proofErr w:type="spellStart"/>
+      <w:r>
+        <w:rPr>
+          <w:rFonts w:ascii="Cascadia Mono" w:hAnsi="Cascadia Mono" w:cs="Cascadia Mono"/>
+          <w:color w:val="000000"/>
+          <w:sz w:val="19"/>
+          <w:szCs w:val="19"/>
+          <w:highlight w:val="white"/>
+        </w:rPr>
+        <w:t>playerMovementScript.UpdateHealth</w:t>
+      </w:r>
+      <w:proofErr w:type="spellEnd"/>
+      <w:r>
+        <w:rPr>
+          <w:rFonts w:ascii="Cascadia Mono" w:hAnsi="Cascadia Mono" w:cs="Cascadia Mono"/>
+          <w:color w:val="000000"/>
+          <w:sz w:val="19"/>
+          <w:szCs w:val="19"/>
+          <w:highlight w:val="white"/>
+        </w:rPr>
+        <w:t>(1</w:t>
+      </w:r>
+      <w:proofErr w:type="gramStart"/>
+      <w:r>
+        <w:rPr>
+          <w:rFonts w:ascii="Cascadia Mono" w:hAnsi="Cascadia Mono" w:cs="Cascadia Mono"/>
+          <w:color w:val="000000"/>
+          <w:sz w:val="19"/>
+          <w:szCs w:val="19"/>
+          <w:highlight w:val="white"/>
+        </w:rPr>
+        <w:t>);</w:t>
+      </w:r>
+      <w:proofErr w:type="gramEnd"/>
+    </w:p>
+    <w:p>
+      <w:pPr>
+        <w:ind w:left="144" w:firstLine="0"/>
+      </w:pPr>
+      <w:r>
+        <w:rPr>
+          <w:rFonts w:ascii="Cascadia Mono" w:hAnsi="Cascadia Mono" w:cs="Cascadia Mono"/>
+          <w:color w:val="000000"/>
+          <w:sz w:val="19"/>
+          <w:szCs w:val="19"/>
+          <w:highlight w:val="white"/>
+        </w:rPr>
         <w:t xml:space="preserve"> }</w:t>
       </w:r>
     </w:p>
@@ -3576,6 +3997,7 @@
       <w:r>
         <w:t xml:space="preserve">Fix </w:t>
       </w:r>
+      <w:proofErr w:type="spellStart"/>
       <w:r>
         <w:rPr>
           <w:b/>
@@ -3585,8 +4007,17 @@
         </w:rPr>
         <w:t>PatrolEnemy</w:t>
       </w:r>
-      <w:r>
-        <w:t xml:space="preserve"> script, uncomment the code and make sure it moves between 3 points A,B and C.</w:t>
+      <w:proofErr w:type="spellEnd"/>
+      <w:r>
+        <w:t xml:space="preserve"> script, uncomment the code and make sure it moves between 3 points </w:t>
+      </w:r>
+      <w:proofErr w:type="gramStart"/>
+      <w:r>
+        <w:t>A,B</w:t>
+      </w:r>
+      <w:proofErr w:type="gramEnd"/>
+      <w:r>
+        <w:t xml:space="preserve"> and C.</w:t>
       </w:r>
     </w:p>
     <w:p>
@@ -3598,7 +4029,23 @@
         </w:numPr>
       </w:pPr>
       <w:r>
-        <w:t>Fix EnemyExploding game object, enable it. It compiles but does not works in play mode.</w:t>
+        <w:t xml:space="preserve">Fix </w:t>
+      </w:r>
+      <w:proofErr w:type="spellStart"/>
+      <w:r>
+        <w:t>EnemyExploding</w:t>
+      </w:r>
+      <w:proofErr w:type="spellEnd"/>
+      <w:r>
+        <w:t xml:space="preserve"> game object, enable it. It compiles but does not </w:t>
+      </w:r>
+      <w:proofErr w:type="gramStart"/>
+      <w:r>
+        <w:t>works</w:t>
+      </w:r>
+      <w:proofErr w:type="gramEnd"/>
+      <w:r>
+        <w:t xml:space="preserve"> in play mode.</w:t>
       </w:r>
     </w:p>
     <w:p/>
@@ -3632,7 +4079,27 @@
           <w:szCs w:val="19"/>
           <w:highlight w:val="white"/>
         </w:rPr>
-        <w:t>private void Update()</w:t>
+        <w:t xml:space="preserve">private void </w:t>
+      </w:r>
+      <w:proofErr w:type="gramStart"/>
+      <w:r>
+        <w:rPr>
+          <w:rFonts w:ascii="Cascadia Mono" w:hAnsi="Cascadia Mono" w:cs="Cascadia Mono"/>
+          <w:sz w:val="19"/>
+          <w:szCs w:val="19"/>
+          <w:highlight w:val="white"/>
+        </w:rPr>
+        <w:t>Update(</w:t>
+      </w:r>
+      <w:proofErr w:type="gramEnd"/>
+      <w:r>
+        <w:rPr>
+          <w:rFonts w:ascii="Cascadia Mono" w:hAnsi="Cascadia Mono" w:cs="Cascadia Mono"/>
+          <w:sz w:val="19"/>
+          <w:szCs w:val="19"/>
+          <w:highlight w:val="white"/>
+        </w:rPr>
+        <w:t>)</w:t>
       </w:r>
     </w:p>
     <w:p>
@@ -3678,7 +4145,27 @@
           <w:szCs w:val="19"/>
           <w:highlight w:val="white"/>
         </w:rPr>
-        <w:t xml:space="preserve">    if (enemyStats.move == true)</w:t>
+        <w:t xml:space="preserve">    if (</w:t>
+      </w:r>
+      <w:proofErr w:type="spellStart"/>
+      <w:r>
+        <w:rPr>
+          <w:rFonts w:ascii="Cascadia Mono" w:hAnsi="Cascadia Mono" w:cs="Cascadia Mono"/>
+          <w:sz w:val="19"/>
+          <w:szCs w:val="19"/>
+          <w:highlight w:val="white"/>
+        </w:rPr>
+        <w:t>enemyStats.move</w:t>
+      </w:r>
+      <w:proofErr w:type="spellEnd"/>
+      <w:r>
+        <w:rPr>
+          <w:rFonts w:ascii="Cascadia Mono" w:hAnsi="Cascadia Mono" w:cs="Cascadia Mono"/>
+          <w:sz w:val="19"/>
+          <w:szCs w:val="19"/>
+          <w:highlight w:val="white"/>
+        </w:rPr>
+        <w:t xml:space="preserve"> == true)</w:t>
       </w:r>
     </w:p>
     <w:p>
@@ -3724,7 +4211,78 @@
           <w:szCs w:val="19"/>
           <w:highlight w:val="white"/>
         </w:rPr>
-        <w:t xml:space="preserve">        Vector3 moveToPoint = patrolPoints[currentPatrolPoint].position;   </w:t>
+        <w:t xml:space="preserve">        Vector3 </w:t>
+      </w:r>
+      <w:proofErr w:type="spellStart"/>
+      <w:r>
+        <w:rPr>
+          <w:rFonts w:ascii="Cascadia Mono" w:hAnsi="Cascadia Mono" w:cs="Cascadia Mono"/>
+          <w:sz w:val="19"/>
+          <w:szCs w:val="19"/>
+          <w:highlight w:val="white"/>
+        </w:rPr>
+        <w:t>moveToPoint</w:t>
+      </w:r>
+      <w:proofErr w:type="spellEnd"/>
+      <w:r>
+        <w:rPr>
+          <w:rFonts w:ascii="Cascadia Mono" w:hAnsi="Cascadia Mono" w:cs="Cascadia Mono"/>
+          <w:sz w:val="19"/>
+          <w:szCs w:val="19"/>
+          <w:highlight w:val="white"/>
+        </w:rPr>
+        <w:t xml:space="preserve"> = </w:t>
+      </w:r>
+      <w:proofErr w:type="spellStart"/>
+      <w:r>
+        <w:rPr>
+          <w:rFonts w:ascii="Cascadia Mono" w:hAnsi="Cascadia Mono" w:cs="Cascadia Mono"/>
+          <w:sz w:val="19"/>
+          <w:szCs w:val="19"/>
+          <w:highlight w:val="white"/>
+        </w:rPr>
+        <w:t>patrolPoints</w:t>
+      </w:r>
+      <w:proofErr w:type="spellEnd"/>
+      <w:r>
+        <w:rPr>
+          <w:rFonts w:ascii="Cascadia Mono" w:hAnsi="Cascadia Mono" w:cs="Cascadia Mono"/>
+          <w:sz w:val="19"/>
+          <w:szCs w:val="19"/>
+          <w:highlight w:val="white"/>
+        </w:rPr>
+        <w:t>[</w:t>
+      </w:r>
+      <w:proofErr w:type="spellStart"/>
+      <w:r>
+        <w:rPr>
+          <w:rFonts w:ascii="Cascadia Mono" w:hAnsi="Cascadia Mono" w:cs="Cascadia Mono"/>
+          <w:sz w:val="19"/>
+          <w:szCs w:val="19"/>
+          <w:highlight w:val="white"/>
+        </w:rPr>
+        <w:t>currentPatrolPoint</w:t>
+      </w:r>
+      <w:proofErr w:type="spellEnd"/>
+      <w:proofErr w:type="gramStart"/>
+      <w:r>
+        <w:rPr>
+          <w:rFonts w:ascii="Cascadia Mono" w:hAnsi="Cascadia Mono" w:cs="Cascadia Mono"/>
+          <w:sz w:val="19"/>
+          <w:szCs w:val="19"/>
+          <w:highlight w:val="white"/>
+        </w:rPr>
+        <w:t>].position</w:t>
+      </w:r>
+      <w:proofErr w:type="gramEnd"/>
+      <w:r>
+        <w:rPr>
+          <w:rFonts w:ascii="Cascadia Mono" w:hAnsi="Cascadia Mono" w:cs="Cascadia Mono"/>
+          <w:sz w:val="19"/>
+          <w:szCs w:val="19"/>
+          <w:highlight w:val="white"/>
+        </w:rPr>
+        <w:t xml:space="preserve">;   </w:t>
       </w:r>
     </w:p>
     <w:p>
@@ -3747,8 +4305,114 @@
           <w:szCs w:val="19"/>
           <w:highlight w:val="white"/>
         </w:rPr>
-        <w:t xml:space="preserve">        transform.position = Vector3.MoveTowards(transform.position, moveToPoint, enemyStats.speed * Time.deltaTime);</w:t>
-      </w:r>
+        <w:t xml:space="preserve">        </w:t>
+      </w:r>
+      <w:proofErr w:type="spellStart"/>
+      <w:proofErr w:type="gramStart"/>
+      <w:r>
+        <w:rPr>
+          <w:rFonts w:ascii="Cascadia Mono" w:hAnsi="Cascadia Mono" w:cs="Cascadia Mono"/>
+          <w:sz w:val="19"/>
+          <w:szCs w:val="19"/>
+          <w:highlight w:val="white"/>
+        </w:rPr>
+        <w:t>transform.position</w:t>
+      </w:r>
+      <w:proofErr w:type="spellEnd"/>
+      <w:proofErr w:type="gramEnd"/>
+      <w:r>
+        <w:rPr>
+          <w:rFonts w:ascii="Cascadia Mono" w:hAnsi="Cascadia Mono" w:cs="Cascadia Mono"/>
+          <w:sz w:val="19"/>
+          <w:szCs w:val="19"/>
+          <w:highlight w:val="white"/>
+        </w:rPr>
+        <w:t xml:space="preserve"> = Vector3.MoveTowards(</w:t>
+      </w:r>
+      <w:proofErr w:type="spellStart"/>
+      <w:proofErr w:type="gramStart"/>
+      <w:r>
+        <w:rPr>
+          <w:rFonts w:ascii="Cascadia Mono" w:hAnsi="Cascadia Mono" w:cs="Cascadia Mono"/>
+          <w:sz w:val="19"/>
+          <w:szCs w:val="19"/>
+          <w:highlight w:val="white"/>
+        </w:rPr>
+        <w:t>transform.position</w:t>
+      </w:r>
+      <w:proofErr w:type="spellEnd"/>
+      <w:proofErr w:type="gramEnd"/>
+      <w:r>
+        <w:rPr>
+          <w:rFonts w:ascii="Cascadia Mono" w:hAnsi="Cascadia Mono" w:cs="Cascadia Mono"/>
+          <w:sz w:val="19"/>
+          <w:szCs w:val="19"/>
+          <w:highlight w:val="white"/>
+        </w:rPr>
+        <w:t xml:space="preserve">, </w:t>
+      </w:r>
+      <w:proofErr w:type="spellStart"/>
+      <w:r>
+        <w:rPr>
+          <w:rFonts w:ascii="Cascadia Mono" w:hAnsi="Cascadia Mono" w:cs="Cascadia Mono"/>
+          <w:sz w:val="19"/>
+          <w:szCs w:val="19"/>
+          <w:highlight w:val="white"/>
+        </w:rPr>
+        <w:t>moveToPoint</w:t>
+      </w:r>
+      <w:proofErr w:type="spellEnd"/>
+      <w:r>
+        <w:rPr>
+          <w:rFonts w:ascii="Cascadia Mono" w:hAnsi="Cascadia Mono" w:cs="Cascadia Mono"/>
+          <w:sz w:val="19"/>
+          <w:szCs w:val="19"/>
+          <w:highlight w:val="white"/>
+        </w:rPr>
+        <w:t xml:space="preserve">, </w:t>
+      </w:r>
+      <w:proofErr w:type="spellStart"/>
+      <w:r>
+        <w:rPr>
+          <w:rFonts w:ascii="Cascadia Mono" w:hAnsi="Cascadia Mono" w:cs="Cascadia Mono"/>
+          <w:sz w:val="19"/>
+          <w:szCs w:val="19"/>
+          <w:highlight w:val="white"/>
+        </w:rPr>
+        <w:t>enemyStats.speed</w:t>
+      </w:r>
+      <w:proofErr w:type="spellEnd"/>
+      <w:r>
+        <w:rPr>
+          <w:rFonts w:ascii="Cascadia Mono" w:hAnsi="Cascadia Mono" w:cs="Cascadia Mono"/>
+          <w:sz w:val="19"/>
+          <w:szCs w:val="19"/>
+          <w:highlight w:val="white"/>
+        </w:rPr>
+        <w:t xml:space="preserve"> * </w:t>
+      </w:r>
+      <w:proofErr w:type="spellStart"/>
+      <w:r>
+        <w:rPr>
+          <w:rFonts w:ascii="Cascadia Mono" w:hAnsi="Cascadia Mono" w:cs="Cascadia Mono"/>
+          <w:sz w:val="19"/>
+          <w:szCs w:val="19"/>
+          <w:highlight w:val="white"/>
+        </w:rPr>
+        <w:t>Time.deltaTime</w:t>
+      </w:r>
+      <w:proofErr w:type="spellEnd"/>
+      <w:proofErr w:type="gramStart"/>
+      <w:r>
+        <w:rPr>
+          <w:rFonts w:ascii="Cascadia Mono" w:hAnsi="Cascadia Mono" w:cs="Cascadia Mono"/>
+          <w:sz w:val="19"/>
+          <w:szCs w:val="19"/>
+          <w:highlight w:val="white"/>
+        </w:rPr>
+        <w:t>);</w:t>
+      </w:r>
+      <w:proofErr w:type="gramEnd"/>
     </w:p>
     <w:p>
       <w:pPr>
@@ -3784,7 +4448,49 @@
           <w:szCs w:val="19"/>
           <w:highlight w:val="white"/>
         </w:rPr>
-        <w:t xml:space="preserve">        if (Vector3.Distance(transform.position, moveToPoint) &lt; 0.01f)</w:t>
+        <w:t xml:space="preserve">        if (Vector3.Distance(</w:t>
+      </w:r>
+      <w:proofErr w:type="spellStart"/>
+      <w:proofErr w:type="gramStart"/>
+      <w:r>
+        <w:rPr>
+          <w:rFonts w:ascii="Cascadia Mono" w:hAnsi="Cascadia Mono" w:cs="Cascadia Mono"/>
+          <w:sz w:val="19"/>
+          <w:szCs w:val="19"/>
+          <w:highlight w:val="white"/>
+        </w:rPr>
+        <w:t>transform.position</w:t>
+      </w:r>
+      <w:proofErr w:type="spellEnd"/>
+      <w:proofErr w:type="gramEnd"/>
+      <w:r>
+        <w:rPr>
+          <w:rFonts w:ascii="Cascadia Mono" w:hAnsi="Cascadia Mono" w:cs="Cascadia Mono"/>
+          <w:sz w:val="19"/>
+          <w:szCs w:val="19"/>
+          <w:highlight w:val="white"/>
+        </w:rPr>
+        <w:t xml:space="preserve">, </w:t>
+      </w:r>
+      <w:proofErr w:type="spellStart"/>
+      <w:r>
+        <w:rPr>
+          <w:rFonts w:ascii="Cascadia Mono" w:hAnsi="Cascadia Mono" w:cs="Cascadia Mono"/>
+          <w:sz w:val="19"/>
+          <w:szCs w:val="19"/>
+          <w:highlight w:val="white"/>
+        </w:rPr>
+        <w:t>moveToPoint</w:t>
+      </w:r>
+      <w:proofErr w:type="spellEnd"/>
+      <w:r>
+        <w:rPr>
+          <w:rFonts w:ascii="Cascadia Mono" w:hAnsi="Cascadia Mono" w:cs="Cascadia Mono"/>
+          <w:sz w:val="19"/>
+          <w:szCs w:val="19"/>
+          <w:highlight w:val="white"/>
+        </w:rPr>
+        <w:t>) &lt; 0.01f)</w:t>
       </w:r>
     </w:p>
     <w:p>
@@ -3830,8 +4536,39 @@
           <w:szCs w:val="19"/>
           <w:highlight w:val="white"/>
         </w:rPr>
-        <w:t xml:space="preserve">            currentPatrolPoint++;</w:t>
-      </w:r>
+        <w:t xml:space="preserve">            </w:t>
+      </w:r>
+      <w:proofErr w:type="spellStart"/>
+      <w:r>
+        <w:rPr>
+          <w:rFonts w:ascii="Cascadia Mono" w:hAnsi="Cascadia Mono" w:cs="Cascadia Mono"/>
+          <w:sz w:val="19"/>
+          <w:szCs w:val="19"/>
+          <w:highlight w:val="white"/>
+        </w:rPr>
+        <w:t>currentPatrolPoint</w:t>
+      </w:r>
+      <w:proofErr w:type="spellEnd"/>
+      <w:r>
+        <w:rPr>
+          <w:rFonts w:ascii="Cascadia Mono" w:hAnsi="Cascadia Mono" w:cs="Cascadia Mono"/>
+          <w:sz w:val="19"/>
+          <w:szCs w:val="19"/>
+          <w:highlight w:val="white"/>
+        </w:rPr>
+        <w:t>+</w:t>
+      </w:r>
+      <w:proofErr w:type="gramStart"/>
+      <w:r>
+        <w:rPr>
+          <w:rFonts w:ascii="Cascadia Mono" w:hAnsi="Cascadia Mono" w:cs="Cascadia Mono"/>
+          <w:sz w:val="19"/>
+          <w:szCs w:val="19"/>
+          <w:highlight w:val="white"/>
+        </w:rPr>
+        <w:t>+;</w:t>
+      </w:r>
+      <w:proofErr w:type="gramEnd"/>
     </w:p>
     <w:p>
       <w:pPr>
@@ -3867,7 +4604,47 @@
           <w:szCs w:val="19"/>
           <w:highlight w:val="white"/>
         </w:rPr>
-        <w:t xml:space="preserve">            if (currentPatrolPoint &gt;= patrolPoints.Length)  </w:t>
+        <w:t xml:space="preserve">            if (</w:t>
+      </w:r>
+      <w:proofErr w:type="spellStart"/>
+      <w:r>
+        <w:rPr>
+          <w:rFonts w:ascii="Cascadia Mono" w:hAnsi="Cascadia Mono" w:cs="Cascadia Mono"/>
+          <w:sz w:val="19"/>
+          <w:szCs w:val="19"/>
+          <w:highlight w:val="white"/>
+        </w:rPr>
+        <w:t>currentPatrolPoint</w:t>
+      </w:r>
+      <w:proofErr w:type="spellEnd"/>
+      <w:r>
+        <w:rPr>
+          <w:rFonts w:ascii="Cascadia Mono" w:hAnsi="Cascadia Mono" w:cs="Cascadia Mono"/>
+          <w:sz w:val="19"/>
+          <w:szCs w:val="19"/>
+          <w:highlight w:val="white"/>
+        </w:rPr>
+        <w:t xml:space="preserve"> &gt;= </w:t>
+      </w:r>
+      <w:proofErr w:type="spellStart"/>
+      <w:r>
+        <w:rPr>
+          <w:rFonts w:ascii="Cascadia Mono" w:hAnsi="Cascadia Mono" w:cs="Cascadia Mono"/>
+          <w:sz w:val="19"/>
+          <w:szCs w:val="19"/>
+          <w:highlight w:val="white"/>
+        </w:rPr>
+        <w:t>patrolPoints.Length</w:t>
+      </w:r>
+      <w:proofErr w:type="spellEnd"/>
+      <w:r>
+        <w:rPr>
+          <w:rFonts w:ascii="Cascadia Mono" w:hAnsi="Cascadia Mono" w:cs="Cascadia Mono"/>
+          <w:sz w:val="19"/>
+          <w:szCs w:val="19"/>
+          <w:highlight w:val="white"/>
+        </w:rPr>
+        <w:t xml:space="preserve">)  </w:t>
       </w:r>
     </w:p>
     <w:p>
@@ -3913,8 +4690,39 @@
           <w:szCs w:val="19"/>
           <w:highlight w:val="white"/>
         </w:rPr>
-        <w:t xml:space="preserve">                currentPatrolPoint = 0;</w:t>
-      </w:r>
+        <w:t xml:space="preserve">                </w:t>
+      </w:r>
+      <w:proofErr w:type="spellStart"/>
+      <w:r>
+        <w:rPr>
+          <w:rFonts w:ascii="Cascadia Mono" w:hAnsi="Cascadia Mono" w:cs="Cascadia Mono"/>
+          <w:sz w:val="19"/>
+          <w:szCs w:val="19"/>
+          <w:highlight w:val="white"/>
+        </w:rPr>
+        <w:t>currentPatrolPoint</w:t>
+      </w:r>
+      <w:proofErr w:type="spellEnd"/>
+      <w:r>
+        <w:rPr>
+          <w:rFonts w:ascii="Cascadia Mono" w:hAnsi="Cascadia Mono" w:cs="Cascadia Mono"/>
+          <w:sz w:val="19"/>
+          <w:szCs w:val="19"/>
+          <w:highlight w:val="white"/>
+        </w:rPr>
+        <w:t xml:space="preserve"> = </w:t>
+      </w:r>
+      <w:proofErr w:type="gramStart"/>
+      <w:r>
+        <w:rPr>
+          <w:rFonts w:ascii="Cascadia Mono" w:hAnsi="Cascadia Mono" w:cs="Cascadia Mono"/>
+          <w:sz w:val="19"/>
+          <w:szCs w:val="19"/>
+          <w:highlight w:val="white"/>
+        </w:rPr>
+        <w:t>0;</w:t>
+      </w:r>
+      <w:proofErr w:type="gramEnd"/>
     </w:p>
     <w:p>
       <w:pPr>
@@ -4040,8 +4848,13 @@
         <w:adjustRightInd w:val="0"/>
       </w:pPr>
       <w:r>
-        <w:t>Update ExplodeEnemy.cs</w:t>
-      </w:r>
+        <w:t xml:space="preserve">Update </w:t>
+      </w:r>
+      <w:proofErr w:type="spellStart"/>
+      <w:r>
+        <w:t>ExplodeEnemy.cs</w:t>
+      </w:r>
+      <w:proofErr w:type="spellEnd"/>
     </w:p>
     <w:p>
       <w:pPr>
@@ -4078,7 +4891,25 @@
           <w:sz w:val="19"/>
           <w:szCs w:val="19"/>
         </w:rPr>
-        <w:t>private void Update()</w:t>
+        <w:t xml:space="preserve">private void </w:t>
+      </w:r>
+      <w:proofErr w:type="gramStart"/>
+      <w:r>
+        <w:rPr>
+          <w:rFonts w:ascii="Cascadia Mono" w:hAnsi="Cascadia Mono" w:cs="Cascadia Mono"/>
+          <w:sz w:val="19"/>
+          <w:szCs w:val="19"/>
+        </w:rPr>
+        <w:t>Update(</w:t>
+      </w:r>
+      <w:proofErr w:type="gramEnd"/>
+      <w:r>
+        <w:rPr>
+          <w:rFonts w:ascii="Cascadia Mono" w:hAnsi="Cascadia Mono" w:cs="Cascadia Mono"/>
+          <w:sz w:val="19"/>
+          <w:szCs w:val="19"/>
+        </w:rPr>
+        <w:t>)</w:t>
       </w:r>
     </w:p>
     <w:p>
@@ -4120,8 +4951,110 @@
           <w:sz w:val="19"/>
           <w:szCs w:val="19"/>
         </w:rPr>
-        <w:t xml:space="preserve">     Debug.Log($"Player distance :{Vector3.Distance(transform.position, playerTransform.position)}");</w:t>
-      </w:r>
+        <w:t xml:space="preserve">     </w:t>
+      </w:r>
+      <w:proofErr w:type="spellStart"/>
+      <w:r>
+        <w:rPr>
+          <w:rFonts w:ascii="Cascadia Mono" w:hAnsi="Cascadia Mono" w:cs="Cascadia Mono"/>
+          <w:sz w:val="19"/>
+          <w:szCs w:val="19"/>
+        </w:rPr>
+        <w:t>Debug.Log</w:t>
+      </w:r>
+      <w:proofErr w:type="spellEnd"/>
+      <w:r>
+        <w:rPr>
+          <w:rFonts w:ascii="Cascadia Mono" w:hAnsi="Cascadia Mono" w:cs="Cascadia Mono"/>
+          <w:sz w:val="19"/>
+          <w:szCs w:val="19"/>
+        </w:rPr>
+        <w:t xml:space="preserve">($"Player </w:t>
+      </w:r>
+      <w:proofErr w:type="gramStart"/>
+      <w:r>
+        <w:rPr>
+          <w:rFonts w:ascii="Cascadia Mono" w:hAnsi="Cascadia Mono" w:cs="Cascadia Mono"/>
+          <w:sz w:val="19"/>
+          <w:szCs w:val="19"/>
+        </w:rPr>
+        <w:t>distance :</w:t>
+      </w:r>
+      <w:proofErr w:type="gramEnd"/>
+      <w:r>
+        <w:rPr>
+          <w:rFonts w:ascii="Cascadia Mono" w:hAnsi="Cascadia Mono" w:cs="Cascadia Mono"/>
+          <w:sz w:val="19"/>
+          <w:szCs w:val="19"/>
+        </w:rPr>
+        <w:t>{Vector3.Distance(</w:t>
+      </w:r>
+      <w:proofErr w:type="spellStart"/>
+      <w:proofErr w:type="gramStart"/>
+      <w:r>
+        <w:rPr>
+          <w:rFonts w:ascii="Cascadia Mono" w:hAnsi="Cascadia Mono" w:cs="Cascadia Mono"/>
+          <w:sz w:val="19"/>
+          <w:szCs w:val="19"/>
+        </w:rPr>
+        <w:t>transform.position</w:t>
+      </w:r>
+      <w:proofErr w:type="spellEnd"/>
+      <w:proofErr w:type="gramEnd"/>
+      <w:r>
+        <w:rPr>
+          <w:rFonts w:ascii="Cascadia Mono" w:hAnsi="Cascadia Mono" w:cs="Cascadia Mono"/>
+          <w:sz w:val="19"/>
+          <w:szCs w:val="19"/>
+        </w:rPr>
+        <w:t xml:space="preserve">, </w:t>
+      </w:r>
+      <w:proofErr w:type="spellStart"/>
+      <w:r>
+        <w:rPr>
+          <w:rFonts w:ascii="Cascadia Mono" w:hAnsi="Cascadia Mono" w:cs="Cascadia Mono"/>
+          <w:sz w:val="19"/>
+          <w:szCs w:val="19"/>
+        </w:rPr>
+        <w:t>playerTransform.</w:t>
+      </w:r>
+      <w:proofErr w:type="gramStart"/>
+      <w:r>
+        <w:rPr>
+          <w:rFonts w:ascii="Cascadia Mono" w:hAnsi="Cascadia Mono" w:cs="Cascadia Mono"/>
+          <w:sz w:val="19"/>
+          <w:szCs w:val="19"/>
+        </w:rPr>
+        <w:t>position</w:t>
+      </w:r>
+      <w:proofErr w:type="spellEnd"/>
+      <w:r>
+        <w:rPr>
+          <w:rFonts w:ascii="Cascadia Mono" w:hAnsi="Cascadia Mono" w:cs="Cascadia Mono"/>
+          <w:sz w:val="19"/>
+          <w:szCs w:val="19"/>
+        </w:rPr>
+        <w:t>)}</w:t>
+      </w:r>
+      <w:proofErr w:type="gramEnd"/>
+      <w:r>
+        <w:rPr>
+          <w:rFonts w:ascii="Cascadia Mono" w:hAnsi="Cascadia Mono" w:cs="Cascadia Mono"/>
+          <w:sz w:val="19"/>
+          <w:szCs w:val="19"/>
+        </w:rPr>
+        <w:t>"</w:t>
+      </w:r>
+      <w:proofErr w:type="gramStart"/>
+      <w:r>
+        <w:rPr>
+          <w:rFonts w:ascii="Cascadia Mono" w:hAnsi="Cascadia Mono" w:cs="Cascadia Mono"/>
+          <w:sz w:val="19"/>
+          <w:szCs w:val="19"/>
+        </w:rPr>
+        <w:t>);</w:t>
+      </w:r>
+      <w:proofErr w:type="gramEnd"/>
     </w:p>
     <w:p>
       <w:pPr>
@@ -4175,7 +5108,63 @@
           <w:sz w:val="19"/>
           <w:szCs w:val="19"/>
         </w:rPr>
-        <w:t xml:space="preserve">     if (Vector3.Distance(transform.position, playerTransform.position) &lt; enemyStats.explodeDist)</w:t>
+        <w:t xml:space="preserve">     if (Vector3.Distance(</w:t>
+      </w:r>
+      <w:proofErr w:type="spellStart"/>
+      <w:proofErr w:type="gramStart"/>
+      <w:r>
+        <w:rPr>
+          <w:rFonts w:ascii="Cascadia Mono" w:hAnsi="Cascadia Mono" w:cs="Cascadia Mono"/>
+          <w:sz w:val="19"/>
+          <w:szCs w:val="19"/>
+        </w:rPr>
+        <w:t>transform.position</w:t>
+      </w:r>
+      <w:proofErr w:type="spellEnd"/>
+      <w:proofErr w:type="gramEnd"/>
+      <w:r>
+        <w:rPr>
+          <w:rFonts w:ascii="Cascadia Mono" w:hAnsi="Cascadia Mono" w:cs="Cascadia Mono"/>
+          <w:sz w:val="19"/>
+          <w:szCs w:val="19"/>
+        </w:rPr>
+        <w:t xml:space="preserve">, </w:t>
+      </w:r>
+      <w:proofErr w:type="spellStart"/>
+      <w:r>
+        <w:rPr>
+          <w:rFonts w:ascii="Cascadia Mono" w:hAnsi="Cascadia Mono" w:cs="Cascadia Mono"/>
+          <w:sz w:val="19"/>
+          <w:szCs w:val="19"/>
+        </w:rPr>
+        <w:t>playerTransform.position</w:t>
+      </w:r>
+      <w:proofErr w:type="spellEnd"/>
+      <w:r>
+        <w:rPr>
+          <w:rFonts w:ascii="Cascadia Mono" w:hAnsi="Cascadia Mono" w:cs="Cascadia Mono"/>
+          <w:sz w:val="19"/>
+          <w:szCs w:val="19"/>
+        </w:rPr>
+        <w:t xml:space="preserve">) &lt; </w:t>
+      </w:r>
+      <w:proofErr w:type="spellStart"/>
+      <w:r>
+        <w:rPr>
+          <w:rFonts w:ascii="Cascadia Mono" w:hAnsi="Cascadia Mono" w:cs="Cascadia Mono"/>
+          <w:sz w:val="19"/>
+          <w:szCs w:val="19"/>
+        </w:rPr>
+        <w:t>enemyStats.explodeDist</w:t>
+      </w:r>
+      <w:proofErr w:type="spellEnd"/>
+      <w:r>
+        <w:rPr>
+          <w:rFonts w:ascii="Cascadia Mono" w:hAnsi="Cascadia Mono" w:cs="Cascadia Mono"/>
+          <w:sz w:val="19"/>
+          <w:szCs w:val="19"/>
+        </w:rPr>
+        <w:t>)</w:t>
       </w:r>
     </w:p>
     <w:p>
@@ -4238,8 +5227,36 @@
           <w:sz w:val="19"/>
           <w:szCs w:val="19"/>
         </w:rPr>
-        <w:t xml:space="preserve">         StartCoroutine("Explode");</w:t>
-      </w:r>
+        <w:t xml:space="preserve">         </w:t>
+      </w:r>
+      <w:proofErr w:type="spellStart"/>
+      <w:r>
+        <w:rPr>
+          <w:rFonts w:ascii="Cascadia Mono" w:hAnsi="Cascadia Mono" w:cs="Cascadia Mono"/>
+          <w:sz w:val="19"/>
+          <w:szCs w:val="19"/>
+        </w:rPr>
+        <w:t>StartCoroutine</w:t>
+      </w:r>
+      <w:proofErr w:type="spellEnd"/>
+      <w:r>
+        <w:rPr>
+          <w:rFonts w:ascii="Cascadia Mono" w:hAnsi="Cascadia Mono" w:cs="Cascadia Mono"/>
+          <w:sz w:val="19"/>
+          <w:szCs w:val="19"/>
+        </w:rPr>
+        <w:t>("Explode"</w:t>
+      </w:r>
+      <w:proofErr w:type="gramStart"/>
+      <w:r>
+        <w:rPr>
+          <w:rFonts w:ascii="Cascadia Mono" w:hAnsi="Cascadia Mono" w:cs="Cascadia Mono"/>
+          <w:sz w:val="19"/>
+          <w:szCs w:val="19"/>
+        </w:rPr>
+        <w:t>);</w:t>
+      </w:r>
+      <w:proofErr w:type="gramEnd"/>
     </w:p>
     <w:p>
       <w:pPr>
@@ -4342,7 +5359,43 @@
           <w:sz w:val="19"/>
           <w:szCs w:val="19"/>
         </w:rPr>
-        <w:t>private IEnumerator Explode()</w:t>
+        <w:t xml:space="preserve">private </w:t>
+      </w:r>
+      <w:proofErr w:type="spellStart"/>
+      <w:r>
+        <w:rPr>
+          <w:rFonts w:ascii="Cascadia Mono" w:hAnsi="Cascadia Mono" w:cs="Cascadia Mono"/>
+          <w:sz w:val="19"/>
+          <w:szCs w:val="19"/>
+        </w:rPr>
+        <w:t>IEnumerator</w:t>
+      </w:r>
+      <w:proofErr w:type="spellEnd"/>
+      <w:r>
+        <w:rPr>
+          <w:rFonts w:ascii="Cascadia Mono" w:hAnsi="Cascadia Mono" w:cs="Cascadia Mono"/>
+          <w:sz w:val="19"/>
+          <w:szCs w:val="19"/>
+        </w:rPr>
+        <w:t xml:space="preserve"> </w:t>
+      </w:r>
+      <w:proofErr w:type="gramStart"/>
+      <w:r>
+        <w:rPr>
+          <w:rFonts w:ascii="Cascadia Mono" w:hAnsi="Cascadia Mono" w:cs="Cascadia Mono"/>
+          <w:sz w:val="19"/>
+          <w:szCs w:val="19"/>
+        </w:rPr>
+        <w:t>Explode(</w:t>
+      </w:r>
+      <w:proofErr w:type="gramEnd"/>
+      <w:r>
+        <w:rPr>
+          <w:rFonts w:ascii="Cascadia Mono" w:hAnsi="Cascadia Mono" w:cs="Cascadia Mono"/>
+          <w:sz w:val="19"/>
+          <w:szCs w:val="19"/>
+        </w:rPr>
+        <w:t>)</w:t>
       </w:r>
     </w:p>
     <w:p>
@@ -4384,8 +5437,46 @@
           <w:sz w:val="19"/>
           <w:szCs w:val="19"/>
         </w:rPr>
-        <w:t xml:space="preserve">     yield return new WaitForSeconds(0.2f);</w:t>
-      </w:r>
+        <w:t xml:space="preserve">     yield return new </w:t>
+      </w:r>
+      <w:proofErr w:type="spellStart"/>
+      <w:proofErr w:type="gramStart"/>
+      <w:r>
+        <w:rPr>
+          <w:rFonts w:ascii="Cascadia Mono" w:hAnsi="Cascadia Mono" w:cs="Cascadia Mono"/>
+          <w:sz w:val="19"/>
+          <w:szCs w:val="19"/>
+        </w:rPr>
+        <w:t>WaitForSeconds</w:t>
+      </w:r>
+      <w:proofErr w:type="spellEnd"/>
+      <w:r>
+        <w:rPr>
+          <w:rFonts w:ascii="Cascadia Mono" w:hAnsi="Cascadia Mono" w:cs="Cascadia Mono"/>
+          <w:sz w:val="19"/>
+          <w:szCs w:val="19"/>
+        </w:rPr>
+        <w:t>(</w:t>
+      </w:r>
+      <w:proofErr w:type="gramEnd"/>
+      <w:r>
+        <w:rPr>
+          <w:rFonts w:ascii="Cascadia Mono" w:hAnsi="Cascadia Mono" w:cs="Cascadia Mono"/>
+          <w:sz w:val="19"/>
+          <w:szCs w:val="19"/>
+        </w:rPr>
+        <w:t>0.2f</w:t>
+      </w:r>
+      <w:proofErr w:type="gramStart"/>
+      <w:r>
+        <w:rPr>
+          <w:rFonts w:ascii="Cascadia Mono" w:hAnsi="Cascadia Mono" w:cs="Cascadia Mono"/>
+          <w:sz w:val="19"/>
+          <w:szCs w:val="19"/>
+        </w:rPr>
+        <w:t>);</w:t>
+      </w:r>
+      <w:proofErr w:type="gramEnd"/>
     </w:p>
     <w:p>
       <w:pPr>
@@ -4418,8 +5509,76 @@
           <w:sz w:val="19"/>
           <w:szCs w:val="19"/>
         </w:rPr>
-        <w:t xml:space="preserve">     Instantiate(enemyExplosionParticles, transform.position, Quaternion.identity);</w:t>
-      </w:r>
+        <w:t xml:space="preserve">     </w:t>
+      </w:r>
+      <w:proofErr w:type="gramStart"/>
+      <w:r>
+        <w:rPr>
+          <w:rFonts w:ascii="Cascadia Mono" w:hAnsi="Cascadia Mono" w:cs="Cascadia Mono"/>
+          <w:sz w:val="19"/>
+          <w:szCs w:val="19"/>
+        </w:rPr>
+        <w:t>Instantiate(</w:t>
+      </w:r>
+      <w:proofErr w:type="spellStart"/>
+      <w:proofErr w:type="gramEnd"/>
+      <w:r>
+        <w:rPr>
+          <w:rFonts w:ascii="Cascadia Mono" w:hAnsi="Cascadia Mono" w:cs="Cascadia Mono"/>
+          <w:sz w:val="19"/>
+          <w:szCs w:val="19"/>
+        </w:rPr>
+        <w:t>enemyExplosionParticles</w:t>
+      </w:r>
+      <w:proofErr w:type="spellEnd"/>
+      <w:r>
+        <w:rPr>
+          <w:rFonts w:ascii="Cascadia Mono" w:hAnsi="Cascadia Mono" w:cs="Cascadia Mono"/>
+          <w:sz w:val="19"/>
+          <w:szCs w:val="19"/>
+        </w:rPr>
+        <w:t xml:space="preserve">, </w:t>
+      </w:r>
+      <w:proofErr w:type="spellStart"/>
+      <w:proofErr w:type="gramStart"/>
+      <w:r>
+        <w:rPr>
+          <w:rFonts w:ascii="Cascadia Mono" w:hAnsi="Cascadia Mono" w:cs="Cascadia Mono"/>
+          <w:sz w:val="19"/>
+          <w:szCs w:val="19"/>
+        </w:rPr>
+        <w:t>transform.position</w:t>
+      </w:r>
+      <w:proofErr w:type="spellEnd"/>
+      <w:proofErr w:type="gramEnd"/>
+      <w:r>
+        <w:rPr>
+          <w:rFonts w:ascii="Cascadia Mono" w:hAnsi="Cascadia Mono" w:cs="Cascadia Mono"/>
+          <w:sz w:val="19"/>
+          <w:szCs w:val="19"/>
+        </w:rPr>
+        <w:t xml:space="preserve">, </w:t>
+      </w:r>
+      <w:proofErr w:type="spellStart"/>
+      <w:r>
+        <w:rPr>
+          <w:rFonts w:ascii="Cascadia Mono" w:hAnsi="Cascadia Mono" w:cs="Cascadia Mono"/>
+          <w:sz w:val="19"/>
+          <w:szCs w:val="19"/>
+        </w:rPr>
+        <w:t>Quaternion.identity</w:t>
+      </w:r>
+      <w:proofErr w:type="spellEnd"/>
+      <w:proofErr w:type="gramStart"/>
+      <w:r>
+        <w:rPr>
+          <w:rFonts w:ascii="Cascadia Mono" w:hAnsi="Cascadia Mono" w:cs="Cascadia Mono"/>
+          <w:sz w:val="19"/>
+          <w:szCs w:val="19"/>
+        </w:rPr>
+        <w:t>);</w:t>
+      </w:r>
+      <w:proofErr w:type="gramEnd"/>
     </w:p>
     <w:p>
       <w:pPr>
@@ -4452,8 +5611,38 @@
           <w:sz w:val="19"/>
           <w:szCs w:val="19"/>
         </w:rPr>
-        <w:t xml:space="preserve">     Destroy(transform.parent.gameObject);</w:t>
-      </w:r>
+        <w:t xml:space="preserve">     Destroy(</w:t>
+      </w:r>
+      <w:proofErr w:type="spellStart"/>
+      <w:proofErr w:type="gramStart"/>
+      <w:r>
+        <w:rPr>
+          <w:rFonts w:ascii="Cascadia Mono" w:hAnsi="Cascadia Mono" w:cs="Cascadia Mono"/>
+          <w:sz w:val="19"/>
+          <w:szCs w:val="19"/>
+        </w:rPr>
+        <w:t>transform.parent</w:t>
+      </w:r>
+      <w:proofErr w:type="gramEnd"/>
+      <w:r>
+        <w:rPr>
+          <w:rFonts w:ascii="Cascadia Mono" w:hAnsi="Cascadia Mono" w:cs="Cascadia Mono"/>
+          <w:sz w:val="19"/>
+          <w:szCs w:val="19"/>
+        </w:rPr>
+        <w:t>.gameObject</w:t>
+      </w:r>
+      <w:proofErr w:type="spellEnd"/>
+      <w:proofErr w:type="gramStart"/>
+      <w:r>
+        <w:rPr>
+          <w:rFonts w:ascii="Cascadia Mono" w:hAnsi="Cascadia Mono" w:cs="Cascadia Mono"/>
+          <w:sz w:val="19"/>
+          <w:szCs w:val="19"/>
+        </w:rPr>
+        <w:t>);</w:t>
+      </w:r>
+      <w:proofErr w:type="gramEnd"/>
     </w:p>
     <w:p>
       <w:pPr>
@@ -4501,7 +5690,33 @@
         <w:adjustRightInd w:val="0"/>
       </w:pPr>
       <w:r>
-        <w:t>In Unity, Goto EnemyExploding gameobject &gt; Enemy &gt; Explode Enemy Script &gt; Explode Dist = 5.</w:t>
+        <w:t xml:space="preserve">In Unity, Goto </w:t>
+      </w:r>
+      <w:proofErr w:type="spellStart"/>
+      <w:r>
+        <w:t>EnemyExploding</w:t>
+      </w:r>
+      <w:proofErr w:type="spellEnd"/>
+      <w:r>
+        <w:t xml:space="preserve"> </w:t>
+      </w:r>
+      <w:proofErr w:type="spellStart"/>
+      <w:proofErr w:type="gramStart"/>
+      <w:r>
+        <w:t>gameobject</w:t>
+      </w:r>
+      <w:proofErr w:type="spellEnd"/>
+      <w:proofErr w:type="gramEnd"/>
+      <w:r>
+        <w:t xml:space="preserve"> &gt; Enemy &gt; Explode Enemy Script &gt; Explode </w:t>
+      </w:r>
+      <w:proofErr w:type="spellStart"/>
+      <w:r>
+        <w:t>Dist</w:t>
+      </w:r>
+      <w:proofErr w:type="spellEnd"/>
+      <w:r>
+        <w:t xml:space="preserve"> = 5.</w:t>
       </w:r>
     </w:p>
     <w:p>
@@ -4653,7 +5868,15 @@
         <w:ind w:left="144" w:firstLine="0"/>
       </w:pPr>
       <w:r>
-        <w:t>the code for a new enemy, the RefactorEnemy. This enemy combines the behaviors of the two</w:t>
+        <w:t xml:space="preserve">the code for a new enemy, the </w:t>
+      </w:r>
+      <w:proofErr w:type="spellStart"/>
+      <w:r>
+        <w:t>RefactorEnemy</w:t>
+      </w:r>
+      <w:proofErr w:type="spellEnd"/>
+      <w:r>
+        <w:t>. This enemy combines the behaviors of the two</w:t>
       </w:r>
     </w:p>
     <w:p>
@@ -4703,7 +5926,23 @@
           <w:b/>
           <w:bCs/>
         </w:rPr>
-        <w:t>Step 1: Examine RefactorEnemy’s Behavior</w:t>
+        <w:t xml:space="preserve">Step 1: Examine </w:t>
+      </w:r>
+      <w:proofErr w:type="spellStart"/>
+      <w:r>
+        <w:rPr>
+          <w:b/>
+          <w:bCs/>
+        </w:rPr>
+        <w:t>RefactorEnemy’s</w:t>
+      </w:r>
+      <w:proofErr w:type="spellEnd"/>
+      <w:r>
+        <w:rPr>
+          <w:b/>
+          <w:bCs/>
+        </w:rPr>
+        <w:t xml:space="preserve"> Behavior</w:t>
       </w:r>
     </w:p>
     <w:p>
@@ -4711,7 +5950,20 @@
         <w:ind w:left="144" w:firstLine="0"/>
       </w:pPr>
       <w:r>
-        <w:t>Start by observing the RefactorEnemy's in-game behavior. Understanding its actions and</w:t>
+        <w:t xml:space="preserve">Start by observing </w:t>
+      </w:r>
+      <w:proofErr w:type="gramStart"/>
+      <w:r>
+        <w:t xml:space="preserve">the </w:t>
+      </w:r>
+      <w:proofErr w:type="spellStart"/>
+      <w:r>
+        <w:t>RefactorEnemy's</w:t>
+      </w:r>
+      <w:proofErr w:type="spellEnd"/>
+      <w:proofErr w:type="gramEnd"/>
+      <w:r>
+        <w:t xml:space="preserve"> in-game behavior. Understanding its actions and</w:t>
       </w:r>
     </w:p>
     <w:p>
@@ -4748,7 +6000,23 @@
         <w:ind w:left="144" w:firstLine="0"/>
       </w:pPr>
       <w:r>
-        <w:t>Navigate to RefactorEnemy.cs and thoroughly review the code. This will give you insight into</w:t>
+        <w:t xml:space="preserve">Navigate to </w:t>
+      </w:r>
+      <w:proofErr w:type="spellStart"/>
+      <w:r>
+        <w:t>RefactorEnemy.cs</w:t>
+      </w:r>
+      <w:proofErr w:type="spellEnd"/>
+      <w:r>
+        <w:t xml:space="preserve"> and thoroughly review the code. This will give </w:t>
+      </w:r>
+      <w:proofErr w:type="spellStart"/>
+      <w:r>
+        <w:t>you</w:t>
+      </w:r>
+      <w:proofErr w:type="spellEnd"/>
+      <w:r>
+        <w:t xml:space="preserve"> insight into</w:t>
       </w:r>
     </w:p>
     <w:p>
@@ -4926,7 +6194,15 @@
         <w:ind w:left="144" w:firstLine="0"/>
       </w:pPr>
       <w:r>
-        <w:t>class. This change will not only simplify RefactorEnemy.cs but also promote code</w:t>
+        <w:t xml:space="preserve">class. This change will not only simplify </w:t>
+      </w:r>
+      <w:proofErr w:type="spellStart"/>
+      <w:r>
+        <w:t>RefactorEnemy.cs</w:t>
+      </w:r>
+      <w:proofErr w:type="spellEnd"/>
+      <w:r>
+        <w:t xml:space="preserve"> but also promote code</w:t>
       </w:r>
     </w:p>
     <w:p>
@@ -4984,6 +6260,7 @@
       <w:r>
         <w:t xml:space="preserve">● Ensure that the behavior of </w:t>
       </w:r>
+      <w:proofErr w:type="spellStart"/>
       <w:r>
         <w:rPr>
           <w:b/>
@@ -4993,6 +6270,7 @@
         </w:rPr>
         <w:t>RefactorEnemy</w:t>
       </w:r>
+      <w:proofErr w:type="spellEnd"/>
       <w:r>
         <w:t xml:space="preserve"> remains unchanged from its original</w:t>
       </w:r>
@@ -5168,7 +6446,15 @@
         <w:t>Extra Challenge</w:t>
       </w:r>
       <w:r>
-        <w:t xml:space="preserve"> Making it Better </w:t>
+        <w:t xml:space="preserve"> Making </w:t>
+      </w:r>
+      <w:proofErr w:type="gramStart"/>
+      <w:r>
+        <w:t>it</w:t>
+      </w:r>
+      <w:proofErr w:type="gramEnd"/>
+      <w:r>
+        <w:t xml:space="preserve"> Better </w:t>
       </w:r>
     </w:p>
     <w:p>
@@ -5181,7 +6467,15 @@
         <w:ind w:left="144" w:firstLine="0"/>
       </w:pPr>
       <w:r>
-        <w:t>Create a new enemy based on the Refactored Enemy that adds another behaviour, instead of chasing the enemy, it will flee from the enemy when his health is at its max. Consider how to add this functionality in a legible, flexible way that works within the existing framework</w:t>
+        <w:t xml:space="preserve">Create a new enemy based on the Refactored Enemy that adds another </w:t>
+      </w:r>
+      <w:proofErr w:type="spellStart"/>
+      <w:r>
+        <w:t>behaviour</w:t>
+      </w:r>
+      <w:proofErr w:type="spellEnd"/>
+      <w:r>
+        <w:t>, instead of chasing the enemy, it will flee from the enemy when his health is at its max. Consider how to add this functionality in a legible, flexible way that works within the existing framework</w:t>
       </w:r>
     </w:p>
     <w:p>
@@ -5210,8 +6504,18 @@
         <w:ind w:left="144" w:firstLine="0"/>
       </w:pPr>
       <w:r>
-        <w:t>Update ChaseEnemy :</w:t>
-      </w:r>
+        <w:t xml:space="preserve">Update </w:t>
+      </w:r>
+      <w:proofErr w:type="spellStart"/>
+      <w:proofErr w:type="gramStart"/>
+      <w:r>
+        <w:t>ChaseEnemy</w:t>
+      </w:r>
+      <w:proofErr w:type="spellEnd"/>
+      <w:r>
+        <w:t xml:space="preserve"> :</w:t>
+      </w:r>
+      <w:proofErr w:type="gramEnd"/>
     </w:p>
     <w:p>
       <w:pPr>
@@ -5236,7 +6540,35 @@
           <w:sz w:val="19"/>
           <w:szCs w:val="19"/>
         </w:rPr>
-        <w:t>private void ChaseEnemy()</w:t>
+        <w:t xml:space="preserve">private void </w:t>
+      </w:r>
+      <w:proofErr w:type="spellStart"/>
+      <w:proofErr w:type="gramStart"/>
+      <w:r>
+        <w:rPr>
+          <w:rFonts w:ascii="Cascadia Mono" w:hAnsi="Cascadia Mono" w:cs="Cascadia Mono"/>
+          <w:sz w:val="19"/>
+          <w:szCs w:val="19"/>
+        </w:rPr>
+        <w:t>ChaseEnemy</w:t>
+      </w:r>
+      <w:proofErr w:type="spellEnd"/>
+      <w:r>
+        <w:rPr>
+          <w:rFonts w:ascii="Cascadia Mono" w:hAnsi="Cascadia Mono" w:cs="Cascadia Mono"/>
+          <w:sz w:val="19"/>
+          <w:szCs w:val="19"/>
+        </w:rPr>
+        <w:t>(</w:t>
+      </w:r>
+      <w:proofErr w:type="gramEnd"/>
+      <w:r>
+        <w:rPr>
+          <w:rFonts w:ascii="Cascadia Mono" w:hAnsi="Cascadia Mono" w:cs="Cascadia Mono"/>
+          <w:sz w:val="19"/>
+          <w:szCs w:val="19"/>
+        </w:rPr>
+        <w:t>)</w:t>
       </w:r>
     </w:p>
     <w:p>
@@ -5299,7 +6631,65 @@
           <w:sz w:val="19"/>
           <w:szCs w:val="19"/>
         </w:rPr>
-        <w:t xml:space="preserve">    float health = player.GetComponent&lt;PlayerMovement&gt;().playerStats.health;</w:t>
+        <w:t xml:space="preserve">    float health = </w:t>
+      </w:r>
+      <w:proofErr w:type="spellStart"/>
+      <w:proofErr w:type="gramStart"/>
+      <w:r>
+        <w:rPr>
+          <w:rFonts w:ascii="Cascadia Mono" w:hAnsi="Cascadia Mono" w:cs="Cascadia Mono"/>
+          <w:sz w:val="19"/>
+          <w:szCs w:val="19"/>
+        </w:rPr>
+        <w:t>player.GetComponent</w:t>
+      </w:r>
+      <w:proofErr w:type="spellEnd"/>
+      <w:proofErr w:type="gramEnd"/>
+      <w:r>
+        <w:rPr>
+          <w:rFonts w:ascii="Cascadia Mono" w:hAnsi="Cascadia Mono" w:cs="Cascadia Mono"/>
+          <w:sz w:val="19"/>
+          <w:szCs w:val="19"/>
+        </w:rPr>
+        <w:t>&lt;</w:t>
+      </w:r>
+      <w:proofErr w:type="spellStart"/>
+      <w:r>
+        <w:rPr>
+          <w:rFonts w:ascii="Cascadia Mono" w:hAnsi="Cascadia Mono" w:cs="Cascadia Mono"/>
+          <w:sz w:val="19"/>
+          <w:szCs w:val="19"/>
+        </w:rPr>
+        <w:t>PlayerMovement</w:t>
+      </w:r>
+      <w:proofErr w:type="spellEnd"/>
+      <w:proofErr w:type="gramStart"/>
+      <w:r>
+        <w:rPr>
+          <w:rFonts w:ascii="Cascadia Mono" w:hAnsi="Cascadia Mono" w:cs="Cascadia Mono"/>
+          <w:sz w:val="19"/>
+          <w:szCs w:val="19"/>
+        </w:rPr>
+        <w:t>&gt;().</w:t>
+      </w:r>
+      <w:proofErr w:type="spellStart"/>
+      <w:r>
+        <w:rPr>
+          <w:rFonts w:ascii="Cascadia Mono" w:hAnsi="Cascadia Mono" w:cs="Cascadia Mono"/>
+          <w:sz w:val="19"/>
+          <w:szCs w:val="19"/>
+        </w:rPr>
+        <w:t>playerStats.health</w:t>
+      </w:r>
+      <w:proofErr w:type="spellEnd"/>
+      <w:proofErr w:type="gramEnd"/>
+      <w:r>
+        <w:rPr>
+          <w:rFonts w:ascii="Cascadia Mono" w:hAnsi="Cascadia Mono" w:cs="Cascadia Mono"/>
+          <w:sz w:val="19"/>
+          <w:szCs w:val="19"/>
+        </w:rPr>
+        <w:t>;</w:t>
       </w:r>
     </w:p>
     <w:p>
@@ -5320,8 +6710,36 @@
           <w:sz w:val="19"/>
           <w:szCs w:val="19"/>
         </w:rPr>
-        <w:t xml:space="preserve">    Debug.Log($"health: {health}");</w:t>
-      </w:r>
+        <w:t xml:space="preserve">    </w:t>
+      </w:r>
+      <w:proofErr w:type="spellStart"/>
+      <w:r>
+        <w:rPr>
+          <w:rFonts w:ascii="Cascadia Mono" w:hAnsi="Cascadia Mono" w:cs="Cascadia Mono"/>
+          <w:sz w:val="19"/>
+          <w:szCs w:val="19"/>
+        </w:rPr>
+        <w:t>Debug.Log</w:t>
+      </w:r>
+      <w:proofErr w:type="spellEnd"/>
+      <w:r>
+        <w:rPr>
+          <w:rFonts w:ascii="Cascadia Mono" w:hAnsi="Cascadia Mono" w:cs="Cascadia Mono"/>
+          <w:sz w:val="19"/>
+          <w:szCs w:val="19"/>
+        </w:rPr>
+        <w:t>($"</w:t>
+      </w:r>
+      <w:proofErr w:type="gramStart"/>
+      <w:r>
+        <w:rPr>
+          <w:rFonts w:ascii="Cascadia Mono" w:hAnsi="Cascadia Mono" w:cs="Cascadia Mono"/>
+          <w:sz w:val="19"/>
+          <w:szCs w:val="19"/>
+        </w:rPr>
+        <w:t>health: {health}");</w:t>
+      </w:r>
+      <w:proofErr w:type="gramEnd"/>
     </w:p>
     <w:p>
       <w:pPr>
@@ -5383,8 +6801,36 @@
           <w:sz w:val="19"/>
           <w:szCs w:val="19"/>
         </w:rPr>
-        <w:t xml:space="preserve">        Debug.Log("Fleeing");</w:t>
-      </w:r>
+        <w:t xml:space="preserve">        </w:t>
+      </w:r>
+      <w:proofErr w:type="spellStart"/>
+      <w:r>
+        <w:rPr>
+          <w:rFonts w:ascii="Cascadia Mono" w:hAnsi="Cascadia Mono" w:cs="Cascadia Mono"/>
+          <w:sz w:val="19"/>
+          <w:szCs w:val="19"/>
+        </w:rPr>
+        <w:t>Debug.Log</w:t>
+      </w:r>
+      <w:proofErr w:type="spellEnd"/>
+      <w:r>
+        <w:rPr>
+          <w:rFonts w:ascii="Cascadia Mono" w:hAnsi="Cascadia Mono" w:cs="Cascadia Mono"/>
+          <w:sz w:val="19"/>
+          <w:szCs w:val="19"/>
+        </w:rPr>
+        <w:t>("Fleeing"</w:t>
+      </w:r>
+      <w:proofErr w:type="gramStart"/>
+      <w:r>
+        <w:rPr>
+          <w:rFonts w:ascii="Cascadia Mono" w:hAnsi="Cascadia Mono" w:cs="Cascadia Mono"/>
+          <w:sz w:val="19"/>
+          <w:szCs w:val="19"/>
+        </w:rPr>
+        <w:t>);</w:t>
+      </w:r>
+      <w:proofErr w:type="gramEnd"/>
     </w:p>
     <w:p>
       <w:pPr>
@@ -5425,7 +6871,83 @@
           <w:sz w:val="19"/>
           <w:szCs w:val="19"/>
         </w:rPr>
-        <w:t xml:space="preserve">        Vector3 fleeDirection = (transform.position - player.transform.position).normalized;</w:t>
+        <w:t xml:space="preserve">        Vector3 </w:t>
+      </w:r>
+      <w:proofErr w:type="spellStart"/>
+      <w:r>
+        <w:rPr>
+          <w:rFonts w:ascii="Cascadia Mono" w:hAnsi="Cascadia Mono" w:cs="Cascadia Mono"/>
+          <w:sz w:val="19"/>
+          <w:szCs w:val="19"/>
+        </w:rPr>
+        <w:t>fleeDirection</w:t>
+      </w:r>
+      <w:proofErr w:type="spellEnd"/>
+      <w:r>
+        <w:rPr>
+          <w:rFonts w:ascii="Cascadia Mono" w:hAnsi="Cascadia Mono" w:cs="Cascadia Mono"/>
+          <w:sz w:val="19"/>
+          <w:szCs w:val="19"/>
+        </w:rPr>
+        <w:t xml:space="preserve"> = (</w:t>
+      </w:r>
+      <w:proofErr w:type="spellStart"/>
+      <w:proofErr w:type="gramStart"/>
+      <w:r>
+        <w:rPr>
+          <w:rFonts w:ascii="Cascadia Mono" w:hAnsi="Cascadia Mono" w:cs="Cascadia Mono"/>
+          <w:sz w:val="19"/>
+          <w:szCs w:val="19"/>
+        </w:rPr>
+        <w:t>transform.position</w:t>
+      </w:r>
+      <w:proofErr w:type="spellEnd"/>
+      <w:proofErr w:type="gramEnd"/>
+      <w:r>
+        <w:rPr>
+          <w:rFonts w:ascii="Cascadia Mono" w:hAnsi="Cascadia Mono" w:cs="Cascadia Mono"/>
+          <w:sz w:val="19"/>
+          <w:szCs w:val="19"/>
+        </w:rPr>
+        <w:t xml:space="preserve"> - </w:t>
+      </w:r>
+      <w:proofErr w:type="spellStart"/>
+      <w:proofErr w:type="gramStart"/>
+      <w:r>
+        <w:rPr>
+          <w:rFonts w:ascii="Cascadia Mono" w:hAnsi="Cascadia Mono" w:cs="Cascadia Mono"/>
+          <w:sz w:val="19"/>
+          <w:szCs w:val="19"/>
+        </w:rPr>
+        <w:t>player.transform</w:t>
+      </w:r>
+      <w:proofErr w:type="gramEnd"/>
+      <w:r>
+        <w:rPr>
+          <w:rFonts w:ascii="Cascadia Mono" w:hAnsi="Cascadia Mono" w:cs="Cascadia Mono"/>
+          <w:sz w:val="19"/>
+          <w:szCs w:val="19"/>
+        </w:rPr>
+        <w:t>.position</w:t>
+      </w:r>
+      <w:proofErr w:type="spellEnd"/>
+      <w:proofErr w:type="gramStart"/>
+      <w:r>
+        <w:rPr>
+          <w:rFonts w:ascii="Cascadia Mono" w:hAnsi="Cascadia Mono" w:cs="Cascadia Mono"/>
+          <w:sz w:val="19"/>
+          <w:szCs w:val="19"/>
+        </w:rPr>
+        <w:t>).normalized</w:t>
+      </w:r>
+      <w:proofErr w:type="gramEnd"/>
+      <w:r>
+        <w:rPr>
+          <w:rFonts w:ascii="Cascadia Mono" w:hAnsi="Cascadia Mono" w:cs="Cascadia Mono"/>
+          <w:sz w:val="19"/>
+          <w:szCs w:val="19"/>
+        </w:rPr>
+        <w:t>;</w:t>
       </w:r>
     </w:p>
     <w:p>
@@ -5467,8 +6989,92 @@
           <w:sz w:val="19"/>
           <w:szCs w:val="19"/>
         </w:rPr>
-        <w:t xml:space="preserve">        transform.position += fleeDirection * enemyStats.chaseSpeed * Time.deltaTime;</w:t>
-      </w:r>
+        <w:t xml:space="preserve">        </w:t>
+      </w:r>
+      <w:proofErr w:type="spellStart"/>
+      <w:proofErr w:type="gramStart"/>
+      <w:r>
+        <w:rPr>
+          <w:rFonts w:ascii="Cascadia Mono" w:hAnsi="Cascadia Mono" w:cs="Cascadia Mono"/>
+          <w:sz w:val="19"/>
+          <w:szCs w:val="19"/>
+        </w:rPr>
+        <w:t>transform.position</w:t>
+      </w:r>
+      <w:proofErr w:type="spellEnd"/>
+      <w:proofErr w:type="gramEnd"/>
+      <w:r>
+        <w:rPr>
+          <w:rFonts w:ascii="Cascadia Mono" w:hAnsi="Cascadia Mono" w:cs="Cascadia Mono"/>
+          <w:sz w:val="19"/>
+          <w:szCs w:val="19"/>
+        </w:rPr>
+        <w:t xml:space="preserve"> += </w:t>
+      </w:r>
+      <w:proofErr w:type="spellStart"/>
+      <w:r>
+        <w:rPr>
+          <w:rFonts w:ascii="Cascadia Mono" w:hAnsi="Cascadia Mono" w:cs="Cascadia Mono"/>
+          <w:sz w:val="19"/>
+          <w:szCs w:val="19"/>
+        </w:rPr>
+        <w:t>fleeDirection</w:t>
+      </w:r>
+      <w:proofErr w:type="spellEnd"/>
+      <w:r>
+        <w:rPr>
+          <w:rFonts w:ascii="Cascadia Mono" w:hAnsi="Cascadia Mono" w:cs="Cascadia Mono"/>
+          <w:sz w:val="19"/>
+          <w:szCs w:val="19"/>
+        </w:rPr>
+        <w:t xml:space="preserve"> * </w:t>
+      </w:r>
+      <w:proofErr w:type="spellStart"/>
+      <w:r>
+        <w:rPr>
+          <w:rFonts w:ascii="Cascadia Mono" w:hAnsi="Cascadia Mono" w:cs="Cascadia Mono"/>
+          <w:sz w:val="19"/>
+          <w:szCs w:val="19"/>
+        </w:rPr>
+        <w:t>enemyStats.chaseSpeed</w:t>
+      </w:r>
+      <w:proofErr w:type="spellEnd"/>
+      <w:r>
+        <w:rPr>
+          <w:rFonts w:ascii="Cascadia Mono" w:hAnsi="Cascadia Mono" w:cs="Cascadia Mono"/>
+          <w:sz w:val="19"/>
+          <w:szCs w:val="19"/>
+        </w:rPr>
+        <w:t xml:space="preserve"> * </w:t>
+      </w:r>
+      <w:proofErr w:type="spellStart"/>
+      <w:r>
+        <w:rPr>
+          <w:rFonts w:ascii="Cascadia Mono" w:hAnsi="Cascadia Mono" w:cs="Cascadia Mono"/>
+          <w:sz w:val="19"/>
+          <w:szCs w:val="19"/>
+        </w:rPr>
+        <w:t>Time.</w:t>
+      </w:r>
+      <w:proofErr w:type="gramStart"/>
+      <w:r>
+        <w:rPr>
+          <w:rFonts w:ascii="Cascadia Mono" w:hAnsi="Cascadia Mono" w:cs="Cascadia Mono"/>
+          <w:sz w:val="19"/>
+          <w:szCs w:val="19"/>
+        </w:rPr>
+        <w:t>deltaTime</w:t>
+      </w:r>
+      <w:proofErr w:type="spellEnd"/>
+      <w:r>
+        <w:rPr>
+          <w:rFonts w:ascii="Cascadia Mono" w:hAnsi="Cascadia Mono" w:cs="Cascadia Mono"/>
+          <w:sz w:val="19"/>
+          <w:szCs w:val="19"/>
+        </w:rPr>
+        <w:t>;</w:t>
+      </w:r>
+      <w:proofErr w:type="gramEnd"/>
     </w:p>
     <w:p>
       <w:pPr>
@@ -5509,7 +7115,35 @@
           <w:sz w:val="19"/>
           <w:szCs w:val="19"/>
         </w:rPr>
-        <w:t xml:space="preserve">        if (fleeDirection != Vector3.zero)</w:t>
+        <w:t xml:space="preserve">        if (</w:t>
+      </w:r>
+      <w:proofErr w:type="spellStart"/>
+      <w:proofErr w:type="gramStart"/>
+      <w:r>
+        <w:rPr>
+          <w:rFonts w:ascii="Cascadia Mono" w:hAnsi="Cascadia Mono" w:cs="Cascadia Mono"/>
+          <w:sz w:val="19"/>
+          <w:szCs w:val="19"/>
+        </w:rPr>
+        <w:t>fleeDirection</w:t>
+      </w:r>
+      <w:proofErr w:type="spellEnd"/>
+      <w:r>
+        <w:rPr>
+          <w:rFonts w:ascii="Cascadia Mono" w:hAnsi="Cascadia Mono" w:cs="Cascadia Mono"/>
+          <w:sz w:val="19"/>
+          <w:szCs w:val="19"/>
+        </w:rPr>
+        <w:t xml:space="preserve"> !</w:t>
+      </w:r>
+      <w:proofErr w:type="gramEnd"/>
+      <w:r>
+        <w:rPr>
+          <w:rFonts w:ascii="Cascadia Mono" w:hAnsi="Cascadia Mono" w:cs="Cascadia Mono"/>
+          <w:sz w:val="19"/>
+          <w:szCs w:val="19"/>
+        </w:rPr>
+        <w:t>= Vector3.zero)</w:t>
       </w:r>
     </w:p>
     <w:p>
@@ -5530,8 +7164,66 @@
           <w:sz w:val="19"/>
           <w:szCs w:val="19"/>
         </w:rPr>
-        <w:t xml:space="preserve">            transform.rotation = Quaternion.LookRotation(fleeDirection);</w:t>
-      </w:r>
+        <w:t xml:space="preserve">            </w:t>
+      </w:r>
+      <w:proofErr w:type="spellStart"/>
+      <w:proofErr w:type="gramStart"/>
+      <w:r>
+        <w:rPr>
+          <w:rFonts w:ascii="Cascadia Mono" w:hAnsi="Cascadia Mono" w:cs="Cascadia Mono"/>
+          <w:sz w:val="19"/>
+          <w:szCs w:val="19"/>
+        </w:rPr>
+        <w:t>transform.rotation</w:t>
+      </w:r>
+      <w:proofErr w:type="spellEnd"/>
+      <w:proofErr w:type="gramEnd"/>
+      <w:r>
+        <w:rPr>
+          <w:rFonts w:ascii="Cascadia Mono" w:hAnsi="Cascadia Mono" w:cs="Cascadia Mono"/>
+          <w:sz w:val="19"/>
+          <w:szCs w:val="19"/>
+        </w:rPr>
+        <w:t xml:space="preserve"> = </w:t>
+      </w:r>
+      <w:proofErr w:type="spellStart"/>
+      <w:r>
+        <w:rPr>
+          <w:rFonts w:ascii="Cascadia Mono" w:hAnsi="Cascadia Mono" w:cs="Cascadia Mono"/>
+          <w:sz w:val="19"/>
+          <w:szCs w:val="19"/>
+        </w:rPr>
+        <w:t>Quaternion.LookRotation</w:t>
+      </w:r>
+      <w:proofErr w:type="spellEnd"/>
+      <w:r>
+        <w:rPr>
+          <w:rFonts w:ascii="Cascadia Mono" w:hAnsi="Cascadia Mono" w:cs="Cascadia Mono"/>
+          <w:sz w:val="19"/>
+          <w:szCs w:val="19"/>
+        </w:rPr>
+        <w:t>(</w:t>
+      </w:r>
+      <w:proofErr w:type="spellStart"/>
+      <w:r>
+        <w:rPr>
+          <w:rFonts w:ascii="Cascadia Mono" w:hAnsi="Cascadia Mono" w:cs="Cascadia Mono"/>
+          <w:sz w:val="19"/>
+          <w:szCs w:val="19"/>
+        </w:rPr>
+        <w:t>fleeDirection</w:t>
+      </w:r>
+      <w:proofErr w:type="spellEnd"/>
+      <w:proofErr w:type="gramStart"/>
+      <w:r>
+        <w:rPr>
+          <w:rFonts w:ascii="Cascadia Mono" w:hAnsi="Cascadia Mono" w:cs="Cascadia Mono"/>
+          <w:sz w:val="19"/>
+          <w:szCs w:val="19"/>
+        </w:rPr>
+        <w:t>);</w:t>
+      </w:r>
+      <w:proofErr w:type="gramEnd"/>
     </w:p>
     <w:p>
       <w:pPr>
@@ -5614,8 +7306,36 @@
           <w:sz w:val="19"/>
           <w:szCs w:val="19"/>
         </w:rPr>
-        <w:t xml:space="preserve">        Debug.Log("Chasing");</w:t>
-      </w:r>
+        <w:t xml:space="preserve">        </w:t>
+      </w:r>
+      <w:proofErr w:type="spellStart"/>
+      <w:r>
+        <w:rPr>
+          <w:rFonts w:ascii="Cascadia Mono" w:hAnsi="Cascadia Mono" w:cs="Cascadia Mono"/>
+          <w:sz w:val="19"/>
+          <w:szCs w:val="19"/>
+        </w:rPr>
+        <w:t>Debug.Log</w:t>
+      </w:r>
+      <w:proofErr w:type="spellEnd"/>
+      <w:r>
+        <w:rPr>
+          <w:rFonts w:ascii="Cascadia Mono" w:hAnsi="Cascadia Mono" w:cs="Cascadia Mono"/>
+          <w:sz w:val="19"/>
+          <w:szCs w:val="19"/>
+        </w:rPr>
+        <w:t>("Chasing"</w:t>
+      </w:r>
+      <w:proofErr w:type="gramStart"/>
+      <w:r>
+        <w:rPr>
+          <w:rFonts w:ascii="Cascadia Mono" w:hAnsi="Cascadia Mono" w:cs="Cascadia Mono"/>
+          <w:sz w:val="19"/>
+          <w:szCs w:val="19"/>
+        </w:rPr>
+        <w:t>);</w:t>
+      </w:r>
+      <w:proofErr w:type="gramEnd"/>
     </w:p>
     <w:p>
       <w:pPr>
@@ -5635,8 +7355,66 @@
           <w:sz w:val="19"/>
           <w:szCs w:val="19"/>
         </w:rPr>
-        <w:t xml:space="preserve">        sight.position = player.transform.position;</w:t>
-      </w:r>
+        <w:t xml:space="preserve">        </w:t>
+      </w:r>
+      <w:proofErr w:type="spellStart"/>
+      <w:proofErr w:type="gramStart"/>
+      <w:r>
+        <w:rPr>
+          <w:rFonts w:ascii="Cascadia Mono" w:hAnsi="Cascadia Mono" w:cs="Cascadia Mono"/>
+          <w:sz w:val="19"/>
+          <w:szCs w:val="19"/>
+        </w:rPr>
+        <w:t>sight.position</w:t>
+      </w:r>
+      <w:proofErr w:type="spellEnd"/>
+      <w:proofErr w:type="gramEnd"/>
+      <w:r>
+        <w:rPr>
+          <w:rFonts w:ascii="Cascadia Mono" w:hAnsi="Cascadia Mono" w:cs="Cascadia Mono"/>
+          <w:sz w:val="19"/>
+          <w:szCs w:val="19"/>
+        </w:rPr>
+        <w:t xml:space="preserve"> = </w:t>
+      </w:r>
+      <w:proofErr w:type="spellStart"/>
+      <w:proofErr w:type="gramStart"/>
+      <w:r>
+        <w:rPr>
+          <w:rFonts w:ascii="Cascadia Mono" w:hAnsi="Cascadia Mono" w:cs="Cascadia Mono"/>
+          <w:sz w:val="19"/>
+          <w:szCs w:val="19"/>
+        </w:rPr>
+        <w:t>player.transform</w:t>
+      </w:r>
+      <w:proofErr w:type="gramEnd"/>
+      <w:r>
+        <w:rPr>
+          <w:rFonts w:ascii="Cascadia Mono" w:hAnsi="Cascadia Mono" w:cs="Cascadia Mono"/>
+          <w:sz w:val="19"/>
+          <w:szCs w:val="19"/>
+        </w:rPr>
+        <w:t>.</w:t>
+      </w:r>
+      <w:proofErr w:type="gramStart"/>
+      <w:r>
+        <w:rPr>
+          <w:rFonts w:ascii="Cascadia Mono" w:hAnsi="Cascadia Mono" w:cs="Cascadia Mono"/>
+          <w:sz w:val="19"/>
+          <w:szCs w:val="19"/>
+        </w:rPr>
+        <w:t>position</w:t>
+      </w:r>
+      <w:proofErr w:type="spellEnd"/>
+      <w:r>
+        <w:rPr>
+          <w:rFonts w:ascii="Cascadia Mono" w:hAnsi="Cascadia Mono" w:cs="Cascadia Mono"/>
+          <w:sz w:val="19"/>
+          <w:szCs w:val="19"/>
+        </w:rPr>
+        <w:t>;</w:t>
+      </w:r>
+      <w:proofErr w:type="gramEnd"/>
     </w:p>
     <w:p>
       <w:pPr>
@@ -5656,8 +7434,38 @@
           <w:sz w:val="19"/>
           <w:szCs w:val="19"/>
         </w:rPr>
-        <w:t xml:space="preserve">        transform.LookAt(sight);</w:t>
-      </w:r>
+        <w:t xml:space="preserve">        </w:t>
+      </w:r>
+      <w:proofErr w:type="spellStart"/>
+      <w:proofErr w:type="gramStart"/>
+      <w:r>
+        <w:rPr>
+          <w:rFonts w:ascii="Cascadia Mono" w:hAnsi="Cascadia Mono" w:cs="Cascadia Mono"/>
+          <w:sz w:val="19"/>
+          <w:szCs w:val="19"/>
+        </w:rPr>
+        <w:t>transform.LookAt</w:t>
+      </w:r>
+      <w:proofErr w:type="spellEnd"/>
+      <w:proofErr w:type="gramEnd"/>
+      <w:r>
+        <w:rPr>
+          <w:rFonts w:ascii="Cascadia Mono" w:hAnsi="Cascadia Mono" w:cs="Cascadia Mono"/>
+          <w:sz w:val="19"/>
+          <w:szCs w:val="19"/>
+        </w:rPr>
+        <w:t>(sight</w:t>
+      </w:r>
+      <w:proofErr w:type="gramStart"/>
+      <w:r>
+        <w:rPr>
+          <w:rFonts w:ascii="Cascadia Mono" w:hAnsi="Cascadia Mono" w:cs="Cascadia Mono"/>
+          <w:sz w:val="19"/>
+          <w:szCs w:val="19"/>
+        </w:rPr>
+        <w:t>);</w:t>
+      </w:r>
+      <w:proofErr w:type="gramEnd"/>
     </w:p>
     <w:p>
       <w:pPr>
@@ -5677,8 +7485,114 @@
           <w:sz w:val="19"/>
           <w:szCs w:val="19"/>
         </w:rPr>
-        <w:t xml:space="preserve">        transform.position = Vector3.MoveTowards(transform.position, player.transform.position, Time.deltaTime * enemyStats.chaseSpeed);</w:t>
-      </w:r>
+        <w:t xml:space="preserve">        </w:t>
+      </w:r>
+      <w:proofErr w:type="spellStart"/>
+      <w:proofErr w:type="gramStart"/>
+      <w:r>
+        <w:rPr>
+          <w:rFonts w:ascii="Cascadia Mono" w:hAnsi="Cascadia Mono" w:cs="Cascadia Mono"/>
+          <w:sz w:val="19"/>
+          <w:szCs w:val="19"/>
+        </w:rPr>
+        <w:t>transform.position</w:t>
+      </w:r>
+      <w:proofErr w:type="spellEnd"/>
+      <w:proofErr w:type="gramEnd"/>
+      <w:r>
+        <w:rPr>
+          <w:rFonts w:ascii="Cascadia Mono" w:hAnsi="Cascadia Mono" w:cs="Cascadia Mono"/>
+          <w:sz w:val="19"/>
+          <w:szCs w:val="19"/>
+        </w:rPr>
+        <w:t xml:space="preserve"> = Vector3.MoveTowards(</w:t>
+      </w:r>
+      <w:proofErr w:type="spellStart"/>
+      <w:proofErr w:type="gramStart"/>
+      <w:r>
+        <w:rPr>
+          <w:rFonts w:ascii="Cascadia Mono" w:hAnsi="Cascadia Mono" w:cs="Cascadia Mono"/>
+          <w:sz w:val="19"/>
+          <w:szCs w:val="19"/>
+        </w:rPr>
+        <w:t>transform.position</w:t>
+      </w:r>
+      <w:proofErr w:type="spellEnd"/>
+      <w:proofErr w:type="gramEnd"/>
+      <w:r>
+        <w:rPr>
+          <w:rFonts w:ascii="Cascadia Mono" w:hAnsi="Cascadia Mono" w:cs="Cascadia Mono"/>
+          <w:sz w:val="19"/>
+          <w:szCs w:val="19"/>
+        </w:rPr>
+        <w:t xml:space="preserve">, </w:t>
+      </w:r>
+      <w:proofErr w:type="spellStart"/>
+      <w:proofErr w:type="gramStart"/>
+      <w:r>
+        <w:rPr>
+          <w:rFonts w:ascii="Cascadia Mono" w:hAnsi="Cascadia Mono" w:cs="Cascadia Mono"/>
+          <w:sz w:val="19"/>
+          <w:szCs w:val="19"/>
+        </w:rPr>
+        <w:t>player.transform</w:t>
+      </w:r>
+      <w:proofErr w:type="gramEnd"/>
+      <w:r>
+        <w:rPr>
+          <w:rFonts w:ascii="Cascadia Mono" w:hAnsi="Cascadia Mono" w:cs="Cascadia Mono"/>
+          <w:sz w:val="19"/>
+          <w:szCs w:val="19"/>
+        </w:rPr>
+        <w:t>.position</w:t>
+      </w:r>
+      <w:proofErr w:type="spellEnd"/>
+      <w:r>
+        <w:rPr>
+          <w:rFonts w:ascii="Cascadia Mono" w:hAnsi="Cascadia Mono" w:cs="Cascadia Mono"/>
+          <w:sz w:val="19"/>
+          <w:szCs w:val="19"/>
+        </w:rPr>
+        <w:t xml:space="preserve">, </w:t>
+      </w:r>
+      <w:proofErr w:type="spellStart"/>
+      <w:r>
+        <w:rPr>
+          <w:rFonts w:ascii="Cascadia Mono" w:hAnsi="Cascadia Mono" w:cs="Cascadia Mono"/>
+          <w:sz w:val="19"/>
+          <w:szCs w:val="19"/>
+        </w:rPr>
+        <w:t>Time.deltaTime</w:t>
+      </w:r>
+      <w:proofErr w:type="spellEnd"/>
+      <w:r>
+        <w:rPr>
+          <w:rFonts w:ascii="Cascadia Mono" w:hAnsi="Cascadia Mono" w:cs="Cascadia Mono"/>
+          <w:sz w:val="19"/>
+          <w:szCs w:val="19"/>
+        </w:rPr>
+        <w:t xml:space="preserve"> * </w:t>
+      </w:r>
+      <w:proofErr w:type="spellStart"/>
+      <w:r>
+        <w:rPr>
+          <w:rFonts w:ascii="Cascadia Mono" w:hAnsi="Cascadia Mono" w:cs="Cascadia Mono"/>
+          <w:sz w:val="19"/>
+          <w:szCs w:val="19"/>
+        </w:rPr>
+        <w:t>enemyStats.chaseSpeed</w:t>
+      </w:r>
+      <w:proofErr w:type="spellEnd"/>
+      <w:proofErr w:type="gramStart"/>
+      <w:r>
+        <w:rPr>
+          <w:rFonts w:ascii="Cascadia Mono" w:hAnsi="Cascadia Mono" w:cs="Cascadia Mono"/>
+          <w:sz w:val="19"/>
+          <w:szCs w:val="19"/>
+        </w:rPr>
+        <w:t>);</w:t>
+      </w:r>
+      <w:proofErr w:type="gramEnd"/>
     </w:p>
     <w:p>
       <w:pPr>
@@ -5728,12 +7642,14 @@
       <w:r>
         <w:t xml:space="preserve">: </w:t>
       </w:r>
+      <w:proofErr w:type="gramStart"/>
       <w:r>
         <w:t xml:space="preserve">Scene </w:t>
       </w:r>
       <w:r>
         <w:t xml:space="preserve"> setup</w:t>
       </w:r>
+      <w:proofErr w:type="gramEnd"/>
     </w:p>
     <w:p>
       <w:pPr>
@@ -5767,14 +7683,24 @@
       </w:r>
     </w:p>
     <w:p>
+      <w:proofErr w:type="spellStart"/>
       <w:r>
         <w:t>ProBuilder</w:t>
       </w:r>
+      <w:proofErr w:type="spellEnd"/>
     </w:p>
     <w:p/>
     <w:p>
       <w:r>
-        <w:t>1. Create game design scene using prefab models.</w:t>
+        <w:t xml:space="preserve">1. Create game design </w:t>
+      </w:r>
+      <w:proofErr w:type="gramStart"/>
+      <w:r>
+        <w:t>scene</w:t>
+      </w:r>
+      <w:proofErr w:type="gramEnd"/>
+      <w:r>
+        <w:t xml:space="preserve"> using prefab models.</w:t>
       </w:r>
     </w:p>
     <w:p/>
@@ -5842,6 +7768,7 @@
       <w:r>
         <w:t xml:space="preserve">Add a </w:t>
       </w:r>
+      <w:proofErr w:type="spellStart"/>
       <w:r>
         <w:rPr>
           <w:b/>
@@ -5849,6 +7776,7 @@
         </w:rPr>
         <w:t>RigidBody</w:t>
       </w:r>
+      <w:proofErr w:type="spellEnd"/>
       <w:r>
         <w:t xml:space="preserve"> component to the player.</w:t>
       </w:r>
@@ -5862,7 +7790,15 @@
         </w:numPr>
       </w:pPr>
       <w:r>
-        <w:t>Freeze Rotation in X,Y and Z.</w:t>
+        <w:t xml:space="preserve">Freeze Rotation in </w:t>
+      </w:r>
+      <w:proofErr w:type="gramStart"/>
+      <w:r>
+        <w:t>X,Y</w:t>
+      </w:r>
+      <w:proofErr w:type="gramEnd"/>
+      <w:r>
+        <w:t xml:space="preserve"> and Z.</w:t>
       </w:r>
     </w:p>
     <w:p>
@@ -5914,7 +7850,15 @@
         </w:numPr>
       </w:pPr>
       <w:r>
-        <w:t>Add a following camera to the player</w:t>
+        <w:t xml:space="preserve">Add </w:t>
+      </w:r>
+      <w:proofErr w:type="gramStart"/>
+      <w:r>
+        <w:t>a following</w:t>
+      </w:r>
+      <w:proofErr w:type="gramEnd"/>
+      <w:r>
+        <w:t xml:space="preserve"> camera to the player</w:t>
       </w:r>
     </w:p>
     <w:p>
@@ -5926,7 +7870,33 @@
         </w:numPr>
       </w:pPr>
       <w:r>
-        <w:t>Under PLAYER &gt; R.click &gt; Cinemachine &gt; Targetted Camera &gt; Follow Camera</w:t>
+        <w:t xml:space="preserve">Under PLAYER &gt; </w:t>
+      </w:r>
+      <w:proofErr w:type="spellStart"/>
+      <w:proofErr w:type="gramStart"/>
+      <w:r>
+        <w:t>R.click</w:t>
+      </w:r>
+      <w:proofErr w:type="spellEnd"/>
+      <w:proofErr w:type="gramEnd"/>
+      <w:r>
+        <w:t xml:space="preserve"> &gt; </w:t>
+      </w:r>
+      <w:proofErr w:type="spellStart"/>
+      <w:r>
+        <w:t>Cinemachine</w:t>
+      </w:r>
+      <w:proofErr w:type="spellEnd"/>
+      <w:r>
+        <w:t xml:space="preserve"> &gt; </w:t>
+      </w:r>
+      <w:proofErr w:type="spellStart"/>
+      <w:r>
+        <w:t>Targetted</w:t>
+      </w:r>
+      <w:proofErr w:type="spellEnd"/>
+      <w:r>
+        <w:t xml:space="preserve"> Camera &gt; Follow Camera</w:t>
       </w:r>
     </w:p>
     <w:p>
@@ -5962,7 +7932,15 @@
         </w:numPr>
       </w:pPr>
       <w:r>
-        <w:t>Set Cinemachine Follow &gt; Follow offset: 0, 5, 10</w:t>
+        <w:t xml:space="preserve">Set </w:t>
+      </w:r>
+      <w:proofErr w:type="spellStart"/>
+      <w:r>
+        <w:t>Cinemachine</w:t>
+      </w:r>
+      <w:proofErr w:type="spellEnd"/>
+      <w:r>
+        <w:t xml:space="preserve"> Follow &gt; Follow offset: 0, 5, 10</w:t>
       </w:r>
     </w:p>
     <w:p>
@@ -5976,12 +7954,21 @@
       <w:r>
         <w:t xml:space="preserve">Add </w:t>
       </w:r>
+      <w:proofErr w:type="spellStart"/>
       <w:r>
         <w:rPr>
           <w:b/>
           <w:bCs/>
         </w:rPr>
-        <w:t>Cinemachine Brain</w:t>
+        <w:t>Cinemachine</w:t>
+      </w:r>
+      <w:proofErr w:type="spellEnd"/>
+      <w:r>
+        <w:rPr>
+          <w:b/>
+          <w:bCs/>
+        </w:rPr>
+        <w:t xml:space="preserve"> Brain</w:t>
       </w:r>
       <w:r>
         <w:rPr>
@@ -6118,7 +8105,23 @@
           <w:b/>
           <w:bCs/>
         </w:rPr>
-        <w:t xml:space="preserve">Sprite Renderer , </w:t>
+        <w:t xml:space="preserve">Sprite </w:t>
+      </w:r>
+      <w:proofErr w:type="gramStart"/>
+      <w:r>
+        <w:rPr>
+          <w:b/>
+          <w:bCs/>
+        </w:rPr>
+        <w:t>Renderer ,</w:t>
+      </w:r>
+      <w:proofErr w:type="gramEnd"/>
+      <w:r>
+        <w:rPr>
+          <w:b/>
+          <w:bCs/>
+        </w:rPr>
+        <w:t xml:space="preserve"> </w:t>
       </w:r>
       <w:r>
         <w:t>set</w:t>
@@ -6155,7 +8158,20 @@
         </w:numPr>
       </w:pPr>
       <w:r>
-        <w:t>Window &gt; Rendering &gt; Lighting &gt; set Lighting Settings Asset: Settings.lighting in Assets/Sprites.</w:t>
+        <w:t xml:space="preserve">Window &gt; Rendering &gt; Lighting &gt; set Lighting Settings Asset: </w:t>
+      </w:r>
+      <w:proofErr w:type="spellStart"/>
+      <w:r>
+        <w:t>Settings</w:t>
+      </w:r>
+      <w:proofErr w:type="gramStart"/>
+      <w:r>
+        <w:t>.lighting</w:t>
+      </w:r>
+      <w:proofErr w:type="spellEnd"/>
+      <w:proofErr w:type="gramEnd"/>
+      <w:r>
+        <w:t xml:space="preserve"> in Assets/Sprites.</w:t>
       </w:r>
     </w:p>
     <w:p>
@@ -6215,7 +8231,15 @@
       </w:pPr>
       <w:r>
         <w:lastRenderedPageBreak/>
-        <w:t>3.2.2 Session 2 : Scripting</w:t>
+        <w:t xml:space="preserve">3.2.2 Session </w:t>
+      </w:r>
+      <w:proofErr w:type="gramStart"/>
+      <w:r>
+        <w:t>2 :</w:t>
+      </w:r>
+      <w:proofErr w:type="gramEnd"/>
+      <w:r>
+        <w:t xml:space="preserve"> Scripting</w:t>
       </w:r>
     </w:p>
     <w:p/>
@@ -6233,7 +8257,15 @@
         </w:numPr>
       </w:pPr>
       <w:r>
-        <w:t>The skier should move by changing the velocity of the attached Rigidbody component</w:t>
+        <w:t xml:space="preserve">The skier should move by changing the velocity of the attached </w:t>
+      </w:r>
+      <w:proofErr w:type="spellStart"/>
+      <w:r>
+        <w:t>Rigidbody</w:t>
+      </w:r>
+      <w:proofErr w:type="spellEnd"/>
+      <w:r>
+        <w:t xml:space="preserve"> component</w:t>
       </w:r>
     </w:p>
     <w:p>
@@ -6269,7 +8301,15 @@
         </w:numPr>
       </w:pPr>
       <w:r>
-        <w:t>The skier should stop moving if they are turned at a full 90° angle</w:t>
+        <w:t xml:space="preserve">The </w:t>
+      </w:r>
+      <w:proofErr w:type="gramStart"/>
+      <w:r>
+        <w:t>skier</w:t>
+      </w:r>
+      <w:proofErr w:type="gramEnd"/>
+      <w:r>
+        <w:t xml:space="preserve"> should stop moving if they are turned at a full 90° angle</w:t>
       </w:r>
     </w:p>
     <w:p>
@@ -6305,8 +8345,13 @@
     <w:p/>
     <w:p>
       <w:r>
-        <w:t>Create PlayerController.cs</w:t>
-      </w:r>
+        <w:t xml:space="preserve">Create </w:t>
+      </w:r>
+      <w:proofErr w:type="spellStart"/>
+      <w:r>
+        <w:t>PlayerController.cs</w:t>
+      </w:r>
+      <w:proofErr w:type="spellEnd"/>
     </w:p>
     <w:p/>
     <w:p>
@@ -6335,6 +8380,7 @@
       <w:r>
         <w:t xml:space="preserve"> component from Player, </w:t>
       </w:r>
+      <w:proofErr w:type="spellStart"/>
       <w:r>
         <w:rPr>
           <w:b/>
@@ -6342,6 +8388,7 @@
         </w:rPr>
         <w:t>PlayerController</w:t>
       </w:r>
+      <w:proofErr w:type="spellEnd"/>
       <w:r>
         <w:t xml:space="preserve"> will handle it now.</w:t>
       </w:r>
@@ -6367,7 +8414,15 @@
         </w:numPr>
       </w:pPr>
       <w:r>
-        <w:t xml:space="preserve">Create an empty gameObject under </w:t>
+        <w:t xml:space="preserve">Create an empty </w:t>
+      </w:r>
+      <w:proofErr w:type="spellStart"/>
+      <w:r>
+        <w:t>gameObject</w:t>
+      </w:r>
+      <w:proofErr w:type="spellEnd"/>
+      <w:r>
+        <w:t xml:space="preserve"> under </w:t>
       </w:r>
       <w:r>
         <w:rPr>
@@ -6387,7 +8442,15 @@
         <w:t>Renam</w:t>
       </w:r>
       <w:r>
-        <w:t>e to “GroundCheck” &gt; Reset values.</w:t>
+        <w:t>e to “</w:t>
+      </w:r>
+      <w:proofErr w:type="spellStart"/>
+      <w:r>
+        <w:t>GroundCheck</w:t>
+      </w:r>
+      <w:proofErr w:type="spellEnd"/>
+      <w:r>
+        <w:t>” &gt; Reset values.</w:t>
       </w:r>
     </w:p>
     <w:p>
@@ -6423,7 +8486,17 @@
         </w:numPr>
       </w:pPr>
       <w:r>
-        <w:t>Set the gameobject in the player script.</w:t>
+        <w:t xml:space="preserve">Set the </w:t>
+      </w:r>
+      <w:proofErr w:type="spellStart"/>
+      <w:proofErr w:type="gramStart"/>
+      <w:r>
+        <w:t>gameobject</w:t>
+      </w:r>
+      <w:proofErr w:type="spellEnd"/>
+      <w:proofErr w:type="gramEnd"/>
+      <w:r>
+        <w:t xml:space="preserve"> in the player script.</w:t>
       </w:r>
     </w:p>
     <w:p>
@@ -6493,7 +8566,15 @@
         </w:numPr>
       </w:pPr>
       <w:r>
-        <w:t>Slow to fast.</w:t>
+        <w:t xml:space="preserve">Slow </w:t>
+      </w:r>
+      <w:proofErr w:type="gramStart"/>
+      <w:r>
+        <w:t>to</w:t>
+      </w:r>
+      <w:proofErr w:type="gramEnd"/>
+      <w:r>
+        <w:t xml:space="preserve"> fast.</w:t>
       </w:r>
     </w:p>
     <w:p>
@@ -6522,6 +8603,7 @@
       <w:r>
         <w:t xml:space="preserve">parameter </w:t>
       </w:r>
+      <w:proofErr w:type="spellStart"/>
       <w:r>
         <w:rPr>
           <w:b/>
@@ -6529,6 +8611,7 @@
         </w:rPr>
         <w:t>playerSpeed</w:t>
       </w:r>
+      <w:proofErr w:type="spellEnd"/>
       <w:r>
         <w:rPr>
           <w:b/>
@@ -6557,9 +8640,11 @@
           <w:numId w:val="523"/>
         </w:numPr>
       </w:pPr>
+      <w:proofErr w:type="spellStart"/>
       <w:r>
         <w:t>PlayerController.cs</w:t>
       </w:r>
+      <w:proofErr w:type="spellEnd"/>
     </w:p>
     <w:p>
       <w:pPr>
@@ -6587,7 +8672,35 @@
         <w:t xml:space="preserve">: </w:t>
       </w:r>
       <w:r>
-        <w:t>speed, maxSpeed,minSpeed, turnSpeed, turnAcc,turnDeacc.</w:t>
+        <w:t xml:space="preserve">speed, </w:t>
+      </w:r>
+      <w:proofErr w:type="spellStart"/>
+      <w:proofErr w:type="gramStart"/>
+      <w:r>
+        <w:t>maxSpeed,minSpeed</w:t>
+      </w:r>
+      <w:proofErr w:type="spellEnd"/>
+      <w:proofErr w:type="gramEnd"/>
+      <w:r>
+        <w:t xml:space="preserve">, </w:t>
+      </w:r>
+      <w:proofErr w:type="spellStart"/>
+      <w:r>
+        <w:t>turnSpeed</w:t>
+      </w:r>
+      <w:proofErr w:type="spellEnd"/>
+      <w:r>
+        <w:t xml:space="preserve">, </w:t>
+      </w:r>
+      <w:proofErr w:type="spellStart"/>
+      <w:proofErr w:type="gramStart"/>
+      <w:r>
+        <w:t>turnAcc,turnDeacc</w:t>
+      </w:r>
+      <w:proofErr w:type="spellEnd"/>
+      <w:proofErr w:type="gramEnd"/>
+      <w:r>
+        <w:t>.</w:t>
       </w:r>
     </w:p>
     <w:p>
@@ -6610,9 +8723,11 @@
           <w:numId w:val="523"/>
         </w:numPr>
       </w:pPr>
+      <w:proofErr w:type="spellStart"/>
       <w:r>
         <w:t>playerStats</w:t>
       </w:r>
+      <w:proofErr w:type="spellEnd"/>
     </w:p>
     <w:p>
       <w:pPr>
@@ -6622,9 +8737,19 @@
           <w:numId w:val="523"/>
         </w:numPr>
       </w:pPr>
-      <w:r>
-        <w:t>KeyCode, A,D</w:t>
-      </w:r>
+      <w:proofErr w:type="spellStart"/>
+      <w:r>
+        <w:t>KeyCode</w:t>
+      </w:r>
+      <w:proofErr w:type="spellEnd"/>
+      <w:r>
+        <w:t xml:space="preserve">, </w:t>
+      </w:r>
+      <w:proofErr w:type="gramStart"/>
+      <w:r>
+        <w:t>A,D</w:t>
+      </w:r>
+      <w:proofErr w:type="gramEnd"/>
     </w:p>
     <w:p>
       <w:pPr>
@@ -6635,8 +8760,15 @@
         </w:numPr>
       </w:pPr>
       <w:r>
-        <w:t>Bool isMoving</w:t>
-      </w:r>
+        <w:t xml:space="preserve">Bool </w:t>
+      </w:r>
+      <w:proofErr w:type="spellStart"/>
+      <w:proofErr w:type="gramStart"/>
+      <w:r>
+        <w:t>isMoving</w:t>
+      </w:r>
+      <w:proofErr w:type="spellEnd"/>
+      <w:proofErr w:type="gramEnd"/>
     </w:p>
     <w:p>
       <w:pPr>
@@ -6647,8 +8779,13 @@
         </w:numPr>
       </w:pPr>
       <w:r>
-        <w:t>Transform GroundCheck</w:t>
-      </w:r>
+        <w:t xml:space="preserve">Transform </w:t>
+      </w:r>
+      <w:proofErr w:type="spellStart"/>
+      <w:r>
+        <w:t>GroundCheck</w:t>
+      </w:r>
+      <w:proofErr w:type="spellEnd"/>
     </w:p>
     <w:p>
       <w:pPr>
@@ -6658,9 +8795,19 @@
           <w:numId w:val="523"/>
         </w:numPr>
       </w:pPr>
-      <w:r>
-        <w:t>LayerMask groundLayers</w:t>
-      </w:r>
+      <w:proofErr w:type="spellStart"/>
+      <w:r>
+        <w:t>LayerMask</w:t>
+      </w:r>
+      <w:proofErr w:type="spellEnd"/>
+      <w:r>
+        <w:t xml:space="preserve"> </w:t>
+      </w:r>
+      <w:proofErr w:type="spellStart"/>
+      <w:r>
+        <w:t>groundLayers</w:t>
+      </w:r>
+      <w:proofErr w:type="spellEnd"/>
     </w:p>
     <w:p>
       <w:pPr>
@@ -6670,9 +8817,19 @@
           <w:numId w:val="523"/>
         </w:numPr>
       </w:pPr>
-      <w:r>
-        <w:t>RigidBody rb</w:t>
-      </w:r>
+      <w:proofErr w:type="spellStart"/>
+      <w:r>
+        <w:t>RigidBody</w:t>
+      </w:r>
+      <w:proofErr w:type="spellEnd"/>
+      <w:r>
+        <w:t xml:space="preserve"> </w:t>
+      </w:r>
+      <w:proofErr w:type="spellStart"/>
+      <w:r>
+        <w:t>rb</w:t>
+      </w:r>
+      <w:proofErr w:type="spellEnd"/>
     </w:p>
     <w:p>
       <w:pPr>
@@ -6683,8 +8840,13 @@
         </w:numPr>
       </w:pPr>
       <w:r>
-        <w:t>Animator animator</w:t>
-      </w:r>
+        <w:t xml:space="preserve">Animator </w:t>
+      </w:r>
+      <w:proofErr w:type="spellStart"/>
+      <w:r>
+        <w:t>animator</w:t>
+      </w:r>
+      <w:proofErr w:type="spellEnd"/>
     </w:p>
     <w:p>
       <w:pPr>
@@ -6707,7 +8869,15 @@
         </w:numPr>
       </w:pPr>
       <w:r>
-        <w:t>Limit turn to extreme left and right.</w:t>
+        <w:t xml:space="preserve">Limit </w:t>
+      </w:r>
+      <w:proofErr w:type="gramStart"/>
+      <w:r>
+        <w:t>turn</w:t>
+      </w:r>
+      <w:proofErr w:type="gramEnd"/>
+      <w:r>
+        <w:t xml:space="preserve"> to extreme left and right.</w:t>
       </w:r>
     </w:p>
     <w:p>
@@ -6725,7 +8895,15 @@
     <w:p/>
     <w:p>
       <w:r>
-        <w:t>Refer PlayerController.cs for implementation.</w:t>
+        <w:t xml:space="preserve">Refer </w:t>
+      </w:r>
+      <w:proofErr w:type="spellStart"/>
+      <w:r>
+        <w:t>PlayerController.cs</w:t>
+      </w:r>
+      <w:proofErr w:type="spellEnd"/>
+      <w:r>
+        <w:t xml:space="preserve"> for implementation.</w:t>
       </w:r>
     </w:p>
     <w:p/>
@@ -6755,7 +8933,15 @@
         <w:ind w:left="0" w:firstLine="0"/>
       </w:pPr>
       <w:r>
-        <w:t>We will now implement unity’s new input system which offers much more flexibility for users.</w:t>
+        <w:t xml:space="preserve">We will now implement </w:t>
+      </w:r>
+      <w:proofErr w:type="gramStart"/>
+      <w:r>
+        <w:t>unity’s</w:t>
+      </w:r>
+      <w:proofErr w:type="gramEnd"/>
+      <w:r>
+        <w:t xml:space="preserve"> new input system which offers much more flexibility for users.</w:t>
       </w:r>
     </w:p>
     <w:p/>
@@ -6766,14 +8952,27 @@
       <w:r>
         <w:t xml:space="preserve">Instead of using </w:t>
       </w:r>
-      <w:r>
-        <w:t xml:space="preserve">KeyCode </w:t>
+      <w:proofErr w:type="spellStart"/>
+      <w:r>
+        <w:t>KeyCode</w:t>
+      </w:r>
+      <w:proofErr w:type="spellEnd"/>
+      <w:r>
+        <w:t xml:space="preserve"> </w:t>
       </w:r>
       <w:r>
         <w:t xml:space="preserve">in scripts, </w:t>
       </w:r>
       <w:r>
-        <w:t xml:space="preserve">we use OnMove method which gives movement messages regardless of </w:t>
+        <w:t xml:space="preserve">we use </w:t>
+      </w:r>
+      <w:proofErr w:type="spellStart"/>
+      <w:r>
+        <w:t>OnMove</w:t>
+      </w:r>
+      <w:proofErr w:type="spellEnd"/>
+      <w:r>
+        <w:t xml:space="preserve"> method which gives movement messages regardless of </w:t>
       </w:r>
       <w:r>
         <w:t xml:space="preserve">             </w:t>
@@ -6858,13 +9057,29 @@
         <w:t>Solution:</w:t>
       </w:r>
       <w:r>
-        <w:t xml:space="preserve"> See PlayerController.cs which uses new input system, the older one is </w:t>
+        <w:t xml:space="preserve"> See </w:t>
+      </w:r>
+      <w:proofErr w:type="spellStart"/>
+      <w:r>
+        <w:t>PlayerController.cs</w:t>
+      </w:r>
+      <w:proofErr w:type="spellEnd"/>
+      <w:r>
+        <w:t xml:space="preserve"> which uses new input system, the older one is </w:t>
       </w:r>
       <w:r>
         <w:t>named</w:t>
       </w:r>
       <w:r>
-        <w:t xml:space="preserve"> PlayerController_old.cs which uses legacy input system.</w:t>
+        <w:t xml:space="preserve"> </w:t>
+      </w:r>
+      <w:proofErr w:type="spellStart"/>
+      <w:r>
+        <w:t>PlayerController_old.cs</w:t>
+      </w:r>
+      <w:proofErr w:type="spellEnd"/>
+      <w:r>
+        <w:t xml:space="preserve"> which uses legacy input system.</w:t>
       </w:r>
     </w:p>
     <w:p>
@@ -6946,8 +9161,13 @@
           <w:numId w:val="526"/>
         </w:numPr>
       </w:pPr>
-      <w:r>
-        <w:t>Create a New Component that Destroys the Prefab After a Collision</w:t>
+      <w:proofErr w:type="gramStart"/>
+      <w:r>
+        <w:t>Create</w:t>
+      </w:r>
+      <w:proofErr w:type="gramEnd"/>
+      <w:r>
+        <w:t xml:space="preserve"> a New Component that Destroys the Prefab After a Collision</w:t>
       </w:r>
     </w:p>
     <w:p/>
@@ -7011,7 +9231,15 @@
         </w:rPr>
       </w:pPr>
       <w:r>
-        <w:t>Attach obstacle/RemovableObstacle script directly to the prefab itself.</w:t>
+        <w:t>Attach obstacle/</w:t>
+      </w:r>
+      <w:proofErr w:type="spellStart"/>
+      <w:r>
+        <w:t>RemovableObstacle</w:t>
+      </w:r>
+      <w:proofErr w:type="spellEnd"/>
+      <w:r>
+        <w:t xml:space="preserve"> script directly to the prefab itself.</w:t>
       </w:r>
     </w:p>
     <w:p>
@@ -7032,8 +9260,21 @@
       <w:r>
         <w:t xml:space="preserve">Trees, </w:t>
       </w:r>
-      <w:r>
-        <w:t>Snowmans, SnowBalls, etc.</w:t>
+      <w:proofErr w:type="spellStart"/>
+      <w:r>
+        <w:t>Snowmans</w:t>
+      </w:r>
+      <w:proofErr w:type="spellEnd"/>
+      <w:r>
+        <w:t xml:space="preserve">, </w:t>
+      </w:r>
+      <w:proofErr w:type="spellStart"/>
+      <w:r>
+        <w:t>SnowBalls</w:t>
+      </w:r>
+      <w:proofErr w:type="spellEnd"/>
+      <w:r>
+        <w:t>, etc.</w:t>
       </w:r>
     </w:p>
     <w:p>
@@ -7072,7 +9313,50 @@
           <w:b/>
           <w:bCs/>
         </w:rPr>
-        <w:t xml:space="preserve">Note: OnTriggerEnter() is called when gameobject’s </w:t>
+        <w:t xml:space="preserve">Note: </w:t>
+      </w:r>
+      <w:proofErr w:type="spellStart"/>
+      <w:proofErr w:type="gramStart"/>
+      <w:r>
+        <w:rPr>
+          <w:b/>
+          <w:bCs/>
+        </w:rPr>
+        <w:t>OnTriggerEnter</w:t>
+      </w:r>
+      <w:proofErr w:type="spellEnd"/>
+      <w:r>
+        <w:rPr>
+          <w:b/>
+          <w:bCs/>
+        </w:rPr>
+        <w:t>(</w:t>
+      </w:r>
+      <w:proofErr w:type="gramEnd"/>
+      <w:r>
+        <w:rPr>
+          <w:b/>
+          <w:bCs/>
+        </w:rPr>
+        <w:t xml:space="preserve">) is called when </w:t>
+      </w:r>
+      <w:proofErr w:type="spellStart"/>
+      <w:proofErr w:type="gramStart"/>
+      <w:r>
+        <w:rPr>
+          <w:b/>
+          <w:bCs/>
+        </w:rPr>
+        <w:t>gameobject’s</w:t>
+      </w:r>
+      <w:proofErr w:type="spellEnd"/>
+      <w:proofErr w:type="gramEnd"/>
+      <w:r>
+        <w:rPr>
+          <w:b/>
+          <w:bCs/>
+        </w:rPr>
+        <w:t xml:space="preserve"> </w:t>
       </w:r>
       <w:r>
         <w:rPr>
@@ -7132,7 +9416,15 @@
         <w:ind w:left="144" w:firstLine="0"/>
       </w:pPr>
       <w:r>
-        <w:t>We will learn about: implement event-driven interactions to create dynamic responses when the player collides with obstacles.</w:t>
+        <w:t xml:space="preserve">We will learn about: </w:t>
+      </w:r>
+      <w:proofErr w:type="gramStart"/>
+      <w:r>
+        <w:t>implement</w:t>
+      </w:r>
+      <w:proofErr w:type="gramEnd"/>
+      <w:r>
+        <w:t xml:space="preserve"> event-driven interactions to create dynamic responses when the player collides with obstacles.</w:t>
       </w:r>
     </w:p>
     <w:p>
@@ -7206,6 +9498,7 @@
       <w:r>
         <w:t xml:space="preserve">Create </w:t>
       </w:r>
+      <w:proofErr w:type="spellStart"/>
       <w:r>
         <w:rPr>
           <w:b/>
@@ -7213,6 +9506,7 @@
         </w:rPr>
         <w:t>PlayerEvents</w:t>
       </w:r>
+      <w:proofErr w:type="spellEnd"/>
       <w:r>
         <w:rPr>
           <w:b/>
@@ -7226,6 +9520,7 @@
       <w:r>
         <w:t xml:space="preserve">which will define </w:t>
       </w:r>
+      <w:proofErr w:type="spellStart"/>
       <w:r>
         <w:rPr>
           <w:b/>
@@ -7233,6 +9528,7 @@
         </w:rPr>
         <w:t>OnPlyerHit</w:t>
       </w:r>
+      <w:proofErr w:type="spellEnd"/>
       <w:r>
         <w:rPr>
           <w:b/>
@@ -7255,6 +9551,7 @@
       <w:r>
         <w:t xml:space="preserve">Create </w:t>
       </w:r>
+      <w:proofErr w:type="spellStart"/>
       <w:r>
         <w:rPr>
           <w:b/>
@@ -7262,6 +9559,7 @@
         </w:rPr>
         <w:t>PlayerDamage</w:t>
       </w:r>
+      <w:proofErr w:type="spellEnd"/>
       <w:r>
         <w:rPr>
           <w:b/>
@@ -7280,7 +9578,15 @@
         <w:t xml:space="preserve"> </w:t>
       </w:r>
       <w:r>
-        <w:t xml:space="preserve">which will subscribe to PlayerHit event </w:t>
+        <w:t xml:space="preserve">which will subscribe to </w:t>
+      </w:r>
+      <w:proofErr w:type="spellStart"/>
+      <w:r>
+        <w:t>PlayerHit</w:t>
+      </w:r>
+      <w:proofErr w:type="spellEnd"/>
+      <w:r>
+        <w:t xml:space="preserve"> event </w:t>
       </w:r>
     </w:p>
     <w:p>
@@ -7291,8 +9597,21 @@
           <w:numId w:val="530"/>
         </w:numPr>
       </w:pPr>
-      <w:r>
-        <w:t>Applies knockback physics on players RigidBody component.</w:t>
+      <w:proofErr w:type="gramStart"/>
+      <w:r>
+        <w:t>Applies</w:t>
+      </w:r>
+      <w:proofErr w:type="gramEnd"/>
+      <w:r>
+        <w:t xml:space="preserve"> knockback physics on players </w:t>
+      </w:r>
+      <w:proofErr w:type="spellStart"/>
+      <w:r>
+        <w:t>RigidBody</w:t>
+      </w:r>
+      <w:proofErr w:type="spellEnd"/>
+      <w:r>
+        <w:t xml:space="preserve"> component.</w:t>
       </w:r>
     </w:p>
     <w:p>
@@ -7303,8 +9622,13 @@
           <w:numId w:val="530"/>
         </w:numPr>
       </w:pPr>
-      <w:r>
-        <w:t>Updates player health.</w:t>
+      <w:proofErr w:type="gramStart"/>
+      <w:r>
+        <w:t>Updates player health</w:t>
+      </w:r>
+      <w:proofErr w:type="gramEnd"/>
+      <w:r>
+        <w:t>.</w:t>
       </w:r>
     </w:p>
     <w:p>
@@ -7345,7 +9669,15 @@
         <w:t xml:space="preserve"> </w:t>
       </w:r>
       <w:r>
-        <w:t>script inside OnCollisionEnter.</w:t>
+        <w:t xml:space="preserve">script inside </w:t>
+      </w:r>
+      <w:proofErr w:type="spellStart"/>
+      <w:r>
+        <w:t>OnCollisionEnter</w:t>
+      </w:r>
+      <w:proofErr w:type="spellEnd"/>
+      <w:r>
+        <w:t>.</w:t>
       </w:r>
     </w:p>
     <w:p>
@@ -7372,7 +9704,15 @@
         </w:numPr>
       </w:pPr>
       <w:r>
-        <w:t>Create an empty GameManager.</w:t>
+        <w:t xml:space="preserve">Create an empty </w:t>
+      </w:r>
+      <w:proofErr w:type="spellStart"/>
+      <w:r>
+        <w:t>GameManager</w:t>
+      </w:r>
+      <w:proofErr w:type="spellEnd"/>
+      <w:r>
+        <w:t>.</w:t>
       </w:r>
     </w:p>
     <w:p>
@@ -7401,8 +9741,17 @@
         <w:t xml:space="preserve"> </w:t>
       </w:r>
       <w:r>
-        <w:t xml:space="preserve">which subscribe to </w:t>
-      </w:r>
+        <w:t xml:space="preserve">which </w:t>
+      </w:r>
+      <w:proofErr w:type="gramStart"/>
+      <w:r>
+        <w:t>subscribe</w:t>
+      </w:r>
+      <w:proofErr w:type="gramEnd"/>
+      <w:r>
+        <w:t xml:space="preserve"> to </w:t>
+      </w:r>
+      <w:proofErr w:type="spellStart"/>
       <w:r>
         <w:rPr>
           <w:b/>
@@ -7410,6 +9759,7 @@
         </w:rPr>
         <w:t>PlayerHit</w:t>
       </w:r>
+      <w:proofErr w:type="spellEnd"/>
       <w:r>
         <w:t xml:space="preserve"> event.</w:t>
       </w:r>
@@ -7425,6 +9775,7 @@
       <w:r>
         <w:t xml:space="preserve">Create </w:t>
       </w:r>
+      <w:proofErr w:type="spellStart"/>
       <w:r>
         <w:rPr>
           <w:b/>
@@ -7432,6 +9783,7 @@
         </w:rPr>
         <w:t>AudioClip</w:t>
       </w:r>
+      <w:proofErr w:type="spellEnd"/>
       <w:r>
         <w:t xml:space="preserve"> public field and attach a .wav in unity.</w:t>
       </w:r>
@@ -7462,7 +9814,15 @@
         <w:t xml:space="preserve"> </w:t>
       </w:r>
       <w:r>
-        <w:t>script to the GameManager.</w:t>
+        <w:t xml:space="preserve">script to the </w:t>
+      </w:r>
+      <w:proofErr w:type="spellStart"/>
+      <w:r>
+        <w:t>GameManager</w:t>
+      </w:r>
+      <w:proofErr w:type="spellEnd"/>
+      <w:r>
+        <w:t>.</w:t>
       </w:r>
     </w:p>
     <w:p>
@@ -7476,6 +9836,7 @@
       <w:r>
         <w:t xml:space="preserve">Add </w:t>
       </w:r>
+      <w:proofErr w:type="spellStart"/>
       <w:r>
         <w:rPr>
           <w:b/>
@@ -7483,6 +9844,7 @@
         </w:rPr>
         <w:t>AudioSource</w:t>
       </w:r>
+      <w:proofErr w:type="spellEnd"/>
       <w:r>
         <w:rPr>
           <w:b/>
@@ -7490,9 +9852,15 @@
         </w:rPr>
         <w:t xml:space="preserve"> </w:t>
       </w:r>
-      <w:r>
-        <w:t xml:space="preserve">gameobject in </w:t>
-      </w:r>
+      <w:proofErr w:type="spellStart"/>
+      <w:r>
+        <w:t>gameobject</w:t>
+      </w:r>
+      <w:proofErr w:type="spellEnd"/>
+      <w:r>
+        <w:t xml:space="preserve"> in </w:t>
+      </w:r>
+      <w:proofErr w:type="spellStart"/>
       <w:r>
         <w:rPr>
           <w:b/>
@@ -7500,6 +9868,7 @@
         </w:rPr>
         <w:t>GameManager</w:t>
       </w:r>
+      <w:proofErr w:type="spellEnd"/>
       <w:r>
         <w:rPr>
           <w:b/>
@@ -7557,7 +9926,15 @@
         <w:t xml:space="preserve">: </w:t>
       </w:r>
       <w:r>
-        <w:t>Create Impluse of camera on collision</w:t>
+        <w:t xml:space="preserve">Create </w:t>
+      </w:r>
+      <w:proofErr w:type="spellStart"/>
+      <w:r>
+        <w:t>Impluse</w:t>
+      </w:r>
+      <w:proofErr w:type="spellEnd"/>
+      <w:r>
+        <w:t xml:space="preserve"> of camera on collision</w:t>
       </w:r>
     </w:p>
     <w:p>
@@ -7571,12 +9948,21 @@
       <w:r>
         <w:t xml:space="preserve">Add component </w:t>
       </w:r>
+      <w:proofErr w:type="spellStart"/>
       <w:r>
         <w:rPr>
           <w:b/>
           <w:bCs/>
         </w:rPr>
-        <w:t xml:space="preserve">Cinemachine Impulse Source </w:t>
+        <w:t>Cinemachine</w:t>
+      </w:r>
+      <w:proofErr w:type="spellEnd"/>
+      <w:r>
+        <w:rPr>
+          <w:b/>
+          <w:bCs/>
+        </w:rPr>
+        <w:t xml:space="preserve"> Impulse Source </w:t>
       </w:r>
       <w:r>
         <w:t xml:space="preserve">to the </w:t>
@@ -7600,12 +9986,21 @@
       <w:r>
         <w:t xml:space="preserve">Add component </w:t>
       </w:r>
+      <w:proofErr w:type="spellStart"/>
       <w:r>
         <w:rPr>
           <w:b/>
           <w:bCs/>
         </w:rPr>
-        <w:t xml:space="preserve">Cinemachine Impulse Listener </w:t>
+        <w:t>Cinemachine</w:t>
+      </w:r>
+      <w:proofErr w:type="spellEnd"/>
+      <w:r>
+        <w:rPr>
+          <w:b/>
+          <w:bCs/>
+        </w:rPr>
+        <w:t xml:space="preserve"> Impulse Listener </w:t>
       </w:r>
       <w:r>
         <w:t xml:space="preserve">to the </w:t>
@@ -7630,7 +10025,15 @@
         </w:numPr>
       </w:pPr>
       <w:r>
-        <w:t>Update Onstacle script: generate the impulse.</w:t>
+        <w:t xml:space="preserve">Update </w:t>
+      </w:r>
+      <w:proofErr w:type="spellStart"/>
+      <w:r>
+        <w:t>Onstacle</w:t>
+      </w:r>
+      <w:proofErr w:type="spellEnd"/>
+      <w:r>
+        <w:t xml:space="preserve"> script: generate the impulse.</w:t>
       </w:r>
     </w:p>
     <w:p>
@@ -7641,9 +10044,27 @@
           <w:numId w:val="530"/>
         </w:numPr>
       </w:pPr>
-      <w:r>
-        <w:t>player.GetComponent&lt;CinemachineImpulseSource&gt;().GenerateImpulse();</w:t>
-      </w:r>
+      <w:proofErr w:type="gramStart"/>
+      <w:r>
+        <w:t>player.GetComponent</w:t>
+      </w:r>
+      <w:proofErr w:type="gramEnd"/>
+      <w:r>
+        <w:t>&lt;CinemachineImpulseSource&gt;(</w:t>
+      </w:r>
+      <w:proofErr w:type="gramStart"/>
+      <w:r>
+        <w:t>).GenerateImpulse</w:t>
+      </w:r>
+      <w:proofErr w:type="gramEnd"/>
+      <w:r>
+        <w:t>(</w:t>
+      </w:r>
+      <w:proofErr w:type="gramStart"/>
+      <w:r>
+        <w:t>);</w:t>
+      </w:r>
+      <w:proofErr w:type="gramEnd"/>
     </w:p>
     <w:p>
       <w:r>
@@ -7683,10 +10104,18 @@
       </w:pPr>
       <w:r>
         <w:lastRenderedPageBreak/>
-        <w:t xml:space="preserve">3.3 Course 3: SkiGame </w:t>
-      </w:r>
-      <w:r>
-        <w:t>Race Elements</w:t>
+        <w:t xml:space="preserve">3.3 Course 3: </w:t>
+      </w:r>
+      <w:proofErr w:type="spellStart"/>
+      <w:r>
+        <w:t>SkiGame</w:t>
+      </w:r>
+      <w:proofErr w:type="spellEnd"/>
+      <w:r>
+        <w:t xml:space="preserve"> </w:t>
+      </w:r>
+      <w:r>
+        <w:t>in Action</w:t>
       </w:r>
     </w:p>
     <w:p>
@@ -7702,8 +10131,28 @@
     </w:p>
     <w:p>
       <w:pPr>
+        <w:pStyle w:val="Heading3"/>
         <w:ind w:left="0" w:firstLine="0"/>
       </w:pPr>
+      <w:proofErr w:type="gramStart"/>
+      <w:r>
+        <w:t>3.3.1 :</w:t>
+      </w:r>
+      <w:proofErr w:type="gramEnd"/>
+      <w:r>
+        <w:t xml:space="preserve"> </w:t>
+      </w:r>
+      <w:r>
+        <w:t xml:space="preserve">Session 1: </w:t>
+      </w:r>
+      <w:proofErr w:type="spellStart"/>
+      <w:r>
+        <w:t>SkiGame</w:t>
+      </w:r>
+      <w:proofErr w:type="spellEnd"/>
+      <w:r>
+        <w:t xml:space="preserve"> Race Elements</w:t>
+      </w:r>
     </w:p>
     <w:p>
       <w:pPr>
@@ -7749,7 +10198,15 @@
         </w:numPr>
       </w:pPr>
       <w:r>
-        <w:t>Add Blue and pink flags to pass thru – Add/Sub time panelty of 1 sec</w:t>
+        <w:t xml:space="preserve">Add Blue and pink flags to pass thru – Add/Sub time </w:t>
+      </w:r>
+      <w:proofErr w:type="spellStart"/>
+      <w:r>
+        <w:t>panelty</w:t>
+      </w:r>
+      <w:proofErr w:type="spellEnd"/>
+      <w:r>
+        <w:t xml:space="preserve"> of 1 sec</w:t>
       </w:r>
     </w:p>
     <w:p>
@@ -7760,8 +10217,21 @@
           <w:numId w:val="535"/>
         </w:numPr>
       </w:pPr>
-      <w:r>
-        <w:t>Player should pass thru left of blue flag and right of pink flag else add time penalty.</w:t>
+      <w:proofErr w:type="gramStart"/>
+      <w:r>
+        <w:t>Player</w:t>
+      </w:r>
+      <w:proofErr w:type="gramEnd"/>
+      <w:r>
+        <w:t xml:space="preserve"> should pass </w:t>
+      </w:r>
+      <w:proofErr w:type="gramStart"/>
+      <w:r>
+        <w:t>thru</w:t>
+      </w:r>
+      <w:proofErr w:type="gramEnd"/>
+      <w:r>
+        <w:t xml:space="preserve"> left of blue flag and right of pink flag else add time penalty.</w:t>
       </w:r>
     </w:p>
     <w:p>
@@ -7880,6 +10350,7 @@
       <w:r>
         <w:t xml:space="preserve">Create </w:t>
       </w:r>
+      <w:proofErr w:type="spellStart"/>
       <w:r>
         <w:rPr>
           <w:b/>
@@ -7887,6 +10358,7 @@
         </w:rPr>
         <w:t>GameEvents</w:t>
       </w:r>
+      <w:proofErr w:type="spellEnd"/>
       <w:r>
         <w:t xml:space="preserve"> script which has events for race start/stop, correct/incorrect pass.</w:t>
       </w:r>
@@ -7906,6 +10378,7 @@
       <w:r>
         <w:t xml:space="preserve">Create </w:t>
       </w:r>
+      <w:proofErr w:type="spellStart"/>
       <w:r>
         <w:rPr>
           <w:b/>
@@ -7913,9 +10386,11 @@
         </w:rPr>
         <w:t>PinkFlagAction</w:t>
       </w:r>
+      <w:proofErr w:type="spellEnd"/>
       <w:r>
         <w:t xml:space="preserve"> and </w:t>
       </w:r>
+      <w:proofErr w:type="spellStart"/>
       <w:r>
         <w:rPr>
           <w:b/>
@@ -7923,6 +10398,7 @@
         </w:rPr>
         <w:t>BlueFlagAction</w:t>
       </w:r>
+      <w:proofErr w:type="spellEnd"/>
       <w:r>
         <w:t xml:space="preserve"> scripts and invoke the events as per algo.</w:t>
       </w:r>
@@ -7942,6 +10418,7 @@
       <w:r>
         <w:t xml:space="preserve">Create </w:t>
       </w:r>
+      <w:proofErr w:type="spellStart"/>
       <w:r>
         <w:rPr>
           <w:b/>
@@ -7949,8 +10426,17 @@
         </w:rPr>
         <w:t>RaceTimer</w:t>
       </w:r>
-      <w:r>
-        <w:t xml:space="preserve"> script which manages and keep track of the game timings.</w:t>
+      <w:proofErr w:type="spellEnd"/>
+      <w:r>
+        <w:t xml:space="preserve"> script which manages and </w:t>
+      </w:r>
+      <w:proofErr w:type="gramStart"/>
+      <w:r>
+        <w:t>keep</w:t>
+      </w:r>
+      <w:proofErr w:type="gramEnd"/>
+      <w:r>
+        <w:t xml:space="preserve"> track of the game timings.</w:t>
       </w:r>
     </w:p>
     <w:p>
@@ -7965,8 +10451,13 @@
           <w:bCs/>
         </w:rPr>
       </w:pPr>
-      <w:r>
-        <w:t>Subscribe the game events and update time.</w:t>
+      <w:proofErr w:type="gramStart"/>
+      <w:r>
+        <w:t>Subscribe</w:t>
+      </w:r>
+      <w:proofErr w:type="gramEnd"/>
+      <w:r>
+        <w:t xml:space="preserve"> the game events and update time.</w:t>
       </w:r>
     </w:p>
     <w:p>
@@ -7981,8 +10472,13 @@
           <w:bCs/>
         </w:rPr>
       </w:pPr>
-      <w:r>
-        <w:t xml:space="preserve">Subscribe the game events in </w:t>
+      <w:proofErr w:type="gramStart"/>
+      <w:r>
+        <w:t>Subscribe</w:t>
+      </w:r>
+      <w:proofErr w:type="gramEnd"/>
+      <w:r>
+        <w:t xml:space="preserve"> the game events in </w:t>
       </w:r>
       <w:r>
         <w:rPr>
@@ -8018,7 +10514,15 @@
         <w:t>Box Colliders</w:t>
       </w:r>
       <w:r>
-        <w:t xml:space="preserve">, adjust its size and set </w:t>
+        <w:t xml:space="preserve">, adjust </w:t>
+      </w:r>
+      <w:proofErr w:type="gramStart"/>
+      <w:r>
+        <w:t>its</w:t>
+      </w:r>
+      <w:proofErr w:type="gramEnd"/>
+      <w:r>
+        <w:t xml:space="preserve"> size and set </w:t>
       </w:r>
       <w:r>
         <w:rPr>
@@ -8044,7 +10548,33 @@
         </w:rPr>
       </w:pPr>
       <w:r>
-        <w:t>Is Trigger generates OnCollisionEnter/Exit event once a gameobject collides with it irrespective of the unity’s physics engine.</w:t>
+        <w:t xml:space="preserve">Is Trigger </w:t>
+      </w:r>
+      <w:proofErr w:type="gramStart"/>
+      <w:r>
+        <w:t>generates</w:t>
+      </w:r>
+      <w:proofErr w:type="gramEnd"/>
+      <w:r>
+        <w:t xml:space="preserve"> </w:t>
+      </w:r>
+      <w:proofErr w:type="spellStart"/>
+      <w:r>
+        <w:t>OnCollisionEnter</w:t>
+      </w:r>
+      <w:proofErr w:type="spellEnd"/>
+      <w:r>
+        <w:t xml:space="preserve">/Exit event once a </w:t>
+      </w:r>
+      <w:proofErr w:type="spellStart"/>
+      <w:proofErr w:type="gramStart"/>
+      <w:r>
+        <w:t>gameobject</w:t>
+      </w:r>
+      <w:proofErr w:type="spellEnd"/>
+      <w:proofErr w:type="gramEnd"/>
+      <w:r>
+        <w:t xml:space="preserve"> collides with it irrespective of the unity’s physics engine.</w:t>
       </w:r>
     </w:p>
     <w:p>
@@ -8068,7 +10598,15 @@
         <w:t xml:space="preserve">Extra Challenge: </w:t>
       </w:r>
       <w:r>
-        <w:t>Create BoostFlag which increases the speed of the player for some time.</w:t>
+        <w:t xml:space="preserve">Create </w:t>
+      </w:r>
+      <w:proofErr w:type="spellStart"/>
+      <w:r>
+        <w:t>BoostFlag</w:t>
+      </w:r>
+      <w:proofErr w:type="spellEnd"/>
+      <w:r>
+        <w:t xml:space="preserve"> which increases the speed of the player for some time.</w:t>
       </w:r>
     </w:p>
     <w:p>
@@ -8117,6 +10655,7 @@
       <w:r>
         <w:t xml:space="preserve">Create a Coroutine called </w:t>
       </w:r>
+      <w:proofErr w:type="spellStart"/>
       <w:r>
         <w:rPr>
           <w:b/>
@@ -8129,10 +10668,26 @@
           <w:b/>
           <w:bCs/>
         </w:rPr>
-        <w:t xml:space="preserve">Speed </w:t>
-      </w:r>
-      <w:r>
-        <w:t>in PlayerController script.</w:t>
+        <w:t>Speed</w:t>
+      </w:r>
+      <w:proofErr w:type="spellEnd"/>
+      <w:r>
+        <w:rPr>
+          <w:b/>
+          <w:bCs/>
+        </w:rPr>
+        <w:t xml:space="preserve"> </w:t>
+      </w:r>
+      <w:r>
+        <w:t xml:space="preserve">in </w:t>
+      </w:r>
+      <w:proofErr w:type="spellStart"/>
+      <w:r>
+        <w:t>PlayerController</w:t>
+      </w:r>
+      <w:proofErr w:type="spellEnd"/>
+      <w:r>
+        <w:t xml:space="preserve"> script.</w:t>
       </w:r>
     </w:p>
     <w:p>
@@ -8144,7 +10699,15 @@
         </w:numPr>
       </w:pPr>
       <w:r>
-        <w:t xml:space="preserve">Coroutine is a simple IEnumerable method which contains </w:t>
+        <w:t xml:space="preserve">Coroutine is a simple </w:t>
+      </w:r>
+      <w:proofErr w:type="spellStart"/>
+      <w:r>
+        <w:t>IEnumerable</w:t>
+      </w:r>
+      <w:proofErr w:type="spellEnd"/>
+      <w:r>
+        <w:t xml:space="preserve"> method which contains </w:t>
       </w:r>
       <w:r>
         <w:rPr>
@@ -8175,6 +10738,7 @@
       <w:r>
         <w:t xml:space="preserve">Call the Coroutine from the </w:t>
       </w:r>
+      <w:proofErr w:type="spellStart"/>
       <w:r>
         <w:rPr>
           <w:b/>
@@ -8182,6 +10746,7 @@
         </w:rPr>
         <w:t>BoostFlagAction</w:t>
       </w:r>
+      <w:proofErr w:type="spellEnd"/>
       <w:r>
         <w:t xml:space="preserve"> script</w:t>
       </w:r>
@@ -8193,14 +10758,24 @@
       </w:r>
     </w:p>
     <w:p>
-      <w:pPr>
-        <w:ind w:left="0" w:firstLine="0"/>
-      </w:pPr>
+      <w:r>
+        <w:br w:type="page"/>
+      </w:r>
     </w:p>
     <w:p>
       <w:pPr>
+        <w:pStyle w:val="Heading3"/>
         <w:ind w:left="0" w:firstLine="0"/>
       </w:pPr>
+      <w:proofErr w:type="gramStart"/>
+      <w:r>
+        <w:lastRenderedPageBreak/>
+        <w:t>3.3.2 :</w:t>
+      </w:r>
+      <w:proofErr w:type="gramEnd"/>
+      <w:r>
+        <w:t xml:space="preserve"> Session 2: Switching Game States</w:t>
+      </w:r>
     </w:p>
     <w:p>
       <w:pPr>
@@ -8215,13 +10790,460 @@
           <w:bCs/>
         </w:rPr>
       </w:pPr>
+      <w:r>
+        <w:t xml:space="preserve">Follow Document: </w:t>
+      </w:r>
+      <w:r>
+        <w:rPr>
+          <w:b/>
+          <w:bCs/>
+        </w:rPr>
+        <w:t>Challenge 2_ Switching Game States.pdf</w:t>
+      </w:r>
     </w:p>
     <w:p>
       <w:pPr>
         <w:ind w:left="0" w:firstLine="0"/>
       </w:pPr>
     </w:p>
+    <w:p>
+      <w:pPr>
+        <w:ind w:left="0" w:firstLine="0"/>
+      </w:pPr>
+      <w:r>
+        <w:t xml:space="preserve">Challenge: </w:t>
+      </w:r>
+      <w:r>
+        <w:t>Implementing Transitions and State</w:t>
+      </w:r>
+      <w:r>
+        <w:t xml:space="preserve"> </w:t>
+      </w:r>
+      <w:r>
+        <w:t>Management</w:t>
+      </w:r>
+    </w:p>
+    <w:p>
+      <w:pPr>
+        <w:ind w:left="0" w:firstLine="0"/>
+      </w:pPr>
+      <w:r>
+        <w:t>Step 1: Create a Race Over Window</w:t>
+      </w:r>
+    </w:p>
+    <w:p>
+      <w:pPr>
+        <w:ind w:left="0" w:firstLine="0"/>
+      </w:pPr>
+      <w:r>
+        <w:t>Step 2: Implement UI Functions</w:t>
+      </w:r>
+    </w:p>
+    <w:p>
+      <w:pPr>
+        <w:ind w:left="0" w:firstLine="0"/>
+      </w:pPr>
+      <w:r>
+        <w:t>Step 3: Design Screen Transitions</w:t>
+      </w:r>
+    </w:p>
+    <w:p>
+      <w:pPr>
+        <w:ind w:left="0" w:firstLine="0"/>
+      </w:pPr>
+      <w:r>
+        <w:t>Step 4: Implement State Management</w:t>
+      </w:r>
+    </w:p>
+    <w:p>
+      <w:pPr>
+        <w:ind w:left="0" w:firstLine="0"/>
+      </w:pPr>
+    </w:p>
+    <w:p>
+      <w:pPr>
+        <w:ind w:left="0" w:firstLine="0"/>
+      </w:pPr>
+      <w:r>
+        <w:t>Solution:</w:t>
+      </w:r>
+    </w:p>
+    <w:p>
+      <w:pPr>
+        <w:ind w:left="0" w:firstLine="0"/>
+      </w:pPr>
+      <w:r>
+        <w:t xml:space="preserve">1. Create </w:t>
+      </w:r>
+      <w:proofErr w:type="spellStart"/>
+      <w:r>
+        <w:rPr>
+          <w:b/>
+          <w:bCs/>
+        </w:rPr>
+        <w:t>GameEvents</w:t>
+      </w:r>
+      <w:proofErr w:type="spellEnd"/>
+      <w:r>
+        <w:rPr>
+          <w:b/>
+          <w:bCs/>
+        </w:rPr>
+        <w:t xml:space="preserve">/ </w:t>
+      </w:r>
+      <w:proofErr w:type="spellStart"/>
+      <w:r>
+        <w:rPr>
+          <w:b/>
+          <w:bCs/>
+        </w:rPr>
+        <w:t>GameEvents</w:t>
+      </w:r>
+      <w:proofErr w:type="spellEnd"/>
+      <w:r>
+        <w:rPr>
+          <w:b/>
+          <w:bCs/>
+        </w:rPr>
+        <w:t xml:space="preserve"> </w:t>
+      </w:r>
+      <w:r>
+        <w:t>script which will contain events for race start, stop, retry race, next level, and quit game events.</w:t>
+      </w:r>
+    </w:p>
+    <w:p>
+      <w:pPr>
+        <w:ind w:left="0" w:firstLine="0"/>
+      </w:pPr>
+      <w:r>
+        <w:t xml:space="preserve">2. Create </w:t>
+      </w:r>
+      <w:proofErr w:type="spellStart"/>
+      <w:r>
+        <w:rPr>
+          <w:b/>
+          <w:bCs/>
+        </w:rPr>
+        <w:t>GameManager</w:t>
+      </w:r>
+      <w:proofErr w:type="spellEnd"/>
+      <w:r>
+        <w:rPr>
+          <w:b/>
+          <w:bCs/>
+        </w:rPr>
+        <w:t xml:space="preserve"> </w:t>
+      </w:r>
+      <w:r>
+        <w:t>script which will invoke these events based on either:</w:t>
+      </w:r>
+    </w:p>
+    <w:p>
+      <w:pPr>
+        <w:ind w:left="0" w:firstLine="0"/>
+      </w:pPr>
+      <w:r>
+        <w:tab/>
+        <w:t xml:space="preserve">a. Direct call to a method here from unity callback on button click </w:t>
+      </w:r>
+      <w:proofErr w:type="gramStart"/>
+      <w:r>
+        <w:t>event.</w:t>
+      </w:r>
+      <w:r>
+        <w:t>(</w:t>
+      </w:r>
+      <w:proofErr w:type="gramEnd"/>
+      <w:r>
+        <w:t>Shortcut)</w:t>
+      </w:r>
+    </w:p>
+    <w:p>
+      <w:pPr>
+        <w:ind w:left="0" w:firstLine="0"/>
+      </w:pPr>
+      <w:r>
+        <w:tab/>
+        <w:t xml:space="preserve">b. Create separate scripts </w:t>
+      </w:r>
+      <w:proofErr w:type="spellStart"/>
+      <w:r>
+        <w:rPr>
+          <w:b/>
+          <w:bCs/>
+        </w:rPr>
+        <w:t>RetryRaceHandler</w:t>
+      </w:r>
+      <w:proofErr w:type="spellEnd"/>
+      <w:r>
+        <w:rPr>
+          <w:b/>
+          <w:bCs/>
+        </w:rPr>
+        <w:t xml:space="preserve"> </w:t>
+      </w:r>
+      <w:r>
+        <w:t>and attach to button</w:t>
+      </w:r>
+      <w:r>
+        <w:t>’s</w:t>
+      </w:r>
+      <w:r>
+        <w:t xml:space="preserve"> </w:t>
+      </w:r>
+      <w:proofErr w:type="spellStart"/>
+      <w:proofErr w:type="gramStart"/>
+      <w:r>
+        <w:t>gameobject</w:t>
+      </w:r>
+      <w:proofErr w:type="spellEnd"/>
+      <w:proofErr w:type="gramEnd"/>
+      <w:r>
+        <w:t xml:space="preserve"> and listen to click </w:t>
+      </w:r>
+      <w:proofErr w:type="gramStart"/>
+      <w:r>
+        <w:t>inside  the</w:t>
+      </w:r>
+      <w:proofErr w:type="gramEnd"/>
+      <w:r>
+        <w:t xml:space="preserve"> script.(More robust approach.)</w:t>
+      </w:r>
+    </w:p>
+    <w:p>
+      <w:pPr>
+        <w:ind w:left="0" w:firstLine="0"/>
+      </w:pPr>
+      <w:r>
+        <w:t xml:space="preserve">3. Design a new scene or copy existing scene and </w:t>
+      </w:r>
+      <w:proofErr w:type="gramStart"/>
+      <w:r>
+        <w:t>rename</w:t>
+      </w:r>
+      <w:proofErr w:type="gramEnd"/>
+      <w:r>
+        <w:t xml:space="preserve"> to </w:t>
+      </w:r>
+      <w:r>
+        <w:rPr>
+          <w:b/>
+          <w:bCs/>
+        </w:rPr>
+        <w:t>Level2_Scene</w:t>
+      </w:r>
+      <w:r>
+        <w:rPr>
+          <w:b/>
+          <w:bCs/>
+        </w:rPr>
+        <w:t>.</w:t>
+      </w:r>
+    </w:p>
+    <w:p>
+      <w:pPr>
+        <w:ind w:left="0" w:firstLine="0"/>
+      </w:pPr>
+    </w:p>
+    <w:p>
+      <w:pPr>
+        <w:ind w:left="0" w:firstLine="0"/>
+        <w:rPr>
+          <w:b/>
+          <w:bCs/>
+        </w:rPr>
+      </w:pPr>
+      <w:r>
+        <w:rPr>
+          <w:b/>
+          <w:bCs/>
+        </w:rPr>
+        <w:t>Extra Challenge:</w:t>
+      </w:r>
+    </w:p>
+    <w:p>
+      <w:pPr>
+        <w:ind w:left="0" w:firstLine="0"/>
+      </w:pPr>
+      <w:r>
+        <w:t xml:space="preserve">Add a </w:t>
+      </w:r>
+      <w:proofErr w:type="gramStart"/>
+      <w:r>
+        <w:t>“ Are</w:t>
+      </w:r>
+      <w:proofErr w:type="gramEnd"/>
+      <w:r>
+        <w:t xml:space="preserve"> you Sure” to the exit sequence to confirm that the users really want to exit the game. Consider how this can be built into the existing UI menu</w:t>
+      </w:r>
+      <w:r>
+        <w:t>.</w:t>
+      </w:r>
+    </w:p>
+    <w:p>
+      <w:pPr>
+        <w:ind w:left="0" w:firstLine="0"/>
+      </w:pPr>
+    </w:p>
+    <w:p>
+      <w:pPr>
+        <w:ind w:left="0" w:firstLine="0"/>
+        <w:rPr>
+          <w:b/>
+          <w:bCs/>
+        </w:rPr>
+      </w:pPr>
+      <w:r>
+        <w:rPr>
+          <w:b/>
+          <w:bCs/>
+        </w:rPr>
+        <w:t>Solution:</w:t>
+      </w:r>
+    </w:p>
+    <w:p>
+      <w:pPr>
+        <w:ind w:left="0" w:firstLine="0"/>
+      </w:pPr>
+      <w:r>
+        <w:t xml:space="preserve">1. Create a </w:t>
+      </w:r>
+      <w:proofErr w:type="spellStart"/>
+      <w:r>
+        <w:t>QuitGamePanel</w:t>
+      </w:r>
+      <w:proofErr w:type="spellEnd"/>
+      <w:r>
+        <w:t xml:space="preserve"> &gt; Adjust BG color etc.</w:t>
+      </w:r>
+    </w:p>
+    <w:p>
+      <w:pPr>
+        <w:ind w:left="0" w:firstLine="0"/>
+      </w:pPr>
+      <w:r>
+        <w:t xml:space="preserve">2. Add 2 buttons Yes/ No and a </w:t>
+      </w:r>
+      <w:proofErr w:type="gramStart"/>
+      <w:r>
+        <w:t>text :</w:t>
+      </w:r>
+      <w:proofErr w:type="gramEnd"/>
+      <w:r>
+        <w:t xml:space="preserve"> “Are you sure”</w:t>
+      </w:r>
+    </w:p>
+    <w:p>
+      <w:pPr>
+        <w:ind w:left="0" w:firstLine="0"/>
+      </w:pPr>
+      <w:r>
+        <w:t xml:space="preserve">3. Create an event On </w:t>
+      </w:r>
+      <w:proofErr w:type="spellStart"/>
+      <w:r>
+        <w:t>QuitGameOk</w:t>
+      </w:r>
+      <w:proofErr w:type="spellEnd"/>
+      <w:r>
+        <w:t xml:space="preserve"> and </w:t>
+      </w:r>
+      <w:proofErr w:type="spellStart"/>
+      <w:r>
+        <w:t>QuitGameCancel</w:t>
+      </w:r>
+      <w:proofErr w:type="spellEnd"/>
+      <w:r>
+        <w:t>.</w:t>
+      </w:r>
+    </w:p>
+    <w:p>
+      <w:pPr>
+        <w:ind w:left="0" w:firstLine="0"/>
+      </w:pPr>
+      <w:r>
+        <w:t xml:space="preserve">4. Inside </w:t>
+      </w:r>
+      <w:proofErr w:type="spellStart"/>
+      <w:r>
+        <w:t>QuitGameHandler</w:t>
+      </w:r>
+      <w:proofErr w:type="spellEnd"/>
+      <w:r>
+        <w:t xml:space="preserve"> script invoke relevant events.</w:t>
+      </w:r>
+    </w:p>
+    <w:p>
+      <w:pPr>
+        <w:ind w:left="0" w:firstLine="0"/>
+      </w:pPr>
+      <w:r>
+        <w:t>5. Enable/disable panel on events.</w:t>
+      </w:r>
+    </w:p>
+    <w:p>
+      <w:r>
+        <w:br w:type="page"/>
+      </w:r>
+    </w:p>
+    <w:p>
+      <w:pPr>
+        <w:pStyle w:val="Heading3"/>
+      </w:pPr>
+      <w:proofErr w:type="gramStart"/>
+      <w:r>
+        <w:lastRenderedPageBreak/>
+        <w:t>3.3.3 :</w:t>
+      </w:r>
+      <w:proofErr w:type="gramEnd"/>
+      <w:r>
+        <w:t xml:space="preserve"> Session 3: Save Game</w:t>
+      </w:r>
+    </w:p>
     <w:p/>
+    <w:p>
+      <w:proofErr w:type="gramStart"/>
+      <w:r>
+        <w:t>Follow</w:t>
+      </w:r>
+      <w:proofErr w:type="gramEnd"/>
+      <w:r>
+        <w:t xml:space="preserve"> document: </w:t>
+      </w:r>
+      <w:r>
+        <w:rPr>
+          <w:b/>
+          <w:bCs/>
+        </w:rPr>
+        <w:t>Challenge 3_ Data Persistence.pdf</w:t>
+      </w:r>
+    </w:p>
+    <w:p/>
+    <w:p>
+      <w:proofErr w:type="gramStart"/>
+      <w:r>
+        <w:rPr>
+          <w:b/>
+          <w:bCs/>
+        </w:rPr>
+        <w:t>Challenge</w:t>
+      </w:r>
+      <w:r>
+        <w:t xml:space="preserve"> :</w:t>
+      </w:r>
+      <w:proofErr w:type="gramEnd"/>
+      <w:r>
+        <w:t xml:space="preserve"> </w:t>
+      </w:r>
+      <w:r>
+        <w:t xml:space="preserve">Save data between scenes and between sessions using approaches such as static variables and </w:t>
+      </w:r>
+      <w:proofErr w:type="spellStart"/>
+      <w:r>
+        <w:t>PlayerPrefs</w:t>
+      </w:r>
+      <w:proofErr w:type="spellEnd"/>
+    </w:p>
     <w:sectPr>
       <w:footerReference w:type="default" r:id="rId9"/>
       <w:pgSz w:w="12240" w:h="15840"/>

</xml_diff>

<commit_message>
Improved flag actions to once, updated race timer to add penalty time, improved collision detection setting Continous dynamic collision detection, adjusted invisible borders.
</commit_message>
<xml_diff>
--- a/Documentation/Unity Associate Programmer.docx
+++ b/Documentation/Unity Associate Programmer.docx
@@ -9609,6 +9609,9 @@
         </w:rPr>
       </w:pPr>
       <w:r>
+        <w:rPr>
+          <w:noProof/>
+        </w:rPr>
         <w:lastRenderedPageBreak/>
         <w:drawing>
           <wp:anchor distT="0" distB="0" distL="114300" distR="114300" simplePos="0" relativeHeight="251659264" behindDoc="1" locked="0" layoutInCell="1" allowOverlap="1" wp14:anchorId="71E59359" wp14:editId="5D6D8785">
@@ -9675,6 +9678,9 @@
         </w:drawing>
       </w:r>
       <w:r>
+        <w:rPr>
+          <w:noProof/>
+        </w:rPr>
         <w:drawing>
           <wp:anchor distT="0" distB="0" distL="114300" distR="114300" simplePos="0" relativeHeight="251658240" behindDoc="0" locked="0" layoutInCell="1" allowOverlap="1" wp14:anchorId="456796CF" wp14:editId="0A0429B1">
             <wp:simplePos x="0" y="0"/>
@@ -9846,11 +9852,169 @@
       </w:r>
     </w:p>
     <w:p>
+      <w:r>
+        <w:br w:type="page"/>
+      </w:r>
+    </w:p>
+    <w:p>
+      <w:pPr>
+        <w:pStyle w:val="Heading3"/>
+        <w:numPr>
+          <w:ilvl w:val="2"/>
+          <w:numId w:val="548"/>
+        </w:numPr>
+      </w:pPr>
+      <w:r>
+        <w:lastRenderedPageBreak/>
+        <w:t xml:space="preserve">: Session 5: </w:t>
+      </w:r>
+      <w:r>
+        <w:t>Builds</w:t>
+      </w:r>
+    </w:p>
+    <w:p>
+      <w:pPr>
+        <w:ind w:left="144" w:firstLine="0"/>
+      </w:pPr>
+    </w:p>
+    <w:p>
+      <w:pPr>
+        <w:ind w:left="0" w:firstLine="0"/>
+      </w:pPr>
+      <w:r>
+        <w:t>Let’s give a Build to our project.</w:t>
+      </w:r>
+    </w:p>
+    <w:p>
+      <w:pPr>
+        <w:ind w:left="144" w:firstLine="0"/>
+      </w:pPr>
+    </w:p>
+    <w:p>
+      <w:pPr>
+        <w:ind w:left="0" w:firstLine="0"/>
+      </w:pPr>
+      <w:r>
+        <w:t>Steps:</w:t>
+      </w:r>
+    </w:p>
+    <w:p>
       <w:pPr>
         <w:pStyle w:val="ListParagraph"/>
-        <w:ind w:left="360" w:firstLine="0"/>
-      </w:pPr>
-    </w:p>
+        <w:numPr>
+          <w:ilvl w:val="0"/>
+          <w:numId w:val="555"/>
+        </w:numPr>
+      </w:pPr>
+      <w:r>
+        <w:t>File &gt; Build Profiles.</w:t>
+      </w:r>
+    </w:p>
+    <w:p>
+      <w:pPr>
+        <w:pStyle w:val="ListParagraph"/>
+        <w:numPr>
+          <w:ilvl w:val="0"/>
+          <w:numId w:val="555"/>
+        </w:numPr>
+      </w:pPr>
+      <w:r>
+        <w:t>Select Scenes from the scene list.</w:t>
+      </w:r>
+    </w:p>
+    <w:p>
+      <w:pPr>
+        <w:pStyle w:val="ListParagraph"/>
+        <w:numPr>
+          <w:ilvl w:val="0"/>
+          <w:numId w:val="555"/>
+        </w:numPr>
+      </w:pPr>
+      <w:r>
+        <w:t>Open Scene list and select the scenes to be included.</w:t>
+      </w:r>
+    </w:p>
+    <w:p>
+      <w:pPr>
+        <w:pStyle w:val="ListParagraph"/>
+        <w:numPr>
+          <w:ilvl w:val="0"/>
+          <w:numId w:val="555"/>
+        </w:numPr>
+      </w:pPr>
+      <w:r>
+        <w:t>Check Development Build (Optional for logging/debugging).</w:t>
+      </w:r>
+    </w:p>
+    <w:p>
+      <w:pPr>
+        <w:pStyle w:val="ListParagraph"/>
+        <w:numPr>
+          <w:ilvl w:val="1"/>
+          <w:numId w:val="555"/>
+        </w:numPr>
+      </w:pPr>
+      <w:r>
+        <w:t>Dev build can be inspected by the profiler tool and preserve debugging.</w:t>
+      </w:r>
+    </w:p>
+    <w:p>
+      <w:pPr>
+        <w:pStyle w:val="ListParagraph"/>
+        <w:numPr>
+          <w:ilvl w:val="0"/>
+          <w:numId w:val="555"/>
+        </w:numPr>
+      </w:pPr>
+      <w:r>
+        <w:t xml:space="preserve">Click </w:t>
+      </w:r>
+      <w:r>
+        <w:rPr>
+          <w:b/>
+          <w:bCs/>
+        </w:rPr>
+        <w:t>Build</w:t>
+      </w:r>
+      <w:r>
+        <w:t xml:space="preserve"> on top right.</w:t>
+      </w:r>
+    </w:p>
+    <w:p>
+      <w:pPr>
+        <w:pStyle w:val="ListParagraph"/>
+        <w:numPr>
+          <w:ilvl w:val="0"/>
+          <w:numId w:val="555"/>
+        </w:numPr>
+      </w:pPr>
+      <w:r>
+        <w:t xml:space="preserve">Select a path to save.(Create a folder </w:t>
+      </w:r>
+      <w:r>
+        <w:rPr>
+          <w:i/>
+          <w:iCs/>
+        </w:rPr>
+        <w:t>Builds</w:t>
+      </w:r>
+      <w:r>
+        <w:t xml:space="preserve"> inside the project root.</w:t>
+      </w:r>
+    </w:p>
+    <w:p>
+      <w:pPr>
+        <w:pStyle w:val="ListParagraph"/>
+        <w:numPr>
+          <w:ilvl w:val="0"/>
+          <w:numId w:val="555"/>
+        </w:numPr>
+      </w:pPr>
+      <w:r>
+        <w:t>Optionally create folders for versioning.</w:t>
+      </w:r>
+    </w:p>
+    <w:p/>
     <w:sectPr>
       <w:footerReference w:type="default" r:id="rId11"/>
       <w:pgSz w:w="12240" w:h="15840"/>
@@ -11512,9 +11676,9 @@
   </w:abstractNum>
   <w:abstractNum w:abstractNumId="12" w15:restartNumberingAfterBreak="0">
     <w:nsid w:val="0720142C"/>
-    <w:multiLevelType w:val="hybridMultilevel"/>
-    <w:tmpl w:val="2B141F3A"/>
-    <w:lvl w:ilvl="0" w:tplc="0409000F">
+    <w:multiLevelType w:val="multilevel"/>
+    <w:tmpl w:val="56EE3C20"/>
+    <w:lvl w:ilvl="0">
       <w:start w:val="1"/>
       <w:numFmt w:val="decimal"/>
       <w:lvlText w:val="%1."/>
@@ -11523,77 +11687,109 @@
         <w:ind w:left="360" w:hanging="360"/>
       </w:pPr>
     </w:lvl>
-    <w:lvl w:ilvl="1" w:tplc="04090019" w:tentative="1">
-      <w:start w:val="1"/>
-      <w:numFmt w:val="lowerLetter"/>
-      <w:lvlText w:val="%2."/>
-      <w:lvlJc w:val="left"/>
-      <w:pPr>
-        <w:ind w:left="1080" w:hanging="360"/>
-      </w:pPr>
-    </w:lvl>
-    <w:lvl w:ilvl="2" w:tplc="0409001B" w:tentative="1">
-      <w:start w:val="1"/>
-      <w:numFmt w:val="lowerRoman"/>
-      <w:lvlText w:val="%3."/>
-      <w:lvlJc w:val="right"/>
-      <w:pPr>
-        <w:ind w:left="1800" w:hanging="180"/>
-      </w:pPr>
-    </w:lvl>
-    <w:lvl w:ilvl="3" w:tplc="0409000F" w:tentative="1">
-      <w:start w:val="1"/>
+    <w:lvl w:ilvl="1">
+      <w:start w:val="3"/>
       <w:numFmt w:val="decimal"/>
-      <w:lvlText w:val="%4."/>
-      <w:lvlJc w:val="left"/>
-      <w:pPr>
-        <w:ind w:left="2520" w:hanging="360"/>
-      </w:pPr>
-    </w:lvl>
-    <w:lvl w:ilvl="4" w:tplc="04090019" w:tentative="1">
-      <w:start w:val="1"/>
-      <w:numFmt w:val="lowerLetter"/>
-      <w:lvlText w:val="%5."/>
-      <w:lvlJc w:val="left"/>
-      <w:pPr>
-        <w:ind w:left="3240" w:hanging="360"/>
-      </w:pPr>
-    </w:lvl>
-    <w:lvl w:ilvl="5" w:tplc="0409001B" w:tentative="1">
-      <w:start w:val="1"/>
-      <w:numFmt w:val="lowerRoman"/>
-      <w:lvlText w:val="%6."/>
-      <w:lvlJc w:val="right"/>
-      <w:pPr>
-        <w:ind w:left="3960" w:hanging="180"/>
-      </w:pPr>
-    </w:lvl>
-    <w:lvl w:ilvl="6" w:tplc="0409000F" w:tentative="1">
-      <w:start w:val="1"/>
+      <w:isLgl/>
+      <w:lvlText w:val="%1.%2"/>
+      <w:lvlJc w:val="left"/>
+      <w:pPr>
+        <w:ind w:left="687" w:hanging="615"/>
+      </w:pPr>
+      <w:rPr>
+        <w:rFonts w:hint="default"/>
+      </w:rPr>
+    </w:lvl>
+    <w:lvl w:ilvl="2">
+      <w:start w:val="5"/>
       <w:numFmt w:val="decimal"/>
-      <w:lvlText w:val="%7."/>
-      <w:lvlJc w:val="left"/>
-      <w:pPr>
-        <w:ind w:left="4680" w:hanging="360"/>
-      </w:pPr>
-    </w:lvl>
-    <w:lvl w:ilvl="7" w:tplc="04090019" w:tentative="1">
-      <w:start w:val="1"/>
-      <w:numFmt w:val="lowerLetter"/>
-      <w:lvlText w:val="%8."/>
-      <w:lvlJc w:val="left"/>
-      <w:pPr>
-        <w:ind w:left="5400" w:hanging="360"/>
-      </w:pPr>
-    </w:lvl>
-    <w:lvl w:ilvl="8" w:tplc="0409001B" w:tentative="1">
-      <w:start w:val="1"/>
-      <w:numFmt w:val="lowerRoman"/>
-      <w:lvlText w:val="%9."/>
-      <w:lvlJc w:val="right"/>
-      <w:pPr>
-        <w:ind w:left="6120" w:hanging="180"/>
-      </w:pPr>
+      <w:isLgl/>
+      <w:lvlText w:val="%1.%2.%3"/>
+      <w:lvlJc w:val="left"/>
+      <w:pPr>
+        <w:ind w:left="864" w:hanging="720"/>
+      </w:pPr>
+      <w:rPr>
+        <w:rFonts w:hint="default"/>
+      </w:rPr>
+    </w:lvl>
+    <w:lvl w:ilvl="3">
+      <w:start w:val="1"/>
+      <w:numFmt w:val="decimal"/>
+      <w:isLgl/>
+      <w:lvlText w:val="%1.%2.%3.%4"/>
+      <w:lvlJc w:val="left"/>
+      <w:pPr>
+        <w:ind w:left="936" w:hanging="720"/>
+      </w:pPr>
+      <w:rPr>
+        <w:rFonts w:hint="default"/>
+      </w:rPr>
+    </w:lvl>
+    <w:lvl w:ilvl="4">
+      <w:start w:val="1"/>
+      <w:numFmt w:val="decimal"/>
+      <w:isLgl/>
+      <w:lvlText w:val="%1.%2.%3.%4.%5"/>
+      <w:lvlJc w:val="left"/>
+      <w:pPr>
+        <w:ind w:left="1368" w:hanging="1080"/>
+      </w:pPr>
+      <w:rPr>
+        <w:rFonts w:hint="default"/>
+      </w:rPr>
+    </w:lvl>
+    <w:lvl w:ilvl="5">
+      <w:start w:val="1"/>
+      <w:numFmt w:val="decimal"/>
+      <w:isLgl/>
+      <w:lvlText w:val="%1.%2.%3.%4.%5.%6"/>
+      <w:lvlJc w:val="left"/>
+      <w:pPr>
+        <w:ind w:left="1440" w:hanging="1080"/>
+      </w:pPr>
+      <w:rPr>
+        <w:rFonts w:hint="default"/>
+      </w:rPr>
+    </w:lvl>
+    <w:lvl w:ilvl="6">
+      <w:start w:val="1"/>
+      <w:numFmt w:val="decimal"/>
+      <w:isLgl/>
+      <w:lvlText w:val="%1.%2.%3.%4.%5.%6.%7"/>
+      <w:lvlJc w:val="left"/>
+      <w:pPr>
+        <w:ind w:left="1872" w:hanging="1440"/>
+      </w:pPr>
+      <w:rPr>
+        <w:rFonts w:hint="default"/>
+      </w:rPr>
+    </w:lvl>
+    <w:lvl w:ilvl="7">
+      <w:start w:val="1"/>
+      <w:numFmt w:val="decimal"/>
+      <w:isLgl/>
+      <w:lvlText w:val="%1.%2.%3.%4.%5.%6.%7.%8"/>
+      <w:lvlJc w:val="left"/>
+      <w:pPr>
+        <w:ind w:left="1944" w:hanging="1440"/>
+      </w:pPr>
+      <w:rPr>
+        <w:rFonts w:hint="default"/>
+      </w:rPr>
+    </w:lvl>
+    <w:lvl w:ilvl="8">
+      <w:start w:val="1"/>
+      <w:numFmt w:val="decimal"/>
+      <w:isLgl/>
+      <w:lvlText w:val="%1.%2.%3.%4.%5.%6.%7.%8.%9"/>
+      <w:lvlJc w:val="left"/>
+      <w:pPr>
+        <w:ind w:left="2376" w:hanging="1800"/>
+      </w:pPr>
+      <w:rPr>
+        <w:rFonts w:hint="default"/>
+      </w:rPr>
     </w:lvl>
   </w:abstractNum>
   <w:abstractNum w:abstractNumId="13" w15:restartNumberingAfterBreak="0">
@@ -32671,6 +32867,92 @@
     </w:lvl>
   </w:abstractNum>
   <w:abstractNum w:abstractNumId="173" w15:restartNumberingAfterBreak="0">
+    <w:nsid w:val="5EC864FB"/>
+    <w:multiLevelType w:val="multilevel"/>
+    <w:tmpl w:val="0409001D"/>
+    <w:lvl w:ilvl="0">
+      <w:start w:val="1"/>
+      <w:numFmt w:val="decimal"/>
+      <w:lvlText w:val="%1)"/>
+      <w:lvlJc w:val="left"/>
+      <w:pPr>
+        <w:ind w:left="360" w:hanging="360"/>
+      </w:pPr>
+    </w:lvl>
+    <w:lvl w:ilvl="1">
+      <w:start w:val="1"/>
+      <w:numFmt w:val="lowerLetter"/>
+      <w:lvlText w:val="%2)"/>
+      <w:lvlJc w:val="left"/>
+      <w:pPr>
+        <w:ind w:left="720" w:hanging="360"/>
+      </w:pPr>
+    </w:lvl>
+    <w:lvl w:ilvl="2">
+      <w:start w:val="1"/>
+      <w:numFmt w:val="lowerRoman"/>
+      <w:lvlText w:val="%3)"/>
+      <w:lvlJc w:val="left"/>
+      <w:pPr>
+        <w:ind w:left="1080" w:hanging="360"/>
+      </w:pPr>
+    </w:lvl>
+    <w:lvl w:ilvl="3">
+      <w:start w:val="1"/>
+      <w:numFmt w:val="decimal"/>
+      <w:lvlText w:val="(%4)"/>
+      <w:lvlJc w:val="left"/>
+      <w:pPr>
+        <w:ind w:left="1440" w:hanging="360"/>
+      </w:pPr>
+    </w:lvl>
+    <w:lvl w:ilvl="4">
+      <w:start w:val="1"/>
+      <w:numFmt w:val="lowerLetter"/>
+      <w:lvlText w:val="(%5)"/>
+      <w:lvlJc w:val="left"/>
+      <w:pPr>
+        <w:ind w:left="1800" w:hanging="360"/>
+      </w:pPr>
+    </w:lvl>
+    <w:lvl w:ilvl="5">
+      <w:start w:val="1"/>
+      <w:numFmt w:val="lowerRoman"/>
+      <w:lvlText w:val="(%6)"/>
+      <w:lvlJc w:val="left"/>
+      <w:pPr>
+        <w:ind w:left="2160" w:hanging="360"/>
+      </w:pPr>
+    </w:lvl>
+    <w:lvl w:ilvl="6">
+      <w:start w:val="1"/>
+      <w:numFmt w:val="decimal"/>
+      <w:lvlText w:val="%7."/>
+      <w:lvlJc w:val="left"/>
+      <w:pPr>
+        <w:ind w:left="2520" w:hanging="360"/>
+      </w:pPr>
+    </w:lvl>
+    <w:lvl w:ilvl="7">
+      <w:start w:val="1"/>
+      <w:numFmt w:val="lowerLetter"/>
+      <w:lvlText w:val="%8."/>
+      <w:lvlJc w:val="left"/>
+      <w:pPr>
+        <w:ind w:left="2880" w:hanging="360"/>
+      </w:pPr>
+    </w:lvl>
+    <w:lvl w:ilvl="8">
+      <w:start w:val="1"/>
+      <w:numFmt w:val="lowerRoman"/>
+      <w:lvlText w:val="%9."/>
+      <w:lvlJc w:val="left"/>
+      <w:pPr>
+        <w:ind w:left="3240" w:hanging="360"/>
+      </w:pPr>
+    </w:lvl>
+  </w:abstractNum>
+  <w:abstractNum w:abstractNumId="174" w15:restartNumberingAfterBreak="0">
     <w:nsid w:val="5F4F2A76"/>
     <w:multiLevelType w:val="hybridMultilevel"/>
     <w:tmpl w:val="1864F6D0"/>
@@ -32783,7 +33065,7 @@
       </w:rPr>
     </w:lvl>
   </w:abstractNum>
-  <w:abstractNum w:abstractNumId="174" w15:restartNumberingAfterBreak="0">
+  <w:abstractNum w:abstractNumId="175" w15:restartNumberingAfterBreak="0">
     <w:nsid w:val="6023578A"/>
     <w:multiLevelType w:val="multilevel"/>
     <w:tmpl w:val="20FE3972"/>
@@ -32900,7 +33182,7 @@
       </w:pPr>
     </w:lvl>
   </w:abstractNum>
-  <w:abstractNum w:abstractNumId="175" w15:restartNumberingAfterBreak="0">
+  <w:abstractNum w:abstractNumId="176" w15:restartNumberingAfterBreak="0">
     <w:nsid w:val="60B304F8"/>
     <w:multiLevelType w:val="multilevel"/>
     <w:tmpl w:val="AE020256"/>
@@ -33049,7 +33331,7 @@
       </w:rPr>
     </w:lvl>
   </w:abstractNum>
-  <w:abstractNum w:abstractNumId="176" w15:restartNumberingAfterBreak="0">
+  <w:abstractNum w:abstractNumId="177" w15:restartNumberingAfterBreak="0">
     <w:nsid w:val="61CA4512"/>
     <w:multiLevelType w:val="multilevel"/>
     <w:tmpl w:val="113687FE"/>
@@ -33198,7 +33480,7 @@
       </w:rPr>
     </w:lvl>
   </w:abstractNum>
-  <w:abstractNum w:abstractNumId="177" w15:restartNumberingAfterBreak="0">
+  <w:abstractNum w:abstractNumId="178" w15:restartNumberingAfterBreak="0">
     <w:nsid w:val="62633F16"/>
     <w:multiLevelType w:val="multilevel"/>
     <w:tmpl w:val="01D491C4"/>
@@ -33347,7 +33629,7 @@
       </w:rPr>
     </w:lvl>
   </w:abstractNum>
-  <w:abstractNum w:abstractNumId="178" w15:restartNumberingAfterBreak="0">
+  <w:abstractNum w:abstractNumId="179" w15:restartNumberingAfterBreak="0">
     <w:nsid w:val="62FA4B02"/>
     <w:multiLevelType w:val="multilevel"/>
     <w:tmpl w:val="AC469EA4"/>
@@ -33496,7 +33778,7 @@
       </w:rPr>
     </w:lvl>
   </w:abstractNum>
-  <w:abstractNum w:abstractNumId="179" w15:restartNumberingAfterBreak="0">
+  <w:abstractNum w:abstractNumId="180" w15:restartNumberingAfterBreak="0">
     <w:nsid w:val="63B56A28"/>
     <w:multiLevelType w:val="hybridMultilevel"/>
     <w:tmpl w:val="BBDA46C8"/>
@@ -33582,7 +33864,7 @@
       </w:pPr>
     </w:lvl>
   </w:abstractNum>
-  <w:abstractNum w:abstractNumId="180" w15:restartNumberingAfterBreak="0">
+  <w:abstractNum w:abstractNumId="181" w15:restartNumberingAfterBreak="0">
     <w:nsid w:val="63D35024"/>
     <w:multiLevelType w:val="hybridMultilevel"/>
     <w:tmpl w:val="52DACB14"/>
@@ -33668,7 +33950,7 @@
       </w:pPr>
     </w:lvl>
   </w:abstractNum>
-  <w:abstractNum w:abstractNumId="181" w15:restartNumberingAfterBreak="0">
+  <w:abstractNum w:abstractNumId="182" w15:restartNumberingAfterBreak="0">
     <w:nsid w:val="64364942"/>
     <w:multiLevelType w:val="multilevel"/>
     <w:tmpl w:val="3B688F7C"/>
@@ -33817,7 +34099,7 @@
       </w:rPr>
     </w:lvl>
   </w:abstractNum>
-  <w:abstractNum w:abstractNumId="182" w15:restartNumberingAfterBreak="0">
+  <w:abstractNum w:abstractNumId="183" w15:restartNumberingAfterBreak="0">
     <w:nsid w:val="64DF02EF"/>
     <w:multiLevelType w:val="hybridMultilevel"/>
     <w:tmpl w:val="5D1C61DC"/>
@@ -33930,7 +34212,7 @@
       </w:rPr>
     </w:lvl>
   </w:abstractNum>
-  <w:abstractNum w:abstractNumId="183" w15:restartNumberingAfterBreak="0">
+  <w:abstractNum w:abstractNumId="184" w15:restartNumberingAfterBreak="0">
     <w:nsid w:val="65151DA6"/>
     <w:multiLevelType w:val="multilevel"/>
     <w:tmpl w:val="265ABBB0"/>
@@ -34079,7 +34361,7 @@
       </w:rPr>
     </w:lvl>
   </w:abstractNum>
-  <w:abstractNum w:abstractNumId="184" w15:restartNumberingAfterBreak="0">
+  <w:abstractNum w:abstractNumId="185" w15:restartNumberingAfterBreak="0">
     <w:nsid w:val="6621531D"/>
     <w:multiLevelType w:val="multilevel"/>
     <w:tmpl w:val="9CE22912"/>
@@ -34192,7 +34474,7 @@
       </w:pPr>
     </w:lvl>
   </w:abstractNum>
-  <w:abstractNum w:abstractNumId="185" w15:restartNumberingAfterBreak="0">
+  <w:abstractNum w:abstractNumId="186" w15:restartNumberingAfterBreak="0">
     <w:nsid w:val="66A75F06"/>
     <w:multiLevelType w:val="multilevel"/>
     <w:tmpl w:val="7B2CDB5E"/>
@@ -34341,7 +34623,7 @@
       </w:rPr>
     </w:lvl>
   </w:abstractNum>
-  <w:abstractNum w:abstractNumId="186" w15:restartNumberingAfterBreak="0">
+  <w:abstractNum w:abstractNumId="187" w15:restartNumberingAfterBreak="0">
     <w:nsid w:val="66AF21A2"/>
     <w:multiLevelType w:val="multilevel"/>
     <w:tmpl w:val="F3FCA768"/>
@@ -34490,7 +34772,7 @@
       </w:rPr>
     </w:lvl>
   </w:abstractNum>
-  <w:abstractNum w:abstractNumId="187" w15:restartNumberingAfterBreak="0">
+  <w:abstractNum w:abstractNumId="188" w15:restartNumberingAfterBreak="0">
     <w:nsid w:val="66DF406A"/>
     <w:multiLevelType w:val="hybridMultilevel"/>
     <w:tmpl w:val="DAF6A5D0"/>
@@ -34576,7 +34858,7 @@
       </w:pPr>
     </w:lvl>
   </w:abstractNum>
-  <w:abstractNum w:abstractNumId="188" w15:restartNumberingAfterBreak="0">
+  <w:abstractNum w:abstractNumId="189" w15:restartNumberingAfterBreak="0">
     <w:nsid w:val="672530A8"/>
     <w:multiLevelType w:val="multilevel"/>
     <w:tmpl w:val="C916E6BE"/>
@@ -34725,7 +35007,7 @@
       </w:rPr>
     </w:lvl>
   </w:abstractNum>
-  <w:abstractNum w:abstractNumId="189" w15:restartNumberingAfterBreak="0">
+  <w:abstractNum w:abstractNumId="190" w15:restartNumberingAfterBreak="0">
     <w:nsid w:val="67834D5A"/>
     <w:multiLevelType w:val="multilevel"/>
     <w:tmpl w:val="849CC442"/>
@@ -34874,7 +35156,7 @@
       </w:rPr>
     </w:lvl>
   </w:abstractNum>
-  <w:abstractNum w:abstractNumId="190" w15:restartNumberingAfterBreak="0">
+  <w:abstractNum w:abstractNumId="191" w15:restartNumberingAfterBreak="0">
     <w:nsid w:val="67AC7510"/>
     <w:multiLevelType w:val="multilevel"/>
     <w:tmpl w:val="53787E7C"/>
@@ -35023,7 +35305,7 @@
       </w:rPr>
     </w:lvl>
   </w:abstractNum>
-  <w:abstractNum w:abstractNumId="191" w15:restartNumberingAfterBreak="0">
+  <w:abstractNum w:abstractNumId="192" w15:restartNumberingAfterBreak="0">
     <w:nsid w:val="67D51A63"/>
     <w:multiLevelType w:val="hybridMultilevel"/>
     <w:tmpl w:val="06DC9326"/>
@@ -35109,7 +35391,7 @@
       </w:pPr>
     </w:lvl>
   </w:abstractNum>
-  <w:abstractNum w:abstractNumId="192" w15:restartNumberingAfterBreak="0">
+  <w:abstractNum w:abstractNumId="193" w15:restartNumberingAfterBreak="0">
     <w:nsid w:val="67FF749D"/>
     <w:multiLevelType w:val="hybridMultilevel"/>
     <w:tmpl w:val="F7C848A4"/>
@@ -35195,7 +35477,7 @@
       </w:pPr>
     </w:lvl>
   </w:abstractNum>
-  <w:abstractNum w:abstractNumId="193" w15:restartNumberingAfterBreak="0">
+  <w:abstractNum w:abstractNumId="194" w15:restartNumberingAfterBreak="0">
     <w:nsid w:val="692C7E70"/>
     <w:multiLevelType w:val="multilevel"/>
     <w:tmpl w:val="A1468520"/>
@@ -35344,7 +35626,7 @@
       </w:rPr>
     </w:lvl>
   </w:abstractNum>
-  <w:abstractNum w:abstractNumId="194" w15:restartNumberingAfterBreak="0">
+  <w:abstractNum w:abstractNumId="195" w15:restartNumberingAfterBreak="0">
     <w:nsid w:val="6981505F"/>
     <w:multiLevelType w:val="multilevel"/>
     <w:tmpl w:val="1D1C1664"/>
@@ -35493,7 +35775,7 @@
       </w:rPr>
     </w:lvl>
   </w:abstractNum>
-  <w:abstractNum w:abstractNumId="195" w15:restartNumberingAfterBreak="0">
+  <w:abstractNum w:abstractNumId="196" w15:restartNumberingAfterBreak="0">
     <w:nsid w:val="69B34C11"/>
     <w:multiLevelType w:val="hybridMultilevel"/>
     <w:tmpl w:val="89981944"/>
@@ -35582,7 +35864,7 @@
       </w:pPr>
     </w:lvl>
   </w:abstractNum>
-  <w:abstractNum w:abstractNumId="196" w15:restartNumberingAfterBreak="0">
+  <w:abstractNum w:abstractNumId="197" w15:restartNumberingAfterBreak="0">
     <w:nsid w:val="6AC25373"/>
     <w:multiLevelType w:val="multilevel"/>
     <w:tmpl w:val="72CEB312"/>
@@ -35731,7 +36013,7 @@
       </w:rPr>
     </w:lvl>
   </w:abstractNum>
-  <w:abstractNum w:abstractNumId="197" w15:restartNumberingAfterBreak="0">
+  <w:abstractNum w:abstractNumId="198" w15:restartNumberingAfterBreak="0">
     <w:nsid w:val="6B2F2D93"/>
     <w:multiLevelType w:val="multilevel"/>
     <w:tmpl w:val="4F0CE180"/>
@@ -35880,7 +36162,7 @@
       </w:rPr>
     </w:lvl>
   </w:abstractNum>
-  <w:abstractNum w:abstractNumId="198" w15:restartNumberingAfterBreak="0">
+  <w:abstractNum w:abstractNumId="199" w15:restartNumberingAfterBreak="0">
     <w:nsid w:val="6B723626"/>
     <w:multiLevelType w:val="multilevel"/>
     <w:tmpl w:val="41E42FA2"/>
@@ -36029,7 +36311,7 @@
       </w:rPr>
     </w:lvl>
   </w:abstractNum>
-  <w:abstractNum w:abstractNumId="199" w15:restartNumberingAfterBreak="0">
+  <w:abstractNum w:abstractNumId="200" w15:restartNumberingAfterBreak="0">
     <w:nsid w:val="6BB9614E"/>
     <w:multiLevelType w:val="multilevel"/>
     <w:tmpl w:val="918878F8"/>
@@ -36146,7 +36428,7 @@
       </w:pPr>
     </w:lvl>
   </w:abstractNum>
-  <w:abstractNum w:abstractNumId="200" w15:restartNumberingAfterBreak="0">
+  <w:abstractNum w:abstractNumId="201" w15:restartNumberingAfterBreak="0">
     <w:nsid w:val="6C4A3061"/>
     <w:multiLevelType w:val="multilevel"/>
     <w:tmpl w:val="70DAF58E"/>
@@ -36295,7 +36577,7 @@
       </w:rPr>
     </w:lvl>
   </w:abstractNum>
-  <w:abstractNum w:abstractNumId="201" w15:restartNumberingAfterBreak="0">
+  <w:abstractNum w:abstractNumId="202" w15:restartNumberingAfterBreak="0">
     <w:nsid w:val="6C4F7431"/>
     <w:multiLevelType w:val="multilevel"/>
     <w:tmpl w:val="901E4082"/>
@@ -36444,7 +36726,7 @@
       </w:rPr>
     </w:lvl>
   </w:abstractNum>
-  <w:abstractNum w:abstractNumId="202" w15:restartNumberingAfterBreak="0">
+  <w:abstractNum w:abstractNumId="203" w15:restartNumberingAfterBreak="0">
     <w:nsid w:val="6C6123A7"/>
     <w:multiLevelType w:val="multilevel"/>
     <w:tmpl w:val="FA5C3F7E"/>
@@ -36593,7 +36875,7 @@
       </w:rPr>
     </w:lvl>
   </w:abstractNum>
-  <w:abstractNum w:abstractNumId="203" w15:restartNumberingAfterBreak="0">
+  <w:abstractNum w:abstractNumId="204" w15:restartNumberingAfterBreak="0">
     <w:nsid w:val="6D256BE4"/>
     <w:multiLevelType w:val="hybridMultilevel"/>
     <w:tmpl w:val="AA0C1D60"/>
@@ -36706,7 +36988,7 @@
       </w:rPr>
     </w:lvl>
   </w:abstractNum>
-  <w:abstractNum w:abstractNumId="204" w15:restartNumberingAfterBreak="0">
+  <w:abstractNum w:abstractNumId="205" w15:restartNumberingAfterBreak="0">
     <w:nsid w:val="6D8B4E45"/>
     <w:multiLevelType w:val="multilevel"/>
     <w:tmpl w:val="E802456E"/>
@@ -36823,7 +37105,7 @@
       </w:pPr>
     </w:lvl>
   </w:abstractNum>
-  <w:abstractNum w:abstractNumId="205" w15:restartNumberingAfterBreak="0">
+  <w:abstractNum w:abstractNumId="206" w15:restartNumberingAfterBreak="0">
     <w:nsid w:val="6F3761B0"/>
     <w:multiLevelType w:val="multilevel"/>
     <w:tmpl w:val="BD1C961C"/>
@@ -36936,7 +37218,7 @@
       </w:pPr>
     </w:lvl>
   </w:abstractNum>
-  <w:abstractNum w:abstractNumId="206" w15:restartNumberingAfterBreak="0">
+  <w:abstractNum w:abstractNumId="207" w15:restartNumberingAfterBreak="0">
     <w:nsid w:val="6F613257"/>
     <w:multiLevelType w:val="hybridMultilevel"/>
     <w:tmpl w:val="F2BCA812"/>
@@ -37049,7 +37331,7 @@
       </w:rPr>
     </w:lvl>
   </w:abstractNum>
-  <w:abstractNum w:abstractNumId="207" w15:restartNumberingAfterBreak="0">
+  <w:abstractNum w:abstractNumId="208" w15:restartNumberingAfterBreak="0">
     <w:nsid w:val="6F8C22B1"/>
     <w:multiLevelType w:val="multilevel"/>
     <w:tmpl w:val="514C38C4"/>
@@ -37166,7 +37448,7 @@
       </w:pPr>
     </w:lvl>
   </w:abstractNum>
-  <w:abstractNum w:abstractNumId="208" w15:restartNumberingAfterBreak="0">
+  <w:abstractNum w:abstractNumId="209" w15:restartNumberingAfterBreak="0">
     <w:nsid w:val="6FC76959"/>
     <w:multiLevelType w:val="multilevel"/>
     <w:tmpl w:val="9956E00C"/>
@@ -37315,7 +37597,7 @@
       </w:rPr>
     </w:lvl>
   </w:abstractNum>
-  <w:abstractNum w:abstractNumId="209" w15:restartNumberingAfterBreak="0">
+  <w:abstractNum w:abstractNumId="210" w15:restartNumberingAfterBreak="0">
     <w:nsid w:val="703B64C2"/>
     <w:multiLevelType w:val="multilevel"/>
     <w:tmpl w:val="4ED83146"/>
@@ -37464,7 +37746,7 @@
       </w:rPr>
     </w:lvl>
   </w:abstractNum>
-  <w:abstractNum w:abstractNumId="210" w15:restartNumberingAfterBreak="0">
+  <w:abstractNum w:abstractNumId="211" w15:restartNumberingAfterBreak="0">
     <w:nsid w:val="708D29E9"/>
     <w:multiLevelType w:val="hybridMultilevel"/>
     <w:tmpl w:val="235A9E60"/>
@@ -37577,7 +37859,7 @@
       </w:rPr>
     </w:lvl>
   </w:abstractNum>
-  <w:abstractNum w:abstractNumId="211" w15:restartNumberingAfterBreak="0">
+  <w:abstractNum w:abstractNumId="212" w15:restartNumberingAfterBreak="0">
     <w:nsid w:val="70DB5F35"/>
     <w:multiLevelType w:val="multilevel"/>
     <w:tmpl w:val="5CFA3CAC"/>
@@ -37694,7 +37976,7 @@
       </w:pPr>
     </w:lvl>
   </w:abstractNum>
-  <w:abstractNum w:abstractNumId="212" w15:restartNumberingAfterBreak="0">
+  <w:abstractNum w:abstractNumId="213" w15:restartNumberingAfterBreak="0">
     <w:nsid w:val="710818BF"/>
     <w:multiLevelType w:val="multilevel"/>
     <w:tmpl w:val="244025E6"/>
@@ -37843,7 +38125,7 @@
       </w:rPr>
     </w:lvl>
   </w:abstractNum>
-  <w:abstractNum w:abstractNumId="213" w15:restartNumberingAfterBreak="0">
+  <w:abstractNum w:abstractNumId="214" w15:restartNumberingAfterBreak="0">
     <w:nsid w:val="715A6526"/>
     <w:multiLevelType w:val="multilevel"/>
     <w:tmpl w:val="7A7E9BD0"/>
@@ -37992,7 +38274,7 @@
       </w:rPr>
     </w:lvl>
   </w:abstractNum>
-  <w:abstractNum w:abstractNumId="214" w15:restartNumberingAfterBreak="0">
+  <w:abstractNum w:abstractNumId="215" w15:restartNumberingAfterBreak="0">
     <w:nsid w:val="71604CD1"/>
     <w:multiLevelType w:val="hybridMultilevel"/>
     <w:tmpl w:val="8F42548E"/>
@@ -38081,7 +38363,7 @@
       </w:pPr>
     </w:lvl>
   </w:abstractNum>
-  <w:abstractNum w:abstractNumId="215" w15:restartNumberingAfterBreak="0">
+  <w:abstractNum w:abstractNumId="216" w15:restartNumberingAfterBreak="0">
     <w:nsid w:val="72086F4A"/>
     <w:multiLevelType w:val="multilevel"/>
     <w:tmpl w:val="950087C2"/>
@@ -38230,7 +38512,7 @@
       </w:rPr>
     </w:lvl>
   </w:abstractNum>
-  <w:abstractNum w:abstractNumId="216" w15:restartNumberingAfterBreak="0">
+  <w:abstractNum w:abstractNumId="217" w15:restartNumberingAfterBreak="0">
     <w:nsid w:val="72904D14"/>
     <w:multiLevelType w:val="multilevel"/>
     <w:tmpl w:val="7AF8E330"/>
@@ -38379,7 +38661,7 @@
       </w:rPr>
     </w:lvl>
   </w:abstractNum>
-  <w:abstractNum w:abstractNumId="217" w15:restartNumberingAfterBreak="0">
+  <w:abstractNum w:abstractNumId="218" w15:restartNumberingAfterBreak="0">
     <w:nsid w:val="735858CC"/>
     <w:multiLevelType w:val="multilevel"/>
     <w:tmpl w:val="A9DE2526"/>
@@ -38528,7 +38810,7 @@
       </w:rPr>
     </w:lvl>
   </w:abstractNum>
-  <w:abstractNum w:abstractNumId="218" w15:restartNumberingAfterBreak="0">
+  <w:abstractNum w:abstractNumId="219" w15:restartNumberingAfterBreak="0">
     <w:nsid w:val="74123403"/>
     <w:multiLevelType w:val="hybridMultilevel"/>
     <w:tmpl w:val="73726886"/>
@@ -38617,7 +38899,7 @@
       </w:pPr>
     </w:lvl>
   </w:abstractNum>
-  <w:abstractNum w:abstractNumId="219" w15:restartNumberingAfterBreak="0">
+  <w:abstractNum w:abstractNumId="220" w15:restartNumberingAfterBreak="0">
     <w:nsid w:val="744542A0"/>
     <w:multiLevelType w:val="multilevel"/>
     <w:tmpl w:val="64EAC428"/>
@@ -38766,7 +39048,7 @@
       </w:rPr>
     </w:lvl>
   </w:abstractNum>
-  <w:abstractNum w:abstractNumId="220" w15:restartNumberingAfterBreak="0">
+  <w:abstractNum w:abstractNumId="221" w15:restartNumberingAfterBreak="0">
     <w:nsid w:val="745C2C6F"/>
     <w:multiLevelType w:val="hybridMultilevel"/>
     <w:tmpl w:val="8EDAE7EA"/>
@@ -38852,7 +39134,7 @@
       </w:pPr>
     </w:lvl>
   </w:abstractNum>
-  <w:abstractNum w:abstractNumId="221" w15:restartNumberingAfterBreak="0">
+  <w:abstractNum w:abstractNumId="222" w15:restartNumberingAfterBreak="0">
     <w:nsid w:val="746808FE"/>
     <w:multiLevelType w:val="multilevel"/>
     <w:tmpl w:val="69405DB4"/>
@@ -39001,7 +39283,7 @@
       </w:rPr>
     </w:lvl>
   </w:abstractNum>
-  <w:abstractNum w:abstractNumId="222" w15:restartNumberingAfterBreak="0">
+  <w:abstractNum w:abstractNumId="223" w15:restartNumberingAfterBreak="0">
     <w:nsid w:val="762D5E5A"/>
     <w:multiLevelType w:val="hybridMultilevel"/>
     <w:tmpl w:val="C48472E2"/>
@@ -39087,7 +39369,7 @@
       </w:pPr>
     </w:lvl>
   </w:abstractNum>
-  <w:abstractNum w:abstractNumId="223" w15:restartNumberingAfterBreak="0">
+  <w:abstractNum w:abstractNumId="224" w15:restartNumberingAfterBreak="0">
     <w:nsid w:val="765455B0"/>
     <w:multiLevelType w:val="multilevel"/>
     <w:tmpl w:val="1E04C6DE"/>
@@ -39236,7 +39518,7 @@
       </w:rPr>
     </w:lvl>
   </w:abstractNum>
-  <w:abstractNum w:abstractNumId="224" w15:restartNumberingAfterBreak="0">
+  <w:abstractNum w:abstractNumId="225" w15:restartNumberingAfterBreak="0">
     <w:nsid w:val="768E7B50"/>
     <w:multiLevelType w:val="multilevel"/>
     <w:tmpl w:val="E6B89F94"/>
@@ -39385,7 +39667,7 @@
       </w:rPr>
     </w:lvl>
   </w:abstractNum>
-  <w:abstractNum w:abstractNumId="225" w15:restartNumberingAfterBreak="0">
+  <w:abstractNum w:abstractNumId="226" w15:restartNumberingAfterBreak="0">
     <w:nsid w:val="76A56C15"/>
     <w:multiLevelType w:val="multilevel"/>
     <w:tmpl w:val="86A4CF06"/>
@@ -39534,7 +39816,7 @@
       </w:rPr>
     </w:lvl>
   </w:abstractNum>
-  <w:abstractNum w:abstractNumId="226" w15:restartNumberingAfterBreak="0">
+  <w:abstractNum w:abstractNumId="227" w15:restartNumberingAfterBreak="0">
     <w:nsid w:val="76C83B68"/>
     <w:multiLevelType w:val="multilevel"/>
     <w:tmpl w:val="9E7EB786"/>
@@ -39683,7 +39965,7 @@
       </w:rPr>
     </w:lvl>
   </w:abstractNum>
-  <w:abstractNum w:abstractNumId="227" w15:restartNumberingAfterBreak="0">
+  <w:abstractNum w:abstractNumId="228" w15:restartNumberingAfterBreak="0">
     <w:nsid w:val="779E4425"/>
     <w:multiLevelType w:val="hybridMultilevel"/>
     <w:tmpl w:val="78CEE8D8"/>
@@ -39769,7 +40051,7 @@
       </w:pPr>
     </w:lvl>
   </w:abstractNum>
-  <w:abstractNum w:abstractNumId="228" w15:restartNumberingAfterBreak="0">
+  <w:abstractNum w:abstractNumId="229" w15:restartNumberingAfterBreak="0">
     <w:nsid w:val="77B22F44"/>
     <w:multiLevelType w:val="multilevel"/>
     <w:tmpl w:val="1C380070"/>
@@ -39918,7 +40200,7 @@
       </w:rPr>
     </w:lvl>
   </w:abstractNum>
-  <w:abstractNum w:abstractNumId="229" w15:restartNumberingAfterBreak="0">
+  <w:abstractNum w:abstractNumId="230" w15:restartNumberingAfterBreak="0">
     <w:nsid w:val="77C50830"/>
     <w:multiLevelType w:val="multilevel"/>
     <w:tmpl w:val="7602BDE8"/>
@@ -40067,7 +40349,7 @@
       </w:rPr>
     </w:lvl>
   </w:abstractNum>
-  <w:abstractNum w:abstractNumId="230" w15:restartNumberingAfterBreak="0">
+  <w:abstractNum w:abstractNumId="231" w15:restartNumberingAfterBreak="0">
     <w:nsid w:val="77D6139A"/>
     <w:multiLevelType w:val="multilevel"/>
     <w:tmpl w:val="48CC0768"/>
@@ -40216,7 +40498,7 @@
       </w:rPr>
     </w:lvl>
   </w:abstractNum>
-  <w:abstractNum w:abstractNumId="231" w15:restartNumberingAfterBreak="0">
+  <w:abstractNum w:abstractNumId="232" w15:restartNumberingAfterBreak="0">
     <w:nsid w:val="780101E7"/>
     <w:multiLevelType w:val="multilevel"/>
     <w:tmpl w:val="41B88710"/>
@@ -40365,7 +40647,7 @@
       </w:rPr>
     </w:lvl>
   </w:abstractNum>
-  <w:abstractNum w:abstractNumId="232" w15:restartNumberingAfterBreak="0">
+  <w:abstractNum w:abstractNumId="233" w15:restartNumberingAfterBreak="0">
     <w:nsid w:val="78AA5925"/>
     <w:multiLevelType w:val="multilevel"/>
     <w:tmpl w:val="6BD67862"/>
@@ -40514,7 +40796,7 @@
       </w:rPr>
     </w:lvl>
   </w:abstractNum>
-  <w:abstractNum w:abstractNumId="233" w15:restartNumberingAfterBreak="0">
+  <w:abstractNum w:abstractNumId="234" w15:restartNumberingAfterBreak="0">
     <w:nsid w:val="78FE6A65"/>
     <w:multiLevelType w:val="hybridMultilevel"/>
     <w:tmpl w:val="1B82C0C0"/>
@@ -40603,7 +40885,7 @@
       </w:pPr>
     </w:lvl>
   </w:abstractNum>
-  <w:abstractNum w:abstractNumId="234" w15:restartNumberingAfterBreak="0">
+  <w:abstractNum w:abstractNumId="235" w15:restartNumberingAfterBreak="0">
     <w:nsid w:val="794D4863"/>
     <w:multiLevelType w:val="multilevel"/>
     <w:tmpl w:val="72A24C54"/>
@@ -40752,7 +41034,7 @@
       </w:rPr>
     </w:lvl>
   </w:abstractNum>
-  <w:abstractNum w:abstractNumId="235" w15:restartNumberingAfterBreak="0">
+  <w:abstractNum w:abstractNumId="236" w15:restartNumberingAfterBreak="0">
     <w:nsid w:val="797E3B78"/>
     <w:multiLevelType w:val="multilevel"/>
     <w:tmpl w:val="68E467AA"/>
@@ -40901,7 +41183,7 @@
       </w:rPr>
     </w:lvl>
   </w:abstractNum>
-  <w:abstractNum w:abstractNumId="236" w15:restartNumberingAfterBreak="0">
+  <w:abstractNum w:abstractNumId="237" w15:restartNumberingAfterBreak="0">
     <w:nsid w:val="79981AFA"/>
     <w:multiLevelType w:val="multilevel"/>
     <w:tmpl w:val="512A474C"/>
@@ -41050,7 +41332,7 @@
       </w:rPr>
     </w:lvl>
   </w:abstractNum>
-  <w:abstractNum w:abstractNumId="237" w15:restartNumberingAfterBreak="0">
+  <w:abstractNum w:abstractNumId="238" w15:restartNumberingAfterBreak="0">
     <w:nsid w:val="79EC24A3"/>
     <w:multiLevelType w:val="multilevel"/>
     <w:tmpl w:val="0409001D"/>
@@ -41136,7 +41418,7 @@
       </w:pPr>
     </w:lvl>
   </w:abstractNum>
-  <w:abstractNum w:abstractNumId="238" w15:restartNumberingAfterBreak="0">
+  <w:abstractNum w:abstractNumId="239" w15:restartNumberingAfterBreak="0">
     <w:nsid w:val="7A0615C6"/>
     <w:multiLevelType w:val="multilevel"/>
     <w:tmpl w:val="DD48CE38"/>
@@ -41253,7 +41535,7 @@
       </w:pPr>
     </w:lvl>
   </w:abstractNum>
-  <w:abstractNum w:abstractNumId="239" w15:restartNumberingAfterBreak="0">
+  <w:abstractNum w:abstractNumId="240" w15:restartNumberingAfterBreak="0">
     <w:nsid w:val="7A4A4CDF"/>
     <w:multiLevelType w:val="multilevel"/>
     <w:tmpl w:val="8110DF20"/>
@@ -41402,7 +41684,7 @@
       </w:rPr>
     </w:lvl>
   </w:abstractNum>
-  <w:abstractNum w:abstractNumId="240" w15:restartNumberingAfterBreak="0">
+  <w:abstractNum w:abstractNumId="241" w15:restartNumberingAfterBreak="0">
     <w:nsid w:val="7B7A4D7C"/>
     <w:multiLevelType w:val="multilevel"/>
     <w:tmpl w:val="AA1EE240"/>
@@ -41551,7 +41833,7 @@
       </w:rPr>
     </w:lvl>
   </w:abstractNum>
-  <w:abstractNum w:abstractNumId="241" w15:restartNumberingAfterBreak="0">
+  <w:abstractNum w:abstractNumId="242" w15:restartNumberingAfterBreak="0">
     <w:nsid w:val="7B901ABE"/>
     <w:multiLevelType w:val="multilevel"/>
     <w:tmpl w:val="0409001D"/>
@@ -41637,7 +41919,7 @@
       </w:pPr>
     </w:lvl>
   </w:abstractNum>
-  <w:abstractNum w:abstractNumId="242" w15:restartNumberingAfterBreak="0">
+  <w:abstractNum w:abstractNumId="243" w15:restartNumberingAfterBreak="0">
     <w:nsid w:val="7BBF2CA1"/>
     <w:multiLevelType w:val="hybridMultilevel"/>
     <w:tmpl w:val="B88C84DA"/>
@@ -41723,7 +42005,7 @@
       </w:pPr>
     </w:lvl>
   </w:abstractNum>
-  <w:abstractNum w:abstractNumId="243" w15:restartNumberingAfterBreak="0">
+  <w:abstractNum w:abstractNumId="244" w15:restartNumberingAfterBreak="0">
     <w:nsid w:val="7CC13ED5"/>
     <w:multiLevelType w:val="multilevel"/>
     <w:tmpl w:val="4A840DA8"/>
@@ -41872,7 +42154,7 @@
       </w:rPr>
     </w:lvl>
   </w:abstractNum>
-  <w:abstractNum w:abstractNumId="244" w15:restartNumberingAfterBreak="0">
+  <w:abstractNum w:abstractNumId="245" w15:restartNumberingAfterBreak="0">
     <w:nsid w:val="7CED752A"/>
     <w:multiLevelType w:val="multilevel"/>
     <w:tmpl w:val="3716C828"/>
@@ -42021,7 +42303,7 @@
       </w:rPr>
     </w:lvl>
   </w:abstractNum>
-  <w:abstractNum w:abstractNumId="245" w15:restartNumberingAfterBreak="0">
+  <w:abstractNum w:abstractNumId="246" w15:restartNumberingAfterBreak="0">
     <w:nsid w:val="7CF646D9"/>
     <w:multiLevelType w:val="multilevel"/>
     <w:tmpl w:val="7D221904"/>
@@ -42170,7 +42452,7 @@
       </w:rPr>
     </w:lvl>
   </w:abstractNum>
-  <w:abstractNum w:abstractNumId="246" w15:restartNumberingAfterBreak="0">
+  <w:abstractNum w:abstractNumId="247" w15:restartNumberingAfterBreak="0">
     <w:nsid w:val="7E5848B4"/>
     <w:multiLevelType w:val="multilevel"/>
     <w:tmpl w:val="DA2C6884"/>
@@ -42319,7 +42601,7 @@
       </w:rPr>
     </w:lvl>
   </w:abstractNum>
-  <w:abstractNum w:abstractNumId="247" w15:restartNumberingAfterBreak="0">
+  <w:abstractNum w:abstractNumId="248" w15:restartNumberingAfterBreak="0">
     <w:nsid w:val="7EA43E28"/>
     <w:multiLevelType w:val="multilevel"/>
     <w:tmpl w:val="AEE89ED0"/>
@@ -42468,7 +42750,7 @@
       </w:rPr>
     </w:lvl>
   </w:abstractNum>
-  <w:abstractNum w:abstractNumId="248" w15:restartNumberingAfterBreak="0">
+  <w:abstractNum w:abstractNumId="249" w15:restartNumberingAfterBreak="0">
     <w:nsid w:val="7FF412D9"/>
     <w:multiLevelType w:val="hybridMultilevel"/>
     <w:tmpl w:val="209427A0"/>
@@ -42561,7 +42843,7 @@
     <w:abstractNumId w:val="108"/>
   </w:num>
   <w:num w:numId="3" w16cid:durableId="64963145">
-    <w:abstractNumId w:val="210"/>
+    <w:abstractNumId w:val="211"/>
   </w:num>
   <w:num w:numId="4" w16cid:durableId="1229270948">
     <w:abstractNumId w:val="144"/>
@@ -42588,7 +42870,7 @@
     <w:abstractNumId w:val="48"/>
   </w:num>
   <w:num w:numId="12" w16cid:durableId="2003923399">
-    <w:abstractNumId w:val="223"/>
+    <w:abstractNumId w:val="224"/>
   </w:num>
   <w:num w:numId="13" w16cid:durableId="1241252992">
     <w:abstractNumId w:val="96"/>
@@ -42600,7 +42882,7 @@
     <w:abstractNumId w:val="70"/>
   </w:num>
   <w:num w:numId="16" w16cid:durableId="226192028">
-    <w:abstractNumId w:val="229"/>
+    <w:abstractNumId w:val="230"/>
   </w:num>
   <w:num w:numId="17" w16cid:durableId="458841060">
     <w:abstractNumId w:val="101"/>
@@ -42609,10 +42891,10 @@
     <w:abstractNumId w:val="109"/>
   </w:num>
   <w:num w:numId="19" w16cid:durableId="323896942">
-    <w:abstractNumId w:val="213"/>
+    <w:abstractNumId w:val="214"/>
   </w:num>
   <w:num w:numId="20" w16cid:durableId="2014717543">
-    <w:abstractNumId w:val="213"/>
+    <w:abstractNumId w:val="214"/>
     <w:lvlOverride w:ilvl="1">
       <w:lvl w:ilvl="1">
         <w:numFmt w:val="bullet"/>
@@ -42632,7 +42914,7 @@
     </w:lvlOverride>
   </w:num>
   <w:num w:numId="21" w16cid:durableId="1605527520">
-    <w:abstractNumId w:val="213"/>
+    <w:abstractNumId w:val="214"/>
     <w:lvlOverride w:ilvl="1">
       <w:lvl w:ilvl="1">
         <w:numFmt w:val="bullet"/>
@@ -42652,7 +42934,7 @@
     </w:lvlOverride>
   </w:num>
   <w:num w:numId="22" w16cid:durableId="1875263998">
-    <w:abstractNumId w:val="213"/>
+    <w:abstractNumId w:val="214"/>
     <w:lvlOverride w:ilvl="1">
       <w:lvl w:ilvl="1">
         <w:numFmt w:val="bullet"/>
@@ -42672,7 +42954,7 @@
     </w:lvlOverride>
   </w:num>
   <w:num w:numId="23" w16cid:durableId="2081824830">
-    <w:abstractNumId w:val="213"/>
+    <w:abstractNumId w:val="214"/>
     <w:lvlOverride w:ilvl="1">
       <w:lvl w:ilvl="1">
         <w:numFmt w:val="bullet"/>
@@ -42692,7 +42974,7 @@
     </w:lvlOverride>
   </w:num>
   <w:num w:numId="24" w16cid:durableId="976180975">
-    <w:abstractNumId w:val="213"/>
+    <w:abstractNumId w:val="214"/>
     <w:lvlOverride w:ilvl="1">
       <w:lvl w:ilvl="1">
         <w:numFmt w:val="bullet"/>
@@ -42712,7 +42994,7 @@
     </w:lvlOverride>
   </w:num>
   <w:num w:numId="25" w16cid:durableId="888036745">
-    <w:abstractNumId w:val="213"/>
+    <w:abstractNumId w:val="214"/>
     <w:lvlOverride w:ilvl="1">
       <w:lvl w:ilvl="1">
         <w:numFmt w:val="bullet"/>
@@ -42732,7 +43014,7 @@
     </w:lvlOverride>
   </w:num>
   <w:num w:numId="26" w16cid:durableId="1793013006">
-    <w:abstractNumId w:val="213"/>
+    <w:abstractNumId w:val="214"/>
     <w:lvlOverride w:ilvl="1">
       <w:lvl w:ilvl="1">
         <w:numFmt w:val="bullet"/>
@@ -42752,7 +43034,7 @@
     </w:lvlOverride>
   </w:num>
   <w:num w:numId="27" w16cid:durableId="2090610408">
-    <w:abstractNumId w:val="213"/>
+    <w:abstractNumId w:val="214"/>
     <w:lvlOverride w:ilvl="1">
       <w:lvl w:ilvl="1">
         <w:numFmt w:val="bullet"/>
@@ -42772,7 +43054,7 @@
     </w:lvlOverride>
   </w:num>
   <w:num w:numId="28" w16cid:durableId="1841657711">
-    <w:abstractNumId w:val="213"/>
+    <w:abstractNumId w:val="214"/>
     <w:lvlOverride w:ilvl="1">
       <w:lvl w:ilvl="1">
         <w:numFmt w:val="bullet"/>
@@ -42792,7 +43074,7 @@
     </w:lvlOverride>
   </w:num>
   <w:num w:numId="29" w16cid:durableId="1797480727">
-    <w:abstractNumId w:val="213"/>
+    <w:abstractNumId w:val="214"/>
     <w:lvlOverride w:ilvl="1">
       <w:lvl w:ilvl="1">
         <w:numFmt w:val="bullet"/>
@@ -42812,7 +43094,7 @@
     </w:lvlOverride>
   </w:num>
   <w:num w:numId="30" w16cid:durableId="362439137">
-    <w:abstractNumId w:val="213"/>
+    <w:abstractNumId w:val="214"/>
     <w:lvlOverride w:ilvl="1">
       <w:lvl w:ilvl="1">
         <w:numFmt w:val="bullet"/>
@@ -42832,7 +43114,7 @@
     </w:lvlOverride>
   </w:num>
   <w:num w:numId="31" w16cid:durableId="746461409">
-    <w:abstractNumId w:val="213"/>
+    <w:abstractNumId w:val="214"/>
     <w:lvlOverride w:ilvl="1">
       <w:lvl w:ilvl="1">
         <w:numFmt w:val="bullet"/>
@@ -42852,7 +43134,7 @@
     </w:lvlOverride>
   </w:num>
   <w:num w:numId="32" w16cid:durableId="29651206">
-    <w:abstractNumId w:val="213"/>
+    <w:abstractNumId w:val="214"/>
     <w:lvlOverride w:ilvl="1">
       <w:lvl w:ilvl="1">
         <w:numFmt w:val="bullet"/>
@@ -42872,7 +43154,7 @@
     </w:lvlOverride>
   </w:num>
   <w:num w:numId="33" w16cid:durableId="1423523359">
-    <w:abstractNumId w:val="213"/>
+    <w:abstractNumId w:val="214"/>
     <w:lvlOverride w:ilvl="1">
       <w:lvl w:ilvl="1">
         <w:numFmt w:val="bullet"/>
@@ -42892,7 +43174,7 @@
     </w:lvlOverride>
   </w:num>
   <w:num w:numId="34" w16cid:durableId="13970421">
-    <w:abstractNumId w:val="213"/>
+    <w:abstractNumId w:val="214"/>
     <w:lvlOverride w:ilvl="1">
       <w:lvl w:ilvl="1">
         <w:numFmt w:val="bullet"/>
@@ -42912,7 +43194,7 @@
     </w:lvlOverride>
   </w:num>
   <w:num w:numId="35" w16cid:durableId="553279678">
-    <w:abstractNumId w:val="213"/>
+    <w:abstractNumId w:val="214"/>
     <w:lvlOverride w:ilvl="1">
       <w:lvl w:ilvl="1">
         <w:numFmt w:val="bullet"/>
@@ -42932,7 +43214,7 @@
     </w:lvlOverride>
   </w:num>
   <w:num w:numId="36" w16cid:durableId="1540238886">
-    <w:abstractNumId w:val="213"/>
+    <w:abstractNumId w:val="214"/>
     <w:lvlOverride w:ilvl="1">
       <w:lvl w:ilvl="1">
         <w:numFmt w:val="bullet"/>
@@ -42952,7 +43234,7 @@
     </w:lvlOverride>
   </w:num>
   <w:num w:numId="37" w16cid:durableId="2117942773">
-    <w:abstractNumId w:val="213"/>
+    <w:abstractNumId w:val="214"/>
     <w:lvlOverride w:ilvl="1">
       <w:lvl w:ilvl="1">
         <w:numFmt w:val="bullet"/>
@@ -42972,7 +43254,7 @@
     </w:lvlOverride>
   </w:num>
   <w:num w:numId="38" w16cid:durableId="270286304">
-    <w:abstractNumId w:val="213"/>
+    <w:abstractNumId w:val="214"/>
     <w:lvlOverride w:ilvl="1">
       <w:lvl w:ilvl="1">
         <w:numFmt w:val="bullet"/>
@@ -42992,7 +43274,7 @@
     </w:lvlOverride>
   </w:num>
   <w:num w:numId="39" w16cid:durableId="564265283">
-    <w:abstractNumId w:val="213"/>
+    <w:abstractNumId w:val="214"/>
     <w:lvlOverride w:ilvl="1">
       <w:lvl w:ilvl="1">
         <w:numFmt w:val="bullet"/>
@@ -43012,7 +43294,7 @@
     </w:lvlOverride>
   </w:num>
   <w:num w:numId="40" w16cid:durableId="718943036">
-    <w:abstractNumId w:val="213"/>
+    <w:abstractNumId w:val="214"/>
     <w:lvlOverride w:ilvl="1">
       <w:lvl w:ilvl="1">
         <w:numFmt w:val="bullet"/>
@@ -43032,10 +43314,10 @@
     </w:lvlOverride>
   </w:num>
   <w:num w:numId="41" w16cid:durableId="1212961162">
-    <w:abstractNumId w:val="189"/>
+    <w:abstractNumId w:val="190"/>
   </w:num>
   <w:num w:numId="42" w16cid:durableId="381096346">
-    <w:abstractNumId w:val="189"/>
+    <w:abstractNumId w:val="190"/>
     <w:lvlOverride w:ilvl="1">
       <w:lvl w:ilvl="1">
         <w:numFmt w:val="bullet"/>
@@ -43055,7 +43337,7 @@
     </w:lvlOverride>
   </w:num>
   <w:num w:numId="43" w16cid:durableId="1579099378">
-    <w:abstractNumId w:val="189"/>
+    <w:abstractNumId w:val="190"/>
     <w:lvlOverride w:ilvl="1">
       <w:lvl w:ilvl="1">
         <w:numFmt w:val="bullet"/>
@@ -43075,7 +43357,7 @@
     </w:lvlOverride>
   </w:num>
   <w:num w:numId="44" w16cid:durableId="97339869">
-    <w:abstractNumId w:val="189"/>
+    <w:abstractNumId w:val="190"/>
     <w:lvlOverride w:ilvl="1">
       <w:lvl w:ilvl="1">
         <w:numFmt w:val="bullet"/>
@@ -43095,7 +43377,7 @@
     </w:lvlOverride>
   </w:num>
   <w:num w:numId="45" w16cid:durableId="1383678707">
-    <w:abstractNumId w:val="189"/>
+    <w:abstractNumId w:val="190"/>
     <w:lvlOverride w:ilvl="1">
       <w:lvl w:ilvl="1">
         <w:numFmt w:val="bullet"/>
@@ -43115,7 +43397,7 @@
     </w:lvlOverride>
   </w:num>
   <w:num w:numId="46" w16cid:durableId="19472521">
-    <w:abstractNumId w:val="189"/>
+    <w:abstractNumId w:val="190"/>
     <w:lvlOverride w:ilvl="1">
       <w:lvl w:ilvl="1">
         <w:numFmt w:val="bullet"/>
@@ -43135,7 +43417,7 @@
     </w:lvlOverride>
   </w:num>
   <w:num w:numId="47" w16cid:durableId="1077171845">
-    <w:abstractNumId w:val="189"/>
+    <w:abstractNumId w:val="190"/>
     <w:lvlOverride w:ilvl="1">
       <w:lvl w:ilvl="1">
         <w:numFmt w:val="bullet"/>
@@ -43155,7 +43437,7 @@
     </w:lvlOverride>
   </w:num>
   <w:num w:numId="48" w16cid:durableId="1782066344">
-    <w:abstractNumId w:val="189"/>
+    <w:abstractNumId w:val="190"/>
     <w:lvlOverride w:ilvl="1">
       <w:lvl w:ilvl="1">
         <w:numFmt w:val="bullet"/>
@@ -43224,7 +43506,7 @@
     <w:abstractNumId w:val="151"/>
   </w:num>
   <w:num w:numId="54" w16cid:durableId="822160321">
-    <w:abstractNumId w:val="240"/>
+    <w:abstractNumId w:val="241"/>
   </w:num>
   <w:num w:numId="55" w16cid:durableId="1398046579">
     <w:abstractNumId w:val="6"/>
@@ -43784,7 +44066,7 @@
     <w:abstractNumId w:val="115"/>
   </w:num>
   <w:num w:numId="82" w16cid:durableId="292322769">
-    <w:abstractNumId w:val="244"/>
+    <w:abstractNumId w:val="245"/>
   </w:num>
   <w:num w:numId="83" w16cid:durableId="1072122421">
     <w:abstractNumId w:val="1"/>
@@ -43988,10 +44270,10 @@
     <w:abstractNumId w:val="79"/>
   </w:num>
   <w:num w:numId="99" w16cid:durableId="1273435789">
-    <w:abstractNumId w:val="230"/>
+    <w:abstractNumId w:val="231"/>
   </w:num>
   <w:num w:numId="100" w16cid:durableId="276329018">
-    <w:abstractNumId w:val="230"/>
+    <w:abstractNumId w:val="231"/>
     <w:lvlOverride w:ilvl="1">
       <w:lvl w:ilvl="1">
         <w:numFmt w:val="bullet"/>
@@ -44011,7 +44293,7 @@
     </w:lvlOverride>
   </w:num>
   <w:num w:numId="101" w16cid:durableId="30688120">
-    <w:abstractNumId w:val="230"/>
+    <w:abstractNumId w:val="231"/>
     <w:lvlOverride w:ilvl="1">
       <w:lvl w:ilvl="1">
         <w:numFmt w:val="bullet"/>
@@ -44031,7 +44313,7 @@
     </w:lvlOverride>
   </w:num>
   <w:num w:numId="102" w16cid:durableId="1667392475">
-    <w:abstractNumId w:val="230"/>
+    <w:abstractNumId w:val="231"/>
     <w:lvlOverride w:ilvl="1">
       <w:lvl w:ilvl="1">
         <w:numFmt w:val="bullet"/>
@@ -44243,10 +44525,10 @@
     </w:lvlOverride>
   </w:num>
   <w:num w:numId="116" w16cid:durableId="1248926505">
-    <w:abstractNumId w:val="234"/>
+    <w:abstractNumId w:val="235"/>
   </w:num>
   <w:num w:numId="117" w16cid:durableId="1191838156">
-    <w:abstractNumId w:val="234"/>
+    <w:abstractNumId w:val="235"/>
     <w:lvlOverride w:ilvl="1">
       <w:lvl w:ilvl="1">
         <w:numFmt w:val="bullet"/>
@@ -44266,7 +44548,7 @@
     </w:lvlOverride>
   </w:num>
   <w:num w:numId="118" w16cid:durableId="1828550388">
-    <w:abstractNumId w:val="234"/>
+    <w:abstractNumId w:val="235"/>
     <w:lvlOverride w:ilvl="1">
       <w:lvl w:ilvl="1">
         <w:numFmt w:val="bullet"/>
@@ -44286,7 +44568,7 @@
     </w:lvlOverride>
   </w:num>
   <w:num w:numId="119" w16cid:durableId="89082411">
-    <w:abstractNumId w:val="234"/>
+    <w:abstractNumId w:val="235"/>
     <w:lvlOverride w:ilvl="1">
       <w:lvl w:ilvl="1">
         <w:numFmt w:val="bullet"/>
@@ -44306,7 +44588,7 @@
     </w:lvlOverride>
   </w:num>
   <w:num w:numId="120" w16cid:durableId="637103643">
-    <w:abstractNumId w:val="221"/>
+    <w:abstractNumId w:val="222"/>
   </w:num>
   <w:num w:numId="121" w16cid:durableId="590161043">
     <w:abstractNumId w:val="171"/>
@@ -44315,10 +44597,10 @@
     <w:abstractNumId w:val="56"/>
   </w:num>
   <w:num w:numId="123" w16cid:durableId="546142573">
-    <w:abstractNumId w:val="185"/>
+    <w:abstractNumId w:val="186"/>
   </w:num>
   <w:num w:numId="124" w16cid:durableId="1559707329">
-    <w:abstractNumId w:val="185"/>
+    <w:abstractNumId w:val="186"/>
     <w:lvlOverride w:ilvl="1">
       <w:lvl w:ilvl="1">
         <w:numFmt w:val="bullet"/>
@@ -44338,7 +44620,7 @@
     </w:lvlOverride>
   </w:num>
   <w:num w:numId="125" w16cid:durableId="1927378409">
-    <w:abstractNumId w:val="185"/>
+    <w:abstractNumId w:val="186"/>
     <w:lvlOverride w:ilvl="1">
       <w:lvl w:ilvl="1">
         <w:numFmt w:val="bullet"/>
@@ -44358,7 +44640,7 @@
     </w:lvlOverride>
   </w:num>
   <w:num w:numId="126" w16cid:durableId="410005087">
-    <w:abstractNumId w:val="185"/>
+    <w:abstractNumId w:val="186"/>
     <w:lvlOverride w:ilvl="1">
       <w:lvl w:ilvl="1">
         <w:numFmt w:val="bullet"/>
@@ -44381,7 +44663,7 @@
     <w:abstractNumId w:val="138"/>
   </w:num>
   <w:num w:numId="128" w16cid:durableId="302587285">
-    <w:abstractNumId w:val="201"/>
+    <w:abstractNumId w:val="202"/>
   </w:num>
   <w:num w:numId="129" w16cid:durableId="2118985017">
     <w:abstractNumId w:val="37"/>
@@ -44447,10 +44729,10 @@
     </w:lvlOverride>
   </w:num>
   <w:num w:numId="133" w16cid:durableId="1749501442">
-    <w:abstractNumId w:val="231"/>
+    <w:abstractNumId w:val="232"/>
   </w:num>
   <w:num w:numId="134" w16cid:durableId="2144762810">
-    <w:abstractNumId w:val="231"/>
+    <w:abstractNumId w:val="232"/>
     <w:lvlOverride w:ilvl="1">
       <w:lvl w:ilvl="1">
         <w:numFmt w:val="bullet"/>
@@ -44470,7 +44752,7 @@
     </w:lvlOverride>
   </w:num>
   <w:num w:numId="135" w16cid:durableId="1302731136">
-    <w:abstractNumId w:val="231"/>
+    <w:abstractNumId w:val="232"/>
     <w:lvlOverride w:ilvl="1">
       <w:lvl w:ilvl="1">
         <w:numFmt w:val="bullet"/>
@@ -44523,7 +44805,7 @@
     <w:abstractNumId w:val="160"/>
   </w:num>
   <w:num w:numId="147" w16cid:durableId="661202721">
-    <w:abstractNumId w:val="243"/>
+    <w:abstractNumId w:val="244"/>
   </w:num>
   <w:num w:numId="148" w16cid:durableId="448746352">
     <w:abstractNumId w:val="166"/>
@@ -44535,16 +44817,16 @@
     <w:abstractNumId w:val="121"/>
   </w:num>
   <w:num w:numId="151" w16cid:durableId="471873912">
-    <w:abstractNumId w:val="247"/>
+    <w:abstractNumId w:val="248"/>
   </w:num>
   <w:num w:numId="152" w16cid:durableId="237441317">
-    <w:abstractNumId w:val="175"/>
+    <w:abstractNumId w:val="176"/>
   </w:num>
   <w:num w:numId="153" w16cid:durableId="5834486">
-    <w:abstractNumId w:val="181"/>
+    <w:abstractNumId w:val="182"/>
   </w:num>
   <w:num w:numId="154" w16cid:durableId="797186606">
-    <w:abstractNumId w:val="181"/>
+    <w:abstractNumId w:val="182"/>
     <w:lvlOverride w:ilvl="1">
       <w:lvl w:ilvl="1">
         <w:numFmt w:val="bullet"/>
@@ -44564,7 +44846,7 @@
     </w:lvlOverride>
   </w:num>
   <w:num w:numId="155" w16cid:durableId="1889298302">
-    <w:abstractNumId w:val="181"/>
+    <w:abstractNumId w:val="182"/>
     <w:lvlOverride w:ilvl="1">
       <w:lvl w:ilvl="1">
         <w:numFmt w:val="bullet"/>
@@ -44584,7 +44866,7 @@
     </w:lvlOverride>
   </w:num>
   <w:num w:numId="156" w16cid:durableId="1352603847">
-    <w:abstractNumId w:val="181"/>
+    <w:abstractNumId w:val="182"/>
     <w:lvlOverride w:ilvl="1">
       <w:lvl w:ilvl="1">
         <w:numFmt w:val="bullet"/>
@@ -44604,7 +44886,7 @@
     </w:lvlOverride>
   </w:num>
   <w:num w:numId="157" w16cid:durableId="1290235541">
-    <w:abstractNumId w:val="181"/>
+    <w:abstractNumId w:val="182"/>
     <w:lvlOverride w:ilvl="1">
       <w:lvl w:ilvl="1">
         <w:numFmt w:val="bullet"/>
@@ -44773,22 +45055,22 @@
     </w:lvlOverride>
   </w:num>
   <w:num w:numId="168" w16cid:durableId="1527786785">
-    <w:abstractNumId w:val="177"/>
+    <w:abstractNumId w:val="178"/>
   </w:num>
   <w:num w:numId="169" w16cid:durableId="515653910">
-    <w:abstractNumId w:val="228"/>
+    <w:abstractNumId w:val="229"/>
   </w:num>
   <w:num w:numId="170" w16cid:durableId="412776935">
     <w:abstractNumId w:val="46"/>
   </w:num>
   <w:num w:numId="171" w16cid:durableId="731655134">
-    <w:abstractNumId w:val="224"/>
+    <w:abstractNumId w:val="225"/>
   </w:num>
   <w:num w:numId="172" w16cid:durableId="1394739513">
     <w:abstractNumId w:val="44"/>
   </w:num>
   <w:num w:numId="173" w16cid:durableId="902134711">
-    <w:abstractNumId w:val="235"/>
+    <w:abstractNumId w:val="236"/>
   </w:num>
   <w:num w:numId="174" w16cid:durableId="423645284">
     <w:abstractNumId w:val="106"/>
@@ -44860,7 +45142,7 @@
     <w:abstractNumId w:val="116"/>
   </w:num>
   <w:num w:numId="180" w16cid:durableId="1897351112">
-    <w:abstractNumId w:val="186"/>
+    <w:abstractNumId w:val="187"/>
   </w:num>
   <w:num w:numId="181" w16cid:durableId="1293823200">
     <w:abstractNumId w:val="26"/>
@@ -44869,13 +45151,13 @@
     <w:abstractNumId w:val="67"/>
   </w:num>
   <w:num w:numId="183" w16cid:durableId="1578203619">
-    <w:abstractNumId w:val="193"/>
+    <w:abstractNumId w:val="194"/>
   </w:num>
   <w:num w:numId="184" w16cid:durableId="1885748767">
     <w:abstractNumId w:val="111"/>
   </w:num>
   <w:num w:numId="185" w16cid:durableId="1557861500">
-    <w:abstractNumId w:val="190"/>
+    <w:abstractNumId w:val="191"/>
   </w:num>
   <w:num w:numId="186" w16cid:durableId="1617448027">
     <w:abstractNumId w:val="23"/>
@@ -44884,7 +45166,7 @@
     <w:abstractNumId w:val="19"/>
   </w:num>
   <w:num w:numId="188" w16cid:durableId="1842814178">
-    <w:abstractNumId w:val="219"/>
+    <w:abstractNumId w:val="220"/>
   </w:num>
   <w:num w:numId="189" w16cid:durableId="1408192392">
     <w:abstractNumId w:val="139"/>
@@ -45036,7 +45318,7 @@
     </w:lvlOverride>
   </w:num>
   <w:num w:numId="199" w16cid:durableId="989673041">
-    <w:abstractNumId w:val="217"/>
+    <w:abstractNumId w:val="218"/>
   </w:num>
   <w:num w:numId="200" w16cid:durableId="1227497349">
     <w:abstractNumId w:val="105"/>
@@ -45045,10 +45327,10 @@
     <w:abstractNumId w:val="98"/>
   </w:num>
   <w:num w:numId="202" w16cid:durableId="345908412">
-    <w:abstractNumId w:val="205"/>
+    <w:abstractNumId w:val="206"/>
   </w:num>
   <w:num w:numId="203" w16cid:durableId="1740860495">
-    <w:abstractNumId w:val="232"/>
+    <w:abstractNumId w:val="233"/>
   </w:num>
   <w:num w:numId="204" w16cid:durableId="1623877669">
     <w:abstractNumId w:val="5"/>
@@ -45337,7 +45619,7 @@
     <w:abstractNumId w:val="61"/>
   </w:num>
   <w:num w:numId="220" w16cid:durableId="5792790">
-    <w:abstractNumId w:val="183"/>
+    <w:abstractNumId w:val="184"/>
   </w:num>
   <w:num w:numId="221" w16cid:durableId="1056590543">
     <w:abstractNumId w:val="25"/>
@@ -46077,19 +46359,19 @@
     </w:lvlOverride>
   </w:num>
   <w:num w:numId="257" w16cid:durableId="448738575">
-    <w:abstractNumId w:val="196"/>
+    <w:abstractNumId w:val="197"/>
   </w:num>
   <w:num w:numId="258" w16cid:durableId="221867197">
     <w:abstractNumId w:val="80"/>
   </w:num>
   <w:num w:numId="259" w16cid:durableId="1652055639">
-    <w:abstractNumId w:val="209"/>
+    <w:abstractNumId w:val="210"/>
   </w:num>
   <w:num w:numId="260" w16cid:durableId="1037126241">
-    <w:abstractNumId w:val="239"/>
+    <w:abstractNumId w:val="240"/>
   </w:num>
   <w:num w:numId="261" w16cid:durableId="1860850401">
-    <w:abstractNumId w:val="239"/>
+    <w:abstractNumId w:val="240"/>
     <w:lvlOverride w:ilvl="1">
       <w:lvl w:ilvl="1">
         <w:numFmt w:val="bullet"/>
@@ -46109,7 +46391,7 @@
     </w:lvlOverride>
   </w:num>
   <w:num w:numId="262" w16cid:durableId="1093086728">
-    <w:abstractNumId w:val="239"/>
+    <w:abstractNumId w:val="240"/>
     <w:lvlOverride w:ilvl="1">
       <w:lvl w:ilvl="1">
         <w:numFmt w:val="bullet"/>
@@ -46129,7 +46411,7 @@
     </w:lvlOverride>
   </w:num>
   <w:num w:numId="263" w16cid:durableId="1959141894">
-    <w:abstractNumId w:val="239"/>
+    <w:abstractNumId w:val="240"/>
     <w:lvlOverride w:ilvl="1">
       <w:lvl w:ilvl="1">
         <w:numFmt w:val="bullet"/>
@@ -46149,7 +46431,7 @@
     </w:lvlOverride>
   </w:num>
   <w:num w:numId="264" w16cid:durableId="1993632123">
-    <w:abstractNumId w:val="239"/>
+    <w:abstractNumId w:val="240"/>
     <w:lvlOverride w:ilvl="1">
       <w:lvl w:ilvl="1">
         <w:numFmt w:val="bullet"/>
@@ -46169,7 +46451,7 @@
     </w:lvlOverride>
   </w:num>
   <w:num w:numId="265" w16cid:durableId="1998731107">
-    <w:abstractNumId w:val="239"/>
+    <w:abstractNumId w:val="240"/>
     <w:lvlOverride w:ilvl="1">
       <w:lvl w:ilvl="1">
         <w:numFmt w:val="bullet"/>
@@ -46666,10 +46948,10 @@
     </w:lvlOverride>
   </w:num>
   <w:num w:numId="289" w16cid:durableId="1517040379">
-    <w:abstractNumId w:val="215"/>
+    <w:abstractNumId w:val="216"/>
   </w:num>
   <w:num w:numId="290" w16cid:durableId="976379404">
-    <w:abstractNumId w:val="215"/>
+    <w:abstractNumId w:val="216"/>
     <w:lvlOverride w:ilvl="1">
       <w:lvl w:ilvl="1">
         <w:numFmt w:val="bullet"/>
@@ -46689,7 +46971,7 @@
     </w:lvlOverride>
   </w:num>
   <w:num w:numId="291" w16cid:durableId="661541238">
-    <w:abstractNumId w:val="215"/>
+    <w:abstractNumId w:val="216"/>
     <w:lvlOverride w:ilvl="1">
       <w:lvl w:ilvl="1">
         <w:numFmt w:val="bullet"/>
@@ -46709,7 +46991,7 @@
     </w:lvlOverride>
   </w:num>
   <w:num w:numId="292" w16cid:durableId="180047134">
-    <w:abstractNumId w:val="215"/>
+    <w:abstractNumId w:val="216"/>
     <w:lvlOverride w:ilvl="1">
       <w:lvl w:ilvl="1">
         <w:numFmt w:val="bullet"/>
@@ -46795,7 +47077,7 @@
     </w:lvlOverride>
   </w:num>
   <w:num w:numId="298" w16cid:durableId="1210455041">
-    <w:abstractNumId w:val="197"/>
+    <w:abstractNumId w:val="198"/>
   </w:num>
   <w:num w:numId="299" w16cid:durableId="1245333743">
     <w:abstractNumId w:val="76"/>
@@ -46853,10 +47135,10 @@
     <w:abstractNumId w:val="129"/>
   </w:num>
   <w:num w:numId="306" w16cid:durableId="1939630282">
-    <w:abstractNumId w:val="198"/>
+    <w:abstractNumId w:val="199"/>
   </w:num>
   <w:num w:numId="307" w16cid:durableId="1396196915">
-    <w:abstractNumId w:val="198"/>
+    <w:abstractNumId w:val="199"/>
     <w:lvlOverride w:ilvl="1">
       <w:lvl w:ilvl="1">
         <w:numFmt w:val="bullet"/>
@@ -46876,7 +47158,7 @@
     </w:lvlOverride>
   </w:num>
   <w:num w:numId="308" w16cid:durableId="1471708049">
-    <w:abstractNumId w:val="198"/>
+    <w:abstractNumId w:val="199"/>
     <w:lvlOverride w:ilvl="1">
       <w:lvl w:ilvl="1">
         <w:numFmt w:val="bullet"/>
@@ -46896,10 +47178,10 @@
     </w:lvlOverride>
   </w:num>
   <w:num w:numId="309" w16cid:durableId="1964460778">
-    <w:abstractNumId w:val="211"/>
+    <w:abstractNumId w:val="212"/>
   </w:num>
   <w:num w:numId="310" w16cid:durableId="2101101690">
-    <w:abstractNumId w:val="211"/>
+    <w:abstractNumId w:val="212"/>
     <w:lvlOverride w:ilvl="1">
       <w:lvl w:ilvl="1">
         <w:numFmt w:val="bullet"/>
@@ -46919,7 +47201,7 @@
     </w:lvlOverride>
   </w:num>
   <w:num w:numId="311" w16cid:durableId="1677730701">
-    <w:abstractNumId w:val="211"/>
+    <w:abstractNumId w:val="212"/>
     <w:lvlOverride w:ilvl="1">
       <w:lvl w:ilvl="1">
         <w:numFmt w:val="bullet"/>
@@ -46939,7 +47221,7 @@
     </w:lvlOverride>
   </w:num>
   <w:num w:numId="312" w16cid:durableId="1687440433">
-    <w:abstractNumId w:val="211"/>
+    <w:abstractNumId w:val="212"/>
     <w:lvlOverride w:ilvl="1">
       <w:lvl w:ilvl="1">
         <w:numFmt w:val="bullet"/>
@@ -46959,7 +47241,7 @@
     </w:lvlOverride>
   </w:num>
   <w:num w:numId="313" w16cid:durableId="334190081">
-    <w:abstractNumId w:val="211"/>
+    <w:abstractNumId w:val="212"/>
     <w:lvlOverride w:ilvl="1">
       <w:lvl w:ilvl="1">
         <w:numFmt w:val="bullet"/>
@@ -46979,7 +47261,7 @@
     </w:lvlOverride>
   </w:num>
   <w:num w:numId="314" w16cid:durableId="1638536272">
-    <w:abstractNumId w:val="211"/>
+    <w:abstractNumId w:val="212"/>
     <w:lvlOverride w:ilvl="1">
       <w:lvl w:ilvl="1">
         <w:numFmt w:val="bullet"/>
@@ -46999,7 +47281,7 @@
     </w:lvlOverride>
   </w:num>
   <w:num w:numId="315" w16cid:durableId="593048540">
-    <w:abstractNumId w:val="211"/>
+    <w:abstractNumId w:val="212"/>
     <w:lvlOverride w:ilvl="1">
       <w:lvl w:ilvl="1">
         <w:numFmt w:val="bullet"/>
@@ -47019,7 +47301,7 @@
     </w:lvlOverride>
   </w:num>
   <w:num w:numId="316" w16cid:durableId="590624177">
-    <w:abstractNumId w:val="211"/>
+    <w:abstractNumId w:val="212"/>
     <w:lvlOverride w:ilvl="1">
       <w:lvl w:ilvl="1">
         <w:numFmt w:val="bullet"/>
@@ -47039,10 +47321,10 @@
     </w:lvlOverride>
   </w:num>
   <w:num w:numId="317" w16cid:durableId="2135054504">
-    <w:abstractNumId w:val="245"/>
+    <w:abstractNumId w:val="246"/>
   </w:num>
   <w:num w:numId="318" w16cid:durableId="1790512776">
-    <w:abstractNumId w:val="225"/>
+    <w:abstractNumId w:val="226"/>
   </w:num>
   <w:num w:numId="319" w16cid:durableId="1900899971">
     <w:abstractNumId w:val="63"/>
@@ -47177,7 +47459,7 @@
     <w:abstractNumId w:val="24"/>
   </w:num>
   <w:num w:numId="329" w16cid:durableId="1137530575">
-    <w:abstractNumId w:val="178"/>
+    <w:abstractNumId w:val="179"/>
   </w:num>
   <w:num w:numId="330" w16cid:durableId="1038896762">
     <w:abstractNumId w:val="9"/>
@@ -47466,7 +47748,7 @@
     <w:abstractNumId w:val="30"/>
   </w:num>
   <w:num w:numId="346" w16cid:durableId="1170826855">
-    <w:abstractNumId w:val="176"/>
+    <w:abstractNumId w:val="177"/>
   </w:num>
   <w:num w:numId="347" w16cid:durableId="1876500035">
     <w:abstractNumId w:val="136"/>
@@ -47612,10 +47894,10 @@
     </w:lvlOverride>
   </w:num>
   <w:num w:numId="355" w16cid:durableId="162933598">
-    <w:abstractNumId w:val="204"/>
+    <w:abstractNumId w:val="205"/>
   </w:num>
   <w:num w:numId="356" w16cid:durableId="1507281708">
-    <w:abstractNumId w:val="204"/>
+    <w:abstractNumId w:val="205"/>
     <w:lvlOverride w:ilvl="1">
       <w:lvl w:ilvl="1">
         <w:numFmt w:val="bullet"/>
@@ -47635,7 +47917,7 @@
     </w:lvlOverride>
   </w:num>
   <w:num w:numId="357" w16cid:durableId="1527062965">
-    <w:abstractNumId w:val="204"/>
+    <w:abstractNumId w:val="205"/>
     <w:lvlOverride w:ilvl="1">
       <w:lvl w:ilvl="1">
         <w:numFmt w:val="bullet"/>
@@ -47655,7 +47937,7 @@
     </w:lvlOverride>
   </w:num>
   <w:num w:numId="358" w16cid:durableId="1381590890">
-    <w:abstractNumId w:val="204"/>
+    <w:abstractNumId w:val="205"/>
     <w:lvlOverride w:ilvl="1">
       <w:lvl w:ilvl="1">
         <w:numFmt w:val="bullet"/>
@@ -47675,7 +47957,7 @@
     </w:lvlOverride>
   </w:num>
   <w:num w:numId="359" w16cid:durableId="1474562395">
-    <w:abstractNumId w:val="204"/>
+    <w:abstractNumId w:val="205"/>
     <w:lvlOverride w:ilvl="1">
       <w:lvl w:ilvl="1">
         <w:numFmt w:val="bullet"/>
@@ -47695,7 +47977,7 @@
     </w:lvlOverride>
   </w:num>
   <w:num w:numId="360" w16cid:durableId="1721904938">
-    <w:abstractNumId w:val="204"/>
+    <w:abstractNumId w:val="205"/>
     <w:lvlOverride w:ilvl="1">
       <w:lvl w:ilvl="1">
         <w:numFmt w:val="bullet"/>
@@ -47715,7 +47997,7 @@
     </w:lvlOverride>
   </w:num>
   <w:num w:numId="361" w16cid:durableId="179785792">
-    <w:abstractNumId w:val="204"/>
+    <w:abstractNumId w:val="205"/>
     <w:lvlOverride w:ilvl="1">
       <w:lvl w:ilvl="1">
         <w:numFmt w:val="bullet"/>
@@ -47735,7 +48017,7 @@
     </w:lvlOverride>
   </w:num>
   <w:num w:numId="362" w16cid:durableId="822282911">
-    <w:abstractNumId w:val="204"/>
+    <w:abstractNumId w:val="205"/>
     <w:lvlOverride w:ilvl="1">
       <w:lvl w:ilvl="1">
         <w:numFmt w:val="bullet"/>
@@ -47755,13 +48037,13 @@
     </w:lvlOverride>
   </w:num>
   <w:num w:numId="363" w16cid:durableId="1525944486">
-    <w:abstractNumId w:val="208"/>
+    <w:abstractNumId w:val="209"/>
   </w:num>
   <w:num w:numId="364" w16cid:durableId="121389017">
-    <w:abstractNumId w:val="246"/>
+    <w:abstractNumId w:val="247"/>
   </w:num>
   <w:num w:numId="365" w16cid:durableId="670328241">
-    <w:abstractNumId w:val="246"/>
+    <w:abstractNumId w:val="247"/>
     <w:lvlOverride w:ilvl="1">
       <w:lvl w:ilvl="1">
         <w:numFmt w:val="bullet"/>
@@ -47781,7 +48063,7 @@
     </w:lvlOverride>
   </w:num>
   <w:num w:numId="366" w16cid:durableId="147673844">
-    <w:abstractNumId w:val="246"/>
+    <w:abstractNumId w:val="247"/>
     <w:lvlOverride w:ilvl="1">
       <w:lvl w:ilvl="1">
         <w:numFmt w:val="bullet"/>
@@ -47801,10 +48083,10 @@
     </w:lvlOverride>
   </w:num>
   <w:num w:numId="367" w16cid:durableId="440804537">
-    <w:abstractNumId w:val="174"/>
+    <w:abstractNumId w:val="175"/>
   </w:num>
   <w:num w:numId="368" w16cid:durableId="104272455">
-    <w:abstractNumId w:val="174"/>
+    <w:abstractNumId w:val="175"/>
     <w:lvlOverride w:ilvl="1">
       <w:lvl w:ilvl="1">
         <w:numFmt w:val="bullet"/>
@@ -47824,7 +48106,7 @@
     </w:lvlOverride>
   </w:num>
   <w:num w:numId="369" w16cid:durableId="1089039473">
-    <w:abstractNumId w:val="174"/>
+    <w:abstractNumId w:val="175"/>
     <w:lvlOverride w:ilvl="1">
       <w:lvl w:ilvl="1">
         <w:numFmt w:val="bullet"/>
@@ -47844,7 +48126,7 @@
     </w:lvlOverride>
   </w:num>
   <w:num w:numId="370" w16cid:durableId="1605722484">
-    <w:abstractNumId w:val="174"/>
+    <w:abstractNumId w:val="175"/>
     <w:lvlOverride w:ilvl="1">
       <w:lvl w:ilvl="1">
         <w:numFmt w:val="bullet"/>
@@ -47864,7 +48146,7 @@
     </w:lvlOverride>
   </w:num>
   <w:num w:numId="371" w16cid:durableId="1788115749">
-    <w:abstractNumId w:val="174"/>
+    <w:abstractNumId w:val="175"/>
     <w:lvlOverride w:ilvl="1">
       <w:lvl w:ilvl="1">
         <w:numFmt w:val="bullet"/>
@@ -47884,7 +48166,7 @@
     </w:lvlOverride>
   </w:num>
   <w:num w:numId="372" w16cid:durableId="389964750">
-    <w:abstractNumId w:val="174"/>
+    <w:abstractNumId w:val="175"/>
     <w:lvlOverride w:ilvl="1">
       <w:lvl w:ilvl="1">
         <w:numFmt w:val="bullet"/>
@@ -47904,7 +48186,7 @@
     </w:lvlOverride>
   </w:num>
   <w:num w:numId="373" w16cid:durableId="1775900948">
-    <w:abstractNumId w:val="174"/>
+    <w:abstractNumId w:val="175"/>
     <w:lvlOverride w:ilvl="1">
       <w:lvl w:ilvl="1">
         <w:numFmt w:val="bullet"/>
@@ -47924,7 +48206,7 @@
     </w:lvlOverride>
   </w:num>
   <w:num w:numId="374" w16cid:durableId="1583833744">
-    <w:abstractNumId w:val="174"/>
+    <w:abstractNumId w:val="175"/>
     <w:lvlOverride w:ilvl="1">
       <w:lvl w:ilvl="1">
         <w:numFmt w:val="bullet"/>
@@ -47944,7 +48226,7 @@
     </w:lvlOverride>
   </w:num>
   <w:num w:numId="375" w16cid:durableId="57016376">
-    <w:abstractNumId w:val="174"/>
+    <w:abstractNumId w:val="175"/>
     <w:lvlOverride w:ilvl="1">
       <w:lvl w:ilvl="1">
         <w:numFmt w:val="bullet"/>
@@ -47964,7 +48246,7 @@
     </w:lvlOverride>
   </w:num>
   <w:num w:numId="376" w16cid:durableId="986782883">
-    <w:abstractNumId w:val="174"/>
+    <w:abstractNumId w:val="175"/>
     <w:lvlOverride w:ilvl="1">
       <w:lvl w:ilvl="1">
         <w:numFmt w:val="bullet"/>
@@ -48047,10 +48329,10 @@
     </w:lvlOverride>
   </w:num>
   <w:num w:numId="381" w16cid:durableId="65304410">
-    <w:abstractNumId w:val="207"/>
+    <w:abstractNumId w:val="208"/>
   </w:num>
   <w:num w:numId="382" w16cid:durableId="33699091">
-    <w:abstractNumId w:val="207"/>
+    <w:abstractNumId w:val="208"/>
     <w:lvlOverride w:ilvl="1">
       <w:lvl w:ilvl="1">
         <w:numFmt w:val="bullet"/>
@@ -48070,7 +48352,7 @@
     </w:lvlOverride>
   </w:num>
   <w:num w:numId="383" w16cid:durableId="344136954">
-    <w:abstractNumId w:val="207"/>
+    <w:abstractNumId w:val="208"/>
     <w:lvlOverride w:ilvl="1">
       <w:lvl w:ilvl="1">
         <w:numFmt w:val="bullet"/>
@@ -48474,10 +48756,10 @@
     <w:abstractNumId w:val="159"/>
   </w:num>
   <w:num w:numId="410" w16cid:durableId="451897618">
-    <w:abstractNumId w:val="199"/>
+    <w:abstractNumId w:val="200"/>
   </w:num>
   <w:num w:numId="411" w16cid:durableId="975717288">
-    <w:abstractNumId w:val="199"/>
+    <w:abstractNumId w:val="200"/>
     <w:lvlOverride w:ilvl="1">
       <w:lvl w:ilvl="1">
         <w:numFmt w:val="bullet"/>
@@ -48497,7 +48779,7 @@
     </w:lvlOverride>
   </w:num>
   <w:num w:numId="412" w16cid:durableId="567880089">
-    <w:abstractNumId w:val="199"/>
+    <w:abstractNumId w:val="200"/>
     <w:lvlOverride w:ilvl="1">
       <w:lvl w:ilvl="1">
         <w:numFmt w:val="bullet"/>
@@ -48517,7 +48799,7 @@
     </w:lvlOverride>
   </w:num>
   <w:num w:numId="413" w16cid:durableId="139032186">
-    <w:abstractNumId w:val="199"/>
+    <w:abstractNumId w:val="200"/>
     <w:lvlOverride w:ilvl="1">
       <w:lvl w:ilvl="1">
         <w:numFmt w:val="bullet"/>
@@ -48537,7 +48819,7 @@
     </w:lvlOverride>
   </w:num>
   <w:num w:numId="414" w16cid:durableId="1200895258">
-    <w:abstractNumId w:val="199"/>
+    <w:abstractNumId w:val="200"/>
     <w:lvlOverride w:ilvl="1">
       <w:lvl w:ilvl="1">
         <w:numFmt w:val="bullet"/>
@@ -48557,7 +48839,7 @@
     </w:lvlOverride>
   </w:num>
   <w:num w:numId="415" w16cid:durableId="1534031402">
-    <w:abstractNumId w:val="199"/>
+    <w:abstractNumId w:val="200"/>
     <w:lvlOverride w:ilvl="1">
       <w:lvl w:ilvl="1">
         <w:numFmt w:val="bullet"/>
@@ -48583,10 +48865,10 @@
     <w:abstractNumId w:val="130"/>
   </w:num>
   <w:num w:numId="418" w16cid:durableId="1618828123">
-    <w:abstractNumId w:val="238"/>
+    <w:abstractNumId w:val="239"/>
   </w:num>
   <w:num w:numId="419" w16cid:durableId="371350015">
-    <w:abstractNumId w:val="238"/>
+    <w:abstractNumId w:val="239"/>
     <w:lvlOverride w:ilvl="1">
       <w:lvl w:ilvl="1">
         <w:numFmt w:val="bullet"/>
@@ -48606,7 +48888,7 @@
     </w:lvlOverride>
   </w:num>
   <w:num w:numId="420" w16cid:durableId="54276952">
-    <w:abstractNumId w:val="238"/>
+    <w:abstractNumId w:val="239"/>
     <w:lvlOverride w:ilvl="1">
       <w:lvl w:ilvl="1">
         <w:numFmt w:val="bullet"/>
@@ -48626,7 +48908,7 @@
     </w:lvlOverride>
   </w:num>
   <w:num w:numId="421" w16cid:durableId="1527601039">
-    <w:abstractNumId w:val="238"/>
+    <w:abstractNumId w:val="239"/>
     <w:lvlOverride w:ilvl="1">
       <w:lvl w:ilvl="1">
         <w:numFmt w:val="bullet"/>
@@ -48646,7 +48928,7 @@
     </w:lvlOverride>
   </w:num>
   <w:num w:numId="422" w16cid:durableId="432407122">
-    <w:abstractNumId w:val="238"/>
+    <w:abstractNumId w:val="239"/>
     <w:lvlOverride w:ilvl="1">
       <w:lvl w:ilvl="1">
         <w:numFmt w:val="bullet"/>
@@ -48666,7 +48948,7 @@
     </w:lvlOverride>
   </w:num>
   <w:num w:numId="423" w16cid:durableId="23950186">
-    <w:abstractNumId w:val="238"/>
+    <w:abstractNumId w:val="239"/>
     <w:lvlOverride w:ilvl="1">
       <w:lvl w:ilvl="1">
         <w:numFmt w:val="bullet"/>
@@ -48686,7 +48968,7 @@
     </w:lvlOverride>
   </w:num>
   <w:num w:numId="424" w16cid:durableId="1095712291">
-    <w:abstractNumId w:val="238"/>
+    <w:abstractNumId w:val="239"/>
     <w:lvlOverride w:ilvl="1">
       <w:lvl w:ilvl="1">
         <w:numFmt w:val="bullet"/>
@@ -48706,7 +48988,7 @@
     </w:lvlOverride>
   </w:num>
   <w:num w:numId="425" w16cid:durableId="44649956">
-    <w:abstractNumId w:val="238"/>
+    <w:abstractNumId w:val="239"/>
     <w:lvlOverride w:ilvl="1">
       <w:lvl w:ilvl="1">
         <w:numFmt w:val="bullet"/>
@@ -49210,10 +49492,10 @@
     </w:lvlOverride>
   </w:num>
   <w:num w:numId="457" w16cid:durableId="595866949">
-    <w:abstractNumId w:val="226"/>
+    <w:abstractNumId w:val="227"/>
   </w:num>
   <w:num w:numId="458" w16cid:durableId="1789736070">
-    <w:abstractNumId w:val="226"/>
+    <w:abstractNumId w:val="227"/>
     <w:lvlOverride w:ilvl="1">
       <w:lvl w:ilvl="1">
         <w:numFmt w:val="bullet"/>
@@ -49233,7 +49515,7 @@
     </w:lvlOverride>
   </w:num>
   <w:num w:numId="459" w16cid:durableId="578641482">
-    <w:abstractNumId w:val="226"/>
+    <w:abstractNumId w:val="227"/>
     <w:lvlOverride w:ilvl="1">
       <w:lvl w:ilvl="1">
         <w:numFmt w:val="bullet"/>
@@ -49253,7 +49535,7 @@
     </w:lvlOverride>
   </w:num>
   <w:num w:numId="460" w16cid:durableId="1626159982">
-    <w:abstractNumId w:val="226"/>
+    <w:abstractNumId w:val="227"/>
     <w:lvlOverride w:ilvl="1">
       <w:lvl w:ilvl="1">
         <w:numFmt w:val="bullet"/>
@@ -49273,7 +49555,7 @@
     </w:lvlOverride>
   </w:num>
   <w:num w:numId="461" w16cid:durableId="362823212">
-    <w:abstractNumId w:val="226"/>
+    <w:abstractNumId w:val="227"/>
     <w:lvlOverride w:ilvl="1">
       <w:lvl w:ilvl="1">
         <w:numFmt w:val="bullet"/>
@@ -49336,10 +49618,10 @@
     </w:lvlOverride>
   </w:num>
   <w:num w:numId="465" w16cid:durableId="292905749">
-    <w:abstractNumId w:val="216"/>
+    <w:abstractNumId w:val="217"/>
   </w:num>
   <w:num w:numId="466" w16cid:durableId="201944174">
-    <w:abstractNumId w:val="216"/>
+    <w:abstractNumId w:val="217"/>
     <w:lvlOverride w:ilvl="1">
       <w:lvl w:ilvl="1">
         <w:numFmt w:val="bullet"/>
@@ -49359,7 +49641,7 @@
     </w:lvlOverride>
   </w:num>
   <w:num w:numId="467" w16cid:durableId="359167791">
-    <w:abstractNumId w:val="216"/>
+    <w:abstractNumId w:val="217"/>
     <w:lvlOverride w:ilvl="1">
       <w:lvl w:ilvl="1">
         <w:numFmt w:val="bullet"/>
@@ -49379,7 +49661,7 @@
     </w:lvlOverride>
   </w:num>
   <w:num w:numId="468" w16cid:durableId="515273267">
-    <w:abstractNumId w:val="216"/>
+    <w:abstractNumId w:val="217"/>
     <w:lvlOverride w:ilvl="1">
       <w:lvl w:ilvl="1">
         <w:numFmt w:val="bullet"/>
@@ -49399,7 +49681,7 @@
     </w:lvlOverride>
   </w:num>
   <w:num w:numId="469" w16cid:durableId="176963739">
-    <w:abstractNumId w:val="216"/>
+    <w:abstractNumId w:val="217"/>
     <w:lvlOverride w:ilvl="1">
       <w:lvl w:ilvl="1">
         <w:numFmt w:val="bullet"/>
@@ -49434,10 +49716,10 @@
     <w:abstractNumId w:val="33"/>
   </w:num>
   <w:num w:numId="475" w16cid:durableId="739333064">
-    <w:abstractNumId w:val="194"/>
+    <w:abstractNumId w:val="195"/>
   </w:num>
   <w:num w:numId="476" w16cid:durableId="245775278">
-    <w:abstractNumId w:val="202"/>
+    <w:abstractNumId w:val="203"/>
   </w:num>
   <w:num w:numId="477" w16cid:durableId="2144493695">
     <w:abstractNumId w:val="86"/>
@@ -49449,31 +49731,31 @@
     <w:abstractNumId w:val="21"/>
   </w:num>
   <w:num w:numId="480" w16cid:durableId="1818689662">
-    <w:abstractNumId w:val="200"/>
+    <w:abstractNumId w:val="201"/>
   </w:num>
   <w:num w:numId="481" w16cid:durableId="1355155217">
     <w:abstractNumId w:val="22"/>
   </w:num>
   <w:num w:numId="482" w16cid:durableId="1408383904">
-    <w:abstractNumId w:val="195"/>
+    <w:abstractNumId w:val="196"/>
   </w:num>
   <w:num w:numId="483" w16cid:durableId="247464343">
-    <w:abstractNumId w:val="184"/>
+    <w:abstractNumId w:val="185"/>
   </w:num>
   <w:num w:numId="484" w16cid:durableId="1698965271">
-    <w:abstractNumId w:val="173"/>
+    <w:abstractNumId w:val="174"/>
   </w:num>
   <w:num w:numId="485" w16cid:durableId="196042308">
     <w:abstractNumId w:val="45"/>
   </w:num>
   <w:num w:numId="486" w16cid:durableId="155192790">
-    <w:abstractNumId w:val="206"/>
+    <w:abstractNumId w:val="207"/>
   </w:num>
   <w:num w:numId="487" w16cid:durableId="124006441">
     <w:abstractNumId w:val="127"/>
   </w:num>
   <w:num w:numId="488" w16cid:durableId="1021859187">
-    <w:abstractNumId w:val="203"/>
+    <w:abstractNumId w:val="204"/>
   </w:num>
   <w:num w:numId="489" w16cid:durableId="844326744">
     <w:abstractNumId w:val="142"/>
@@ -49482,7 +49764,7 @@
     <w:abstractNumId w:val="77"/>
   </w:num>
   <w:num w:numId="491" w16cid:durableId="1285188320">
-    <w:abstractNumId w:val="182"/>
+    <w:abstractNumId w:val="183"/>
   </w:num>
   <w:num w:numId="492" w16cid:durableId="1186096464">
     <w:abstractNumId w:val="120"/>
@@ -49620,7 +49902,7 @@
     <w:abstractNumId w:val="112"/>
   </w:num>
   <w:num w:numId="503" w16cid:durableId="769934454">
-    <w:abstractNumId w:val="212"/>
+    <w:abstractNumId w:val="213"/>
   </w:num>
   <w:num w:numId="504" w16cid:durableId="127092240">
     <w:abstractNumId w:val="152"/>
@@ -49632,7 +49914,7 @@
     <w:abstractNumId w:val="161"/>
   </w:num>
   <w:num w:numId="507" w16cid:durableId="2041665929">
-    <w:abstractNumId w:val="233"/>
+    <w:abstractNumId w:val="234"/>
   </w:num>
   <w:num w:numId="508" w16cid:durableId="1096680387">
     <w:abstractNumId w:val="149"/>
@@ -49650,7 +49932,7 @@
     <w:abstractNumId w:val="50"/>
   </w:num>
   <w:num w:numId="513" w16cid:durableId="1565489822">
-    <w:abstractNumId w:val="214"/>
+    <w:abstractNumId w:val="215"/>
   </w:num>
   <w:num w:numId="514" w16cid:durableId="1695761682">
     <w:abstractNumId w:val="74"/>
@@ -49662,7 +49944,7 @@
     <w:abstractNumId w:val="73"/>
   </w:num>
   <w:num w:numId="517" w16cid:durableId="301466323">
-    <w:abstractNumId w:val="227"/>
+    <w:abstractNumId w:val="228"/>
   </w:num>
   <w:num w:numId="518" w16cid:durableId="1098983162">
     <w:abstractNumId w:val="2"/>
@@ -49671,37 +49953,37 @@
     <w:abstractNumId w:val="11"/>
   </w:num>
   <w:num w:numId="520" w16cid:durableId="1560482079">
-    <w:abstractNumId w:val="222"/>
+    <w:abstractNumId w:val="223"/>
   </w:num>
   <w:num w:numId="521" w16cid:durableId="939142479">
-    <w:abstractNumId w:val="180"/>
+    <w:abstractNumId w:val="181"/>
   </w:num>
   <w:num w:numId="522" w16cid:durableId="2129465230">
-    <w:abstractNumId w:val="192"/>
+    <w:abstractNumId w:val="193"/>
   </w:num>
   <w:num w:numId="523" w16cid:durableId="170224357">
     <w:abstractNumId w:val="68"/>
   </w:num>
   <w:num w:numId="524" w16cid:durableId="1300499789">
-    <w:abstractNumId w:val="236"/>
+    <w:abstractNumId w:val="237"/>
   </w:num>
   <w:num w:numId="525" w16cid:durableId="1112822429">
-    <w:abstractNumId w:val="188"/>
+    <w:abstractNumId w:val="189"/>
   </w:num>
   <w:num w:numId="526" w16cid:durableId="515459889">
     <w:abstractNumId w:val="169"/>
   </w:num>
   <w:num w:numId="527" w16cid:durableId="2046323769">
-    <w:abstractNumId w:val="218"/>
+    <w:abstractNumId w:val="219"/>
   </w:num>
   <w:num w:numId="528" w16cid:durableId="578910849">
-    <w:abstractNumId w:val="220"/>
+    <w:abstractNumId w:val="221"/>
   </w:num>
   <w:num w:numId="529" w16cid:durableId="712536835">
     <w:abstractNumId w:val="43"/>
   </w:num>
   <w:num w:numId="530" w16cid:durableId="896403956">
-    <w:abstractNumId w:val="248"/>
+    <w:abstractNumId w:val="249"/>
   </w:num>
   <w:num w:numId="531" w16cid:durableId="2048600201">
     <w:abstractNumId w:val="122"/>
@@ -49716,7 +49998,7 @@
     <w:abstractNumId w:val="34"/>
   </w:num>
   <w:num w:numId="535" w16cid:durableId="242110835">
-    <w:abstractNumId w:val="179"/>
+    <w:abstractNumId w:val="180"/>
   </w:num>
   <w:num w:numId="536" w16cid:durableId="1106729083">
     <w:abstractNumId w:val="65"/>
@@ -49725,10 +50007,10 @@
     <w:abstractNumId w:val="83"/>
   </w:num>
   <w:num w:numId="538" w16cid:durableId="1309897227">
-    <w:abstractNumId w:val="187"/>
+    <w:abstractNumId w:val="188"/>
   </w:num>
   <w:num w:numId="539" w16cid:durableId="1189875745">
-    <w:abstractNumId w:val="191"/>
+    <w:abstractNumId w:val="192"/>
   </w:num>
   <w:num w:numId="540" w16cid:durableId="1567716513">
     <w:abstractNumId w:val="32"/>
@@ -49746,7 +50028,7 @@
     <w:abstractNumId w:val="134"/>
   </w:num>
   <w:num w:numId="545" w16cid:durableId="23679911">
-    <w:abstractNumId w:val="242"/>
+    <w:abstractNumId w:val="243"/>
   </w:num>
   <w:num w:numId="546" w16cid:durableId="904680098">
     <w:abstractNumId w:val="156"/>
@@ -49761,19 +50043,22 @@
     <w:abstractNumId w:val="10"/>
   </w:num>
   <w:num w:numId="550" w16cid:durableId="1668358292">
-    <w:abstractNumId w:val="241"/>
+    <w:abstractNumId w:val="242"/>
   </w:num>
   <w:num w:numId="551" w16cid:durableId="2093622435">
     <w:abstractNumId w:val="124"/>
   </w:num>
   <w:num w:numId="552" w16cid:durableId="2121993035">
-    <w:abstractNumId w:val="237"/>
+    <w:abstractNumId w:val="238"/>
   </w:num>
   <w:num w:numId="553" w16cid:durableId="278295026">
     <w:abstractNumId w:val="78"/>
   </w:num>
   <w:num w:numId="554" w16cid:durableId="1125469350">
     <w:abstractNumId w:val="95"/>
+  </w:num>
+  <w:num w:numId="555" w16cid:durableId="1550527793">
+    <w:abstractNumId w:val="173"/>
   </w:num>
   <w:numIdMacAtCleanup w:val="18"/>
 </w:numbering>
@@ -50369,6 +50654,7 @@
   <w:style w:type="character" w:default="1" w:styleId="DefaultParagraphFont">
     <w:name w:val="Default Paragraph Font"/>
     <w:uiPriority w:val="1"/>
+    <w:semiHidden/>
     <w:unhideWhenUsed/>
   </w:style>
   <w:style w:type="table" w:default="1" w:styleId="TableNormal">

</xml_diff>

<commit_message>
Improved Start screen scene UI, Added DOTWeen for fading effects, Added Bonus flag action. Added TitleEasterEgg effect on text.
</commit_message>
<xml_diff>
--- a/Documentation/Unity Associate Programmer.docx
+++ b/Documentation/Unity Associate Programmer.docx
@@ -10823,7 +10823,592 @@
         <w:t>.</w:t>
       </w:r>
     </w:p>
-    <w:p/>
+    <w:p>
+      <w:pPr>
+        <w:pStyle w:val="Heading3"/>
+        <w:ind w:left="0" w:firstLine="0"/>
+      </w:pPr>
+      <w:r>
+        <w:lastRenderedPageBreak/>
+        <w:t>3.4.2 Session 2: UI Functionality</w:t>
+      </w:r>
+    </w:p>
+    <w:p>
+      <w:pPr>
+        <w:ind w:left="0" w:firstLine="0"/>
+      </w:pPr>
+    </w:p>
+    <w:p>
+      <w:pPr>
+        <w:ind w:left="0" w:firstLine="0"/>
+        <w:rPr>
+          <w:b/>
+          <w:bCs/>
+        </w:rPr>
+      </w:pPr>
+      <w:r>
+        <w:rPr>
+          <w:b/>
+          <w:bCs/>
+        </w:rPr>
+        <w:t xml:space="preserve">Challenge: </w:t>
+      </w:r>
+      <w:r>
+        <w:rPr>
+          <w:b/>
+          <w:bCs/>
+        </w:rPr>
+        <w:t>Challenge 2_ Adding Functionality.pdf</w:t>
+      </w:r>
+    </w:p>
+    <w:p>
+      <w:pPr>
+        <w:ind w:left="0" w:firstLine="0"/>
+        <w:rPr>
+          <w:b/>
+          <w:bCs/>
+        </w:rPr>
+      </w:pPr>
+      <w:r>
+        <w:rPr>
+          <w:b/>
+          <w:bCs/>
+        </w:rPr>
+        <w:t>it’s time to add functionality so players can load into the game scene and quit the application.</w:t>
+      </w:r>
+    </w:p>
+    <w:p>
+      <w:pPr>
+        <w:ind w:left="0" w:firstLine="0"/>
+        <w:rPr>
+          <w:b/>
+          <w:bCs/>
+        </w:rPr>
+      </w:pPr>
+    </w:p>
+    <w:p>
+      <w:pPr>
+        <w:ind w:left="0" w:firstLine="0"/>
+        <w:rPr>
+          <w:b/>
+          <w:bCs/>
+        </w:rPr>
+      </w:pPr>
+      <w:r>
+        <w:rPr>
+          <w:b/>
+          <w:bCs/>
+        </w:rPr>
+        <w:t>Solution:</w:t>
+      </w:r>
+    </w:p>
+    <w:p>
+      <w:pPr>
+        <w:pStyle w:val="ListParagraph"/>
+        <w:numPr>
+          <w:ilvl w:val="0"/>
+          <w:numId w:val="560"/>
+        </w:numPr>
+      </w:pPr>
+      <w:r>
+        <w:t xml:space="preserve">Create a new script </w:t>
+      </w:r>
+      <w:r>
+        <w:rPr>
+          <w:b/>
+          <w:bCs/>
+        </w:rPr>
+        <w:t>Play</w:t>
+      </w:r>
+      <w:r>
+        <w:rPr>
+          <w:b/>
+          <w:bCs/>
+        </w:rPr>
+        <w:t>Game</w:t>
+      </w:r>
+      <w:r>
+        <w:rPr>
+          <w:b/>
+          <w:bCs/>
+        </w:rPr>
+        <w:t>Handler</w:t>
+      </w:r>
+      <w:r>
+        <w:rPr>
+          <w:b/>
+          <w:bCs/>
+        </w:rPr>
+        <w:t>.</w:t>
+      </w:r>
+    </w:p>
+    <w:p>
+      <w:pPr>
+        <w:pStyle w:val="ListParagraph"/>
+        <w:numPr>
+          <w:ilvl w:val="1"/>
+          <w:numId w:val="560"/>
+        </w:numPr>
+      </w:pPr>
+      <w:r>
+        <w:t>Add references to PlayButton, OverlayPanel to hide on click.</w:t>
+      </w:r>
+    </w:p>
+    <w:p>
+      <w:pPr>
+        <w:pStyle w:val="ListParagraph"/>
+        <w:numPr>
+          <w:ilvl w:val="1"/>
+          <w:numId w:val="560"/>
+        </w:numPr>
+      </w:pPr>
+      <w:r>
+        <w:t>Display a loading text on click.</w:t>
+      </w:r>
+    </w:p>
+    <w:p>
+      <w:pPr>
+        <w:pStyle w:val="ListParagraph"/>
+        <w:numPr>
+          <w:ilvl w:val="1"/>
+          <w:numId w:val="560"/>
+        </w:numPr>
+      </w:pPr>
+      <w:r>
+        <w:t>Stop playing the sound on click.</w:t>
+      </w:r>
+    </w:p>
+    <w:p>
+      <w:pPr>
+        <w:pStyle w:val="ListParagraph"/>
+        <w:numPr>
+          <w:ilvl w:val="1"/>
+          <w:numId w:val="560"/>
+        </w:numPr>
+      </w:pPr>
+      <w:r>
+        <w:t>Load the “</w:t>
+      </w:r>
+      <w:r>
+        <w:rPr>
+          <w:b/>
+          <w:bCs/>
+        </w:rPr>
+        <w:t>Level1_Scene</w:t>
+      </w:r>
+      <w:r>
+        <w:rPr>
+          <w:b/>
+          <w:bCs/>
+        </w:rPr>
+        <w:t>”</w:t>
+      </w:r>
+      <w:r>
+        <w:t xml:space="preserve"> on click.</w:t>
+      </w:r>
+    </w:p>
+    <w:p>
+      <w:pPr>
+        <w:pStyle w:val="ListParagraph"/>
+        <w:numPr>
+          <w:ilvl w:val="0"/>
+          <w:numId w:val="560"/>
+        </w:numPr>
+      </w:pPr>
+      <w:r>
+        <w:t xml:space="preserve">Resuse the script </w:t>
+      </w:r>
+      <w:r>
+        <w:rPr>
+          <w:b/>
+          <w:bCs/>
+        </w:rPr>
+        <w:t>Quit</w:t>
+      </w:r>
+      <w:r>
+        <w:rPr>
+          <w:b/>
+          <w:bCs/>
+        </w:rPr>
+        <w:t xml:space="preserve">GameHander </w:t>
+      </w:r>
+      <w:r>
+        <w:t xml:space="preserve"> to show the quit popup dialog.</w:t>
+      </w:r>
+    </w:p>
+    <w:p>
+      <w:pPr>
+        <w:pStyle w:val="ListParagraph"/>
+        <w:numPr>
+          <w:ilvl w:val="0"/>
+          <w:numId w:val="560"/>
+        </w:numPr>
+      </w:pPr>
+      <w:r>
+        <w:t xml:space="preserve">Create a script </w:t>
+      </w:r>
+      <w:r>
+        <w:rPr>
+          <w:b/>
+          <w:bCs/>
+        </w:rPr>
+        <w:t>TitleEasterEgg</w:t>
+      </w:r>
+      <w:r>
+        <w:rPr>
+          <w:b/>
+          <w:bCs/>
+        </w:rPr>
+        <w:t xml:space="preserve"> </w:t>
+      </w:r>
+      <w:r>
+        <w:t>which changes behavior of a text on mouse event click.</w:t>
+      </w:r>
+    </w:p>
+    <w:p>
+      <w:pPr>
+        <w:pStyle w:val="ListParagraph"/>
+        <w:numPr>
+          <w:ilvl w:val="1"/>
+          <w:numId w:val="560"/>
+        </w:numPr>
+      </w:pPr>
+      <w:r>
+        <w:t xml:space="preserve">Check the </w:t>
+      </w:r>
+      <w:r>
+        <w:rPr>
+          <w:b/>
+          <w:bCs/>
+        </w:rPr>
+        <w:t>Rect transform</w:t>
+      </w:r>
+      <w:r>
+        <w:t xml:space="preserve"> of the text and adjust using </w:t>
+      </w:r>
+      <w:r>
+        <w:rPr>
+          <w:b/>
+          <w:bCs/>
+        </w:rPr>
+        <w:t>rect tool</w:t>
+      </w:r>
+      <w:r>
+        <w:rPr>
+          <w:b/>
+          <w:bCs/>
+        </w:rPr>
+        <w:t>.</w:t>
+      </w:r>
+    </w:p>
+    <w:p>
+      <w:pPr>
+        <w:pStyle w:val="ListParagraph"/>
+        <w:numPr>
+          <w:ilvl w:val="0"/>
+          <w:numId w:val="560"/>
+        </w:numPr>
+      </w:pPr>
+      <w:r>
+        <w:t xml:space="preserve">Attach the scripts to </w:t>
+      </w:r>
+      <w:r>
+        <w:rPr>
+          <w:b/>
+          <w:bCs/>
+        </w:rPr>
+        <w:t>GameManager</w:t>
+      </w:r>
+      <w:r>
+        <w:rPr>
+          <w:b/>
+          <w:bCs/>
+        </w:rPr>
+        <w:t xml:space="preserve"> </w:t>
+      </w:r>
+      <w:r>
+        <w:t>and assign the objects.</w:t>
+      </w:r>
+    </w:p>
+    <w:p>
+      <w:pPr>
+        <w:pStyle w:val="ListParagraph"/>
+        <w:numPr>
+          <w:ilvl w:val="0"/>
+          <w:numId w:val="560"/>
+        </w:numPr>
+      </w:pPr>
+      <w:r>
+        <w:t>Let</w:t>
+      </w:r>
+      <w:r>
+        <w:t>’</w:t>
+      </w:r>
+      <w:r>
+        <w:t xml:space="preserve">s use a free Unity Asset library </w:t>
+      </w:r>
+      <w:r>
+        <w:rPr>
+          <w:b/>
+          <w:bCs/>
+        </w:rPr>
+        <w:t>DOTween</w:t>
+      </w:r>
+      <w:r>
+        <w:rPr>
+          <w:b/>
+          <w:bCs/>
+        </w:rPr>
+        <w:t xml:space="preserve"> </w:t>
+      </w:r>
+      <w:r>
+        <w:t>for our fading animations.</w:t>
+      </w:r>
+    </w:p>
+    <w:p>
+      <w:pPr>
+        <w:pStyle w:val="ListParagraph"/>
+        <w:numPr>
+          <w:ilvl w:val="1"/>
+          <w:numId w:val="560"/>
+        </w:numPr>
+      </w:pPr>
+      <w:r>
+        <w:t xml:space="preserve">Click on the link on top in </w:t>
+      </w:r>
+      <w:r>
+        <w:rPr>
+          <w:b/>
+          <w:bCs/>
+        </w:rPr>
+        <w:t>TitleScreenManager</w:t>
+      </w:r>
+      <w:r>
+        <w:rPr>
+          <w:b/>
+          <w:bCs/>
+        </w:rPr>
+        <w:t>.cs</w:t>
+      </w:r>
+    </w:p>
+    <w:p>
+      <w:pPr>
+        <w:pStyle w:val="ListParagraph"/>
+        <w:numPr>
+          <w:ilvl w:val="1"/>
+          <w:numId w:val="560"/>
+        </w:numPr>
+      </w:pPr>
+      <w:r>
+        <w:t>It will open Unity’ Asset Store</w:t>
+      </w:r>
+      <w:r>
+        <w:t xml:space="preserve"> &gt;</w:t>
+      </w:r>
+      <w:r>
+        <w:t xml:space="preserve"> </w:t>
+      </w:r>
+      <w:r>
+        <w:rPr>
+          <w:b/>
+          <w:bCs/>
+        </w:rPr>
+        <w:t>DOTween</w:t>
+      </w:r>
+      <w:r>
+        <w:t xml:space="preserve"> &gt;</w:t>
+      </w:r>
+      <w:r>
+        <w:t xml:space="preserve"> Download &gt; Add to project.</w:t>
+      </w:r>
+    </w:p>
+    <w:p>
+      <w:pPr>
+        <w:pStyle w:val="ListParagraph"/>
+        <w:numPr>
+          <w:ilvl w:val="1"/>
+          <w:numId w:val="560"/>
+        </w:numPr>
+      </w:pPr>
+      <w:r>
+        <w:t>Setup and configure &gt; Click create A0.. button &gt; This will add and activate modules.</w:t>
+      </w:r>
+    </w:p>
+    <w:p>
+      <w:pPr>
+        <w:pStyle w:val="ListParagraph"/>
+        <w:numPr>
+          <w:ilvl w:val="1"/>
+          <w:numId w:val="560"/>
+        </w:numPr>
+      </w:pPr>
+      <w:r>
+        <w:t xml:space="preserve">Use </w:t>
+      </w:r>
+      <w:r>
+        <w:rPr>
+          <w:b/>
+          <w:bCs/>
+        </w:rPr>
+        <w:t>DG.DOFade</w:t>
+      </w:r>
+      <w:r>
+        <w:rPr>
+          <w:b/>
+          <w:bCs/>
+        </w:rPr>
+        <w:t>(</w:t>
+      </w:r>
+      <w:r>
+        <w:rPr>
+          <w:b/>
+          <w:bCs/>
+        </w:rPr>
+        <w:t>value, duration</w:t>
+      </w:r>
+      <w:r>
+        <w:rPr>
+          <w:b/>
+          <w:bCs/>
+        </w:rPr>
+        <w:t>)</w:t>
+      </w:r>
+      <w:r>
+        <w:t xml:space="preserve"> for Objects having component </w:t>
+      </w:r>
+      <w:r>
+        <w:rPr>
+          <w:b/>
+          <w:bCs/>
+        </w:rPr>
+        <w:t>CanvasGroup</w:t>
+      </w:r>
+    </w:p>
+    <w:p>
+      <w:pPr>
+        <w:pStyle w:val="ListParagraph"/>
+        <w:numPr>
+          <w:ilvl w:val="1"/>
+          <w:numId w:val="560"/>
+        </w:numPr>
+      </w:pPr>
+      <w:r>
+        <w:t xml:space="preserve">For Screen transitions, use an Image gameobject </w:t>
+      </w:r>
+      <w:r>
+        <w:t xml:space="preserve">of white color </w:t>
+      </w:r>
+      <w:r>
+        <w:t>and set its Alpha to 0 initially.</w:t>
+      </w:r>
+    </w:p>
+    <w:p>
+      <w:pPr>
+        <w:pStyle w:val="ListParagraph"/>
+        <w:numPr>
+          <w:ilvl w:val="1"/>
+          <w:numId w:val="560"/>
+        </w:numPr>
+      </w:pPr>
+      <w:r>
+        <w:t>Use (1,1) for making it 0 to 1 opaque. The second parameter is the time duration.</w:t>
+      </w:r>
+    </w:p>
+    <w:p>
+      <w:pPr>
+        <w:pStyle w:val="ListParagraph"/>
+        <w:numPr>
+          <w:ilvl w:val="1"/>
+          <w:numId w:val="560"/>
+        </w:numPr>
+      </w:pPr>
+      <w:r>
+        <w:t>Use( 0,1) for making it 1 to 0 transparent.</w:t>
+      </w:r>
+    </w:p>
+    <w:p>
+      <w:pPr>
+        <w:pStyle w:val="ListParagraph"/>
+        <w:numPr>
+          <w:ilvl w:val="1"/>
+          <w:numId w:val="560"/>
+        </w:numPr>
+      </w:pPr>
+      <w:r>
+        <w:t xml:space="preserve">Attach the </w:t>
+      </w:r>
+      <w:r>
+        <w:rPr>
+          <w:b/>
+          <w:bCs/>
+        </w:rPr>
+        <w:t>TitleScreenManager</w:t>
+      </w:r>
+      <w:r>
+        <w:rPr>
+          <w:b/>
+          <w:bCs/>
+        </w:rPr>
+        <w:t xml:space="preserve"> </w:t>
+      </w:r>
+      <w:r>
+        <w:t xml:space="preserve">to </w:t>
+      </w:r>
+      <w:r>
+        <w:rPr>
+          <w:b/>
+          <w:bCs/>
+        </w:rPr>
+        <w:t>GameManager</w:t>
+      </w:r>
+      <w:r>
+        <w:rPr>
+          <w:b/>
+          <w:bCs/>
+        </w:rPr>
+        <w:t xml:space="preserve"> </w:t>
+      </w:r>
+      <w:r>
+        <w:t>and assign objects.</w:t>
+      </w:r>
+    </w:p>
+    <w:p>
+      <w:pPr>
+        <w:pStyle w:val="ListParagraph"/>
+        <w:numPr>
+          <w:ilvl w:val="1"/>
+          <w:numId w:val="560"/>
+        </w:numPr>
+      </w:pPr>
+      <w:r>
+        <w:t xml:space="preserve">Optionally add a </w:t>
+      </w:r>
+      <w:r>
+        <w:rPr>
+          <w:i/>
+          <w:iCs/>
+        </w:rPr>
+        <w:t xml:space="preserve">“Loading…” </w:t>
+      </w:r>
+      <w:r>
+        <w:t>text once Play is clicked.</w:t>
+      </w:r>
+    </w:p>
+    <w:p>
+      <w:pPr>
+        <w:pStyle w:val="ListParagraph"/>
+        <w:numPr>
+          <w:ilvl w:val="1"/>
+          <w:numId w:val="560"/>
+        </w:numPr>
+      </w:pPr>
+      <w:r>
+        <w:t>Use fade effects instead of setActive()</w:t>
+      </w:r>
+      <w:r>
+        <w:t xml:space="preserve"> to enhance UI experience.</w:t>
+      </w:r>
+    </w:p>
     <w:p>
       <w:pPr>
         <w:ind w:left="0" w:firstLine="0"/>
@@ -27903,6 +28488,92 @@
     </w:lvl>
   </w:abstractNum>
   <w:abstractNum w:abstractNumId="130" w15:restartNumberingAfterBreak="0">
+    <w:nsid w:val="49F33EB0"/>
+    <w:multiLevelType w:val="multilevel"/>
+    <w:tmpl w:val="0A5E29C2"/>
+    <w:lvl w:ilvl="0">
+      <w:start w:val="1"/>
+      <w:numFmt w:val="decimal"/>
+      <w:lvlText w:val="%1."/>
+      <w:lvlJc w:val="left"/>
+      <w:pPr>
+        <w:ind w:left="360" w:hanging="360"/>
+      </w:pPr>
+    </w:lvl>
+    <w:lvl w:ilvl="1">
+      <w:start w:val="1"/>
+      <w:numFmt w:val="lowerLetter"/>
+      <w:lvlText w:val="%2)"/>
+      <w:lvlJc w:val="left"/>
+      <w:pPr>
+        <w:ind w:left="720" w:hanging="360"/>
+      </w:pPr>
+    </w:lvl>
+    <w:lvl w:ilvl="2">
+      <w:start w:val="1"/>
+      <w:numFmt w:val="lowerRoman"/>
+      <w:lvlText w:val="%3)"/>
+      <w:lvlJc w:val="left"/>
+      <w:pPr>
+        <w:ind w:left="1080" w:hanging="360"/>
+      </w:pPr>
+    </w:lvl>
+    <w:lvl w:ilvl="3">
+      <w:start w:val="1"/>
+      <w:numFmt w:val="lowerLetter"/>
+      <w:lvlText w:val="%4."/>
+      <w:lvlJc w:val="left"/>
+      <w:pPr>
+        <w:ind w:left="1440" w:hanging="360"/>
+      </w:pPr>
+    </w:lvl>
+    <w:lvl w:ilvl="4">
+      <w:start w:val="1"/>
+      <w:numFmt w:val="lowerLetter"/>
+      <w:lvlText w:val="(%5)"/>
+      <w:lvlJc w:val="left"/>
+      <w:pPr>
+        <w:ind w:left="1800" w:hanging="360"/>
+      </w:pPr>
+    </w:lvl>
+    <w:lvl w:ilvl="5">
+      <w:start w:val="1"/>
+      <w:numFmt w:val="lowerRoman"/>
+      <w:lvlText w:val="(%6)"/>
+      <w:lvlJc w:val="left"/>
+      <w:pPr>
+        <w:ind w:left="2160" w:hanging="360"/>
+      </w:pPr>
+    </w:lvl>
+    <w:lvl w:ilvl="6">
+      <w:start w:val="1"/>
+      <w:numFmt w:val="decimal"/>
+      <w:lvlText w:val="%7."/>
+      <w:lvlJc w:val="left"/>
+      <w:pPr>
+        <w:ind w:left="2520" w:hanging="360"/>
+      </w:pPr>
+    </w:lvl>
+    <w:lvl w:ilvl="7">
+      <w:start w:val="1"/>
+      <w:numFmt w:val="lowerLetter"/>
+      <w:lvlText w:val="%8."/>
+      <w:lvlJc w:val="left"/>
+      <w:pPr>
+        <w:ind w:left="2880" w:hanging="360"/>
+      </w:pPr>
+    </w:lvl>
+    <w:lvl w:ilvl="8">
+      <w:start w:val="1"/>
+      <w:numFmt w:val="lowerRoman"/>
+      <w:lvlText w:val="%9."/>
+      <w:lvlJc w:val="left"/>
+      <w:pPr>
+        <w:ind w:left="3240" w:hanging="360"/>
+      </w:pPr>
+    </w:lvl>
+  </w:abstractNum>
+  <w:abstractNum w:abstractNumId="131" w15:restartNumberingAfterBreak="0">
     <w:nsid w:val="4A0D29B9"/>
     <w:multiLevelType w:val="multilevel"/>
     <w:tmpl w:val="9D184C00"/>
@@ -28051,7 +28722,7 @@
       </w:rPr>
     </w:lvl>
   </w:abstractNum>
-  <w:abstractNum w:abstractNumId="131" w15:restartNumberingAfterBreak="0">
+  <w:abstractNum w:abstractNumId="132" w15:restartNumberingAfterBreak="0">
     <w:nsid w:val="4AAF6B41"/>
     <w:multiLevelType w:val="multilevel"/>
     <w:tmpl w:val="BD68CCD4"/>
@@ -28200,7 +28871,7 @@
       </w:rPr>
     </w:lvl>
   </w:abstractNum>
-  <w:abstractNum w:abstractNumId="132" w15:restartNumberingAfterBreak="0">
+  <w:abstractNum w:abstractNumId="133" w15:restartNumberingAfterBreak="0">
     <w:nsid w:val="4AC52D9C"/>
     <w:multiLevelType w:val="multilevel"/>
     <w:tmpl w:val="1138FEFA"/>
@@ -28349,7 +29020,7 @@
       </w:rPr>
     </w:lvl>
   </w:abstractNum>
-  <w:abstractNum w:abstractNumId="133" w15:restartNumberingAfterBreak="0">
+  <w:abstractNum w:abstractNumId="134" w15:restartNumberingAfterBreak="0">
     <w:nsid w:val="4AED35A7"/>
     <w:multiLevelType w:val="multilevel"/>
     <w:tmpl w:val="14DA4004"/>
@@ -28466,7 +29137,7 @@
       </w:pPr>
     </w:lvl>
   </w:abstractNum>
-  <w:abstractNum w:abstractNumId="134" w15:restartNumberingAfterBreak="0">
+  <w:abstractNum w:abstractNumId="135" w15:restartNumberingAfterBreak="0">
     <w:nsid w:val="4B8F70B6"/>
     <w:multiLevelType w:val="multilevel"/>
     <w:tmpl w:val="8614339A"/>
@@ -28615,7 +29286,7 @@
       </w:rPr>
     </w:lvl>
   </w:abstractNum>
-  <w:abstractNum w:abstractNumId="135" w15:restartNumberingAfterBreak="0">
+  <w:abstractNum w:abstractNumId="136" w15:restartNumberingAfterBreak="0">
     <w:nsid w:val="4D805C9A"/>
     <w:multiLevelType w:val="multilevel"/>
     <w:tmpl w:val="79EA9606"/>
@@ -28764,7 +29435,7 @@
       </w:rPr>
     </w:lvl>
   </w:abstractNum>
-  <w:abstractNum w:abstractNumId="136" w15:restartNumberingAfterBreak="0">
+  <w:abstractNum w:abstractNumId="137" w15:restartNumberingAfterBreak="0">
     <w:nsid w:val="4DB5621F"/>
     <w:multiLevelType w:val="hybridMultilevel"/>
     <w:tmpl w:val="2944A124"/>
@@ -28850,7 +29521,7 @@
       </w:pPr>
     </w:lvl>
   </w:abstractNum>
-  <w:abstractNum w:abstractNumId="137" w15:restartNumberingAfterBreak="0">
+  <w:abstractNum w:abstractNumId="138" w15:restartNumberingAfterBreak="0">
     <w:nsid w:val="4EDC26EF"/>
     <w:multiLevelType w:val="multilevel"/>
     <w:tmpl w:val="AD866CB2"/>
@@ -28999,7 +29670,7 @@
       </w:rPr>
     </w:lvl>
   </w:abstractNum>
-  <w:abstractNum w:abstractNumId="138" w15:restartNumberingAfterBreak="0">
+  <w:abstractNum w:abstractNumId="139" w15:restartNumberingAfterBreak="0">
     <w:nsid w:val="4FDB444E"/>
     <w:multiLevelType w:val="multilevel"/>
     <w:tmpl w:val="3E023432"/>
@@ -29116,7 +29787,7 @@
       </w:pPr>
     </w:lvl>
   </w:abstractNum>
-  <w:abstractNum w:abstractNumId="139" w15:restartNumberingAfterBreak="0">
+  <w:abstractNum w:abstractNumId="140" w15:restartNumberingAfterBreak="0">
     <w:nsid w:val="51B0206C"/>
     <w:multiLevelType w:val="multilevel"/>
     <w:tmpl w:val="0B2021D0"/>
@@ -29265,7 +29936,7 @@
       </w:rPr>
     </w:lvl>
   </w:abstractNum>
-  <w:abstractNum w:abstractNumId="140" w15:restartNumberingAfterBreak="0">
+  <w:abstractNum w:abstractNumId="141" w15:restartNumberingAfterBreak="0">
     <w:nsid w:val="51B56294"/>
     <w:multiLevelType w:val="multilevel"/>
     <w:tmpl w:val="3BB4CEEA"/>
@@ -29414,7 +30085,7 @@
       </w:rPr>
     </w:lvl>
   </w:abstractNum>
-  <w:abstractNum w:abstractNumId="141" w15:restartNumberingAfterBreak="0">
+  <w:abstractNum w:abstractNumId="142" w15:restartNumberingAfterBreak="0">
     <w:nsid w:val="51C823C7"/>
     <w:multiLevelType w:val="multilevel"/>
     <w:tmpl w:val="985A346E"/>
@@ -29563,7 +30234,7 @@
       </w:rPr>
     </w:lvl>
   </w:abstractNum>
-  <w:abstractNum w:abstractNumId="142" w15:restartNumberingAfterBreak="0">
+  <w:abstractNum w:abstractNumId="143" w15:restartNumberingAfterBreak="0">
     <w:nsid w:val="526E06D5"/>
     <w:multiLevelType w:val="multilevel"/>
     <w:tmpl w:val="81B0E3A0"/>
@@ -29712,7 +30383,7 @@
       </w:rPr>
     </w:lvl>
   </w:abstractNum>
-  <w:abstractNum w:abstractNumId="143" w15:restartNumberingAfterBreak="0">
+  <w:abstractNum w:abstractNumId="144" w15:restartNumberingAfterBreak="0">
     <w:nsid w:val="52832FFC"/>
     <w:multiLevelType w:val="hybridMultilevel"/>
     <w:tmpl w:val="2848B824"/>
@@ -29798,7 +30469,7 @@
       </w:pPr>
     </w:lvl>
   </w:abstractNum>
-  <w:abstractNum w:abstractNumId="144" w15:restartNumberingAfterBreak="0">
+  <w:abstractNum w:abstractNumId="145" w15:restartNumberingAfterBreak="0">
     <w:nsid w:val="528623C9"/>
     <w:multiLevelType w:val="multilevel"/>
     <w:tmpl w:val="3438DA90"/>
@@ -29947,7 +30618,7 @@
       </w:rPr>
     </w:lvl>
   </w:abstractNum>
-  <w:abstractNum w:abstractNumId="145" w15:restartNumberingAfterBreak="0">
+  <w:abstractNum w:abstractNumId="146" w15:restartNumberingAfterBreak="0">
     <w:nsid w:val="545519CC"/>
     <w:multiLevelType w:val="hybridMultilevel"/>
     <w:tmpl w:val="B980DB02"/>
@@ -30060,7 +30731,7 @@
       </w:rPr>
     </w:lvl>
   </w:abstractNum>
-  <w:abstractNum w:abstractNumId="146" w15:restartNumberingAfterBreak="0">
+  <w:abstractNum w:abstractNumId="147" w15:restartNumberingAfterBreak="0">
     <w:nsid w:val="54C711EA"/>
     <w:multiLevelType w:val="hybridMultilevel"/>
     <w:tmpl w:val="C0F4CE18"/>
@@ -30146,7 +30817,7 @@
       </w:pPr>
     </w:lvl>
   </w:abstractNum>
-  <w:abstractNum w:abstractNumId="147" w15:restartNumberingAfterBreak="0">
+  <w:abstractNum w:abstractNumId="148" w15:restartNumberingAfterBreak="0">
     <w:nsid w:val="54CA184C"/>
     <w:multiLevelType w:val="hybridMultilevel"/>
     <w:tmpl w:val="AD24AB30"/>
@@ -30235,7 +30906,7 @@
       </w:pPr>
     </w:lvl>
   </w:abstractNum>
-  <w:abstractNum w:abstractNumId="148" w15:restartNumberingAfterBreak="0">
+  <w:abstractNum w:abstractNumId="149" w15:restartNumberingAfterBreak="0">
     <w:nsid w:val="554A43B9"/>
     <w:multiLevelType w:val="multilevel"/>
     <w:tmpl w:val="816EE9A4"/>
@@ -30352,7 +31023,7 @@
       </w:pPr>
     </w:lvl>
   </w:abstractNum>
-  <w:abstractNum w:abstractNumId="149" w15:restartNumberingAfterBreak="0">
+  <w:abstractNum w:abstractNumId="150" w15:restartNumberingAfterBreak="0">
     <w:nsid w:val="55A327A6"/>
     <w:multiLevelType w:val="multilevel"/>
     <w:tmpl w:val="A23204C2"/>
@@ -30469,7 +31140,7 @@
       </w:pPr>
     </w:lvl>
   </w:abstractNum>
-  <w:abstractNum w:abstractNumId="150" w15:restartNumberingAfterBreak="0">
+  <w:abstractNum w:abstractNumId="151" w15:restartNumberingAfterBreak="0">
     <w:nsid w:val="55B120AB"/>
     <w:multiLevelType w:val="hybridMultilevel"/>
     <w:tmpl w:val="DB6A33F0"/>
@@ -30582,7 +31253,7 @@
       </w:rPr>
     </w:lvl>
   </w:abstractNum>
-  <w:abstractNum w:abstractNumId="151" w15:restartNumberingAfterBreak="0">
+  <w:abstractNum w:abstractNumId="152" w15:restartNumberingAfterBreak="0">
     <w:nsid w:val="56996F77"/>
     <w:multiLevelType w:val="multilevel"/>
     <w:tmpl w:val="12BE4CB8"/>
@@ -30731,7 +31402,7 @@
       </w:rPr>
     </w:lvl>
   </w:abstractNum>
-  <w:abstractNum w:abstractNumId="152" w15:restartNumberingAfterBreak="0">
+  <w:abstractNum w:abstractNumId="153" w15:restartNumberingAfterBreak="0">
     <w:nsid w:val="56B231C3"/>
     <w:multiLevelType w:val="multilevel"/>
     <w:tmpl w:val="68E0D54C"/>
@@ -30880,7 +31551,7 @@
       </w:rPr>
     </w:lvl>
   </w:abstractNum>
-  <w:abstractNum w:abstractNumId="153" w15:restartNumberingAfterBreak="0">
+  <w:abstractNum w:abstractNumId="154" w15:restartNumberingAfterBreak="0">
     <w:nsid w:val="57411A88"/>
     <w:multiLevelType w:val="multilevel"/>
     <w:tmpl w:val="1FBA6882"/>
@@ -31029,7 +31700,7 @@
       </w:rPr>
     </w:lvl>
   </w:abstractNum>
-  <w:abstractNum w:abstractNumId="154" w15:restartNumberingAfterBreak="0">
+  <w:abstractNum w:abstractNumId="155" w15:restartNumberingAfterBreak="0">
     <w:nsid w:val="5784255B"/>
     <w:multiLevelType w:val="multilevel"/>
     <w:tmpl w:val="A6F8E1EE"/>
@@ -31178,7 +31849,7 @@
       </w:rPr>
     </w:lvl>
   </w:abstractNum>
-  <w:abstractNum w:abstractNumId="155" w15:restartNumberingAfterBreak="0">
+  <w:abstractNum w:abstractNumId="156" w15:restartNumberingAfterBreak="0">
     <w:nsid w:val="57BB5E2A"/>
     <w:multiLevelType w:val="multilevel"/>
     <w:tmpl w:val="68C6EB48"/>
@@ -31295,7 +31966,7 @@
       </w:pPr>
     </w:lvl>
   </w:abstractNum>
-  <w:abstractNum w:abstractNumId="156" w15:restartNumberingAfterBreak="0">
+  <w:abstractNum w:abstractNumId="157" w15:restartNumberingAfterBreak="0">
     <w:nsid w:val="57BB663C"/>
     <w:multiLevelType w:val="multilevel"/>
     <w:tmpl w:val="B2086892"/>
@@ -31444,7 +32115,7 @@
       </w:rPr>
     </w:lvl>
   </w:abstractNum>
-  <w:abstractNum w:abstractNumId="157" w15:restartNumberingAfterBreak="0">
+  <w:abstractNum w:abstractNumId="158" w15:restartNumberingAfterBreak="0">
     <w:nsid w:val="58AF76CF"/>
     <w:multiLevelType w:val="multilevel"/>
     <w:tmpl w:val="6DB65206"/>
@@ -31593,7 +32264,7 @@
       </w:rPr>
     </w:lvl>
   </w:abstractNum>
-  <w:abstractNum w:abstractNumId="158" w15:restartNumberingAfterBreak="0">
+  <w:abstractNum w:abstractNumId="159" w15:restartNumberingAfterBreak="0">
     <w:nsid w:val="58CC64E6"/>
     <w:multiLevelType w:val="hybridMultilevel"/>
     <w:tmpl w:val="23FA8802"/>
@@ -31679,7 +32350,7 @@
       </w:pPr>
     </w:lvl>
   </w:abstractNum>
-  <w:abstractNum w:abstractNumId="159" w15:restartNumberingAfterBreak="0">
+  <w:abstractNum w:abstractNumId="160" w15:restartNumberingAfterBreak="0">
     <w:nsid w:val="59B82A65"/>
     <w:multiLevelType w:val="multilevel"/>
     <w:tmpl w:val="8EFA7868"/>
@@ -31800,7 +32471,7 @@
       </w:rPr>
     </w:lvl>
   </w:abstractNum>
-  <w:abstractNum w:abstractNumId="160" w15:restartNumberingAfterBreak="0">
+  <w:abstractNum w:abstractNumId="161" w15:restartNumberingAfterBreak="0">
     <w:nsid w:val="5A455885"/>
     <w:multiLevelType w:val="multilevel"/>
     <w:tmpl w:val="5650B4B6"/>
@@ -31949,7 +32620,7 @@
       </w:rPr>
     </w:lvl>
   </w:abstractNum>
-  <w:abstractNum w:abstractNumId="161" w15:restartNumberingAfterBreak="0">
+  <w:abstractNum w:abstractNumId="162" w15:restartNumberingAfterBreak="0">
     <w:nsid w:val="5A8F63C8"/>
     <w:multiLevelType w:val="multilevel"/>
     <w:tmpl w:val="6EAC4FB4"/>
@@ -32098,7 +32769,7 @@
       </w:rPr>
     </w:lvl>
   </w:abstractNum>
-  <w:abstractNum w:abstractNumId="162" w15:restartNumberingAfterBreak="0">
+  <w:abstractNum w:abstractNumId="163" w15:restartNumberingAfterBreak="0">
     <w:nsid w:val="5AE2637E"/>
     <w:multiLevelType w:val="multilevel"/>
     <w:tmpl w:val="4E56A100"/>
@@ -32247,7 +32918,7 @@
       </w:rPr>
     </w:lvl>
   </w:abstractNum>
-  <w:abstractNum w:abstractNumId="163" w15:restartNumberingAfterBreak="0">
+  <w:abstractNum w:abstractNumId="164" w15:restartNumberingAfterBreak="0">
     <w:nsid w:val="5B1A4B8B"/>
     <w:multiLevelType w:val="multilevel"/>
     <w:tmpl w:val="C59A3BDA"/>
@@ -32396,7 +33067,7 @@
       </w:rPr>
     </w:lvl>
   </w:abstractNum>
-  <w:abstractNum w:abstractNumId="164" w15:restartNumberingAfterBreak="0">
+  <w:abstractNum w:abstractNumId="165" w15:restartNumberingAfterBreak="0">
     <w:nsid w:val="5B481F93"/>
     <w:multiLevelType w:val="multilevel"/>
     <w:tmpl w:val="2786CE54"/>
@@ -32545,7 +33216,7 @@
       </w:rPr>
     </w:lvl>
   </w:abstractNum>
-  <w:abstractNum w:abstractNumId="165" w15:restartNumberingAfterBreak="0">
+  <w:abstractNum w:abstractNumId="166" w15:restartNumberingAfterBreak="0">
     <w:nsid w:val="5B674EEB"/>
     <w:multiLevelType w:val="multilevel"/>
     <w:tmpl w:val="9D1A7932"/>
@@ -32662,7 +33333,7 @@
       </w:pPr>
     </w:lvl>
   </w:abstractNum>
-  <w:abstractNum w:abstractNumId="166" w15:restartNumberingAfterBreak="0">
+  <w:abstractNum w:abstractNumId="167" w15:restartNumberingAfterBreak="0">
     <w:nsid w:val="5BC25A83"/>
     <w:multiLevelType w:val="multilevel"/>
     <w:tmpl w:val="D1ECC2A4"/>
@@ -32783,7 +33454,7 @@
       </w:rPr>
     </w:lvl>
   </w:abstractNum>
-  <w:abstractNum w:abstractNumId="167" w15:restartNumberingAfterBreak="0">
+  <w:abstractNum w:abstractNumId="168" w15:restartNumberingAfterBreak="0">
     <w:nsid w:val="5BE52B39"/>
     <w:multiLevelType w:val="multilevel"/>
     <w:tmpl w:val="E7E265F6"/>
@@ -32932,7 +33603,7 @@
       </w:rPr>
     </w:lvl>
   </w:abstractNum>
-  <w:abstractNum w:abstractNumId="168" w15:restartNumberingAfterBreak="0">
+  <w:abstractNum w:abstractNumId="169" w15:restartNumberingAfterBreak="0">
     <w:nsid w:val="5C3A747E"/>
     <w:multiLevelType w:val="multilevel"/>
     <w:tmpl w:val="A38A56EC"/>
@@ -33081,7 +33752,7 @@
       </w:rPr>
     </w:lvl>
   </w:abstractNum>
-  <w:abstractNum w:abstractNumId="169" w15:restartNumberingAfterBreak="0">
+  <w:abstractNum w:abstractNumId="170" w15:restartNumberingAfterBreak="0">
     <w:nsid w:val="5D3466EE"/>
     <w:multiLevelType w:val="multilevel"/>
     <w:tmpl w:val="28EE987A"/>
@@ -33230,7 +33901,7 @@
       </w:rPr>
     </w:lvl>
   </w:abstractNum>
-  <w:abstractNum w:abstractNumId="170" w15:restartNumberingAfterBreak="0">
+  <w:abstractNum w:abstractNumId="171" w15:restartNumberingAfterBreak="0">
     <w:nsid w:val="5D584833"/>
     <w:multiLevelType w:val="multilevel"/>
     <w:tmpl w:val="2A44CCB0"/>
@@ -33379,7 +34050,7 @@
       </w:rPr>
     </w:lvl>
   </w:abstractNum>
-  <w:abstractNum w:abstractNumId="171" w15:restartNumberingAfterBreak="0">
+  <w:abstractNum w:abstractNumId="172" w15:restartNumberingAfterBreak="0">
     <w:nsid w:val="5DB531D5"/>
     <w:multiLevelType w:val="hybridMultilevel"/>
     <w:tmpl w:val="006EE762"/>
@@ -33465,7 +34136,7 @@
       </w:pPr>
     </w:lvl>
   </w:abstractNum>
-  <w:abstractNum w:abstractNumId="172" w15:restartNumberingAfterBreak="0">
+  <w:abstractNum w:abstractNumId="173" w15:restartNumberingAfterBreak="0">
     <w:nsid w:val="5DB94B79"/>
     <w:multiLevelType w:val="multilevel"/>
     <w:tmpl w:val="60029486"/>
@@ -33614,7 +34285,7 @@
       </w:rPr>
     </w:lvl>
   </w:abstractNum>
-  <w:abstractNum w:abstractNumId="173" w15:restartNumberingAfterBreak="0">
+  <w:abstractNum w:abstractNumId="174" w15:restartNumberingAfterBreak="0">
     <w:nsid w:val="5E3325E7"/>
     <w:multiLevelType w:val="hybridMultilevel"/>
     <w:tmpl w:val="AAE6C24E"/>
@@ -33703,7 +34374,7 @@
       </w:pPr>
     </w:lvl>
   </w:abstractNum>
-  <w:abstractNum w:abstractNumId="174" w15:restartNumberingAfterBreak="0">
+  <w:abstractNum w:abstractNumId="175" w15:restartNumberingAfterBreak="0">
     <w:nsid w:val="5E7F034A"/>
     <w:multiLevelType w:val="multilevel"/>
     <w:tmpl w:val="C776B29A"/>
@@ -33852,7 +34523,7 @@
       </w:rPr>
     </w:lvl>
   </w:abstractNum>
-  <w:abstractNum w:abstractNumId="175" w15:restartNumberingAfterBreak="0">
+  <w:abstractNum w:abstractNumId="176" w15:restartNumberingAfterBreak="0">
     <w:nsid w:val="5EC864FB"/>
     <w:multiLevelType w:val="multilevel"/>
     <w:tmpl w:val="0409001D"/>
@@ -33938,7 +34609,7 @@
       </w:pPr>
     </w:lvl>
   </w:abstractNum>
-  <w:abstractNum w:abstractNumId="176" w15:restartNumberingAfterBreak="0">
+  <w:abstractNum w:abstractNumId="177" w15:restartNumberingAfterBreak="0">
     <w:nsid w:val="5F4F2A76"/>
     <w:multiLevelType w:val="hybridMultilevel"/>
     <w:tmpl w:val="1864F6D0"/>
@@ -34051,7 +34722,7 @@
       </w:rPr>
     </w:lvl>
   </w:abstractNum>
-  <w:abstractNum w:abstractNumId="177" w15:restartNumberingAfterBreak="0">
+  <w:abstractNum w:abstractNumId="178" w15:restartNumberingAfterBreak="0">
     <w:nsid w:val="6023578A"/>
     <w:multiLevelType w:val="multilevel"/>
     <w:tmpl w:val="20FE3972"/>
@@ -34168,7 +34839,7 @@
       </w:pPr>
     </w:lvl>
   </w:abstractNum>
-  <w:abstractNum w:abstractNumId="178" w15:restartNumberingAfterBreak="0">
+  <w:abstractNum w:abstractNumId="179" w15:restartNumberingAfterBreak="0">
     <w:nsid w:val="60B304F8"/>
     <w:multiLevelType w:val="multilevel"/>
     <w:tmpl w:val="AE020256"/>
@@ -34317,7 +34988,7 @@
       </w:rPr>
     </w:lvl>
   </w:abstractNum>
-  <w:abstractNum w:abstractNumId="179" w15:restartNumberingAfterBreak="0">
+  <w:abstractNum w:abstractNumId="180" w15:restartNumberingAfterBreak="0">
     <w:nsid w:val="61CA4512"/>
     <w:multiLevelType w:val="multilevel"/>
     <w:tmpl w:val="113687FE"/>
@@ -34466,7 +35137,7 @@
       </w:rPr>
     </w:lvl>
   </w:abstractNum>
-  <w:abstractNum w:abstractNumId="180" w15:restartNumberingAfterBreak="0">
+  <w:abstractNum w:abstractNumId="181" w15:restartNumberingAfterBreak="0">
     <w:nsid w:val="62633F16"/>
     <w:multiLevelType w:val="multilevel"/>
     <w:tmpl w:val="01D491C4"/>
@@ -34615,7 +35286,7 @@
       </w:rPr>
     </w:lvl>
   </w:abstractNum>
-  <w:abstractNum w:abstractNumId="181" w15:restartNumberingAfterBreak="0">
+  <w:abstractNum w:abstractNumId="182" w15:restartNumberingAfterBreak="0">
     <w:nsid w:val="62FA4B02"/>
     <w:multiLevelType w:val="multilevel"/>
     <w:tmpl w:val="AC469EA4"/>
@@ -34764,7 +35435,7 @@
       </w:rPr>
     </w:lvl>
   </w:abstractNum>
-  <w:abstractNum w:abstractNumId="182" w15:restartNumberingAfterBreak="0">
+  <w:abstractNum w:abstractNumId="183" w15:restartNumberingAfterBreak="0">
     <w:nsid w:val="63B56A28"/>
     <w:multiLevelType w:val="hybridMultilevel"/>
     <w:tmpl w:val="BBDA46C8"/>
@@ -34850,7 +35521,7 @@
       </w:pPr>
     </w:lvl>
   </w:abstractNum>
-  <w:abstractNum w:abstractNumId="183" w15:restartNumberingAfterBreak="0">
+  <w:abstractNum w:abstractNumId="184" w15:restartNumberingAfterBreak="0">
     <w:nsid w:val="63D35024"/>
     <w:multiLevelType w:val="hybridMultilevel"/>
     <w:tmpl w:val="52DACB14"/>
@@ -34936,7 +35607,7 @@
       </w:pPr>
     </w:lvl>
   </w:abstractNum>
-  <w:abstractNum w:abstractNumId="184" w15:restartNumberingAfterBreak="0">
+  <w:abstractNum w:abstractNumId="185" w15:restartNumberingAfterBreak="0">
     <w:nsid w:val="64364942"/>
     <w:multiLevelType w:val="multilevel"/>
     <w:tmpl w:val="3B688F7C"/>
@@ -35085,7 +35756,7 @@
       </w:rPr>
     </w:lvl>
   </w:abstractNum>
-  <w:abstractNum w:abstractNumId="185" w15:restartNumberingAfterBreak="0">
+  <w:abstractNum w:abstractNumId="186" w15:restartNumberingAfterBreak="0">
     <w:nsid w:val="64DF02EF"/>
     <w:multiLevelType w:val="hybridMultilevel"/>
     <w:tmpl w:val="5D1C61DC"/>
@@ -35198,7 +35869,7 @@
       </w:rPr>
     </w:lvl>
   </w:abstractNum>
-  <w:abstractNum w:abstractNumId="186" w15:restartNumberingAfterBreak="0">
+  <w:abstractNum w:abstractNumId="187" w15:restartNumberingAfterBreak="0">
     <w:nsid w:val="65151DA6"/>
     <w:multiLevelType w:val="multilevel"/>
     <w:tmpl w:val="265ABBB0"/>
@@ -35347,7 +36018,7 @@
       </w:rPr>
     </w:lvl>
   </w:abstractNum>
-  <w:abstractNum w:abstractNumId="187" w15:restartNumberingAfterBreak="0">
+  <w:abstractNum w:abstractNumId="188" w15:restartNumberingAfterBreak="0">
     <w:nsid w:val="6621531D"/>
     <w:multiLevelType w:val="multilevel"/>
     <w:tmpl w:val="9CE22912"/>
@@ -35460,7 +36131,7 @@
       </w:pPr>
     </w:lvl>
   </w:abstractNum>
-  <w:abstractNum w:abstractNumId="188" w15:restartNumberingAfterBreak="0">
+  <w:abstractNum w:abstractNumId="189" w15:restartNumberingAfterBreak="0">
     <w:nsid w:val="66A75F06"/>
     <w:multiLevelType w:val="multilevel"/>
     <w:tmpl w:val="7B2CDB5E"/>
@@ -35609,7 +36280,7 @@
       </w:rPr>
     </w:lvl>
   </w:abstractNum>
-  <w:abstractNum w:abstractNumId="189" w15:restartNumberingAfterBreak="0">
+  <w:abstractNum w:abstractNumId="190" w15:restartNumberingAfterBreak="0">
     <w:nsid w:val="66AF21A2"/>
     <w:multiLevelType w:val="multilevel"/>
     <w:tmpl w:val="F3FCA768"/>
@@ -35758,7 +36429,7 @@
       </w:rPr>
     </w:lvl>
   </w:abstractNum>
-  <w:abstractNum w:abstractNumId="190" w15:restartNumberingAfterBreak="0">
+  <w:abstractNum w:abstractNumId="191" w15:restartNumberingAfterBreak="0">
     <w:nsid w:val="66DF406A"/>
     <w:multiLevelType w:val="hybridMultilevel"/>
     <w:tmpl w:val="DAF6A5D0"/>
@@ -35844,7 +36515,7 @@
       </w:pPr>
     </w:lvl>
   </w:abstractNum>
-  <w:abstractNum w:abstractNumId="191" w15:restartNumberingAfterBreak="0">
+  <w:abstractNum w:abstractNumId="192" w15:restartNumberingAfterBreak="0">
     <w:nsid w:val="672530A8"/>
     <w:multiLevelType w:val="multilevel"/>
     <w:tmpl w:val="C916E6BE"/>
@@ -35993,7 +36664,7 @@
       </w:rPr>
     </w:lvl>
   </w:abstractNum>
-  <w:abstractNum w:abstractNumId="192" w15:restartNumberingAfterBreak="0">
+  <w:abstractNum w:abstractNumId="193" w15:restartNumberingAfterBreak="0">
     <w:nsid w:val="67834D5A"/>
     <w:multiLevelType w:val="multilevel"/>
     <w:tmpl w:val="849CC442"/>
@@ -36142,7 +36813,7 @@
       </w:rPr>
     </w:lvl>
   </w:abstractNum>
-  <w:abstractNum w:abstractNumId="193" w15:restartNumberingAfterBreak="0">
+  <w:abstractNum w:abstractNumId="194" w15:restartNumberingAfterBreak="0">
     <w:nsid w:val="67AC7510"/>
     <w:multiLevelType w:val="multilevel"/>
     <w:tmpl w:val="53787E7C"/>
@@ -36291,7 +36962,7 @@
       </w:rPr>
     </w:lvl>
   </w:abstractNum>
-  <w:abstractNum w:abstractNumId="194" w15:restartNumberingAfterBreak="0">
+  <w:abstractNum w:abstractNumId="195" w15:restartNumberingAfterBreak="0">
     <w:nsid w:val="67D51A63"/>
     <w:multiLevelType w:val="hybridMultilevel"/>
     <w:tmpl w:val="06DC9326"/>
@@ -36377,7 +37048,7 @@
       </w:pPr>
     </w:lvl>
   </w:abstractNum>
-  <w:abstractNum w:abstractNumId="195" w15:restartNumberingAfterBreak="0">
+  <w:abstractNum w:abstractNumId="196" w15:restartNumberingAfterBreak="0">
     <w:nsid w:val="67FF749D"/>
     <w:multiLevelType w:val="hybridMultilevel"/>
     <w:tmpl w:val="F7C848A4"/>
@@ -36463,7 +37134,7 @@
       </w:pPr>
     </w:lvl>
   </w:abstractNum>
-  <w:abstractNum w:abstractNumId="196" w15:restartNumberingAfterBreak="0">
+  <w:abstractNum w:abstractNumId="197" w15:restartNumberingAfterBreak="0">
     <w:nsid w:val="692C7E70"/>
     <w:multiLevelType w:val="multilevel"/>
     <w:tmpl w:val="A1468520"/>
@@ -36612,7 +37283,7 @@
       </w:rPr>
     </w:lvl>
   </w:abstractNum>
-  <w:abstractNum w:abstractNumId="197" w15:restartNumberingAfterBreak="0">
+  <w:abstractNum w:abstractNumId="198" w15:restartNumberingAfterBreak="0">
     <w:nsid w:val="6981505F"/>
     <w:multiLevelType w:val="multilevel"/>
     <w:tmpl w:val="1D1C1664"/>
@@ -36761,7 +37432,7 @@
       </w:rPr>
     </w:lvl>
   </w:abstractNum>
-  <w:abstractNum w:abstractNumId="198" w15:restartNumberingAfterBreak="0">
+  <w:abstractNum w:abstractNumId="199" w15:restartNumberingAfterBreak="0">
     <w:nsid w:val="69B34C11"/>
     <w:multiLevelType w:val="hybridMultilevel"/>
     <w:tmpl w:val="89981944"/>
@@ -36850,7 +37521,7 @@
       </w:pPr>
     </w:lvl>
   </w:abstractNum>
-  <w:abstractNum w:abstractNumId="199" w15:restartNumberingAfterBreak="0">
+  <w:abstractNum w:abstractNumId="200" w15:restartNumberingAfterBreak="0">
     <w:nsid w:val="6AC25373"/>
     <w:multiLevelType w:val="multilevel"/>
     <w:tmpl w:val="72CEB312"/>
@@ -36999,7 +37670,7 @@
       </w:rPr>
     </w:lvl>
   </w:abstractNum>
-  <w:abstractNum w:abstractNumId="200" w15:restartNumberingAfterBreak="0">
+  <w:abstractNum w:abstractNumId="201" w15:restartNumberingAfterBreak="0">
     <w:nsid w:val="6B1F4B93"/>
     <w:multiLevelType w:val="multilevel"/>
     <w:tmpl w:val="0A5E29C2"/>
@@ -37085,7 +37756,7 @@
       </w:pPr>
     </w:lvl>
   </w:abstractNum>
-  <w:abstractNum w:abstractNumId="201" w15:restartNumberingAfterBreak="0">
+  <w:abstractNum w:abstractNumId="202" w15:restartNumberingAfterBreak="0">
     <w:nsid w:val="6B2F2D93"/>
     <w:multiLevelType w:val="multilevel"/>
     <w:tmpl w:val="4F0CE180"/>
@@ -37234,7 +37905,7 @@
       </w:rPr>
     </w:lvl>
   </w:abstractNum>
-  <w:abstractNum w:abstractNumId="202" w15:restartNumberingAfterBreak="0">
+  <w:abstractNum w:abstractNumId="203" w15:restartNumberingAfterBreak="0">
     <w:nsid w:val="6B723626"/>
     <w:multiLevelType w:val="multilevel"/>
     <w:tmpl w:val="41E42FA2"/>
@@ -37383,7 +38054,7 @@
       </w:rPr>
     </w:lvl>
   </w:abstractNum>
-  <w:abstractNum w:abstractNumId="203" w15:restartNumberingAfterBreak="0">
+  <w:abstractNum w:abstractNumId="204" w15:restartNumberingAfterBreak="0">
     <w:nsid w:val="6BB9614E"/>
     <w:multiLevelType w:val="multilevel"/>
     <w:tmpl w:val="918878F8"/>
@@ -37500,7 +38171,7 @@
       </w:pPr>
     </w:lvl>
   </w:abstractNum>
-  <w:abstractNum w:abstractNumId="204" w15:restartNumberingAfterBreak="0">
+  <w:abstractNum w:abstractNumId="205" w15:restartNumberingAfterBreak="0">
     <w:nsid w:val="6C4A3061"/>
     <w:multiLevelType w:val="multilevel"/>
     <w:tmpl w:val="70DAF58E"/>
@@ -37649,7 +38320,7 @@
       </w:rPr>
     </w:lvl>
   </w:abstractNum>
-  <w:abstractNum w:abstractNumId="205" w15:restartNumberingAfterBreak="0">
+  <w:abstractNum w:abstractNumId="206" w15:restartNumberingAfterBreak="0">
     <w:nsid w:val="6C4F7431"/>
     <w:multiLevelType w:val="multilevel"/>
     <w:tmpl w:val="901E4082"/>
@@ -37798,7 +38469,7 @@
       </w:rPr>
     </w:lvl>
   </w:abstractNum>
-  <w:abstractNum w:abstractNumId="206" w15:restartNumberingAfterBreak="0">
+  <w:abstractNum w:abstractNumId="207" w15:restartNumberingAfterBreak="0">
     <w:nsid w:val="6C6123A7"/>
     <w:multiLevelType w:val="multilevel"/>
     <w:tmpl w:val="FA5C3F7E"/>
@@ -37947,7 +38618,7 @@
       </w:rPr>
     </w:lvl>
   </w:abstractNum>
-  <w:abstractNum w:abstractNumId="207" w15:restartNumberingAfterBreak="0">
+  <w:abstractNum w:abstractNumId="208" w15:restartNumberingAfterBreak="0">
     <w:nsid w:val="6D256BE4"/>
     <w:multiLevelType w:val="hybridMultilevel"/>
     <w:tmpl w:val="AA0C1D60"/>
@@ -38060,7 +38731,7 @@
       </w:rPr>
     </w:lvl>
   </w:abstractNum>
-  <w:abstractNum w:abstractNumId="208" w15:restartNumberingAfterBreak="0">
+  <w:abstractNum w:abstractNumId="209" w15:restartNumberingAfterBreak="0">
     <w:nsid w:val="6D8B4E45"/>
     <w:multiLevelType w:val="multilevel"/>
     <w:tmpl w:val="E802456E"/>
@@ -38177,7 +38848,7 @@
       </w:pPr>
     </w:lvl>
   </w:abstractNum>
-  <w:abstractNum w:abstractNumId="209" w15:restartNumberingAfterBreak="0">
+  <w:abstractNum w:abstractNumId="210" w15:restartNumberingAfterBreak="0">
     <w:nsid w:val="6EA16DE9"/>
     <w:multiLevelType w:val="multilevel"/>
     <w:tmpl w:val="F8800EE2"/>
@@ -38263,7 +38934,7 @@
       </w:pPr>
     </w:lvl>
   </w:abstractNum>
-  <w:abstractNum w:abstractNumId="210" w15:restartNumberingAfterBreak="0">
+  <w:abstractNum w:abstractNumId="211" w15:restartNumberingAfterBreak="0">
     <w:nsid w:val="6F3761B0"/>
     <w:multiLevelType w:val="multilevel"/>
     <w:tmpl w:val="BD1C961C"/>
@@ -38376,7 +39047,7 @@
       </w:pPr>
     </w:lvl>
   </w:abstractNum>
-  <w:abstractNum w:abstractNumId="211" w15:restartNumberingAfterBreak="0">
+  <w:abstractNum w:abstractNumId="212" w15:restartNumberingAfterBreak="0">
     <w:nsid w:val="6F613257"/>
     <w:multiLevelType w:val="hybridMultilevel"/>
     <w:tmpl w:val="F2BCA812"/>
@@ -38489,7 +39160,7 @@
       </w:rPr>
     </w:lvl>
   </w:abstractNum>
-  <w:abstractNum w:abstractNumId="212" w15:restartNumberingAfterBreak="0">
+  <w:abstractNum w:abstractNumId="213" w15:restartNumberingAfterBreak="0">
     <w:nsid w:val="6F8C22B1"/>
     <w:multiLevelType w:val="multilevel"/>
     <w:tmpl w:val="514C38C4"/>
@@ -38606,7 +39277,7 @@
       </w:pPr>
     </w:lvl>
   </w:abstractNum>
-  <w:abstractNum w:abstractNumId="213" w15:restartNumberingAfterBreak="0">
+  <w:abstractNum w:abstractNumId="214" w15:restartNumberingAfterBreak="0">
     <w:nsid w:val="6FC76959"/>
     <w:multiLevelType w:val="multilevel"/>
     <w:tmpl w:val="9956E00C"/>
@@ -38755,7 +39426,7 @@
       </w:rPr>
     </w:lvl>
   </w:abstractNum>
-  <w:abstractNum w:abstractNumId="214" w15:restartNumberingAfterBreak="0">
+  <w:abstractNum w:abstractNumId="215" w15:restartNumberingAfterBreak="0">
     <w:nsid w:val="703B64C2"/>
     <w:multiLevelType w:val="multilevel"/>
     <w:tmpl w:val="4ED83146"/>
@@ -38904,7 +39575,7 @@
       </w:rPr>
     </w:lvl>
   </w:abstractNum>
-  <w:abstractNum w:abstractNumId="215" w15:restartNumberingAfterBreak="0">
+  <w:abstractNum w:abstractNumId="216" w15:restartNumberingAfterBreak="0">
     <w:nsid w:val="708D29E9"/>
     <w:multiLevelType w:val="hybridMultilevel"/>
     <w:tmpl w:val="235A9E60"/>
@@ -39017,7 +39688,7 @@
       </w:rPr>
     </w:lvl>
   </w:abstractNum>
-  <w:abstractNum w:abstractNumId="216" w15:restartNumberingAfterBreak="0">
+  <w:abstractNum w:abstractNumId="217" w15:restartNumberingAfterBreak="0">
     <w:nsid w:val="70DB5F35"/>
     <w:multiLevelType w:val="multilevel"/>
     <w:tmpl w:val="5CFA3CAC"/>
@@ -39134,7 +39805,7 @@
       </w:pPr>
     </w:lvl>
   </w:abstractNum>
-  <w:abstractNum w:abstractNumId="217" w15:restartNumberingAfterBreak="0">
+  <w:abstractNum w:abstractNumId="218" w15:restartNumberingAfterBreak="0">
     <w:nsid w:val="710818BF"/>
     <w:multiLevelType w:val="multilevel"/>
     <w:tmpl w:val="244025E6"/>
@@ -39283,7 +39954,7 @@
       </w:rPr>
     </w:lvl>
   </w:abstractNum>
-  <w:abstractNum w:abstractNumId="218" w15:restartNumberingAfterBreak="0">
+  <w:abstractNum w:abstractNumId="219" w15:restartNumberingAfterBreak="0">
     <w:nsid w:val="715A6526"/>
     <w:multiLevelType w:val="multilevel"/>
     <w:tmpl w:val="7A7E9BD0"/>
@@ -39432,7 +40103,7 @@
       </w:rPr>
     </w:lvl>
   </w:abstractNum>
-  <w:abstractNum w:abstractNumId="219" w15:restartNumberingAfterBreak="0">
+  <w:abstractNum w:abstractNumId="220" w15:restartNumberingAfterBreak="0">
     <w:nsid w:val="71604CD1"/>
     <w:multiLevelType w:val="hybridMultilevel"/>
     <w:tmpl w:val="8F42548E"/>
@@ -39521,7 +40192,7 @@
       </w:pPr>
     </w:lvl>
   </w:abstractNum>
-  <w:abstractNum w:abstractNumId="220" w15:restartNumberingAfterBreak="0">
+  <w:abstractNum w:abstractNumId="221" w15:restartNumberingAfterBreak="0">
     <w:nsid w:val="72086F4A"/>
     <w:multiLevelType w:val="multilevel"/>
     <w:tmpl w:val="950087C2"/>
@@ -39670,7 +40341,7 @@
       </w:rPr>
     </w:lvl>
   </w:abstractNum>
-  <w:abstractNum w:abstractNumId="221" w15:restartNumberingAfterBreak="0">
+  <w:abstractNum w:abstractNumId="222" w15:restartNumberingAfterBreak="0">
     <w:nsid w:val="72904D14"/>
     <w:multiLevelType w:val="multilevel"/>
     <w:tmpl w:val="7AF8E330"/>
@@ -39819,7 +40490,7 @@
       </w:rPr>
     </w:lvl>
   </w:abstractNum>
-  <w:abstractNum w:abstractNumId="222" w15:restartNumberingAfterBreak="0">
+  <w:abstractNum w:abstractNumId="223" w15:restartNumberingAfterBreak="0">
     <w:nsid w:val="735858CC"/>
     <w:multiLevelType w:val="multilevel"/>
     <w:tmpl w:val="A9DE2526"/>
@@ -39968,7 +40639,7 @@
       </w:rPr>
     </w:lvl>
   </w:abstractNum>
-  <w:abstractNum w:abstractNumId="223" w15:restartNumberingAfterBreak="0">
+  <w:abstractNum w:abstractNumId="224" w15:restartNumberingAfterBreak="0">
     <w:nsid w:val="74123403"/>
     <w:multiLevelType w:val="hybridMultilevel"/>
     <w:tmpl w:val="73726886"/>
@@ -40057,7 +40728,7 @@
       </w:pPr>
     </w:lvl>
   </w:abstractNum>
-  <w:abstractNum w:abstractNumId="224" w15:restartNumberingAfterBreak="0">
+  <w:abstractNum w:abstractNumId="225" w15:restartNumberingAfterBreak="0">
     <w:nsid w:val="744542A0"/>
     <w:multiLevelType w:val="multilevel"/>
     <w:tmpl w:val="64EAC428"/>
@@ -40206,7 +40877,7 @@
       </w:rPr>
     </w:lvl>
   </w:abstractNum>
-  <w:abstractNum w:abstractNumId="225" w15:restartNumberingAfterBreak="0">
+  <w:abstractNum w:abstractNumId="226" w15:restartNumberingAfterBreak="0">
     <w:nsid w:val="745C2C6F"/>
     <w:multiLevelType w:val="hybridMultilevel"/>
     <w:tmpl w:val="8EDAE7EA"/>
@@ -40292,7 +40963,7 @@
       </w:pPr>
     </w:lvl>
   </w:abstractNum>
-  <w:abstractNum w:abstractNumId="226" w15:restartNumberingAfterBreak="0">
+  <w:abstractNum w:abstractNumId="227" w15:restartNumberingAfterBreak="0">
     <w:nsid w:val="746808FE"/>
     <w:multiLevelType w:val="multilevel"/>
     <w:tmpl w:val="69405DB4"/>
@@ -40441,7 +41112,7 @@
       </w:rPr>
     </w:lvl>
   </w:abstractNum>
-  <w:abstractNum w:abstractNumId="227" w15:restartNumberingAfterBreak="0">
+  <w:abstractNum w:abstractNumId="228" w15:restartNumberingAfterBreak="0">
     <w:nsid w:val="762D5E5A"/>
     <w:multiLevelType w:val="hybridMultilevel"/>
     <w:tmpl w:val="C48472E2"/>
@@ -40527,7 +41198,7 @@
       </w:pPr>
     </w:lvl>
   </w:abstractNum>
-  <w:abstractNum w:abstractNumId="228" w15:restartNumberingAfterBreak="0">
+  <w:abstractNum w:abstractNumId="229" w15:restartNumberingAfterBreak="0">
     <w:nsid w:val="765455B0"/>
     <w:multiLevelType w:val="multilevel"/>
     <w:tmpl w:val="1E04C6DE"/>
@@ -40676,7 +41347,7 @@
       </w:rPr>
     </w:lvl>
   </w:abstractNum>
-  <w:abstractNum w:abstractNumId="229" w15:restartNumberingAfterBreak="0">
+  <w:abstractNum w:abstractNumId="230" w15:restartNumberingAfterBreak="0">
     <w:nsid w:val="768E7B50"/>
     <w:multiLevelType w:val="multilevel"/>
     <w:tmpl w:val="E6B89F94"/>
@@ -40825,7 +41496,7 @@
       </w:rPr>
     </w:lvl>
   </w:abstractNum>
-  <w:abstractNum w:abstractNumId="230" w15:restartNumberingAfterBreak="0">
+  <w:abstractNum w:abstractNumId="231" w15:restartNumberingAfterBreak="0">
     <w:nsid w:val="76A56C15"/>
     <w:multiLevelType w:val="multilevel"/>
     <w:tmpl w:val="86A4CF06"/>
@@ -40974,7 +41645,7 @@
       </w:rPr>
     </w:lvl>
   </w:abstractNum>
-  <w:abstractNum w:abstractNumId="231" w15:restartNumberingAfterBreak="0">
+  <w:abstractNum w:abstractNumId="232" w15:restartNumberingAfterBreak="0">
     <w:nsid w:val="76C83B68"/>
     <w:multiLevelType w:val="multilevel"/>
     <w:tmpl w:val="9E7EB786"/>
@@ -41123,7 +41794,7 @@
       </w:rPr>
     </w:lvl>
   </w:abstractNum>
-  <w:abstractNum w:abstractNumId="232" w15:restartNumberingAfterBreak="0">
+  <w:abstractNum w:abstractNumId="233" w15:restartNumberingAfterBreak="0">
     <w:nsid w:val="779E4425"/>
     <w:multiLevelType w:val="hybridMultilevel"/>
     <w:tmpl w:val="78CEE8D8"/>
@@ -41209,7 +41880,7 @@
       </w:pPr>
     </w:lvl>
   </w:abstractNum>
-  <w:abstractNum w:abstractNumId="233" w15:restartNumberingAfterBreak="0">
+  <w:abstractNum w:abstractNumId="234" w15:restartNumberingAfterBreak="0">
     <w:nsid w:val="77B22F44"/>
     <w:multiLevelType w:val="multilevel"/>
     <w:tmpl w:val="1C380070"/>
@@ -41358,7 +42029,7 @@
       </w:rPr>
     </w:lvl>
   </w:abstractNum>
-  <w:abstractNum w:abstractNumId="234" w15:restartNumberingAfterBreak="0">
+  <w:abstractNum w:abstractNumId="235" w15:restartNumberingAfterBreak="0">
     <w:nsid w:val="77C50830"/>
     <w:multiLevelType w:val="multilevel"/>
     <w:tmpl w:val="7602BDE8"/>
@@ -41507,7 +42178,7 @@
       </w:rPr>
     </w:lvl>
   </w:abstractNum>
-  <w:abstractNum w:abstractNumId="235" w15:restartNumberingAfterBreak="0">
+  <w:abstractNum w:abstractNumId="236" w15:restartNumberingAfterBreak="0">
     <w:nsid w:val="77D6139A"/>
     <w:multiLevelType w:val="multilevel"/>
     <w:tmpl w:val="48CC0768"/>
@@ -41656,7 +42327,7 @@
       </w:rPr>
     </w:lvl>
   </w:abstractNum>
-  <w:abstractNum w:abstractNumId="236" w15:restartNumberingAfterBreak="0">
+  <w:abstractNum w:abstractNumId="237" w15:restartNumberingAfterBreak="0">
     <w:nsid w:val="780101E7"/>
     <w:multiLevelType w:val="multilevel"/>
     <w:tmpl w:val="41B88710"/>
@@ -41805,7 +42476,7 @@
       </w:rPr>
     </w:lvl>
   </w:abstractNum>
-  <w:abstractNum w:abstractNumId="237" w15:restartNumberingAfterBreak="0">
+  <w:abstractNum w:abstractNumId="238" w15:restartNumberingAfterBreak="0">
     <w:nsid w:val="78AA5925"/>
     <w:multiLevelType w:val="multilevel"/>
     <w:tmpl w:val="6BD67862"/>
@@ -41954,7 +42625,7 @@
       </w:rPr>
     </w:lvl>
   </w:abstractNum>
-  <w:abstractNum w:abstractNumId="238" w15:restartNumberingAfterBreak="0">
+  <w:abstractNum w:abstractNumId="239" w15:restartNumberingAfterBreak="0">
     <w:nsid w:val="78FE6A65"/>
     <w:multiLevelType w:val="hybridMultilevel"/>
     <w:tmpl w:val="1B82C0C0"/>
@@ -42043,7 +42714,7 @@
       </w:pPr>
     </w:lvl>
   </w:abstractNum>
-  <w:abstractNum w:abstractNumId="239" w15:restartNumberingAfterBreak="0">
+  <w:abstractNum w:abstractNumId="240" w15:restartNumberingAfterBreak="0">
     <w:nsid w:val="794D4863"/>
     <w:multiLevelType w:val="multilevel"/>
     <w:tmpl w:val="72A24C54"/>
@@ -42192,7 +42863,7 @@
       </w:rPr>
     </w:lvl>
   </w:abstractNum>
-  <w:abstractNum w:abstractNumId="240" w15:restartNumberingAfterBreak="0">
+  <w:abstractNum w:abstractNumId="241" w15:restartNumberingAfterBreak="0">
     <w:nsid w:val="797E3B78"/>
     <w:multiLevelType w:val="multilevel"/>
     <w:tmpl w:val="68E467AA"/>
@@ -42341,7 +43012,7 @@
       </w:rPr>
     </w:lvl>
   </w:abstractNum>
-  <w:abstractNum w:abstractNumId="241" w15:restartNumberingAfterBreak="0">
+  <w:abstractNum w:abstractNumId="242" w15:restartNumberingAfterBreak="0">
     <w:nsid w:val="79981AFA"/>
     <w:multiLevelType w:val="multilevel"/>
     <w:tmpl w:val="512A474C"/>
@@ -42490,7 +43161,7 @@
       </w:rPr>
     </w:lvl>
   </w:abstractNum>
-  <w:abstractNum w:abstractNumId="242" w15:restartNumberingAfterBreak="0">
+  <w:abstractNum w:abstractNumId="243" w15:restartNumberingAfterBreak="0">
     <w:nsid w:val="79EC24A3"/>
     <w:multiLevelType w:val="multilevel"/>
     <w:tmpl w:val="0409001D"/>
@@ -42576,7 +43247,7 @@
       </w:pPr>
     </w:lvl>
   </w:abstractNum>
-  <w:abstractNum w:abstractNumId="243" w15:restartNumberingAfterBreak="0">
+  <w:abstractNum w:abstractNumId="244" w15:restartNumberingAfterBreak="0">
     <w:nsid w:val="7A0615C6"/>
     <w:multiLevelType w:val="multilevel"/>
     <w:tmpl w:val="DD48CE38"/>
@@ -42693,7 +43364,7 @@
       </w:pPr>
     </w:lvl>
   </w:abstractNum>
-  <w:abstractNum w:abstractNumId="244" w15:restartNumberingAfterBreak="0">
+  <w:abstractNum w:abstractNumId="245" w15:restartNumberingAfterBreak="0">
     <w:nsid w:val="7A4A4CDF"/>
     <w:multiLevelType w:val="multilevel"/>
     <w:tmpl w:val="8110DF20"/>
@@ -42842,7 +43513,7 @@
       </w:rPr>
     </w:lvl>
   </w:abstractNum>
-  <w:abstractNum w:abstractNumId="245" w15:restartNumberingAfterBreak="0">
+  <w:abstractNum w:abstractNumId="246" w15:restartNumberingAfterBreak="0">
     <w:nsid w:val="7B7A4D7C"/>
     <w:multiLevelType w:val="multilevel"/>
     <w:tmpl w:val="AA1EE240"/>
@@ -42991,7 +43662,7 @@
       </w:rPr>
     </w:lvl>
   </w:abstractNum>
-  <w:abstractNum w:abstractNumId="246" w15:restartNumberingAfterBreak="0">
+  <w:abstractNum w:abstractNumId="247" w15:restartNumberingAfterBreak="0">
     <w:nsid w:val="7B901ABE"/>
     <w:multiLevelType w:val="multilevel"/>
     <w:tmpl w:val="0409001D"/>
@@ -43077,7 +43748,7 @@
       </w:pPr>
     </w:lvl>
   </w:abstractNum>
-  <w:abstractNum w:abstractNumId="247" w15:restartNumberingAfterBreak="0">
+  <w:abstractNum w:abstractNumId="248" w15:restartNumberingAfterBreak="0">
     <w:nsid w:val="7BBF2CA1"/>
     <w:multiLevelType w:val="hybridMultilevel"/>
     <w:tmpl w:val="B88C84DA"/>
@@ -43163,7 +43834,7 @@
       </w:pPr>
     </w:lvl>
   </w:abstractNum>
-  <w:abstractNum w:abstractNumId="248" w15:restartNumberingAfterBreak="0">
+  <w:abstractNum w:abstractNumId="249" w15:restartNumberingAfterBreak="0">
     <w:nsid w:val="7CC13ED5"/>
     <w:multiLevelType w:val="multilevel"/>
     <w:tmpl w:val="4A840DA8"/>
@@ -43312,7 +43983,7 @@
       </w:rPr>
     </w:lvl>
   </w:abstractNum>
-  <w:abstractNum w:abstractNumId="249" w15:restartNumberingAfterBreak="0">
+  <w:abstractNum w:abstractNumId="250" w15:restartNumberingAfterBreak="0">
     <w:nsid w:val="7CED752A"/>
     <w:multiLevelType w:val="multilevel"/>
     <w:tmpl w:val="3716C828"/>
@@ -43461,7 +44132,7 @@
       </w:rPr>
     </w:lvl>
   </w:abstractNum>
-  <w:abstractNum w:abstractNumId="250" w15:restartNumberingAfterBreak="0">
+  <w:abstractNum w:abstractNumId="251" w15:restartNumberingAfterBreak="0">
     <w:nsid w:val="7CF646D9"/>
     <w:multiLevelType w:val="multilevel"/>
     <w:tmpl w:val="7D221904"/>
@@ -43610,7 +44281,7 @@
       </w:rPr>
     </w:lvl>
   </w:abstractNum>
-  <w:abstractNum w:abstractNumId="251" w15:restartNumberingAfterBreak="0">
+  <w:abstractNum w:abstractNumId="252" w15:restartNumberingAfterBreak="0">
     <w:nsid w:val="7E5848B4"/>
     <w:multiLevelType w:val="multilevel"/>
     <w:tmpl w:val="DA2C6884"/>
@@ -43759,7 +44430,7 @@
       </w:rPr>
     </w:lvl>
   </w:abstractNum>
-  <w:abstractNum w:abstractNumId="252" w15:restartNumberingAfterBreak="0">
+  <w:abstractNum w:abstractNumId="253" w15:restartNumberingAfterBreak="0">
     <w:nsid w:val="7EA43E28"/>
     <w:multiLevelType w:val="multilevel"/>
     <w:tmpl w:val="AEE89ED0"/>
@@ -43908,7 +44579,7 @@
       </w:rPr>
     </w:lvl>
   </w:abstractNum>
-  <w:abstractNum w:abstractNumId="253" w15:restartNumberingAfterBreak="0">
+  <w:abstractNum w:abstractNumId="254" w15:restartNumberingAfterBreak="0">
     <w:nsid w:val="7FF412D9"/>
     <w:multiLevelType w:val="hybridMultilevel"/>
     <w:tmpl w:val="209427A0"/>
@@ -44001,10 +44672,10 @@
     <w:abstractNumId w:val="110"/>
   </w:num>
   <w:num w:numId="3" w16cid:durableId="64963145">
-    <w:abstractNumId w:val="215"/>
+    <w:abstractNumId w:val="216"/>
   </w:num>
   <w:num w:numId="4" w16cid:durableId="1229270948">
-    <w:abstractNumId w:val="146"/>
+    <w:abstractNumId w:val="147"/>
   </w:num>
   <w:num w:numId="5" w16cid:durableId="861936050">
     <w:abstractNumId w:val="17"/>
@@ -44019,16 +44690,16 @@
     <w:abstractNumId w:val="20"/>
   </w:num>
   <w:num w:numId="9" w16cid:durableId="764883545">
-    <w:abstractNumId w:val="159"/>
+    <w:abstractNumId w:val="160"/>
   </w:num>
   <w:num w:numId="10" w16cid:durableId="12387941">
-    <w:abstractNumId w:val="147"/>
+    <w:abstractNumId w:val="148"/>
   </w:num>
   <w:num w:numId="11" w16cid:durableId="21175981">
     <w:abstractNumId w:val="49"/>
   </w:num>
   <w:num w:numId="12" w16cid:durableId="2003923399">
-    <w:abstractNumId w:val="228"/>
+    <w:abstractNumId w:val="229"/>
   </w:num>
   <w:num w:numId="13" w16cid:durableId="1241252992">
     <w:abstractNumId w:val="98"/>
@@ -44040,7 +44711,7 @@
     <w:abstractNumId w:val="71"/>
   </w:num>
   <w:num w:numId="16" w16cid:durableId="226192028">
-    <w:abstractNumId w:val="234"/>
+    <w:abstractNumId w:val="235"/>
   </w:num>
   <w:num w:numId="17" w16cid:durableId="458841060">
     <w:abstractNumId w:val="103"/>
@@ -44049,10 +44720,10 @@
     <w:abstractNumId w:val="111"/>
   </w:num>
   <w:num w:numId="19" w16cid:durableId="323896942">
-    <w:abstractNumId w:val="218"/>
+    <w:abstractNumId w:val="219"/>
   </w:num>
   <w:num w:numId="20" w16cid:durableId="2014717543">
-    <w:abstractNumId w:val="218"/>
+    <w:abstractNumId w:val="219"/>
     <w:lvlOverride w:ilvl="1">
       <w:lvl w:ilvl="1">
         <w:numFmt w:val="bullet"/>
@@ -44072,7 +44743,7 @@
     </w:lvlOverride>
   </w:num>
   <w:num w:numId="21" w16cid:durableId="1605527520">
-    <w:abstractNumId w:val="218"/>
+    <w:abstractNumId w:val="219"/>
     <w:lvlOverride w:ilvl="1">
       <w:lvl w:ilvl="1">
         <w:numFmt w:val="bullet"/>
@@ -44092,7 +44763,7 @@
     </w:lvlOverride>
   </w:num>
   <w:num w:numId="22" w16cid:durableId="1875263998">
-    <w:abstractNumId w:val="218"/>
+    <w:abstractNumId w:val="219"/>
     <w:lvlOverride w:ilvl="1">
       <w:lvl w:ilvl="1">
         <w:numFmt w:val="bullet"/>
@@ -44112,7 +44783,7 @@
     </w:lvlOverride>
   </w:num>
   <w:num w:numId="23" w16cid:durableId="2081824830">
-    <w:abstractNumId w:val="218"/>
+    <w:abstractNumId w:val="219"/>
     <w:lvlOverride w:ilvl="1">
       <w:lvl w:ilvl="1">
         <w:numFmt w:val="bullet"/>
@@ -44132,7 +44803,7 @@
     </w:lvlOverride>
   </w:num>
   <w:num w:numId="24" w16cid:durableId="976180975">
-    <w:abstractNumId w:val="218"/>
+    <w:abstractNumId w:val="219"/>
     <w:lvlOverride w:ilvl="1">
       <w:lvl w:ilvl="1">
         <w:numFmt w:val="bullet"/>
@@ -44152,7 +44823,7 @@
     </w:lvlOverride>
   </w:num>
   <w:num w:numId="25" w16cid:durableId="888036745">
-    <w:abstractNumId w:val="218"/>
+    <w:abstractNumId w:val="219"/>
     <w:lvlOverride w:ilvl="1">
       <w:lvl w:ilvl="1">
         <w:numFmt w:val="bullet"/>
@@ -44172,7 +44843,7 @@
     </w:lvlOverride>
   </w:num>
   <w:num w:numId="26" w16cid:durableId="1793013006">
-    <w:abstractNumId w:val="218"/>
+    <w:abstractNumId w:val="219"/>
     <w:lvlOverride w:ilvl="1">
       <w:lvl w:ilvl="1">
         <w:numFmt w:val="bullet"/>
@@ -44192,7 +44863,7 @@
     </w:lvlOverride>
   </w:num>
   <w:num w:numId="27" w16cid:durableId="2090610408">
-    <w:abstractNumId w:val="218"/>
+    <w:abstractNumId w:val="219"/>
     <w:lvlOverride w:ilvl="1">
       <w:lvl w:ilvl="1">
         <w:numFmt w:val="bullet"/>
@@ -44212,7 +44883,7 @@
     </w:lvlOverride>
   </w:num>
   <w:num w:numId="28" w16cid:durableId="1841657711">
-    <w:abstractNumId w:val="218"/>
+    <w:abstractNumId w:val="219"/>
     <w:lvlOverride w:ilvl="1">
       <w:lvl w:ilvl="1">
         <w:numFmt w:val="bullet"/>
@@ -44232,7 +44903,7 @@
     </w:lvlOverride>
   </w:num>
   <w:num w:numId="29" w16cid:durableId="1797480727">
-    <w:abstractNumId w:val="218"/>
+    <w:abstractNumId w:val="219"/>
     <w:lvlOverride w:ilvl="1">
       <w:lvl w:ilvl="1">
         <w:numFmt w:val="bullet"/>
@@ -44252,7 +44923,7 @@
     </w:lvlOverride>
   </w:num>
   <w:num w:numId="30" w16cid:durableId="362439137">
-    <w:abstractNumId w:val="218"/>
+    <w:abstractNumId w:val="219"/>
     <w:lvlOverride w:ilvl="1">
       <w:lvl w:ilvl="1">
         <w:numFmt w:val="bullet"/>
@@ -44272,7 +44943,7 @@
     </w:lvlOverride>
   </w:num>
   <w:num w:numId="31" w16cid:durableId="746461409">
-    <w:abstractNumId w:val="218"/>
+    <w:abstractNumId w:val="219"/>
     <w:lvlOverride w:ilvl="1">
       <w:lvl w:ilvl="1">
         <w:numFmt w:val="bullet"/>
@@ -44292,7 +44963,7 @@
     </w:lvlOverride>
   </w:num>
   <w:num w:numId="32" w16cid:durableId="29651206">
-    <w:abstractNumId w:val="218"/>
+    <w:abstractNumId w:val="219"/>
     <w:lvlOverride w:ilvl="1">
       <w:lvl w:ilvl="1">
         <w:numFmt w:val="bullet"/>
@@ -44312,7 +44983,7 @@
     </w:lvlOverride>
   </w:num>
   <w:num w:numId="33" w16cid:durableId="1423523359">
-    <w:abstractNumId w:val="218"/>
+    <w:abstractNumId w:val="219"/>
     <w:lvlOverride w:ilvl="1">
       <w:lvl w:ilvl="1">
         <w:numFmt w:val="bullet"/>
@@ -44332,7 +45003,7 @@
     </w:lvlOverride>
   </w:num>
   <w:num w:numId="34" w16cid:durableId="13970421">
-    <w:abstractNumId w:val="218"/>
+    <w:abstractNumId w:val="219"/>
     <w:lvlOverride w:ilvl="1">
       <w:lvl w:ilvl="1">
         <w:numFmt w:val="bullet"/>
@@ -44352,7 +45023,7 @@
     </w:lvlOverride>
   </w:num>
   <w:num w:numId="35" w16cid:durableId="553279678">
-    <w:abstractNumId w:val="218"/>
+    <w:abstractNumId w:val="219"/>
     <w:lvlOverride w:ilvl="1">
       <w:lvl w:ilvl="1">
         <w:numFmt w:val="bullet"/>
@@ -44372,7 +45043,7 @@
     </w:lvlOverride>
   </w:num>
   <w:num w:numId="36" w16cid:durableId="1540238886">
-    <w:abstractNumId w:val="218"/>
+    <w:abstractNumId w:val="219"/>
     <w:lvlOverride w:ilvl="1">
       <w:lvl w:ilvl="1">
         <w:numFmt w:val="bullet"/>
@@ -44392,7 +45063,7 @@
     </w:lvlOverride>
   </w:num>
   <w:num w:numId="37" w16cid:durableId="2117942773">
-    <w:abstractNumId w:val="218"/>
+    <w:abstractNumId w:val="219"/>
     <w:lvlOverride w:ilvl="1">
       <w:lvl w:ilvl="1">
         <w:numFmt w:val="bullet"/>
@@ -44412,7 +45083,7 @@
     </w:lvlOverride>
   </w:num>
   <w:num w:numId="38" w16cid:durableId="270286304">
-    <w:abstractNumId w:val="218"/>
+    <w:abstractNumId w:val="219"/>
     <w:lvlOverride w:ilvl="1">
       <w:lvl w:ilvl="1">
         <w:numFmt w:val="bullet"/>
@@ -44432,7 +45103,7 @@
     </w:lvlOverride>
   </w:num>
   <w:num w:numId="39" w16cid:durableId="564265283">
-    <w:abstractNumId w:val="218"/>
+    <w:abstractNumId w:val="219"/>
     <w:lvlOverride w:ilvl="1">
       <w:lvl w:ilvl="1">
         <w:numFmt w:val="bullet"/>
@@ -44452,7 +45123,7 @@
     </w:lvlOverride>
   </w:num>
   <w:num w:numId="40" w16cid:durableId="718943036">
-    <w:abstractNumId w:val="218"/>
+    <w:abstractNumId w:val="219"/>
     <w:lvlOverride w:ilvl="1">
       <w:lvl w:ilvl="1">
         <w:numFmt w:val="bullet"/>
@@ -44472,10 +45143,10 @@
     </w:lvlOverride>
   </w:num>
   <w:num w:numId="41" w16cid:durableId="1212961162">
-    <w:abstractNumId w:val="192"/>
+    <w:abstractNumId w:val="193"/>
   </w:num>
   <w:num w:numId="42" w16cid:durableId="381096346">
-    <w:abstractNumId w:val="192"/>
+    <w:abstractNumId w:val="193"/>
     <w:lvlOverride w:ilvl="1">
       <w:lvl w:ilvl="1">
         <w:numFmt w:val="bullet"/>
@@ -44495,7 +45166,7 @@
     </w:lvlOverride>
   </w:num>
   <w:num w:numId="43" w16cid:durableId="1579099378">
-    <w:abstractNumId w:val="192"/>
+    <w:abstractNumId w:val="193"/>
     <w:lvlOverride w:ilvl="1">
       <w:lvl w:ilvl="1">
         <w:numFmt w:val="bullet"/>
@@ -44515,7 +45186,7 @@
     </w:lvlOverride>
   </w:num>
   <w:num w:numId="44" w16cid:durableId="97339869">
-    <w:abstractNumId w:val="192"/>
+    <w:abstractNumId w:val="193"/>
     <w:lvlOverride w:ilvl="1">
       <w:lvl w:ilvl="1">
         <w:numFmt w:val="bullet"/>
@@ -44535,7 +45206,7 @@
     </w:lvlOverride>
   </w:num>
   <w:num w:numId="45" w16cid:durableId="1383678707">
-    <w:abstractNumId w:val="192"/>
+    <w:abstractNumId w:val="193"/>
     <w:lvlOverride w:ilvl="1">
       <w:lvl w:ilvl="1">
         <w:numFmt w:val="bullet"/>
@@ -44555,7 +45226,7 @@
     </w:lvlOverride>
   </w:num>
   <w:num w:numId="46" w16cid:durableId="19472521">
-    <w:abstractNumId w:val="192"/>
+    <w:abstractNumId w:val="193"/>
     <w:lvlOverride w:ilvl="1">
       <w:lvl w:ilvl="1">
         <w:numFmt w:val="bullet"/>
@@ -44575,7 +45246,7 @@
     </w:lvlOverride>
   </w:num>
   <w:num w:numId="47" w16cid:durableId="1077171845">
-    <w:abstractNumId w:val="192"/>
+    <w:abstractNumId w:val="193"/>
     <w:lvlOverride w:ilvl="1">
       <w:lvl w:ilvl="1">
         <w:numFmt w:val="bullet"/>
@@ -44595,7 +45266,7 @@
     </w:lvlOverride>
   </w:num>
   <w:num w:numId="48" w16cid:durableId="1782066344">
-    <w:abstractNumId w:val="192"/>
+    <w:abstractNumId w:val="193"/>
     <w:lvlOverride w:ilvl="1">
       <w:lvl w:ilvl="1">
         <w:numFmt w:val="bullet"/>
@@ -44661,10 +45332,10 @@
     <w:abstractNumId w:val="37"/>
   </w:num>
   <w:num w:numId="53" w16cid:durableId="1609578761">
-    <w:abstractNumId w:val="153"/>
+    <w:abstractNumId w:val="154"/>
   </w:num>
   <w:num w:numId="54" w16cid:durableId="822160321">
-    <w:abstractNumId w:val="245"/>
+    <w:abstractNumId w:val="246"/>
   </w:num>
   <w:num w:numId="55" w16cid:durableId="1398046579">
     <w:abstractNumId w:val="6"/>
@@ -45224,7 +45895,7 @@
     <w:abstractNumId w:val="117"/>
   </w:num>
   <w:num w:numId="82" w16cid:durableId="292322769">
-    <w:abstractNumId w:val="249"/>
+    <w:abstractNumId w:val="250"/>
   </w:num>
   <w:num w:numId="83" w16cid:durableId="1072122421">
     <w:abstractNumId w:val="1"/>
@@ -45422,16 +46093,16 @@
     </w:lvlOverride>
   </w:num>
   <w:num w:numId="97" w16cid:durableId="363944189">
-    <w:abstractNumId w:val="174"/>
+    <w:abstractNumId w:val="175"/>
   </w:num>
   <w:num w:numId="98" w16cid:durableId="897206052">
     <w:abstractNumId w:val="81"/>
   </w:num>
   <w:num w:numId="99" w16cid:durableId="1273435789">
-    <w:abstractNumId w:val="235"/>
+    <w:abstractNumId w:val="236"/>
   </w:num>
   <w:num w:numId="100" w16cid:durableId="276329018">
-    <w:abstractNumId w:val="235"/>
+    <w:abstractNumId w:val="236"/>
     <w:lvlOverride w:ilvl="1">
       <w:lvl w:ilvl="1">
         <w:numFmt w:val="bullet"/>
@@ -45451,7 +46122,7 @@
     </w:lvlOverride>
   </w:num>
   <w:num w:numId="101" w16cid:durableId="30688120">
-    <w:abstractNumId w:val="235"/>
+    <w:abstractNumId w:val="236"/>
     <w:lvlOverride w:ilvl="1">
       <w:lvl w:ilvl="1">
         <w:numFmt w:val="bullet"/>
@@ -45471,7 +46142,7 @@
     </w:lvlOverride>
   </w:num>
   <w:num w:numId="102" w16cid:durableId="1667392475">
-    <w:abstractNumId w:val="235"/>
+    <w:abstractNumId w:val="236"/>
     <w:lvlOverride w:ilvl="1">
       <w:lvl w:ilvl="1">
         <w:numFmt w:val="bullet"/>
@@ -45683,10 +46354,10 @@
     </w:lvlOverride>
   </w:num>
   <w:num w:numId="116" w16cid:durableId="1248926505">
-    <w:abstractNumId w:val="239"/>
+    <w:abstractNumId w:val="240"/>
   </w:num>
   <w:num w:numId="117" w16cid:durableId="1191838156">
-    <w:abstractNumId w:val="239"/>
+    <w:abstractNumId w:val="240"/>
     <w:lvlOverride w:ilvl="1">
       <w:lvl w:ilvl="1">
         <w:numFmt w:val="bullet"/>
@@ -45706,7 +46377,7 @@
     </w:lvlOverride>
   </w:num>
   <w:num w:numId="118" w16cid:durableId="1828550388">
-    <w:abstractNumId w:val="239"/>
+    <w:abstractNumId w:val="240"/>
     <w:lvlOverride w:ilvl="1">
       <w:lvl w:ilvl="1">
         <w:numFmt w:val="bullet"/>
@@ -45726,7 +46397,7 @@
     </w:lvlOverride>
   </w:num>
   <w:num w:numId="119" w16cid:durableId="89082411">
-    <w:abstractNumId w:val="239"/>
+    <w:abstractNumId w:val="240"/>
     <w:lvlOverride w:ilvl="1">
       <w:lvl w:ilvl="1">
         <w:numFmt w:val="bullet"/>
@@ -45746,19 +46417,19 @@
     </w:lvlOverride>
   </w:num>
   <w:num w:numId="120" w16cid:durableId="637103643">
-    <w:abstractNumId w:val="226"/>
+    <w:abstractNumId w:val="227"/>
   </w:num>
   <w:num w:numId="121" w16cid:durableId="590161043">
-    <w:abstractNumId w:val="173"/>
+    <w:abstractNumId w:val="174"/>
   </w:num>
   <w:num w:numId="122" w16cid:durableId="1064375739">
     <w:abstractNumId w:val="57"/>
   </w:num>
   <w:num w:numId="123" w16cid:durableId="546142573">
-    <w:abstractNumId w:val="188"/>
+    <w:abstractNumId w:val="189"/>
   </w:num>
   <w:num w:numId="124" w16cid:durableId="1559707329">
-    <w:abstractNumId w:val="188"/>
+    <w:abstractNumId w:val="189"/>
     <w:lvlOverride w:ilvl="1">
       <w:lvl w:ilvl="1">
         <w:numFmt w:val="bullet"/>
@@ -45778,7 +46449,7 @@
     </w:lvlOverride>
   </w:num>
   <w:num w:numId="125" w16cid:durableId="1927378409">
-    <w:abstractNumId w:val="188"/>
+    <w:abstractNumId w:val="189"/>
     <w:lvlOverride w:ilvl="1">
       <w:lvl w:ilvl="1">
         <w:numFmt w:val="bullet"/>
@@ -45798,7 +46469,7 @@
     </w:lvlOverride>
   </w:num>
   <w:num w:numId="126" w16cid:durableId="410005087">
-    <w:abstractNumId w:val="188"/>
+    <w:abstractNumId w:val="189"/>
     <w:lvlOverride w:ilvl="1">
       <w:lvl w:ilvl="1">
         <w:numFmt w:val="bullet"/>
@@ -45818,10 +46489,10 @@
     </w:lvlOverride>
   </w:num>
   <w:num w:numId="127" w16cid:durableId="1004430825">
-    <w:abstractNumId w:val="140"/>
+    <w:abstractNumId w:val="141"/>
   </w:num>
   <w:num w:numId="128" w16cid:durableId="302587285">
-    <w:abstractNumId w:val="205"/>
+    <w:abstractNumId w:val="206"/>
   </w:num>
   <w:num w:numId="129" w16cid:durableId="2118985017">
     <w:abstractNumId w:val="38"/>
@@ -45887,10 +46558,10 @@
     </w:lvlOverride>
   </w:num>
   <w:num w:numId="133" w16cid:durableId="1749501442">
-    <w:abstractNumId w:val="236"/>
+    <w:abstractNumId w:val="237"/>
   </w:num>
   <w:num w:numId="134" w16cid:durableId="2144762810">
-    <w:abstractNumId w:val="236"/>
+    <w:abstractNumId w:val="237"/>
     <w:lvlOverride w:ilvl="1">
       <w:lvl w:ilvl="1">
         <w:numFmt w:val="bullet"/>
@@ -45910,7 +46581,7 @@
     </w:lvlOverride>
   </w:num>
   <w:num w:numId="135" w16cid:durableId="1302731136">
-    <w:abstractNumId w:val="236"/>
+    <w:abstractNumId w:val="237"/>
     <w:lvlOverride w:ilvl="1">
       <w:lvl w:ilvl="1">
         <w:numFmt w:val="bullet"/>
@@ -45954,19 +46625,19 @@
     <w:abstractNumId w:val="115"/>
   </w:num>
   <w:num w:numId="144" w16cid:durableId="2041129404">
-    <w:abstractNumId w:val="142"/>
+    <w:abstractNumId w:val="143"/>
   </w:num>
   <w:num w:numId="145" w16cid:durableId="355158106">
-    <w:abstractNumId w:val="156"/>
+    <w:abstractNumId w:val="157"/>
   </w:num>
   <w:num w:numId="146" w16cid:durableId="328796796">
-    <w:abstractNumId w:val="162"/>
+    <w:abstractNumId w:val="163"/>
   </w:num>
   <w:num w:numId="147" w16cid:durableId="661202721">
-    <w:abstractNumId w:val="248"/>
+    <w:abstractNumId w:val="249"/>
   </w:num>
   <w:num w:numId="148" w16cid:durableId="448746352">
-    <w:abstractNumId w:val="168"/>
+    <w:abstractNumId w:val="169"/>
   </w:num>
   <w:num w:numId="149" w16cid:durableId="585379173">
     <w:abstractNumId w:val="87"/>
@@ -45975,16 +46646,16 @@
     <w:abstractNumId w:val="123"/>
   </w:num>
   <w:num w:numId="151" w16cid:durableId="471873912">
-    <w:abstractNumId w:val="252"/>
+    <w:abstractNumId w:val="253"/>
   </w:num>
   <w:num w:numId="152" w16cid:durableId="237441317">
-    <w:abstractNumId w:val="178"/>
+    <w:abstractNumId w:val="179"/>
   </w:num>
   <w:num w:numId="153" w16cid:durableId="5834486">
-    <w:abstractNumId w:val="184"/>
+    <w:abstractNumId w:val="185"/>
   </w:num>
   <w:num w:numId="154" w16cid:durableId="797186606">
-    <w:abstractNumId w:val="184"/>
+    <w:abstractNumId w:val="185"/>
     <w:lvlOverride w:ilvl="1">
       <w:lvl w:ilvl="1">
         <w:numFmt w:val="bullet"/>
@@ -46004,7 +46675,7 @@
     </w:lvlOverride>
   </w:num>
   <w:num w:numId="155" w16cid:durableId="1889298302">
-    <w:abstractNumId w:val="184"/>
+    <w:abstractNumId w:val="185"/>
     <w:lvlOverride w:ilvl="1">
       <w:lvl w:ilvl="1">
         <w:numFmt w:val="bullet"/>
@@ -46024,7 +46695,7 @@
     </w:lvlOverride>
   </w:num>
   <w:num w:numId="156" w16cid:durableId="1352603847">
-    <w:abstractNumId w:val="184"/>
+    <w:abstractNumId w:val="185"/>
     <w:lvlOverride w:ilvl="1">
       <w:lvl w:ilvl="1">
         <w:numFmt w:val="bullet"/>
@@ -46044,7 +46715,7 @@
     </w:lvlOverride>
   </w:num>
   <w:num w:numId="157" w16cid:durableId="1290235541">
-    <w:abstractNumId w:val="184"/>
+    <w:abstractNumId w:val="185"/>
     <w:lvlOverride w:ilvl="1">
       <w:lvl w:ilvl="1">
         <w:numFmt w:val="bullet"/>
@@ -46070,10 +46741,10 @@
     <w:abstractNumId w:val="128"/>
   </w:num>
   <w:num w:numId="160" w16cid:durableId="783614209">
-    <w:abstractNumId w:val="152"/>
+    <w:abstractNumId w:val="153"/>
   </w:num>
   <w:num w:numId="161" w16cid:durableId="2071732425">
-    <w:abstractNumId w:val="152"/>
+    <w:abstractNumId w:val="153"/>
     <w:lvlOverride w:ilvl="1">
       <w:lvl w:ilvl="1">
         <w:numFmt w:val="bullet"/>
@@ -46093,7 +46764,7 @@
     </w:lvlOverride>
   </w:num>
   <w:num w:numId="162" w16cid:durableId="278224919">
-    <w:abstractNumId w:val="152"/>
+    <w:abstractNumId w:val="153"/>
     <w:lvlOverride w:ilvl="1">
       <w:lvl w:ilvl="1">
         <w:numFmt w:val="bullet"/>
@@ -46113,7 +46784,7 @@
     </w:lvlOverride>
   </w:num>
   <w:num w:numId="163" w16cid:durableId="661542103">
-    <w:abstractNumId w:val="152"/>
+    <w:abstractNumId w:val="153"/>
     <w:lvlOverride w:ilvl="1">
       <w:lvl w:ilvl="1">
         <w:numFmt w:val="bullet"/>
@@ -46133,7 +46804,7 @@
     </w:lvlOverride>
   </w:num>
   <w:num w:numId="164" w16cid:durableId="1140537879">
-    <w:abstractNumId w:val="152"/>
+    <w:abstractNumId w:val="153"/>
     <w:lvlOverride w:ilvl="1">
       <w:lvl w:ilvl="1">
         <w:numFmt w:val="bullet"/>
@@ -46153,7 +46824,7 @@
     </w:lvlOverride>
   </w:num>
   <w:num w:numId="165" w16cid:durableId="1517310538">
-    <w:abstractNumId w:val="152"/>
+    <w:abstractNumId w:val="153"/>
     <w:lvlOverride w:ilvl="1">
       <w:lvl w:ilvl="1">
         <w:numFmt w:val="bullet"/>
@@ -46173,7 +46844,7 @@
     </w:lvlOverride>
   </w:num>
   <w:num w:numId="166" w16cid:durableId="1005135742">
-    <w:abstractNumId w:val="152"/>
+    <w:abstractNumId w:val="153"/>
     <w:lvlOverride w:ilvl="1">
       <w:lvl w:ilvl="1">
         <w:numFmt w:val="bullet"/>
@@ -46193,7 +46864,7 @@
     </w:lvlOverride>
   </w:num>
   <w:num w:numId="167" w16cid:durableId="1328437740">
-    <w:abstractNumId w:val="152"/>
+    <w:abstractNumId w:val="153"/>
     <w:lvlOverride w:ilvl="1">
       <w:lvl w:ilvl="1">
         <w:numFmt w:val="bullet"/>
@@ -46213,31 +46884,31 @@
     </w:lvlOverride>
   </w:num>
   <w:num w:numId="168" w16cid:durableId="1527786785">
-    <w:abstractNumId w:val="180"/>
+    <w:abstractNumId w:val="181"/>
   </w:num>
   <w:num w:numId="169" w16cid:durableId="515653910">
-    <w:abstractNumId w:val="233"/>
+    <w:abstractNumId w:val="234"/>
   </w:num>
   <w:num w:numId="170" w16cid:durableId="412776935">
     <w:abstractNumId w:val="47"/>
   </w:num>
   <w:num w:numId="171" w16cid:durableId="731655134">
-    <w:abstractNumId w:val="229"/>
+    <w:abstractNumId w:val="230"/>
   </w:num>
   <w:num w:numId="172" w16cid:durableId="1394739513">
     <w:abstractNumId w:val="45"/>
   </w:num>
   <w:num w:numId="173" w16cid:durableId="902134711">
-    <w:abstractNumId w:val="240"/>
+    <w:abstractNumId w:val="241"/>
   </w:num>
   <w:num w:numId="174" w16cid:durableId="423645284">
     <w:abstractNumId w:val="108"/>
   </w:num>
   <w:num w:numId="175" w16cid:durableId="732506691">
-    <w:abstractNumId w:val="137"/>
+    <w:abstractNumId w:val="138"/>
   </w:num>
   <w:num w:numId="176" w16cid:durableId="145243084">
-    <w:abstractNumId w:val="137"/>
+    <w:abstractNumId w:val="138"/>
     <w:lvlOverride w:ilvl="1">
       <w:lvl w:ilvl="1">
         <w:numFmt w:val="bullet"/>
@@ -46257,7 +46928,7 @@
     </w:lvlOverride>
   </w:num>
   <w:num w:numId="177" w16cid:durableId="1055617057">
-    <w:abstractNumId w:val="137"/>
+    <w:abstractNumId w:val="138"/>
     <w:lvlOverride w:ilvl="1">
       <w:lvl w:ilvl="1">
         <w:numFmt w:val="bullet"/>
@@ -46277,7 +46948,7 @@
     </w:lvlOverride>
   </w:num>
   <w:num w:numId="178" w16cid:durableId="646934197">
-    <w:abstractNumId w:val="137"/>
+    <w:abstractNumId w:val="138"/>
     <w:lvlOverride w:ilvl="1">
       <w:lvl w:ilvl="1">
         <w:numFmt w:val="bullet"/>
@@ -46300,7 +46971,7 @@
     <w:abstractNumId w:val="118"/>
   </w:num>
   <w:num w:numId="180" w16cid:durableId="1897351112">
-    <w:abstractNumId w:val="189"/>
+    <w:abstractNumId w:val="190"/>
   </w:num>
   <w:num w:numId="181" w16cid:durableId="1293823200">
     <w:abstractNumId w:val="26"/>
@@ -46309,13 +46980,13 @@
     <w:abstractNumId w:val="68"/>
   </w:num>
   <w:num w:numId="183" w16cid:durableId="1578203619">
-    <w:abstractNumId w:val="196"/>
+    <w:abstractNumId w:val="197"/>
   </w:num>
   <w:num w:numId="184" w16cid:durableId="1885748767">
     <w:abstractNumId w:val="113"/>
   </w:num>
   <w:num w:numId="185" w16cid:durableId="1557861500">
-    <w:abstractNumId w:val="193"/>
+    <w:abstractNumId w:val="194"/>
   </w:num>
   <w:num w:numId="186" w16cid:durableId="1617448027">
     <w:abstractNumId w:val="23"/>
@@ -46324,19 +46995,19 @@
     <w:abstractNumId w:val="19"/>
   </w:num>
   <w:num w:numId="188" w16cid:durableId="1842814178">
-    <w:abstractNumId w:val="224"/>
+    <w:abstractNumId w:val="225"/>
   </w:num>
   <w:num w:numId="189" w16cid:durableId="1408192392">
-    <w:abstractNumId w:val="141"/>
+    <w:abstractNumId w:val="142"/>
   </w:num>
   <w:num w:numId="190" w16cid:durableId="2002539781">
     <w:abstractNumId w:val="59"/>
   </w:num>
   <w:num w:numId="191" w16cid:durableId="308364909">
-    <w:abstractNumId w:val="164"/>
+    <w:abstractNumId w:val="165"/>
   </w:num>
   <w:num w:numId="192" w16cid:durableId="181945443">
-    <w:abstractNumId w:val="164"/>
+    <w:abstractNumId w:val="165"/>
     <w:lvlOverride w:ilvl="1">
       <w:lvl w:ilvl="1">
         <w:numFmt w:val="bullet"/>
@@ -46356,7 +47027,7 @@
     </w:lvlOverride>
   </w:num>
   <w:num w:numId="193" w16cid:durableId="1119108335">
-    <w:abstractNumId w:val="164"/>
+    <w:abstractNumId w:val="165"/>
     <w:lvlOverride w:ilvl="1">
       <w:lvl w:ilvl="1">
         <w:numFmt w:val="bullet"/>
@@ -46376,7 +47047,7 @@
     </w:lvlOverride>
   </w:num>
   <w:num w:numId="194" w16cid:durableId="1678729419">
-    <w:abstractNumId w:val="164"/>
+    <w:abstractNumId w:val="165"/>
     <w:lvlOverride w:ilvl="1">
       <w:lvl w:ilvl="1">
         <w:numFmt w:val="bullet"/>
@@ -46396,7 +47067,7 @@
     </w:lvlOverride>
   </w:num>
   <w:num w:numId="195" w16cid:durableId="36442012">
-    <w:abstractNumId w:val="164"/>
+    <w:abstractNumId w:val="165"/>
     <w:lvlOverride w:ilvl="1">
       <w:lvl w:ilvl="1">
         <w:numFmt w:val="bullet"/>
@@ -46416,7 +47087,7 @@
     </w:lvlOverride>
   </w:num>
   <w:num w:numId="196" w16cid:durableId="1469787957">
-    <w:abstractNumId w:val="164"/>
+    <w:abstractNumId w:val="165"/>
     <w:lvlOverride w:ilvl="1">
       <w:lvl w:ilvl="1">
         <w:numFmt w:val="bullet"/>
@@ -46436,7 +47107,7 @@
     </w:lvlOverride>
   </w:num>
   <w:num w:numId="197" w16cid:durableId="384840156">
-    <w:abstractNumId w:val="164"/>
+    <w:abstractNumId w:val="165"/>
     <w:lvlOverride w:ilvl="1">
       <w:lvl w:ilvl="1">
         <w:numFmt w:val="bullet"/>
@@ -46456,7 +47127,7 @@
     </w:lvlOverride>
   </w:num>
   <w:num w:numId="198" w16cid:durableId="1721978433">
-    <w:abstractNumId w:val="164"/>
+    <w:abstractNumId w:val="165"/>
     <w:lvlOverride w:ilvl="1">
       <w:lvl w:ilvl="1">
         <w:numFmt w:val="bullet"/>
@@ -46476,7 +47147,7 @@
     </w:lvlOverride>
   </w:num>
   <w:num w:numId="199" w16cid:durableId="989673041">
-    <w:abstractNumId w:val="222"/>
+    <w:abstractNumId w:val="223"/>
   </w:num>
   <w:num w:numId="200" w16cid:durableId="1227497349">
     <w:abstractNumId w:val="107"/>
@@ -46485,10 +47156,10 @@
     <w:abstractNumId w:val="100"/>
   </w:num>
   <w:num w:numId="202" w16cid:durableId="345908412">
-    <w:abstractNumId w:val="210"/>
+    <w:abstractNumId w:val="211"/>
   </w:num>
   <w:num w:numId="203" w16cid:durableId="1740860495">
-    <w:abstractNumId w:val="237"/>
+    <w:abstractNumId w:val="238"/>
   </w:num>
   <w:num w:numId="204" w16cid:durableId="1623877669">
     <w:abstractNumId w:val="5"/>
@@ -46777,7 +47448,7 @@
     <w:abstractNumId w:val="62"/>
   </w:num>
   <w:num w:numId="220" w16cid:durableId="5792790">
-    <w:abstractNumId w:val="186"/>
+    <w:abstractNumId w:val="187"/>
   </w:num>
   <w:num w:numId="221" w16cid:durableId="1056590543">
     <w:abstractNumId w:val="25"/>
@@ -46786,10 +47457,10 @@
     <w:abstractNumId w:val="105"/>
   </w:num>
   <w:num w:numId="223" w16cid:durableId="1031103742">
-    <w:abstractNumId w:val="139"/>
+    <w:abstractNumId w:val="140"/>
   </w:num>
   <w:num w:numId="224" w16cid:durableId="1762526911">
-    <w:abstractNumId w:val="139"/>
+    <w:abstractNumId w:val="140"/>
     <w:lvlOverride w:ilvl="1">
       <w:lvl w:ilvl="1">
         <w:numFmt w:val="bullet"/>
@@ -46809,7 +47480,7 @@
     </w:lvlOverride>
   </w:num>
   <w:num w:numId="225" w16cid:durableId="239406663">
-    <w:abstractNumId w:val="139"/>
+    <w:abstractNumId w:val="140"/>
     <w:lvlOverride w:ilvl="1">
       <w:lvl w:ilvl="1">
         <w:numFmt w:val="bullet"/>
@@ -46829,7 +47500,7 @@
     </w:lvlOverride>
   </w:num>
   <w:num w:numId="226" w16cid:durableId="389814794">
-    <w:abstractNumId w:val="139"/>
+    <w:abstractNumId w:val="140"/>
     <w:lvlOverride w:ilvl="1">
       <w:lvl w:ilvl="1">
         <w:numFmt w:val="bullet"/>
@@ -46849,7 +47520,7 @@
     </w:lvlOverride>
   </w:num>
   <w:num w:numId="227" w16cid:durableId="2058358433">
-    <w:abstractNumId w:val="139"/>
+    <w:abstractNumId w:val="140"/>
     <w:lvlOverride w:ilvl="1">
       <w:lvl w:ilvl="1">
         <w:numFmt w:val="bullet"/>
@@ -46978,7 +47649,7 @@
     <w:abstractNumId w:val="13"/>
   </w:num>
   <w:num w:numId="236" w16cid:durableId="66222344">
-    <w:abstractNumId w:val="167"/>
+    <w:abstractNumId w:val="168"/>
   </w:num>
   <w:num w:numId="237" w16cid:durableId="1508981368">
     <w:abstractNumId w:val="94"/>
@@ -47517,19 +48188,19 @@
     </w:lvlOverride>
   </w:num>
   <w:num w:numId="257" w16cid:durableId="448738575">
-    <w:abstractNumId w:val="199"/>
+    <w:abstractNumId w:val="200"/>
   </w:num>
   <w:num w:numId="258" w16cid:durableId="221867197">
     <w:abstractNumId w:val="82"/>
   </w:num>
   <w:num w:numId="259" w16cid:durableId="1652055639">
-    <w:abstractNumId w:val="214"/>
+    <w:abstractNumId w:val="215"/>
   </w:num>
   <w:num w:numId="260" w16cid:durableId="1037126241">
-    <w:abstractNumId w:val="244"/>
+    <w:abstractNumId w:val="245"/>
   </w:num>
   <w:num w:numId="261" w16cid:durableId="1860850401">
-    <w:abstractNumId w:val="244"/>
+    <w:abstractNumId w:val="245"/>
     <w:lvlOverride w:ilvl="1">
       <w:lvl w:ilvl="1">
         <w:numFmt w:val="bullet"/>
@@ -47549,7 +48220,7 @@
     </w:lvlOverride>
   </w:num>
   <w:num w:numId="262" w16cid:durableId="1093086728">
-    <w:abstractNumId w:val="244"/>
+    <w:abstractNumId w:val="245"/>
     <w:lvlOverride w:ilvl="1">
       <w:lvl w:ilvl="1">
         <w:numFmt w:val="bullet"/>
@@ -47569,7 +48240,7 @@
     </w:lvlOverride>
   </w:num>
   <w:num w:numId="263" w16cid:durableId="1959141894">
-    <w:abstractNumId w:val="244"/>
+    <w:abstractNumId w:val="245"/>
     <w:lvlOverride w:ilvl="1">
       <w:lvl w:ilvl="1">
         <w:numFmt w:val="bullet"/>
@@ -47589,7 +48260,7 @@
     </w:lvlOverride>
   </w:num>
   <w:num w:numId="264" w16cid:durableId="1993632123">
-    <w:abstractNumId w:val="244"/>
+    <w:abstractNumId w:val="245"/>
     <w:lvlOverride w:ilvl="1">
       <w:lvl w:ilvl="1">
         <w:numFmt w:val="bullet"/>
@@ -47609,7 +48280,7 @@
     </w:lvlOverride>
   </w:num>
   <w:num w:numId="265" w16cid:durableId="1998731107">
-    <w:abstractNumId w:val="244"/>
+    <w:abstractNumId w:val="245"/>
     <w:lvlOverride w:ilvl="1">
       <w:lvl w:ilvl="1">
         <w:numFmt w:val="bullet"/>
@@ -47712,7 +48383,7 @@
     </w:lvlOverride>
   </w:num>
   <w:num w:numId="271" w16cid:durableId="2041858017">
-    <w:abstractNumId w:val="135"/>
+    <w:abstractNumId w:val="136"/>
   </w:num>
   <w:num w:numId="272" w16cid:durableId="332100862">
     <w:abstractNumId w:val="109"/>
@@ -48106,10 +48777,10 @@
     </w:lvlOverride>
   </w:num>
   <w:num w:numId="289" w16cid:durableId="1517040379">
-    <w:abstractNumId w:val="220"/>
+    <w:abstractNumId w:val="221"/>
   </w:num>
   <w:num w:numId="290" w16cid:durableId="976379404">
-    <w:abstractNumId w:val="220"/>
+    <w:abstractNumId w:val="221"/>
     <w:lvlOverride w:ilvl="1">
       <w:lvl w:ilvl="1">
         <w:numFmt w:val="bullet"/>
@@ -48129,7 +48800,7 @@
     </w:lvlOverride>
   </w:num>
   <w:num w:numId="291" w16cid:durableId="661541238">
-    <w:abstractNumId w:val="220"/>
+    <w:abstractNumId w:val="221"/>
     <w:lvlOverride w:ilvl="1">
       <w:lvl w:ilvl="1">
         <w:numFmt w:val="bullet"/>
@@ -48149,7 +48820,7 @@
     </w:lvlOverride>
   </w:num>
   <w:num w:numId="292" w16cid:durableId="180047134">
-    <w:abstractNumId w:val="220"/>
+    <w:abstractNumId w:val="221"/>
     <w:lvlOverride w:ilvl="1">
       <w:lvl w:ilvl="1">
         <w:numFmt w:val="bullet"/>
@@ -48235,7 +48906,7 @@
     </w:lvlOverride>
   </w:num>
   <w:num w:numId="298" w16cid:durableId="1210455041">
-    <w:abstractNumId w:val="201"/>
+    <w:abstractNumId w:val="202"/>
   </w:num>
   <w:num w:numId="299" w16cid:durableId="1245333743">
     <w:abstractNumId w:val="77"/>
@@ -48290,13 +48961,13 @@
     <w:abstractNumId w:val="70"/>
   </w:num>
   <w:num w:numId="305" w16cid:durableId="1344208951">
-    <w:abstractNumId w:val="131"/>
+    <w:abstractNumId w:val="132"/>
   </w:num>
   <w:num w:numId="306" w16cid:durableId="1939630282">
-    <w:abstractNumId w:val="202"/>
+    <w:abstractNumId w:val="203"/>
   </w:num>
   <w:num w:numId="307" w16cid:durableId="1396196915">
-    <w:abstractNumId w:val="202"/>
+    <w:abstractNumId w:val="203"/>
     <w:lvlOverride w:ilvl="1">
       <w:lvl w:ilvl="1">
         <w:numFmt w:val="bullet"/>
@@ -48316,7 +48987,7 @@
     </w:lvlOverride>
   </w:num>
   <w:num w:numId="308" w16cid:durableId="1471708049">
-    <w:abstractNumId w:val="202"/>
+    <w:abstractNumId w:val="203"/>
     <w:lvlOverride w:ilvl="1">
       <w:lvl w:ilvl="1">
         <w:numFmt w:val="bullet"/>
@@ -48336,10 +49007,10 @@
     </w:lvlOverride>
   </w:num>
   <w:num w:numId="309" w16cid:durableId="1964460778">
-    <w:abstractNumId w:val="216"/>
+    <w:abstractNumId w:val="217"/>
   </w:num>
   <w:num w:numId="310" w16cid:durableId="2101101690">
-    <w:abstractNumId w:val="216"/>
+    <w:abstractNumId w:val="217"/>
     <w:lvlOverride w:ilvl="1">
       <w:lvl w:ilvl="1">
         <w:numFmt w:val="bullet"/>
@@ -48359,7 +49030,7 @@
     </w:lvlOverride>
   </w:num>
   <w:num w:numId="311" w16cid:durableId="1677730701">
-    <w:abstractNumId w:val="216"/>
+    <w:abstractNumId w:val="217"/>
     <w:lvlOverride w:ilvl="1">
       <w:lvl w:ilvl="1">
         <w:numFmt w:val="bullet"/>
@@ -48379,7 +49050,7 @@
     </w:lvlOverride>
   </w:num>
   <w:num w:numId="312" w16cid:durableId="1687440433">
-    <w:abstractNumId w:val="216"/>
+    <w:abstractNumId w:val="217"/>
     <w:lvlOverride w:ilvl="1">
       <w:lvl w:ilvl="1">
         <w:numFmt w:val="bullet"/>
@@ -48399,7 +49070,7 @@
     </w:lvlOverride>
   </w:num>
   <w:num w:numId="313" w16cid:durableId="334190081">
-    <w:abstractNumId w:val="216"/>
+    <w:abstractNumId w:val="217"/>
     <w:lvlOverride w:ilvl="1">
       <w:lvl w:ilvl="1">
         <w:numFmt w:val="bullet"/>
@@ -48419,7 +49090,7 @@
     </w:lvlOverride>
   </w:num>
   <w:num w:numId="314" w16cid:durableId="1638536272">
-    <w:abstractNumId w:val="216"/>
+    <w:abstractNumId w:val="217"/>
     <w:lvlOverride w:ilvl="1">
       <w:lvl w:ilvl="1">
         <w:numFmt w:val="bullet"/>
@@ -48439,7 +49110,7 @@
     </w:lvlOverride>
   </w:num>
   <w:num w:numId="315" w16cid:durableId="593048540">
-    <w:abstractNumId w:val="216"/>
+    <w:abstractNumId w:val="217"/>
     <w:lvlOverride w:ilvl="1">
       <w:lvl w:ilvl="1">
         <w:numFmt w:val="bullet"/>
@@ -48459,7 +49130,7 @@
     </w:lvlOverride>
   </w:num>
   <w:num w:numId="316" w16cid:durableId="590624177">
-    <w:abstractNumId w:val="216"/>
+    <w:abstractNumId w:val="217"/>
     <w:lvlOverride w:ilvl="1">
       <w:lvl w:ilvl="1">
         <w:numFmt w:val="bullet"/>
@@ -48479,19 +49150,19 @@
     </w:lvlOverride>
   </w:num>
   <w:num w:numId="317" w16cid:durableId="2135054504">
-    <w:abstractNumId w:val="250"/>
+    <w:abstractNumId w:val="251"/>
   </w:num>
   <w:num w:numId="318" w16cid:durableId="1790512776">
-    <w:abstractNumId w:val="230"/>
+    <w:abstractNumId w:val="231"/>
   </w:num>
   <w:num w:numId="319" w16cid:durableId="1900899971">
     <w:abstractNumId w:val="64"/>
   </w:num>
   <w:num w:numId="320" w16cid:durableId="2052613896">
-    <w:abstractNumId w:val="149"/>
+    <w:abstractNumId w:val="150"/>
   </w:num>
   <w:num w:numId="321" w16cid:durableId="1897741309">
-    <w:abstractNumId w:val="149"/>
+    <w:abstractNumId w:val="150"/>
     <w:lvlOverride w:ilvl="1">
       <w:lvl w:ilvl="1">
         <w:numFmt w:val="bullet"/>
@@ -48511,7 +49182,7 @@
     </w:lvlOverride>
   </w:num>
   <w:num w:numId="322" w16cid:durableId="58947657">
-    <w:abstractNumId w:val="149"/>
+    <w:abstractNumId w:val="150"/>
     <w:lvlOverride w:ilvl="1">
       <w:lvl w:ilvl="1">
         <w:numFmt w:val="bullet"/>
@@ -48531,7 +49202,7 @@
     </w:lvlOverride>
   </w:num>
   <w:num w:numId="323" w16cid:durableId="962272664">
-    <w:abstractNumId w:val="149"/>
+    <w:abstractNumId w:val="150"/>
     <w:lvlOverride w:ilvl="1">
       <w:lvl w:ilvl="1">
         <w:numFmt w:val="bullet"/>
@@ -48551,7 +49222,7 @@
     </w:lvlOverride>
   </w:num>
   <w:num w:numId="324" w16cid:durableId="790049959">
-    <w:abstractNumId w:val="149"/>
+    <w:abstractNumId w:val="150"/>
     <w:lvlOverride w:ilvl="1">
       <w:lvl w:ilvl="1">
         <w:numFmt w:val="bullet"/>
@@ -48571,7 +49242,7 @@
     </w:lvlOverride>
   </w:num>
   <w:num w:numId="325" w16cid:durableId="1095319726">
-    <w:abstractNumId w:val="149"/>
+    <w:abstractNumId w:val="150"/>
     <w:lvlOverride w:ilvl="1">
       <w:lvl w:ilvl="1">
         <w:numFmt w:val="bullet"/>
@@ -48591,7 +49262,7 @@
     </w:lvlOverride>
   </w:num>
   <w:num w:numId="326" w16cid:durableId="30501642">
-    <w:abstractNumId w:val="149"/>
+    <w:abstractNumId w:val="150"/>
     <w:lvlOverride w:ilvl="1">
       <w:lvl w:ilvl="1">
         <w:numFmt w:val="bullet"/>
@@ -48611,13 +49282,13 @@
     </w:lvlOverride>
   </w:num>
   <w:num w:numId="327" w16cid:durableId="570578976">
-    <w:abstractNumId w:val="157"/>
+    <w:abstractNumId w:val="158"/>
   </w:num>
   <w:num w:numId="328" w16cid:durableId="605575109">
     <w:abstractNumId w:val="24"/>
   </w:num>
   <w:num w:numId="329" w16cid:durableId="1137530575">
-    <w:abstractNumId w:val="181"/>
+    <w:abstractNumId w:val="182"/>
   </w:num>
   <w:num w:numId="330" w16cid:durableId="1038896762">
     <w:abstractNumId w:val="9"/>
@@ -48906,13 +49577,13 @@
     <w:abstractNumId w:val="30"/>
   </w:num>
   <w:num w:numId="346" w16cid:durableId="1170826855">
-    <w:abstractNumId w:val="179"/>
+    <w:abstractNumId w:val="180"/>
   </w:num>
   <w:num w:numId="347" w16cid:durableId="1876500035">
-    <w:abstractNumId w:val="138"/>
+    <w:abstractNumId w:val="139"/>
   </w:num>
   <w:num w:numId="348" w16cid:durableId="478764876">
-    <w:abstractNumId w:val="138"/>
+    <w:abstractNumId w:val="139"/>
     <w:lvlOverride w:ilvl="1">
       <w:lvl w:ilvl="1">
         <w:numFmt w:val="bullet"/>
@@ -48932,7 +49603,7 @@
     </w:lvlOverride>
   </w:num>
   <w:num w:numId="349" w16cid:durableId="2146193500">
-    <w:abstractNumId w:val="138"/>
+    <w:abstractNumId w:val="139"/>
     <w:lvlOverride w:ilvl="1">
       <w:lvl w:ilvl="1">
         <w:numFmt w:val="bullet"/>
@@ -48952,7 +49623,7 @@
     </w:lvlOverride>
   </w:num>
   <w:num w:numId="350" w16cid:durableId="611790871">
-    <w:abstractNumId w:val="138"/>
+    <w:abstractNumId w:val="139"/>
     <w:lvlOverride w:ilvl="1">
       <w:lvl w:ilvl="1">
         <w:numFmt w:val="bullet"/>
@@ -48972,7 +49643,7 @@
     </w:lvlOverride>
   </w:num>
   <w:num w:numId="351" w16cid:durableId="1655522343">
-    <w:abstractNumId w:val="138"/>
+    <w:abstractNumId w:val="139"/>
     <w:lvlOverride w:ilvl="1">
       <w:lvl w:ilvl="1">
         <w:numFmt w:val="bullet"/>
@@ -48992,7 +49663,7 @@
     </w:lvlOverride>
   </w:num>
   <w:num w:numId="352" w16cid:durableId="852957138">
-    <w:abstractNumId w:val="138"/>
+    <w:abstractNumId w:val="139"/>
     <w:lvlOverride w:ilvl="1">
       <w:lvl w:ilvl="1">
         <w:numFmt w:val="bullet"/>
@@ -49012,7 +49683,7 @@
     </w:lvlOverride>
   </w:num>
   <w:num w:numId="353" w16cid:durableId="462308073">
-    <w:abstractNumId w:val="138"/>
+    <w:abstractNumId w:val="139"/>
     <w:lvlOverride w:ilvl="1">
       <w:lvl w:ilvl="1">
         <w:numFmt w:val="bullet"/>
@@ -49032,7 +49703,7 @@
     </w:lvlOverride>
   </w:num>
   <w:num w:numId="354" w16cid:durableId="1436906594">
-    <w:abstractNumId w:val="138"/>
+    <w:abstractNumId w:val="139"/>
     <w:lvlOverride w:ilvl="1">
       <w:lvl w:ilvl="1">
         <w:numFmt w:val="bullet"/>
@@ -49052,10 +49723,10 @@
     </w:lvlOverride>
   </w:num>
   <w:num w:numId="355" w16cid:durableId="162933598">
-    <w:abstractNumId w:val="208"/>
+    <w:abstractNumId w:val="209"/>
   </w:num>
   <w:num w:numId="356" w16cid:durableId="1507281708">
-    <w:abstractNumId w:val="208"/>
+    <w:abstractNumId w:val="209"/>
     <w:lvlOverride w:ilvl="1">
       <w:lvl w:ilvl="1">
         <w:numFmt w:val="bullet"/>
@@ -49075,7 +49746,7 @@
     </w:lvlOverride>
   </w:num>
   <w:num w:numId="357" w16cid:durableId="1527062965">
-    <w:abstractNumId w:val="208"/>
+    <w:abstractNumId w:val="209"/>
     <w:lvlOverride w:ilvl="1">
       <w:lvl w:ilvl="1">
         <w:numFmt w:val="bullet"/>
@@ -49095,7 +49766,7 @@
     </w:lvlOverride>
   </w:num>
   <w:num w:numId="358" w16cid:durableId="1381590890">
-    <w:abstractNumId w:val="208"/>
+    <w:abstractNumId w:val="209"/>
     <w:lvlOverride w:ilvl="1">
       <w:lvl w:ilvl="1">
         <w:numFmt w:val="bullet"/>
@@ -49115,7 +49786,7 @@
     </w:lvlOverride>
   </w:num>
   <w:num w:numId="359" w16cid:durableId="1474562395">
-    <w:abstractNumId w:val="208"/>
+    <w:abstractNumId w:val="209"/>
     <w:lvlOverride w:ilvl="1">
       <w:lvl w:ilvl="1">
         <w:numFmt w:val="bullet"/>
@@ -49135,7 +49806,7 @@
     </w:lvlOverride>
   </w:num>
   <w:num w:numId="360" w16cid:durableId="1721904938">
-    <w:abstractNumId w:val="208"/>
+    <w:abstractNumId w:val="209"/>
     <w:lvlOverride w:ilvl="1">
       <w:lvl w:ilvl="1">
         <w:numFmt w:val="bullet"/>
@@ -49155,7 +49826,7 @@
     </w:lvlOverride>
   </w:num>
   <w:num w:numId="361" w16cid:durableId="179785792">
-    <w:abstractNumId w:val="208"/>
+    <w:abstractNumId w:val="209"/>
     <w:lvlOverride w:ilvl="1">
       <w:lvl w:ilvl="1">
         <w:numFmt w:val="bullet"/>
@@ -49175,7 +49846,7 @@
     </w:lvlOverride>
   </w:num>
   <w:num w:numId="362" w16cid:durableId="822282911">
-    <w:abstractNumId w:val="208"/>
+    <w:abstractNumId w:val="209"/>
     <w:lvlOverride w:ilvl="1">
       <w:lvl w:ilvl="1">
         <w:numFmt w:val="bullet"/>
@@ -49195,13 +49866,13 @@
     </w:lvlOverride>
   </w:num>
   <w:num w:numId="363" w16cid:durableId="1525944486">
-    <w:abstractNumId w:val="213"/>
+    <w:abstractNumId w:val="214"/>
   </w:num>
   <w:num w:numId="364" w16cid:durableId="121389017">
-    <w:abstractNumId w:val="251"/>
+    <w:abstractNumId w:val="252"/>
   </w:num>
   <w:num w:numId="365" w16cid:durableId="670328241">
-    <w:abstractNumId w:val="251"/>
+    <w:abstractNumId w:val="252"/>
     <w:lvlOverride w:ilvl="1">
       <w:lvl w:ilvl="1">
         <w:numFmt w:val="bullet"/>
@@ -49221,7 +49892,7 @@
     </w:lvlOverride>
   </w:num>
   <w:num w:numId="366" w16cid:durableId="147673844">
-    <w:abstractNumId w:val="251"/>
+    <w:abstractNumId w:val="252"/>
     <w:lvlOverride w:ilvl="1">
       <w:lvl w:ilvl="1">
         <w:numFmt w:val="bullet"/>
@@ -49241,10 +49912,10 @@
     </w:lvlOverride>
   </w:num>
   <w:num w:numId="367" w16cid:durableId="440804537">
-    <w:abstractNumId w:val="177"/>
+    <w:abstractNumId w:val="178"/>
   </w:num>
   <w:num w:numId="368" w16cid:durableId="104272455">
-    <w:abstractNumId w:val="177"/>
+    <w:abstractNumId w:val="178"/>
     <w:lvlOverride w:ilvl="1">
       <w:lvl w:ilvl="1">
         <w:numFmt w:val="bullet"/>
@@ -49264,7 +49935,7 @@
     </w:lvlOverride>
   </w:num>
   <w:num w:numId="369" w16cid:durableId="1089039473">
-    <w:abstractNumId w:val="177"/>
+    <w:abstractNumId w:val="178"/>
     <w:lvlOverride w:ilvl="1">
       <w:lvl w:ilvl="1">
         <w:numFmt w:val="bullet"/>
@@ -49284,7 +49955,7 @@
     </w:lvlOverride>
   </w:num>
   <w:num w:numId="370" w16cid:durableId="1605722484">
-    <w:abstractNumId w:val="177"/>
+    <w:abstractNumId w:val="178"/>
     <w:lvlOverride w:ilvl="1">
       <w:lvl w:ilvl="1">
         <w:numFmt w:val="bullet"/>
@@ -49304,7 +49975,7 @@
     </w:lvlOverride>
   </w:num>
   <w:num w:numId="371" w16cid:durableId="1788115749">
-    <w:abstractNumId w:val="177"/>
+    <w:abstractNumId w:val="178"/>
     <w:lvlOverride w:ilvl="1">
       <w:lvl w:ilvl="1">
         <w:numFmt w:val="bullet"/>
@@ -49324,7 +49995,7 @@
     </w:lvlOverride>
   </w:num>
   <w:num w:numId="372" w16cid:durableId="389964750">
-    <w:abstractNumId w:val="177"/>
+    <w:abstractNumId w:val="178"/>
     <w:lvlOverride w:ilvl="1">
       <w:lvl w:ilvl="1">
         <w:numFmt w:val="bullet"/>
@@ -49344,7 +50015,7 @@
     </w:lvlOverride>
   </w:num>
   <w:num w:numId="373" w16cid:durableId="1775900948">
-    <w:abstractNumId w:val="177"/>
+    <w:abstractNumId w:val="178"/>
     <w:lvlOverride w:ilvl="1">
       <w:lvl w:ilvl="1">
         <w:numFmt w:val="bullet"/>
@@ -49364,7 +50035,7 @@
     </w:lvlOverride>
   </w:num>
   <w:num w:numId="374" w16cid:durableId="1583833744">
-    <w:abstractNumId w:val="177"/>
+    <w:abstractNumId w:val="178"/>
     <w:lvlOverride w:ilvl="1">
       <w:lvl w:ilvl="1">
         <w:numFmt w:val="bullet"/>
@@ -49384,7 +50055,7 @@
     </w:lvlOverride>
   </w:num>
   <w:num w:numId="375" w16cid:durableId="57016376">
-    <w:abstractNumId w:val="177"/>
+    <w:abstractNumId w:val="178"/>
     <w:lvlOverride w:ilvl="1">
       <w:lvl w:ilvl="1">
         <w:numFmt w:val="bullet"/>
@@ -49404,7 +50075,7 @@
     </w:lvlOverride>
   </w:num>
   <w:num w:numId="376" w16cid:durableId="986782883">
-    <w:abstractNumId w:val="177"/>
+    <w:abstractNumId w:val="178"/>
     <w:lvlOverride w:ilvl="1">
       <w:lvl w:ilvl="1">
         <w:numFmt w:val="bullet"/>
@@ -49487,10 +50158,10 @@
     </w:lvlOverride>
   </w:num>
   <w:num w:numId="381" w16cid:durableId="65304410">
-    <w:abstractNumId w:val="212"/>
+    <w:abstractNumId w:val="213"/>
   </w:num>
   <w:num w:numId="382" w16cid:durableId="33699091">
-    <w:abstractNumId w:val="212"/>
+    <w:abstractNumId w:val="213"/>
     <w:lvlOverride w:ilvl="1">
       <w:lvl w:ilvl="1">
         <w:numFmt w:val="bullet"/>
@@ -49510,7 +50181,7 @@
     </w:lvlOverride>
   </w:num>
   <w:num w:numId="383" w16cid:durableId="344136954">
-    <w:abstractNumId w:val="212"/>
+    <w:abstractNumId w:val="213"/>
     <w:lvlOverride w:ilvl="1">
       <w:lvl w:ilvl="1">
         <w:numFmt w:val="bullet"/>
@@ -49533,13 +50204,13 @@
     <w:abstractNumId w:val="120"/>
   </w:num>
   <w:num w:numId="385" w16cid:durableId="390619000">
-    <w:abstractNumId w:val="170"/>
+    <w:abstractNumId w:val="171"/>
   </w:num>
   <w:num w:numId="386" w16cid:durableId="1930968399">
-    <w:abstractNumId w:val="148"/>
+    <w:abstractNumId w:val="149"/>
   </w:num>
   <w:num w:numId="387" w16cid:durableId="1541816291">
-    <w:abstractNumId w:val="148"/>
+    <w:abstractNumId w:val="149"/>
     <w:lvlOverride w:ilvl="1">
       <w:lvl w:ilvl="1">
         <w:numFmt w:val="bullet"/>
@@ -49559,7 +50230,7 @@
     </w:lvlOverride>
   </w:num>
   <w:num w:numId="388" w16cid:durableId="559946744">
-    <w:abstractNumId w:val="148"/>
+    <w:abstractNumId w:val="149"/>
     <w:lvlOverride w:ilvl="1">
       <w:lvl w:ilvl="1">
         <w:numFmt w:val="bullet"/>
@@ -49579,7 +50250,7 @@
     </w:lvlOverride>
   </w:num>
   <w:num w:numId="389" w16cid:durableId="239028179">
-    <w:abstractNumId w:val="148"/>
+    <w:abstractNumId w:val="149"/>
     <w:lvlOverride w:ilvl="1">
       <w:lvl w:ilvl="1">
         <w:numFmt w:val="bullet"/>
@@ -49599,7 +50270,7 @@
     </w:lvlOverride>
   </w:num>
   <w:num w:numId="390" w16cid:durableId="1118765582">
-    <w:abstractNumId w:val="148"/>
+    <w:abstractNumId w:val="149"/>
     <w:lvlOverride w:ilvl="1">
       <w:lvl w:ilvl="1">
         <w:numFmt w:val="bullet"/>
@@ -49619,7 +50290,7 @@
     </w:lvlOverride>
   </w:num>
   <w:num w:numId="391" w16cid:durableId="1870602126">
-    <w:abstractNumId w:val="148"/>
+    <w:abstractNumId w:val="149"/>
     <w:lvlOverride w:ilvl="1">
       <w:lvl w:ilvl="1">
         <w:numFmt w:val="bullet"/>
@@ -49639,7 +50310,7 @@
     </w:lvlOverride>
   </w:num>
   <w:num w:numId="392" w16cid:durableId="545215514">
-    <w:abstractNumId w:val="148"/>
+    <w:abstractNumId w:val="149"/>
     <w:lvlOverride w:ilvl="1">
       <w:lvl w:ilvl="1">
         <w:numFmt w:val="bullet"/>
@@ -49659,10 +50330,10 @@
     </w:lvlOverride>
   </w:num>
   <w:num w:numId="393" w16cid:durableId="309671589">
-    <w:abstractNumId w:val="160"/>
+    <w:abstractNumId w:val="161"/>
   </w:num>
   <w:num w:numId="394" w16cid:durableId="1675105648">
-    <w:abstractNumId w:val="160"/>
+    <w:abstractNumId w:val="161"/>
     <w:lvlOverride w:ilvl="1">
       <w:lvl w:ilvl="1">
         <w:numFmt w:val="bullet"/>
@@ -49682,7 +50353,7 @@
     </w:lvlOverride>
   </w:num>
   <w:num w:numId="395" w16cid:durableId="1326322710">
-    <w:abstractNumId w:val="160"/>
+    <w:abstractNumId w:val="161"/>
     <w:lvlOverride w:ilvl="1">
       <w:lvl w:ilvl="1">
         <w:numFmt w:val="bullet"/>
@@ -49702,7 +50373,7 @@
     </w:lvlOverride>
   </w:num>
   <w:num w:numId="396" w16cid:durableId="43871617">
-    <w:abstractNumId w:val="160"/>
+    <w:abstractNumId w:val="161"/>
     <w:lvlOverride w:ilvl="1">
       <w:lvl w:ilvl="1">
         <w:numFmt w:val="bullet"/>
@@ -49911,13 +50582,13 @@
     </w:lvlOverride>
   </w:num>
   <w:num w:numId="409" w16cid:durableId="168637425">
-    <w:abstractNumId w:val="161"/>
+    <w:abstractNumId w:val="162"/>
   </w:num>
   <w:num w:numId="410" w16cid:durableId="451897618">
-    <w:abstractNumId w:val="203"/>
+    <w:abstractNumId w:val="204"/>
   </w:num>
   <w:num w:numId="411" w16cid:durableId="975717288">
-    <w:abstractNumId w:val="203"/>
+    <w:abstractNumId w:val="204"/>
     <w:lvlOverride w:ilvl="1">
       <w:lvl w:ilvl="1">
         <w:numFmt w:val="bullet"/>
@@ -49937,7 +50608,7 @@
     </w:lvlOverride>
   </w:num>
   <w:num w:numId="412" w16cid:durableId="567880089">
-    <w:abstractNumId w:val="203"/>
+    <w:abstractNumId w:val="204"/>
     <w:lvlOverride w:ilvl="1">
       <w:lvl w:ilvl="1">
         <w:numFmt w:val="bullet"/>
@@ -49957,7 +50628,7 @@
     </w:lvlOverride>
   </w:num>
   <w:num w:numId="413" w16cid:durableId="139032186">
-    <w:abstractNumId w:val="203"/>
+    <w:abstractNumId w:val="204"/>
     <w:lvlOverride w:ilvl="1">
       <w:lvl w:ilvl="1">
         <w:numFmt w:val="bullet"/>
@@ -49977,7 +50648,7 @@
     </w:lvlOverride>
   </w:num>
   <w:num w:numId="414" w16cid:durableId="1200895258">
-    <w:abstractNumId w:val="203"/>
+    <w:abstractNumId w:val="204"/>
     <w:lvlOverride w:ilvl="1">
       <w:lvl w:ilvl="1">
         <w:numFmt w:val="bullet"/>
@@ -49997,7 +50668,7 @@
     </w:lvlOverride>
   </w:num>
   <w:num w:numId="415" w16cid:durableId="1534031402">
-    <w:abstractNumId w:val="203"/>
+    <w:abstractNumId w:val="204"/>
     <w:lvlOverride w:ilvl="1">
       <w:lvl w:ilvl="1">
         <w:numFmt w:val="bullet"/>
@@ -50017,16 +50688,16 @@
     </w:lvlOverride>
   </w:num>
   <w:num w:numId="416" w16cid:durableId="306133919">
-    <w:abstractNumId w:val="169"/>
+    <w:abstractNumId w:val="170"/>
   </w:num>
   <w:num w:numId="417" w16cid:durableId="754471240">
-    <w:abstractNumId w:val="132"/>
+    <w:abstractNumId w:val="133"/>
   </w:num>
   <w:num w:numId="418" w16cid:durableId="1618828123">
-    <w:abstractNumId w:val="243"/>
+    <w:abstractNumId w:val="244"/>
   </w:num>
   <w:num w:numId="419" w16cid:durableId="371350015">
-    <w:abstractNumId w:val="243"/>
+    <w:abstractNumId w:val="244"/>
     <w:lvlOverride w:ilvl="1">
       <w:lvl w:ilvl="1">
         <w:numFmt w:val="bullet"/>
@@ -50046,7 +50717,7 @@
     </w:lvlOverride>
   </w:num>
   <w:num w:numId="420" w16cid:durableId="54276952">
-    <w:abstractNumId w:val="243"/>
+    <w:abstractNumId w:val="244"/>
     <w:lvlOverride w:ilvl="1">
       <w:lvl w:ilvl="1">
         <w:numFmt w:val="bullet"/>
@@ -50066,7 +50737,7 @@
     </w:lvlOverride>
   </w:num>
   <w:num w:numId="421" w16cid:durableId="1527601039">
-    <w:abstractNumId w:val="243"/>
+    <w:abstractNumId w:val="244"/>
     <w:lvlOverride w:ilvl="1">
       <w:lvl w:ilvl="1">
         <w:numFmt w:val="bullet"/>
@@ -50086,7 +50757,7 @@
     </w:lvlOverride>
   </w:num>
   <w:num w:numId="422" w16cid:durableId="432407122">
-    <w:abstractNumId w:val="243"/>
+    <w:abstractNumId w:val="244"/>
     <w:lvlOverride w:ilvl="1">
       <w:lvl w:ilvl="1">
         <w:numFmt w:val="bullet"/>
@@ -50106,7 +50777,7 @@
     </w:lvlOverride>
   </w:num>
   <w:num w:numId="423" w16cid:durableId="23950186">
-    <w:abstractNumId w:val="243"/>
+    <w:abstractNumId w:val="244"/>
     <w:lvlOverride w:ilvl="1">
       <w:lvl w:ilvl="1">
         <w:numFmt w:val="bullet"/>
@@ -50126,7 +50797,7 @@
     </w:lvlOverride>
   </w:num>
   <w:num w:numId="424" w16cid:durableId="1095712291">
-    <w:abstractNumId w:val="243"/>
+    <w:abstractNumId w:val="244"/>
     <w:lvlOverride w:ilvl="1">
       <w:lvl w:ilvl="1">
         <w:numFmt w:val="bullet"/>
@@ -50146,7 +50817,7 @@
     </w:lvlOverride>
   </w:num>
   <w:num w:numId="425" w16cid:durableId="44649956">
-    <w:abstractNumId w:val="243"/>
+    <w:abstractNumId w:val="244"/>
     <w:lvlOverride w:ilvl="1">
       <w:lvl w:ilvl="1">
         <w:numFmt w:val="bullet"/>
@@ -50169,16 +50840,16 @@
     <w:abstractNumId w:val="56"/>
   </w:num>
   <w:num w:numId="427" w16cid:durableId="226261568">
-    <w:abstractNumId w:val="130"/>
+    <w:abstractNumId w:val="131"/>
   </w:num>
   <w:num w:numId="428" w16cid:durableId="25326572">
-    <w:abstractNumId w:val="134"/>
+    <w:abstractNumId w:val="135"/>
   </w:num>
   <w:num w:numId="429" w16cid:durableId="1994721791">
-    <w:abstractNumId w:val="165"/>
+    <w:abstractNumId w:val="166"/>
   </w:num>
   <w:num w:numId="430" w16cid:durableId="820074511">
-    <w:abstractNumId w:val="165"/>
+    <w:abstractNumId w:val="166"/>
     <w:lvlOverride w:ilvl="1">
       <w:lvl w:ilvl="1">
         <w:numFmt w:val="bullet"/>
@@ -50198,7 +50869,7 @@
     </w:lvlOverride>
   </w:num>
   <w:num w:numId="431" w16cid:durableId="1931809649">
-    <w:abstractNumId w:val="165"/>
+    <w:abstractNumId w:val="166"/>
     <w:lvlOverride w:ilvl="1">
       <w:lvl w:ilvl="1">
         <w:numFmt w:val="bullet"/>
@@ -50218,7 +50889,7 @@
     </w:lvlOverride>
   </w:num>
   <w:num w:numId="432" w16cid:durableId="644772328">
-    <w:abstractNumId w:val="165"/>
+    <w:abstractNumId w:val="166"/>
     <w:lvlOverride w:ilvl="1">
       <w:lvl w:ilvl="1">
         <w:numFmt w:val="bullet"/>
@@ -50238,7 +50909,7 @@
     </w:lvlOverride>
   </w:num>
   <w:num w:numId="433" w16cid:durableId="1881428511">
-    <w:abstractNumId w:val="165"/>
+    <w:abstractNumId w:val="166"/>
     <w:lvlOverride w:ilvl="1">
       <w:lvl w:ilvl="1">
         <w:numFmt w:val="bullet"/>
@@ -50258,7 +50929,7 @@
     </w:lvlOverride>
   </w:num>
   <w:num w:numId="434" w16cid:durableId="635180620">
-    <w:abstractNumId w:val="165"/>
+    <w:abstractNumId w:val="166"/>
     <w:lvlOverride w:ilvl="1">
       <w:lvl w:ilvl="1">
         <w:numFmt w:val="bullet"/>
@@ -50278,7 +50949,7 @@
     </w:lvlOverride>
   </w:num>
   <w:num w:numId="435" w16cid:durableId="1180124068">
-    <w:abstractNumId w:val="165"/>
+    <w:abstractNumId w:val="166"/>
     <w:lvlOverride w:ilvl="1">
       <w:lvl w:ilvl="1">
         <w:numFmt w:val="bullet"/>
@@ -50298,10 +50969,10 @@
     </w:lvlOverride>
   </w:num>
   <w:num w:numId="436" w16cid:durableId="1801654206">
-    <w:abstractNumId w:val="155"/>
+    <w:abstractNumId w:val="156"/>
   </w:num>
   <w:num w:numId="437" w16cid:durableId="1222592467">
-    <w:abstractNumId w:val="155"/>
+    <w:abstractNumId w:val="156"/>
     <w:lvlOverride w:ilvl="1">
       <w:lvl w:ilvl="1">
         <w:numFmt w:val="bullet"/>
@@ -50321,7 +50992,7 @@
     </w:lvlOverride>
   </w:num>
   <w:num w:numId="438" w16cid:durableId="990673079">
-    <w:abstractNumId w:val="155"/>
+    <w:abstractNumId w:val="156"/>
     <w:lvlOverride w:ilvl="1">
       <w:lvl w:ilvl="1">
         <w:numFmt w:val="bullet"/>
@@ -50341,7 +51012,7 @@
     </w:lvlOverride>
   </w:num>
   <w:num w:numId="439" w16cid:durableId="702294307">
-    <w:abstractNumId w:val="155"/>
+    <w:abstractNumId w:val="156"/>
     <w:lvlOverride w:ilvl="1">
       <w:lvl w:ilvl="1">
         <w:numFmt w:val="bullet"/>
@@ -50361,7 +51032,7 @@
     </w:lvlOverride>
   </w:num>
   <w:num w:numId="440" w16cid:durableId="1782070666">
-    <w:abstractNumId w:val="155"/>
+    <w:abstractNumId w:val="156"/>
     <w:lvlOverride w:ilvl="1">
       <w:lvl w:ilvl="1">
         <w:numFmt w:val="bullet"/>
@@ -50381,7 +51052,7 @@
     </w:lvlOverride>
   </w:num>
   <w:num w:numId="441" w16cid:durableId="1987585088">
-    <w:abstractNumId w:val="155"/>
+    <w:abstractNumId w:val="156"/>
     <w:lvlOverride w:ilvl="1">
       <w:lvl w:ilvl="1">
         <w:numFmt w:val="bullet"/>
@@ -50547,10 +51218,10 @@
     <w:abstractNumId w:val="86"/>
   </w:num>
   <w:num w:numId="451" w16cid:durableId="786437438">
-    <w:abstractNumId w:val="133"/>
+    <w:abstractNumId w:val="134"/>
   </w:num>
   <w:num w:numId="452" w16cid:durableId="864096117">
-    <w:abstractNumId w:val="133"/>
+    <w:abstractNumId w:val="134"/>
     <w:lvlOverride w:ilvl="1">
       <w:lvl w:ilvl="1">
         <w:numFmt w:val="bullet"/>
@@ -50570,7 +51241,7 @@
     </w:lvlOverride>
   </w:num>
   <w:num w:numId="453" w16cid:durableId="846091187">
-    <w:abstractNumId w:val="133"/>
+    <w:abstractNumId w:val="134"/>
     <w:lvlOverride w:ilvl="1">
       <w:lvl w:ilvl="1">
         <w:numFmt w:val="bullet"/>
@@ -50590,7 +51261,7 @@
     </w:lvlOverride>
   </w:num>
   <w:num w:numId="454" w16cid:durableId="605230102">
-    <w:abstractNumId w:val="133"/>
+    <w:abstractNumId w:val="134"/>
     <w:lvlOverride w:ilvl="1">
       <w:lvl w:ilvl="1">
         <w:numFmt w:val="bullet"/>
@@ -50610,7 +51281,7 @@
     </w:lvlOverride>
   </w:num>
   <w:num w:numId="455" w16cid:durableId="274168322">
-    <w:abstractNumId w:val="133"/>
+    <w:abstractNumId w:val="134"/>
     <w:lvlOverride w:ilvl="1">
       <w:lvl w:ilvl="1">
         <w:numFmt w:val="bullet"/>
@@ -50630,7 +51301,7 @@
     </w:lvlOverride>
   </w:num>
   <w:num w:numId="456" w16cid:durableId="195192244">
-    <w:abstractNumId w:val="133"/>
+    <w:abstractNumId w:val="134"/>
     <w:lvlOverride w:ilvl="1">
       <w:lvl w:ilvl="1">
         <w:numFmt w:val="bullet"/>
@@ -50650,10 +51321,10 @@
     </w:lvlOverride>
   </w:num>
   <w:num w:numId="457" w16cid:durableId="595866949">
-    <w:abstractNumId w:val="231"/>
+    <w:abstractNumId w:val="232"/>
   </w:num>
   <w:num w:numId="458" w16cid:durableId="1789736070">
-    <w:abstractNumId w:val="231"/>
+    <w:abstractNumId w:val="232"/>
     <w:lvlOverride w:ilvl="1">
       <w:lvl w:ilvl="1">
         <w:numFmt w:val="bullet"/>
@@ -50673,7 +51344,7 @@
     </w:lvlOverride>
   </w:num>
   <w:num w:numId="459" w16cid:durableId="578641482">
-    <w:abstractNumId w:val="231"/>
+    <w:abstractNumId w:val="232"/>
     <w:lvlOverride w:ilvl="1">
       <w:lvl w:ilvl="1">
         <w:numFmt w:val="bullet"/>
@@ -50693,7 +51364,7 @@
     </w:lvlOverride>
   </w:num>
   <w:num w:numId="460" w16cid:durableId="1626159982">
-    <w:abstractNumId w:val="231"/>
+    <w:abstractNumId w:val="232"/>
     <w:lvlOverride w:ilvl="1">
       <w:lvl w:ilvl="1">
         <w:numFmt w:val="bullet"/>
@@ -50713,7 +51384,7 @@
     </w:lvlOverride>
   </w:num>
   <w:num w:numId="461" w16cid:durableId="362823212">
-    <w:abstractNumId w:val="231"/>
+    <w:abstractNumId w:val="232"/>
     <w:lvlOverride w:ilvl="1">
       <w:lvl w:ilvl="1">
         <w:numFmt w:val="bullet"/>
@@ -50733,10 +51404,10 @@
     </w:lvlOverride>
   </w:num>
   <w:num w:numId="462" w16cid:durableId="1102920915">
-    <w:abstractNumId w:val="172"/>
+    <w:abstractNumId w:val="173"/>
   </w:num>
   <w:num w:numId="463" w16cid:durableId="1651251892">
-    <w:abstractNumId w:val="172"/>
+    <w:abstractNumId w:val="173"/>
     <w:lvlOverride w:ilvl="1">
       <w:lvl w:ilvl="1">
         <w:numFmt w:val="bullet"/>
@@ -50756,7 +51427,7 @@
     </w:lvlOverride>
   </w:num>
   <w:num w:numId="464" w16cid:durableId="242298327">
-    <w:abstractNumId w:val="172"/>
+    <w:abstractNumId w:val="173"/>
     <w:lvlOverride w:ilvl="1">
       <w:lvl w:ilvl="1">
         <w:numFmt w:val="bullet"/>
@@ -50776,10 +51447,10 @@
     </w:lvlOverride>
   </w:num>
   <w:num w:numId="465" w16cid:durableId="292905749">
-    <w:abstractNumId w:val="221"/>
+    <w:abstractNumId w:val="222"/>
   </w:num>
   <w:num w:numId="466" w16cid:durableId="201944174">
-    <w:abstractNumId w:val="221"/>
+    <w:abstractNumId w:val="222"/>
     <w:lvlOverride w:ilvl="1">
       <w:lvl w:ilvl="1">
         <w:numFmt w:val="bullet"/>
@@ -50799,7 +51470,7 @@
     </w:lvlOverride>
   </w:num>
   <w:num w:numId="467" w16cid:durableId="359167791">
-    <w:abstractNumId w:val="221"/>
+    <w:abstractNumId w:val="222"/>
     <w:lvlOverride w:ilvl="1">
       <w:lvl w:ilvl="1">
         <w:numFmt w:val="bullet"/>
@@ -50819,7 +51490,7 @@
     </w:lvlOverride>
   </w:num>
   <w:num w:numId="468" w16cid:durableId="515273267">
-    <w:abstractNumId w:val="221"/>
+    <w:abstractNumId w:val="222"/>
     <w:lvlOverride w:ilvl="1">
       <w:lvl w:ilvl="1">
         <w:numFmt w:val="bullet"/>
@@ -50839,7 +51510,7 @@
     </w:lvlOverride>
   </w:num>
   <w:num w:numId="469" w16cid:durableId="176963739">
-    <w:abstractNumId w:val="221"/>
+    <w:abstractNumId w:val="222"/>
     <w:lvlOverride w:ilvl="1">
       <w:lvl w:ilvl="1">
         <w:numFmt w:val="bullet"/>
@@ -50865,7 +51536,7 @@
     <w:abstractNumId w:val="58"/>
   </w:num>
   <w:num w:numId="472" w16cid:durableId="1382436268">
-    <w:abstractNumId w:val="166"/>
+    <w:abstractNumId w:val="167"/>
   </w:num>
   <w:num w:numId="473" w16cid:durableId="398864408">
     <w:abstractNumId w:val="104"/>
@@ -50874,10 +51545,10 @@
     <w:abstractNumId w:val="34"/>
   </w:num>
   <w:num w:numId="475" w16cid:durableId="739333064">
-    <w:abstractNumId w:val="197"/>
+    <w:abstractNumId w:val="198"/>
   </w:num>
   <w:num w:numId="476" w16cid:durableId="245775278">
-    <w:abstractNumId w:val="206"/>
+    <w:abstractNumId w:val="207"/>
   </w:num>
   <w:num w:numId="477" w16cid:durableId="2144493695">
     <w:abstractNumId w:val="88"/>
@@ -50889,40 +51560,40 @@
     <w:abstractNumId w:val="21"/>
   </w:num>
   <w:num w:numId="480" w16cid:durableId="1818689662">
-    <w:abstractNumId w:val="204"/>
+    <w:abstractNumId w:val="205"/>
   </w:num>
   <w:num w:numId="481" w16cid:durableId="1355155217">
     <w:abstractNumId w:val="22"/>
   </w:num>
   <w:num w:numId="482" w16cid:durableId="1408383904">
-    <w:abstractNumId w:val="198"/>
+    <w:abstractNumId w:val="199"/>
   </w:num>
   <w:num w:numId="483" w16cid:durableId="247464343">
-    <w:abstractNumId w:val="187"/>
+    <w:abstractNumId w:val="188"/>
   </w:num>
   <w:num w:numId="484" w16cid:durableId="1698965271">
-    <w:abstractNumId w:val="176"/>
+    <w:abstractNumId w:val="177"/>
   </w:num>
   <w:num w:numId="485" w16cid:durableId="196042308">
     <w:abstractNumId w:val="46"/>
   </w:num>
   <w:num w:numId="486" w16cid:durableId="155192790">
-    <w:abstractNumId w:val="211"/>
+    <w:abstractNumId w:val="212"/>
   </w:num>
   <w:num w:numId="487" w16cid:durableId="124006441">
     <w:abstractNumId w:val="129"/>
   </w:num>
   <w:num w:numId="488" w16cid:durableId="1021859187">
-    <w:abstractNumId w:val="207"/>
+    <w:abstractNumId w:val="208"/>
   </w:num>
   <w:num w:numId="489" w16cid:durableId="844326744">
-    <w:abstractNumId w:val="144"/>
+    <w:abstractNumId w:val="145"/>
   </w:num>
   <w:num w:numId="490" w16cid:durableId="1956522580">
     <w:abstractNumId w:val="78"/>
   </w:num>
   <w:num w:numId="491" w16cid:durableId="1285188320">
-    <w:abstractNumId w:val="185"/>
+    <w:abstractNumId w:val="186"/>
   </w:num>
   <w:num w:numId="492" w16cid:durableId="1186096464">
     <w:abstractNumId w:val="122"/>
@@ -50931,7 +51602,7 @@
     <w:abstractNumId w:val="4"/>
   </w:num>
   <w:num w:numId="494" w16cid:durableId="912738110">
-    <w:abstractNumId w:val="145"/>
+    <w:abstractNumId w:val="146"/>
   </w:num>
   <w:num w:numId="495" w16cid:durableId="636952659">
     <w:abstractNumId w:val="92"/>
@@ -51060,28 +51731,28 @@
     <w:abstractNumId w:val="114"/>
   </w:num>
   <w:num w:numId="503" w16cid:durableId="769934454">
-    <w:abstractNumId w:val="217"/>
+    <w:abstractNumId w:val="218"/>
   </w:num>
   <w:num w:numId="504" w16cid:durableId="127092240">
-    <w:abstractNumId w:val="154"/>
+    <w:abstractNumId w:val="155"/>
   </w:num>
   <w:num w:numId="505" w16cid:durableId="1910576791">
     <w:abstractNumId w:val="31"/>
   </w:num>
   <w:num w:numId="506" w16cid:durableId="944384440">
-    <w:abstractNumId w:val="163"/>
+    <w:abstractNumId w:val="164"/>
   </w:num>
   <w:num w:numId="507" w16cid:durableId="2041665929">
-    <w:abstractNumId w:val="238"/>
+    <w:abstractNumId w:val="239"/>
   </w:num>
   <w:num w:numId="508" w16cid:durableId="1096680387">
-    <w:abstractNumId w:val="151"/>
+    <w:abstractNumId w:val="152"/>
   </w:num>
   <w:num w:numId="509" w16cid:durableId="1764759620">
     <w:abstractNumId w:val="83"/>
   </w:num>
   <w:num w:numId="510" w16cid:durableId="1482192031">
-    <w:abstractNumId w:val="150"/>
+    <w:abstractNumId w:val="151"/>
   </w:num>
   <w:num w:numId="511" w16cid:durableId="991182923">
     <w:abstractNumId w:val="41"/>
@@ -51090,7 +51761,7 @@
     <w:abstractNumId w:val="51"/>
   </w:num>
   <w:num w:numId="513" w16cid:durableId="1565489822">
-    <w:abstractNumId w:val="219"/>
+    <w:abstractNumId w:val="220"/>
   </w:num>
   <w:num w:numId="514" w16cid:durableId="1695761682">
     <w:abstractNumId w:val="75"/>
@@ -51102,7 +51773,7 @@
     <w:abstractNumId w:val="74"/>
   </w:num>
   <w:num w:numId="517" w16cid:durableId="301466323">
-    <w:abstractNumId w:val="232"/>
+    <w:abstractNumId w:val="233"/>
   </w:num>
   <w:num w:numId="518" w16cid:durableId="1098983162">
     <w:abstractNumId w:val="2"/>
@@ -51111,43 +51782,43 @@
     <w:abstractNumId w:val="11"/>
   </w:num>
   <w:num w:numId="520" w16cid:durableId="1560482079">
-    <w:abstractNumId w:val="227"/>
+    <w:abstractNumId w:val="228"/>
   </w:num>
   <w:num w:numId="521" w16cid:durableId="939142479">
-    <w:abstractNumId w:val="183"/>
+    <w:abstractNumId w:val="184"/>
   </w:num>
   <w:num w:numId="522" w16cid:durableId="2129465230">
-    <w:abstractNumId w:val="195"/>
+    <w:abstractNumId w:val="196"/>
   </w:num>
   <w:num w:numId="523" w16cid:durableId="170224357">
     <w:abstractNumId w:val="69"/>
   </w:num>
   <w:num w:numId="524" w16cid:durableId="1300499789">
-    <w:abstractNumId w:val="241"/>
+    <w:abstractNumId w:val="242"/>
   </w:num>
   <w:num w:numId="525" w16cid:durableId="1112822429">
-    <w:abstractNumId w:val="191"/>
+    <w:abstractNumId w:val="192"/>
   </w:num>
   <w:num w:numId="526" w16cid:durableId="515459889">
-    <w:abstractNumId w:val="171"/>
+    <w:abstractNumId w:val="172"/>
   </w:num>
   <w:num w:numId="527" w16cid:durableId="2046323769">
-    <w:abstractNumId w:val="223"/>
+    <w:abstractNumId w:val="224"/>
   </w:num>
   <w:num w:numId="528" w16cid:durableId="578910849">
-    <w:abstractNumId w:val="225"/>
+    <w:abstractNumId w:val="226"/>
   </w:num>
   <w:num w:numId="529" w16cid:durableId="712536835">
     <w:abstractNumId w:val="44"/>
   </w:num>
   <w:num w:numId="530" w16cid:durableId="896403956">
-    <w:abstractNumId w:val="253"/>
+    <w:abstractNumId w:val="254"/>
   </w:num>
   <w:num w:numId="531" w16cid:durableId="2048600201">
     <w:abstractNumId w:val="124"/>
   </w:num>
   <w:num w:numId="532" w16cid:durableId="1834644696">
-    <w:abstractNumId w:val="143"/>
+    <w:abstractNumId w:val="144"/>
   </w:num>
   <w:num w:numId="533" w16cid:durableId="2132745270">
     <w:abstractNumId w:val="18"/>
@@ -51156,7 +51827,7 @@
     <w:abstractNumId w:val="35"/>
   </w:num>
   <w:num w:numId="535" w16cid:durableId="242110835">
-    <w:abstractNumId w:val="182"/>
+    <w:abstractNumId w:val="183"/>
   </w:num>
   <w:num w:numId="536" w16cid:durableId="1106729083">
     <w:abstractNumId w:val="66"/>
@@ -51165,10 +51836,10 @@
     <w:abstractNumId w:val="85"/>
   </w:num>
   <w:num w:numId="538" w16cid:durableId="1309897227">
-    <w:abstractNumId w:val="190"/>
+    <w:abstractNumId w:val="191"/>
   </w:num>
   <w:num w:numId="539" w16cid:durableId="1189875745">
-    <w:abstractNumId w:val="194"/>
+    <w:abstractNumId w:val="195"/>
   </w:num>
   <w:num w:numId="540" w16cid:durableId="1567716513">
     <w:abstractNumId w:val="32"/>
@@ -51183,13 +51854,13 @@
     <w:abstractNumId w:val="127"/>
   </w:num>
   <w:num w:numId="544" w16cid:durableId="583418942">
-    <w:abstractNumId w:val="136"/>
+    <w:abstractNumId w:val="137"/>
   </w:num>
   <w:num w:numId="545" w16cid:durableId="23679911">
-    <w:abstractNumId w:val="247"/>
+    <w:abstractNumId w:val="248"/>
   </w:num>
   <w:num w:numId="546" w16cid:durableId="904680098">
-    <w:abstractNumId w:val="158"/>
+    <w:abstractNumId w:val="159"/>
   </w:num>
   <w:num w:numId="547" w16cid:durableId="691494394">
     <w:abstractNumId w:val="14"/>
@@ -51201,13 +51872,13 @@
     <w:abstractNumId w:val="10"/>
   </w:num>
   <w:num w:numId="550" w16cid:durableId="1668358292">
-    <w:abstractNumId w:val="246"/>
+    <w:abstractNumId w:val="247"/>
   </w:num>
   <w:num w:numId="551" w16cid:durableId="2093622435">
     <w:abstractNumId w:val="126"/>
   </w:num>
   <w:num w:numId="552" w16cid:durableId="2121993035">
-    <w:abstractNumId w:val="242"/>
+    <w:abstractNumId w:val="243"/>
   </w:num>
   <w:num w:numId="553" w16cid:durableId="278295026">
     <w:abstractNumId w:val="79"/>
@@ -51216,19 +51887,22 @@
     <w:abstractNumId w:val="97"/>
   </w:num>
   <w:num w:numId="555" w16cid:durableId="1550527793">
-    <w:abstractNumId w:val="175"/>
+    <w:abstractNumId w:val="176"/>
   </w:num>
   <w:num w:numId="556" w16cid:durableId="1857689261">
     <w:abstractNumId w:val="80"/>
   </w:num>
   <w:num w:numId="557" w16cid:durableId="1902016722">
-    <w:abstractNumId w:val="209"/>
+    <w:abstractNumId w:val="210"/>
   </w:num>
   <w:num w:numId="558" w16cid:durableId="2044477453">
-    <w:abstractNumId w:val="200"/>
+    <w:abstractNumId w:val="201"/>
   </w:num>
   <w:num w:numId="559" w16cid:durableId="36469768">
     <w:abstractNumId w:val="33"/>
+  </w:num>
+  <w:num w:numId="560" w16cid:durableId="343015528">
+    <w:abstractNumId w:val="130"/>
   </w:num>
   <w:numIdMacAtCleanup w:val="18"/>
 </w:numbering>

</xml_diff>